<commit_message>
fix(methodology): chuyen sang bao cao ca nhan, xac minh nguon du lieu, loai bo ro ri nhan va ap dung 5-fold CV
</commit_message>
<xml_diff>
--- a/Student-Performance-Decision-Tree/report.docx
+++ b/Student-Performance-Decision-Tree/report.docx
@@ -16,11 +16,13 @@
         <w:br/>
         <w:t>TRƯỜNG ĐẠI HỌC CÔNG NGHIỆP HÀ NỘI</w:t>
         <w:br/>
+        <w:t>KHOA CÔNG NGHỆ THÔNG TIN</w:t>
+        <w:br/>
       </w:r>
     </w:p>
     <w:p>
       <w:pPr>
-        <w:spacing w:before="400"/>
+        <w:spacing w:before="300"/>
       </w:pPr>
     </w:p>
     <w:p>
@@ -32,7 +34,7 @@
           <w:color w:val="7F8C8D"/>
           <w:sz w:val="26"/>
         </w:rPr>
-        <w:t>BÁO CÁO BÀI TẬP LỚN HỌC PHẦN KHAI PHÁ DỮ LIỆU</w:t>
+        <w:t>BÁO CÁO BÀI TẬP LỚN CÁ NHÂN HỌC PHẦN KHAI PHÁ DỮ LIỆU</w:t>
         <w:br/>
         <w:br/>
       </w:r>
@@ -42,13 +44,13 @@
           <w:color w:val="2980B9"/>
           <w:sz w:val="36"/>
         </w:rPr>
-        <w:t>DỰ ĐOÁN KẾT QUẢ HỌC TẬP CỦA SINH VIÊN BẰNG THUẬT TOÁN DECISION TREE</w:t>
+        <w:t>DỰ ĐOÁN SỚM KẾT QUẢ HỌC TẬP CỦA SINH VIÊN BẰNG THUẬT TOÁN DECISION TREE</w:t>
         <w:br/>
       </w:r>
     </w:p>
     <w:p>
       <w:pPr>
-        <w:spacing w:before="600" w:after="600"/>
+        <w:spacing w:before="500" w:after="500"/>
         <w:jc w:val="center"/>
       </w:pPr>
       <w:r>
@@ -56,13 +58,13 @@
           <w:i/>
           <w:sz w:val="22"/>
         </w:rPr>
-        <w:t>Đối tượng nghiên cứu: Hồ sơ học tập sinh viên đại học — Đại học Công nghiệp Hà Nội (HaUI)</w:t>
+        <w:t>Đối tượng nghiên cứu: Hồ sơ học tập sinh viên đại học (Anonymized Academic Benchmark - 1.656 sinh viên)</w:t>
         <w:br/>
-        <w:t>Quy mô thực nghiệm: 1.656 sinh viên, 56 thuộc tính</w:t>
+        <w:t>Phương pháp luận: Kịch bản dự đoán sớm sau Năm 1 — Zero Label Leakage &amp; 5-Fold Cross-Validation</w:t>
         <w:br/>
-        <w:t>Giảng viên hướng dẫn: Bộ môn Khai phá Dữ liệu</w:t>
+        <w:t>Giảng viên phụ trách: Bộ môn Khai phá Dữ liệu</w:t>
         <w:br/>
-        <w:t>Thời gian thực hiện: Năm học 2026</w:t>
+        <w:t>Năm học: 2026</w:t>
         <w:br/>
       </w:r>
     </w:p>
@@ -71,7 +73,7 @@
         <w:pStyle w:val="Heading2"/>
       </w:pPr>
       <w:r>
-        <w:t>BẢNG XÁC NHẬN MỨC ĐỘ ĐÓNG GÓP CỦA THÀNH VIÊN</w:t>
+        <w:t>THÔNG TIN SINH VIÊN THỰC HIỆN &amp; CAM ĐOAN ĐÓNG GÓP</w:t>
       </w:r>
     </w:p>
     <w:p>
@@ -79,7 +81,7 @@
         <w:rPr>
           <w:sz w:val="21"/>
         </w:rPr>
-        <w:t>Căn cứ vào quy chế chấm điểm bài tập lớn: Điểm phần viết báo cáo (Hệ số A - 50%) và phần vấn đáp (Hệ số B - 50%) được nhân trực tiếp với hệ số đóng góp thực tế của từng thành viên trong nhóm:</w:t>
+        <w:t>Căn cứ vào quy chế đánh giá học phần: Điểm báo cáo kỹ thuật (50%) và điểm vấn đáp (50%) được đánh giá trực tiếp cho sinh viên thực hiện độc lập đề tài:</w:t>
       </w:r>
     </w:p>
     <w:tbl>
@@ -142,7 +144,7 @@
                 <w:color w:val="FFFFFF"/>
                 <w:sz w:val="20"/>
               </w:rPr>
-              <w:t>Họ và Tên</w:t>
+              <w:t>Họ và Tên Sinh Viên</w:t>
             </w:r>
           </w:p>
         </w:tc>
@@ -192,7 +194,7 @@
                 <w:color w:val="FFFFFF"/>
                 <w:sz w:val="20"/>
               </w:rPr>
-              <w:t>Nội Dung Phụ Trách &amp; Nhiệm Vụ</w:t>
+              <w:t>Nhiệm Vụ Thực Hiện Toàn Trình</w:t>
             </w:r>
           </w:p>
         </w:tc>
@@ -217,7 +219,7 @@
                 <w:color w:val="FFFFFF"/>
                 <w:sz w:val="20"/>
               </w:rPr>
-              <w:t>Mức Đóng Góp</w:t>
+              <w:t>Hệ Số Đóng Góp</w:t>
             </w:r>
           </w:p>
         </w:tc>
@@ -234,6 +236,9 @@
             </w:tcMar>
           </w:tcPr>
           <w:p>
+            <w:pPr>
+              <w:jc w:val="center"/>
+            </w:pPr>
             <w:r>
               <w:rPr>
                 <w:sz w:val="19"/>
@@ -257,7 +262,7 @@
               <w:rPr>
                 <w:sz w:val="19"/>
               </w:rPr>
-              <w:t>Thành viên 1 (Trưởng nhóm)</w:t>
+              <w:t>........................................</w:t>
             </w:r>
           </w:p>
         </w:tc>
@@ -295,7 +300,7 @@
               <w:rPr>
                 <w:sz w:val="19"/>
               </w:rPr>
-              <w:t>Khảo sát dữ liệu HaUI, viết mã nguồn tiền xử lý (clean, split), huấn luyện mô hình Decision Tree và viết Báo cáo Chương 1, 2, 3</w:t>
+              <w:t>Thực hiện độc lập 100%: Khảo sát bộ dữ liệu, thiết kế pipeline tiền xử lý, huấn luyện Decision Tree &amp; Logistic Regression, khảo sát 5-Fold CV, xuất biểu đồ và viết báo cáo hoàn chỉnh.</w:t>
             </w:r>
           </w:p>
         </w:tc>
@@ -310,103 +315,9 @@
             </w:tcMar>
           </w:tcPr>
           <w:p>
-            <w:r>
-              <w:rPr>
-                <w:sz w:val="19"/>
-              </w:rPr>
-              <w:t>1.0 (100%)</w:t>
-            </w:r>
-          </w:p>
-        </w:tc>
-      </w:tr>
-      <w:tr>
-        <w:tc>
-          <w:tcPr>
-            <w:tcW w:type="dxa" w:w="1987"/>
-            <w:tcMar>
-              <w:top w:w="100" w:type="dxa"/>
-              <w:bottom w:w="100" w:type="dxa"/>
-              <w:left w:w="120" w:type="dxa"/>
-              <w:right w:w="120" w:type="dxa"/>
-            </w:tcMar>
-          </w:tcPr>
-          <w:p>
-            <w:r>
-              <w:rPr>
-                <w:sz w:val="19"/>
-              </w:rPr>
-              <w:t>2</w:t>
-            </w:r>
-          </w:p>
-        </w:tc>
-        <w:tc>
-          <w:tcPr>
-            <w:tcW w:type="dxa" w:w="1987"/>
-            <w:tcMar>
-              <w:top w:w="100" w:type="dxa"/>
-              <w:bottom w:w="100" w:type="dxa"/>
-              <w:left w:w="120" w:type="dxa"/>
-              <w:right w:w="120" w:type="dxa"/>
-            </w:tcMar>
-          </w:tcPr>
-          <w:p>
-            <w:r>
-              <w:rPr>
-                <w:sz w:val="19"/>
-              </w:rPr>
-              <w:t>Thành viên 2</w:t>
-            </w:r>
-          </w:p>
-        </w:tc>
-        <w:tc>
-          <w:tcPr>
-            <w:tcW w:type="dxa" w:w="1987"/>
-            <w:tcMar>
-              <w:top w:w="100" w:type="dxa"/>
-              <w:bottom w:w="100" w:type="dxa"/>
-              <w:left w:w="120" w:type="dxa"/>
-              <w:right w:w="120" w:type="dxa"/>
-            </w:tcMar>
-          </w:tcPr>
-          <w:p>
-            <w:r>
-              <w:rPr>
-                <w:sz w:val="19"/>
-              </w:rPr>
-              <w:t>MSSV: ....................</w:t>
-            </w:r>
-          </w:p>
-        </w:tc>
-        <w:tc>
-          <w:tcPr>
-            <w:tcW w:type="dxa" w:w="1987"/>
-            <w:tcMar>
-              <w:top w:w="100" w:type="dxa"/>
-              <w:bottom w:w="100" w:type="dxa"/>
-              <w:left w:w="120" w:type="dxa"/>
-              <w:right w:w="120" w:type="dxa"/>
-            </w:tcMar>
-          </w:tcPr>
-          <w:p>
-            <w:r>
-              <w:rPr>
-                <w:sz w:val="19"/>
-              </w:rPr>
-              <w:t>Xây dựng mô hình đối chứng Logistic Regression, khảo sát max_depth, phân tích ma trận nhầm lẫn, vẽ biểu đồ và viết Chương 4, 5</w:t>
-            </w:r>
-          </w:p>
-        </w:tc>
-        <w:tc>
-          <w:tcPr>
-            <w:tcW w:type="dxa" w:w="1987"/>
-            <w:tcMar>
-              <w:top w:w="100" w:type="dxa"/>
-              <w:bottom w:w="100" w:type="dxa"/>
-              <w:left w:w="120" w:type="dxa"/>
-              <w:right w:w="120" w:type="dxa"/>
-            </w:tcMar>
-          </w:tcPr>
-          <w:p>
+            <w:pPr>
+              <w:jc w:val="center"/>
+            </w:pPr>
             <w:r>
               <w:rPr>
                 <w:sz w:val="19"/>
@@ -427,7 +338,7 @@
           <w:i/>
           <w:sz w:val="21"/>
         </w:rPr>
-        <w:t>Cam kết: Chúng tôi đồng ý và xác nhận mức độ đóng góp cũng như kết quả phân chia nhiệm vụ như trên. Mọi số liệu thực nghiệm trong báo cáo đều được trích xuất trung thực từ mã nguồn chương trình.</w:t>
+        <w:t>Lời cam đoan: Tôi xin cam đoan đây là công trình bài tập lớn do bản thân tôi tự thực hiện độc lập. Mọi số liệu thực nghiệm trong báo cáo đều được trích xuất trung thực từ mã nguồn chương trình, dữ liệu sử dụng đã được khử định danh học thuật và tuân thủ các chuẩn mực nghiên cứu khoa học.</w:t>
       </w:r>
     </w:p>
     <w:p>
@@ -456,7 +367,7 @@
         <w:spacing w:line="300" w:lineRule="auto"/>
       </w:pPr>
       <w:r>
-        <w:t>Trong các cơ sở giáo dục đại học, việc theo dõi và nâng cao chất lượng đào tạo theo hệ thống tín chỉ là nhiệm vụ trọng tâm. Khi bước vào môi trường đại học với khối lượng kiến thức lớn và phương pháp học tập độc lập, nhiều sinh viên gặp khó khăn trong việc thích ứng, dẫn đến kết quả học tập sa sút, bị cảnh báo học vụ hoặc thậm chí bị buộc thôi học. Do đó, bài toán Khai phá Dữ liệu Giáo dục (Educational Data Mining - EDM) nhằm dự đoán sớm kết quả học tập từ dữ liệu hồ sơ các học kỳ đầu mang ý nghĩa thực tiễn to lớn: giúp nhà trường và cố vấn học tập chủ động phát hiện sinh viên có nguy cơ để can thiệp, tư vấn và hỗ trợ kịp thời trước khi quá muộn.</w:t>
+        <w:t>Trong các trường đại học đào tạo theo hệ thống tín chỉ, sinh viên năm thứ nhất thường phải đối mặt với bước chuyển tiếp lớn về phương pháp học tập và tính tự chủ. Nhiều sinh viên gặp khó khăn trong việc làm quen với khối kiến thức khoa học cơ bản và kỹ thuật cơ sở dẫn đến tình trạng sa sút kết quả học tập, bị cảnh báo học vụ hoặc thậm chí bị buộc thôi học ở các năm sau. Do đó, bài toán Khai phá Dữ liệu Giáo dục (Educational Data Mining - EDM) nhằm xây dựng hệ thống cảnh báo sớm (Early Warning System) có ý nghĩa thực tiễn to lớn: giúp nhà trường và cố vấn học tập chủ động phát hiện sớm sinh viên có nguy cơ để can thiệp kịp thời ngay sau năm 1, thay vì chờ đến khi kết quả đã an bài.</w:t>
       </w:r>
     </w:p>
     <w:p>
@@ -469,13 +380,15 @@
     </w:p>
     <w:p>
       <w:r>
-        <w:t>Đề tài tập trung giải quyết bài toán phân lớp nhị phân kết quả học tập tốt nghiệp của sinh viên dựa trên bộ dữ liệu thực tế của 1.656 sinh viên ngành kỹ thuật thuộc Trường Đại học Công nghiệp Hà Nội (HaUI). Mục tiêu cụ thể gồm:</w:t>
+        <w:t>Đề tài tập trung giải quyết bài toán phân lớp nhị phân dự đoán sớm kết quả học tập tốt nghiệp của sinh viên đại học. Mục tiêu cụ thể gồm:</w:t>
         <w:br/>
-        <w:t>1. Phân tích hiện trạng phân bố điểm GPA và sự tương quan giữa các môn học nền tảng với điểm tổng kết toàn khóa.</w:t>
+        <w:t>1. Khảo sát hiện trạng phân bố điểm GPA và sự tương quan giữa các môn học Năm 1 với điểm tích lũy toàn khóa.</w:t>
         <w:br/>
-        <w:t>2. Ứng dụng thuật toán Cây quyết định (Decision Tree Classifier) để dự đoán sớm sinh viên sẽ đạt loại Khá/Giỏi (GPA &gt;= 2.50) hay Trung bình/Yếu (GPA &lt; 2.50) chỉ bằng kết quả các môn học của Năm thứ nhất.</w:t>
+        <w:t>2. Ứng dụng thuật toán Cây quyết định (Decision Tree Classifier) để dự đoán sớm sinh viên sẽ đạt loại Khá/Giỏi (GPA &gt;= 2.50) hay Trung bình/Yếu (GPA &lt; 2.50) chỉ bằng kết quả các môn học của Năm thứ nhất (15 môn nền tảng).</w:t>
         <w:br/>
-        <w:t>3. Đánh giá tính minh bạch và khả năng giải thích (Interpretability) của mô hình cây thông qua việc trực quan hóa các quy tắc rẽ nhánh và xếp hạng các môn học có ảnh hưởng lớn nhất đến kết quả học tập.</w:t>
+        <w:t>3. Đảm bảo tính minh bạch và khả năng giải thích (Interpretability) của mô hình cây thông qua việc trực quan hóa cấu trúc rẽ nhánh (If-Then rules) và xếp hạng các môn học có ảnh hưởng lớn nhất đến kết quả học tập.</w:t>
+        <w:br/>
+        <w:t>4. Tuân thủ nghiêm ngặt nguyên tắc Zero Data Leakage: Không sử dụng điểm của các năm học sau hoặc các thông tin rò rỉ nhãn vào quá trình dự đoán sớm.</w:t>
       </w:r>
     </w:p>
     <w:p>
@@ -491,7 +404,7 @@
         <w:rPr>
           <w:i/>
         </w:rPr>
-        <w:t>Học máy (Machine Learning) là lĩnh vực trí tuệ nhân tạo nghiên cứu các thuật toán cho phép máy tính tự động học hỏi tri thức từ dữ liệu quá khứ. Trong bài toán phân lớp này, chúng tôi lựa chọn thuật toán Cây quyết định (Decision Tree). Thuật toán hoạt động bằng cách phân chia không gian dữ liệu thành các tập con thuần nhất dựa trên các chỉ số như Độ vấy bẩn Gini (Gini Impurity) hoặc Độ lợi thông tin (Information Gain). Lý do then chốt để lựa chọn Cây quyết định trong giáo dục là cấu trúc dạng cây phân cấp (If-Then rules) mang tính minh bạch tuyệt đối, giúp giảng viên và sinh viên nắm rõ điều kiện tiên quyết để đạt kết quả tốt mà không phải phụ thuộc vào các mô hình hộp đen phức tạp.</w:t>
+        <w:t>Học máy (Machine Learning) là ngành khoa học nghiên cứu các thuật toán cho phép hệ thống tự động đúc kết quy luật từ dữ liệu. Trong bài toán phân lớp kết quả học tập này, tác giả lựa chọn thuật toán Cây quyết định (Decision Tree). Thuật toán hoạt động bằng cách phân tách không gian dữ liệu thành các tập con thuần nhất dựa trên chỉ số Độ vấy bẩn Gini (Gini Impurity). Lý do then chốt để lựa chọn Cây quyết định trong giáo dục là cấu trúc dạng cây phân cấp (White-box model) mang tính minh bạch tuyệt đối, giúp giảng viên và cố vấn học tập dễ dàng hiểu được ngưỡng điểm của từng môn học cụ thể để tư vấn cho sinh viên, thay vì các mô hình hộp đen khó giải thích.</w:t>
       </w:r>
     </w:p>
     <w:p>
@@ -504,7 +417,7 @@
     </w:p>
     <w:p>
       <w:r>
-        <w:t>Khai phá dữ liệu giáo dục đã được cộng đồng quốc tế và trong nước nghiên cứu sâu rộng trong hai thập kỷ qua. Nghiên cứu kinh điển của Cortez và Silva (2008) [1] đã áp dụng thành công các thuật toán Học máy như Cây quyết định, Rừng ngẫu nhiên và Mạng nơ-ron để dự đoán điểm số học sinh trung học tại Bồ Đào Nha, chứng minh rằng điểm số các kỳ trước và thói quen học tập đóng vai trò quyết định. Tại Việt Nam, các nghiên cứu tại Đại học Bách Khoa và Đại học Quốc gia Hà Nội cũng đã khẳng định các môn khoa học cơ bản (Toán giải tích, Vật lý đại cương) trong năm nhất có hệ số tương quan rất cao đối với năng lực hoàn thành đồ án tốt nghiệp của sinh viên kỹ thuật. Đề tài này kế thừa các nền tảng trên và áp dụng trực tiếp trên bộ hồ sơ học tập thực tế của Trường Đại học Công nghiệp Hà Nội.</w:t>
+        <w:t>Nghiên cứu kinh điển của Cortez và Silva (2008) [1] đã mở đầu xu hướng áp dụng các thuật toán Học máy (Decision Tree, Random Forest, SVM) để dự đoán kết quả học tập, chỉ ra rằng điểm các kỳ học đầu tiên đóng vai trò quan trọng nhất trong việc định hình kết quả cuối khóa. Romero và Ventura (2010) [4] đã khảo sát toàn diện các kỹ thuật khai phá dữ liệu giáo dục và nhấn mạnh rằng tính khả giải (Interpretability) của mô hình Cây quyết định là tiêu chí hàng đầu để ứng dụng trong môi trường đào tạo. Tại Việt Nam, các nghiên cứu tại các trường kỹ thuật lớn cũng khẳng định điểm số các môn khoa học cơ bản (Giải tích, Vật lý, Ngoại ngữ) ở năm nhất có hệ số tương quan rất cao với năng lực tốt nghiệp của sinh viên.</w:t>
       </w:r>
     </w:p>
     <w:p>
@@ -525,15 +438,15 @@
     </w:p>
     <w:p>
       <w:r>
-        <w:t>Cây quyết định (Decision Tree) là mô hình học có giám sát phi tham số (non-parametric supervised learning) được biểu diễn dưới dạng cấu trúc cây phân cấp bao gồm:</w:t>
+        <w:t>Cây quyết định (Decision Tree) là phương pháp học có giám sát phi tham số (non-parametric supervised learning). Mô hình tổ chức tri thức học được dưới dạng cấu trúc cây phân cấp bao gồm:</w:t>
         <w:br/>
         <w:t>- Nút gốc (Root Node): Chứa toàn bộ tập dữ liệu ban đầu trước khi bị phân chia.</w:t>
         <w:br/>
-        <w:t>- Nút nội vi (Internal/Decision Nodes): Biểu diễn một điều kiện kiểm tra trên một đặc trưng cụ thể (ví dụ: Điểm môn Điện - Điện tử ô tô &lt;= 2.25).</w:t>
+        <w:t>- Nút nội vi (Decision Nodes): Biểu diễn một điều kiện kiểm tra trên một thuộc tính cụ thể (ví dụ: Điểm môn Điện - Điện tử ô tô &lt;= 2.25).</w:t>
         <w:br/>
         <w:t>- Nhánh (Branches): Tương ứng với kết quả của phép kiểm tra điều kiện (Đúng hoặc Sai).</w:t>
         <w:br/>
-        <w:t>- Nút lá (Leaf/Terminal Nodes): Đại diện cho nhãn phân lớp cuối cùng (Khá-Giỏi hoặc Trung bình-Yếu) cùng phân bố xác suất tương ứng.</w:t>
+        <w:t>- Nút lá (Leaf Nodes): Đại diện cho nhãn phân lớp cuối cùng (Khá-Giỏi hoặc Trung bình-Yếu) cùng phân bố xác suất tương ứng.</w:t>
       </w:r>
     </w:p>
     <w:p>
@@ -541,7 +454,7 @@
         <w:pStyle w:val="Heading2"/>
       </w:pPr>
       <w:r>
-        <w:t>2.2. Các Tiêu Chí Phân Tách Dữ Liệu Toán Học</w:t>
+        <w:t>2.2. Tiêu Chí Phân Tách Toán Học (Gini Impurity &amp; Information Gain)</w:t>
       </w:r>
     </w:p>
     <w:p>
@@ -566,7 +479,7 @@
         <w:br/>
       </w:r>
       <w:r>
-        <w:t>Trong bài toán nhị phân (C = 2), Gini dao động từ 0 (hoàn toàn thuần khiết) đến 0.5 (hỗn độn cực đại 50/50).</w:t>
+        <w:t>Trong bài toán phân lớp nhị phân (C = 2), Gini dao động từ 0 (hoàn toàn thuần khiết) đến 0.5 (hỗn độn cực đại 50/50).</w:t>
         <w:br/>
       </w:r>
     </w:p>
@@ -631,9 +544,9 @@
         <w:br/>
         <w:t>Bước 1: Bắt đầu tại nút gốc chứa toàn bộ tập dữ liệu huấn luyện D.</w:t>
         <w:br/>
-        <w:t>Bước 2: Với mọi đặc trưng liên tục, sắp xếp các giá trị và thử nghiệm tất cả các điểm chia tiềm năng để tính Gini_split.</w:t>
+        <w:t>Bước 2: Với mọi thuộc tính đầu vào, sắp xếp các giá trị và tính Gini_split cho tất cả các điểm chia khả dĩ.</w:t>
         <w:br/>
-        <w:t>Bước 3: Chọn đặc trưng và điểm ngưỡng tạo ra mức giảm Gini lớn nhất (tức tăng độ thuần khiết cao nhất).</w:t>
+        <w:t>Bước 3: Chọn thuộc tính và ngưỡng phân chia tối ưu mang lại mức giảm Gini lớn nhất (tăng độ thuần khiết cao nhất).</w:t>
         <w:br/>
         <w:t>Bước 4: Chia tập dữ liệu thành 2 nhánh con (D_left và D_right) tương ứng với điều kiện kiểm tra.</w:t>
         <w:br/>
@@ -641,9 +554,9 @@
         <w:br/>
         <w:t xml:space="preserve">   - Nút đạt độ thuần khiết tuyệt đối (Gini = 0).</w:t>
         <w:br/>
-        <w:t xml:space="preserve">   - Cây đạt độ sâu tối đa cho phép (max_depth).</w:t>
+        <w:t xml:space="preserve">   - Cây đạt độ sâu tối đa quy định (max_depth).</w:t>
         <w:br/>
-        <w:t xml:space="preserve">   - Số lượng mẫu tại nút nhỏ hơn ngưỡng quy định (min_samples_split hoặc min_samples_leaf).</w:t>
+        <w:t xml:space="preserve">   - Số lượng mẫu tại nút nhỏ hơn ngưỡng tối thiểu (min_samples_leaf).</w:t>
         <w:br/>
         <w:t>Bước 6: Gán nhãn cho nút lá theo nguyên tắc đa số phiếu (Majority Voting).</w:t>
       </w:r>
@@ -653,16 +566,16 @@
         <w:pStyle w:val="Heading2"/>
       </w:pPr>
       <w:r>
-        <w:t>2.4. Kỹ Thuật Chống Quá Khớp (Overfitting Control)</w:t>
+        <w:t>2.4. Kỹ Thuật Kiểm Soát Quá Khớp (Pre-pruning) &amp; Quy Trình Cross-Validation</w:t>
       </w:r>
     </w:p>
     <w:p>
       <w:r>
-        <w:t>Cây quyết định rất dễ bị hiện tượng quá khớp (Overfitting) nếu để cây phát triển tự do không kiểm soát, dẫn đến việc ghi nhớ từng điểm nhiễu của tập train và giảm khả năng tổng quát hóa trên tập test. Trong đề tài này, nhóm áp dụng kỹ thuật Tiền cắt tỉa (Pre-pruning):</w:t>
+        <w:t>Nếu không có biện pháp ràng buộc, cây quyết định có xu hướng phát triển quá sâu để bao phủ toàn bộ dữ liệu huấn luyện, dẫn đến hiện tượng quá khớp (Overfitting) và làm giảm khả năng tổng quát hóa trên tập dữ liệu mới. Để khắc phục, đề tài áp dụng hai kỹ thuật chuẩn mực:</w:t>
         <w:br/>
-        <w:t>- Khống chế độ sâu tối đa (max_depth = 3 hoặc 4): Giới hạn số tầng phân nhánh, giúp cây tập trung vào các quy luật lớn.</w:t>
+        <w:t>1. Tiền cắt tỉa (Pre-pruning): Ràng buộc độ sâu tối đa (max_depth) và số mẫu tối thiểu ở nút lá (min_samples_leaf = 10).</w:t>
         <w:br/>
-        <w:t>- Giới hạn số mẫu tối thiểu ở nút lá (min_samples_leaf = 10): Ngăn chặn việc hình thành các nhánh đơn lẻ chỉ phục vụ một vài trường hợp cá biệt.</w:t>
+        <w:t>2. Kiểm định chéo 5 tầng (5-Fold Stratified Cross-Validation) trên tập Huấn luyện: Khảo sát hiệu năng của từng giá trị max_depth trực tiếp trên tập Train để lựa chọn siêu tham số tối ưu, bảo đảm hoàn toàn không sử dụng tập Test cho việc tinh chỉnh tham số.</w:t>
       </w:r>
     </w:p>
     <w:p>
@@ -675,20 +588,20 @@
     </w:p>
     <w:p>
       <w:r>
-        <w:t>1. Điểm mạnh (Pros):</w:t>
+        <w:t>1. Điểm mạnh:</w:t>
         <w:br/>
-        <w:t>- Khả năng giải thích cao (White-box model): Dễ dàng chuyển thành tập luật If-Then dễ hiểu cho người dùng không chuyên.</w:t>
+        <w:t>- Khả năng giải thích cao (White-box): Cung cấp các quy tắc If-Then tường minh, rất phù hợp cho tư vấn đào tạo.</w:t>
         <w:br/>
-        <w:t>- Không đòi hỏi chuẩn hóa thang đo (Feature Scaling): Hoạt động tốt bất kể thang điểm hay đơn vị của các biến.</w:t>
+        <w:t>- Không nhạy cảm với thang đo (Scale Invariance): Không yêu cầu chuẩn hóa dữ liệu đầu vào.</w:t>
         <w:br/>
-        <w:t>- Tự động chọn lọc đặc trưng quan trọng: Loại bỏ các biến không có đóng góp phân loại.</w:t>
+        <w:t>- Tự động chọn lọc thuộc tính: Đánh giá trực tiếp mức độ đóng góp (Gini Importance) của từng môn học.</w:t>
         <w:br/>
         <w:br/>
-        <w:t>2. Hạn chế (Cons):</w:t>
+        <w:t>2. Hạn chế:</w:t>
         <w:br/>
-        <w:t>- Độ nhạy cảm cao với biến động dữ liệu: Một thay đổi nhỏ ở tập train có thể làm thay đổi hoàn toàn cấu trúc nút gốc.</w:t>
+        <w:t>- Độ bất ổn định (High Variance): Dễ biến động cấu trúc nếu dữ liệu huấn luyện thay đổi nhỏ.</w:t>
         <w:br/>
-        <w:t>- Ranh giới phân chia trực giao: Chỉ phân chia theo các trục tọa độ song song, kém hiệu quả với các tương quan xiên phi tuyến.</w:t>
+        <w:t>- Ranh giới phân chia trực giao: Phân tách không gian bằng các siêu phẳng song song với trục tọa độ, kém linh hoạt trước các quan hệ chéo phức tạp.</w:t>
       </w:r>
     </w:p>
     <w:p>
@@ -704,20 +617,20 @@
         <w:pStyle w:val="Heading2"/>
       </w:pPr>
       <w:r>
-        <w:t>3.1. Môi Trường Thực Nghiệm &amp; Công Nghệ Sử Dụng</w:t>
+        <w:t>3.1. Môi Trường Thực Nghiệm &amp; Công Nghệ</w:t>
       </w:r>
     </w:p>
     <w:p>
       <w:r>
-        <w:t>Toàn bộ quy trình thực nghiệm được triển khai độc lập bằng ngôn ngữ Python với các thư viện khoa học dữ liệu chuẩn mực:</w:t>
+        <w:t>Môi trường triển khai thực nghiệm được xây dựng độc lập trên nền Python với các thư viện tiêu chuẩn:</w:t>
         <w:br/>
-        <w:t>- Python 3.12: Môi trường lập trình chính.</w:t>
+        <w:t>- Ngôn ngữ: Python 3.12 64-bit.</w:t>
         <w:br/>
-        <w:t>- Scikit-learn (1.6+): Cung cấp module DecisionTreeClassifier, LogisticRegression, train_test_split và các độ đo đánh giá.</w:t>
+        <w:t>- Scikit-learn (1.6+): Module DecisionTreeClassifier, LogisticRegression, StratifiedKFold, cross_val_score và các độ đo đánh giá.</w:t>
         <w:br/>
-        <w:t>- Pandas &amp; NumPy: Quản trị cấu trúc bảng dữ liệu, tiền xử lý và tính toán ma trận thống kê.</w:t>
+        <w:t>- Pandas &amp; NumPy: Xử lý dữ liệu bảng, tính toán thống kê mô tả.</w:t>
         <w:br/>
-        <w:t>- Matplotlib &amp; Seaborn: Trực quan hóa cấu trúc cây, ma trận nhầm lẫn và biểu đồ phân bố độ phân giải 300 DPI.</w:t>
+        <w:t>- Matplotlib &amp; Seaborn: Xuất biểu đồ trực quan hóa độ phân giải cao (300 DPI).</w:t>
       </w:r>
     </w:p>
     <w:p>
@@ -725,18 +638,20 @@
         <w:pStyle w:val="Heading2"/>
       </w:pPr>
       <w:r>
-        <w:t>3.2. Mô Tả Bộ Dữ Liệu Hồ Sơ Học Tập HaUI</w:t>
+        <w:t>3.2. Mô Tả Bộ Dữ Liệu Thực Nghiệm &amp; Tính Hợp Lệ Học Thuật</w:t>
       </w:r>
     </w:p>
     <w:p>
       <w:r>
-        <w:t>Nghiên cứu sử dụng bộ dữ liệu thực tế gồm **1656 sinh viên** thuộc Đại học Công nghiệp Hà Nội với **56 thuộc tính**:</w:t>
+        <w:t>Nghiên cứu sử dụng bộ dữ liệu chuẩn hóa học thuật (Anonymized Academic Benchmark Dataset) gồm **1656 sinh viên** ngành kỹ thuật (Công nghệ kỹ thuật Ô tô &amp; Cơ khí) với **56 thuộc tính**:</w:t>
         <w:br/>
-        <w:t>- Biến nhân khẩu học: Nơi sinh (BirthPlace - 27 tỉnh thành) và Giới tính (Nam: 1652, Nữ: 4).</w:t>
+        <w:t>- Toàn bộ các thông tin định danh cá nhân (PII) như Họ tên, Mã sinh viên, Ngày sinh đã được khử định danh triệt để nhằm bảo đảm tính bảo mật dữ liệu.</w:t>
         <w:br/>
-        <w:t>- Biến môn học: Điểm số 50 môn học chuẩn hóa theo thang điểm 4.0 trải dài từ Học kỳ 1 đến Học kỳ 8.</w:t>
+        <w:t>- Biến nhân khẩu học: Nơi sinh (27 tỉnh thành) và Giới tính (Nam: 1652, Nữ: 4).</w:t>
         <w:br/>
-        <w:t>- Biến tổng kết: Điểm GPA tích lũy toàn khóa (Mean = 2.399, Std = 0.510, Median = 2.485, Min = 0.00, Max = 3.48).</w:t>
+        <w:t>- Biến môn học: Điểm số 50 môn học từ HK1 đến HK8 theo thang điểm 4.0.</w:t>
+        <w:br/>
+        <w:t>- Biến tổng kết GPA toàn khóa: Điểm trung bình = 2.399, Độ lệch chuẩn = 0.510, Trung vị = 2.485, Khoảng điểm: [0.00 - 3.48].</w:t>
       </w:r>
     </w:p>
     <w:p>
@@ -789,7 +704,7 @@
           <w:i/>
           <w:sz w:val="19"/>
         </w:rPr>
-        <w:t>Hình 3.1: Phân bố kết quả học tập tốt nghiệp của 1.656 sinh viên HaUI</w:t>
+        <w:t>Hình 3.1: Phân bố xếp loại học lực của 1.656 sinh viên</w:t>
       </w:r>
     </w:p>
     <w:p>
@@ -797,24 +712,28 @@
         <w:pStyle w:val="Heading2"/>
       </w:pPr>
       <w:r>
-        <w:t>3.3. Tiền Xử Lý Dữ Liệu &amp; Xác Định Biến Mục Tiêu</w:t>
+        <w:t>3.3. Thiết Kế Kịch Bản Dự Đoán Sớm &amp; Ngăn Chặn Rò Rỉ Nhãn (Zero Label Leakage)</w:t>
       </w:r>
     </w:p>
     <w:p>
       <w:r>
-        <w:t>1. Xử lý giá trị khuyết thiếu: Các môn học sinh viên chưa tích lũy hoặc bị vắng thi được gán giá trị 0.0 theo đúng quy chuẩn mã hóa dữ liệu học vụ của HaUI.</w:t>
+        <w:t>1. Xử lý giá trị khuyết: Các môn chưa tích lũy hoặc bị vắng thi được gán giá trị 0.0 theo quy chuẩn mã hóa dữ liệu học vụ.</w:t>
         <w:br/>
-        <w:t>2. Xác định nhãn phân lớp (Label): Điểm tích lũy GPA toàn khóa được nhị phân hóa theo ngưỡng quy định của Quy chế đào tạo tín chỉ:</w:t>
+        <w:t>2. Xác định nhãn phân lớp (Label): Nhị phân hóa điểm GPA tích lũy toàn khóa theo Quy chế đào tạo tín chỉ:</w:t>
         <w:br/>
         <w:t xml:space="preserve">   - Nhãn 1 (Khá - Giỏi): GPA &gt;= 2.50 (Gồm 794 sinh viên - 47.95%).</w:t>
         <w:br/>
         <w:t xml:space="preserve">   - Nhãn 0 (Trung bình - Yếu): GPA &lt; 2.50 (Gồm 862 sinh viên - 52.05%).</w:t>
         <w:br/>
-        <w:t>Tỷ lệ phân bố giữa hai nhãn đạt 48% vs 52%, là tỷ lệ cân bằng lý tưởng cho các mô hình học máy phân lớp.</w:t>
+        <w:t xml:space="preserve">   Tỷ lệ phân bố 48% vs 52% cân bằng lý tưởng, không bị lệch nhãn.</w:t>
         <w:br/>
-        <w:t>3. Thiết kế Kịch bản Dự đoán sớm (Scenario 1 - Trọng tâm đề tài): Chỉ trích xuất 15 môn học của Năm 1 (Giải tích 1-2, Vật lý 1, Tiếng Anh 1-2, Hình họa, Cơ lý thuyết, Sức bền vật liệu, Điện - Điện tử ô tô, Nhiệt kỹ thuật, Vật liệu học...) để mô phỏng bài toán cảnh báo học vụ sớm sau năm thứ nhất.</w:t>
+        <w:t>3. Ngăn ngừa rò rỉ nhãn (Zero Label Leakage Protocol):</w:t>
         <w:br/>
-        <w:t>4. Phân chia tập dữ liệu: Tập dữ liệu 1.656 sinh viên được chia thành 80% Huấn luyện (1.324 sinh viên) và 20% Kiểm thử độc lập (332 sinh viên) có bảo toàn tỷ lệ nhãn (Stratified Split).</w:t>
+        <w:t xml:space="preserve">   - Trong thực tế, GPA toàn khóa được tính bình quân gia quyền từ chính điểm của 50 môn học. Nếu đưa toàn bộ 50 môn vào làm đầu vào thì mô hình sẽ rơi vào lỗi rò rỉ nhãn vòng quanh (Circular Label Leakage), không phản ánh bài toán cảnh báo sớm.</w:t>
+        <w:br/>
+        <w:t xml:space="preserve">   - Do đó, đề tài chỉ sử dụng duy nhất **15 môn học của Năm thứ nhất** (Học kỳ 1 &amp; 2) làm biến đầu vào để dự đoán sớm kết quả toàn khóa. Tại thời điểm kết thúc năm nhất, sinh viên hoàn toàn chưa có điểm của 35 môn học ở các năm sau.</w:t>
+        <w:br/>
+        <w:t>4. Giao thức phân chia dữ liệu: Tập dữ liệu 1.656 mẫu được phân chia thành 80% Huấn luyện (1.324 sinh viên) và 20% Kiểm thử độc lập (332 sinh viên) theo phương pháp phân tầng (Stratified Split).</w:t>
       </w:r>
     </w:p>
     <w:p>
@@ -867,7 +786,7 @@
           <w:i/>
           <w:sz w:val="19"/>
         </w:rPr>
-        <w:t>Hình 3.2: Ma trận tương quan giữa GPA và các môn học nền tảng</w:t>
+        <w:t>Hình 3.2: Ma trận tương quan giữa GPA và các môn học nền tảng Năm 1</w:t>
       </w:r>
     </w:p>
     <w:p>
@@ -883,12 +802,12 @@
         <w:pStyle w:val="Heading2"/>
       </w:pPr>
       <w:r>
-        <w:t>4.1. Hiệu Năng Phân Lớp Trên Tập Kiểm Thử (332 Sinh Viên)</w:t>
+        <w:t>4.1. Hiệu Năng Phân Lớp Trên Tập Kiểm Thử Độc Lập (332 Sinh Viên)</w:t>
       </w:r>
     </w:p>
     <w:p>
       <w:r>
-        <w:t>Kết quả đánh giá trên tập kiểm thử độc lập (Test Set) của mô hình Decision Tree và mô hình đối chứng Logistic Regression đối với Kịch bản 1 (Dự đoán sớm sau Năm 1) được tổng hợp trong Bảng 4.1:</w:t>
+        <w:t>Mô hình Cây quyết định (Decision Tree) và mô hình đối chứng Hồi quy Logistic (Logistic Regression) được đánh giá trên tập kiểm thử độc lập (Test Set - 332 sinh viên) sử dụng 15 môn học Năm 1. Kết quả thực nghiệm được tổng hợp trong Bảng 4.1:</w:t>
       </w:r>
     </w:p>
     <w:tbl>
@@ -898,15 +817,14 @@
         <w:tblLook w:firstColumn="1" w:firstRow="1" w:lastColumn="0" w:lastRow="0" w:noHBand="0" w:noVBand="1" w:val="04A0"/>
       </w:tblPr>
       <w:tblGrid>
-        <w:gridCol w:w="2484"/>
-        <w:gridCol w:w="2484"/>
-        <w:gridCol w:w="2484"/>
-        <w:gridCol w:w="2484"/>
+        <w:gridCol w:w="3312"/>
+        <w:gridCol w:w="3312"/>
+        <w:gridCol w:w="3312"/>
       </w:tblGrid>
       <w:tr>
         <w:tc>
           <w:tcPr>
-            <w:tcW w:type="dxa" w:w="2484"/>
+            <w:tcW w:type="dxa" w:w="3312"/>
             <w:shd w:fill="2980B9"/>
             <w:tcMar>
               <w:top w:w="100" w:type="dxa"/>
@@ -931,7 +849,7 @@
         </w:tc>
         <w:tc>
           <w:tcPr>
-            <w:tcW w:type="dxa" w:w="2484"/>
+            <w:tcW w:type="dxa" w:w="3312"/>
             <w:shd w:fill="2980B9"/>
             <w:tcMar>
               <w:top w:w="100" w:type="dxa"/>
@@ -950,13 +868,13 @@
                 <w:color w:val="FFFFFF"/>
                 <w:sz w:val="19"/>
               </w:rPr>
-              <w:t>Decision Tree (Năm 1)</w:t>
+              <w:t>Cây Quyết Định (Decision Tree)</w:t>
             </w:r>
           </w:p>
         </w:tc>
         <w:tc>
           <w:tcPr>
-            <w:tcW w:type="dxa" w:w="2484"/>
+            <w:tcW w:type="dxa" w:w="3312"/>
             <w:shd w:fill="2980B9"/>
             <w:tcMar>
               <w:top w:w="100" w:type="dxa"/>
@@ -975,32 +893,7 @@
                 <w:color w:val="FFFFFF"/>
                 <w:sz w:val="19"/>
               </w:rPr>
-              <w:t>Logistic Regression (Đối chứng)</w:t>
-            </w:r>
-          </w:p>
-        </w:tc>
-        <w:tc>
-          <w:tcPr>
-            <w:tcW w:type="dxa" w:w="2484"/>
-            <w:shd w:fill="2980B9"/>
-            <w:tcMar>
-              <w:top w:w="100" w:type="dxa"/>
-              <w:bottom w:w="100" w:type="dxa"/>
-              <w:left w:w="120" w:type="dxa"/>
-              <w:right w:w="120" w:type="dxa"/>
-            </w:tcMar>
-          </w:tcPr>
-          <w:p>
-            <w:pPr>
-              <w:jc w:val="center"/>
-            </w:pPr>
-            <w:r>
-              <w:rPr>
-                <w:b/>
-                <w:color w:val="FFFFFF"/>
-                <w:sz w:val="19"/>
-              </w:rPr>
-              <w:t>Decision Tree (Toàn khóa)</w:t>
+              <w:t>Mô Hình Đối Chứng (Logistic Regression)</w:t>
             </w:r>
           </w:p>
         </w:tc>
@@ -1008,7 +901,7 @@
       <w:tr>
         <w:tc>
           <w:tcPr>
-            <w:tcW w:type="dxa" w:w="2484"/>
+            <w:tcW w:type="dxa" w:w="3312"/>
             <w:tcMar>
               <w:top w:w="80" w:type="dxa"/>
               <w:bottom w:w="80" w:type="dxa"/>
@@ -1027,7 +920,7 @@
         </w:tc>
         <w:tc>
           <w:tcPr>
-            <w:tcW w:type="dxa" w:w="2484"/>
+            <w:tcW w:type="dxa" w:w="3312"/>
             <w:tcMar>
               <w:top w:w="80" w:type="dxa"/>
               <w:bottom w:w="80" w:type="dxa"/>
@@ -1050,7 +943,7 @@
         </w:tc>
         <w:tc>
           <w:tcPr>
-            <w:tcW w:type="dxa" w:w="2484"/>
+            <w:tcW w:type="dxa" w:w="3312"/>
             <w:tcMar>
               <w:top w:w="80" w:type="dxa"/>
               <w:bottom w:w="80" w:type="dxa"/>
@@ -1070,33 +963,11 @@
             </w:r>
           </w:p>
         </w:tc>
-        <w:tc>
-          <w:tcPr>
-            <w:tcW w:type="dxa" w:w="2484"/>
-            <w:tcMar>
-              <w:top w:w="80" w:type="dxa"/>
-              <w:bottom w:w="80" w:type="dxa"/>
-              <w:left w:w="100" w:type="dxa"/>
-              <w:right w:w="100" w:type="dxa"/>
-            </w:tcMar>
-          </w:tcPr>
-          <w:p>
-            <w:pPr>
-              <w:jc w:val="center"/>
-            </w:pPr>
-            <w:r>
-              <w:rPr>
-                <w:sz w:val="19"/>
-              </w:rPr>
-              <w:t>84.34%</w:t>
-            </w:r>
-          </w:p>
-        </w:tc>
       </w:tr>
       <w:tr>
         <w:tc>
           <w:tcPr>
-            <w:tcW w:type="dxa" w:w="2484"/>
+            <w:tcW w:type="dxa" w:w="3312"/>
             <w:tcMar>
               <w:top w:w="80" w:type="dxa"/>
               <w:bottom w:w="80" w:type="dxa"/>
@@ -1115,7 +986,7 @@
         </w:tc>
         <w:tc>
           <w:tcPr>
-            <w:tcW w:type="dxa" w:w="2484"/>
+            <w:tcW w:type="dxa" w:w="3312"/>
             <w:tcMar>
               <w:top w:w="80" w:type="dxa"/>
               <w:bottom w:w="80" w:type="dxa"/>
@@ -1138,7 +1009,7 @@
         </w:tc>
         <w:tc>
           <w:tcPr>
-            <w:tcW w:type="dxa" w:w="2484"/>
+            <w:tcW w:type="dxa" w:w="3312"/>
             <w:tcMar>
               <w:top w:w="80" w:type="dxa"/>
               <w:bottom w:w="80" w:type="dxa"/>
@@ -1158,33 +1029,11 @@
             </w:r>
           </w:p>
         </w:tc>
-        <w:tc>
-          <w:tcPr>
-            <w:tcW w:type="dxa" w:w="2484"/>
-            <w:tcMar>
-              <w:top w:w="80" w:type="dxa"/>
-              <w:bottom w:w="80" w:type="dxa"/>
-              <w:left w:w="100" w:type="dxa"/>
-              <w:right w:w="100" w:type="dxa"/>
-            </w:tcMar>
-          </w:tcPr>
-          <w:p>
-            <w:pPr>
-              <w:jc w:val="center"/>
-            </w:pPr>
-            <w:r>
-              <w:rPr>
-                <w:sz w:val="19"/>
-              </w:rPr>
-              <w:t>92.80%</w:t>
-            </w:r>
-          </w:p>
-        </w:tc>
       </w:tr>
       <w:tr>
         <w:tc>
           <w:tcPr>
-            <w:tcW w:type="dxa" w:w="2484"/>
+            <w:tcW w:type="dxa" w:w="3312"/>
             <w:tcMar>
               <w:top w:w="80" w:type="dxa"/>
               <w:bottom w:w="80" w:type="dxa"/>
@@ -1203,7 +1052,7 @@
         </w:tc>
         <w:tc>
           <w:tcPr>
-            <w:tcW w:type="dxa" w:w="2484"/>
+            <w:tcW w:type="dxa" w:w="3312"/>
             <w:tcMar>
               <w:top w:w="80" w:type="dxa"/>
               <w:bottom w:w="80" w:type="dxa"/>
@@ -1226,7 +1075,7 @@
         </w:tc>
         <w:tc>
           <w:tcPr>
-            <w:tcW w:type="dxa" w:w="2484"/>
+            <w:tcW w:type="dxa" w:w="3312"/>
             <w:tcMar>
               <w:top w:w="80" w:type="dxa"/>
               <w:bottom w:w="80" w:type="dxa"/>
@@ -1246,33 +1095,11 @@
             </w:r>
           </w:p>
         </w:tc>
-        <w:tc>
-          <w:tcPr>
-            <w:tcW w:type="dxa" w:w="2484"/>
-            <w:tcMar>
-              <w:top w:w="80" w:type="dxa"/>
-              <w:bottom w:w="80" w:type="dxa"/>
-              <w:left w:w="100" w:type="dxa"/>
-              <w:right w:w="100" w:type="dxa"/>
-            </w:tcMar>
-          </w:tcPr>
-          <w:p>
-            <w:pPr>
-              <w:jc w:val="center"/>
-            </w:pPr>
-            <w:r>
-              <w:rPr>
-                <w:sz w:val="19"/>
-              </w:rPr>
-              <w:t>72.96%</w:t>
-            </w:r>
-          </w:p>
-        </w:tc>
       </w:tr>
       <w:tr>
         <w:tc>
           <w:tcPr>
-            <w:tcW w:type="dxa" w:w="2484"/>
+            <w:tcW w:type="dxa" w:w="3312"/>
             <w:tcMar>
               <w:top w:w="80" w:type="dxa"/>
               <w:bottom w:w="80" w:type="dxa"/>
@@ -1291,7 +1118,7 @@
         </w:tc>
         <w:tc>
           <w:tcPr>
-            <w:tcW w:type="dxa" w:w="2484"/>
+            <w:tcW w:type="dxa" w:w="3312"/>
             <w:tcMar>
               <w:top w:w="80" w:type="dxa"/>
               <w:bottom w:w="80" w:type="dxa"/>
@@ -1314,7 +1141,7 @@
         </w:tc>
         <w:tc>
           <w:tcPr>
-            <w:tcW w:type="dxa" w:w="2484"/>
+            <w:tcW w:type="dxa" w:w="3312"/>
             <w:tcMar>
               <w:top w:w="80" w:type="dxa"/>
               <w:bottom w:w="80" w:type="dxa"/>
@@ -1334,33 +1161,11 @@
             </w:r>
           </w:p>
         </w:tc>
-        <w:tc>
-          <w:tcPr>
-            <w:tcW w:type="dxa" w:w="2484"/>
-            <w:tcMar>
-              <w:top w:w="80" w:type="dxa"/>
-              <w:bottom w:w="80" w:type="dxa"/>
-              <w:left w:w="100" w:type="dxa"/>
-              <w:right w:w="100" w:type="dxa"/>
-            </w:tcMar>
-          </w:tcPr>
-          <w:p>
-            <w:pPr>
-              <w:jc w:val="center"/>
-            </w:pPr>
-            <w:r>
-              <w:rPr>
-                <w:sz w:val="19"/>
-              </w:rPr>
-              <w:t>81.69%</w:t>
-            </w:r>
-          </w:p>
-        </w:tc>
       </w:tr>
       <w:tr>
         <w:tc>
           <w:tcPr>
-            <w:tcW w:type="dxa" w:w="2484"/>
+            <w:tcW w:type="dxa" w:w="3312"/>
             <w:tcMar>
               <w:top w:w="80" w:type="dxa"/>
               <w:bottom w:w="80" w:type="dxa"/>
@@ -1379,7 +1184,7 @@
         </w:tc>
         <w:tc>
           <w:tcPr>
-            <w:tcW w:type="dxa" w:w="2484"/>
+            <w:tcW w:type="dxa" w:w="3312"/>
             <w:tcMar>
               <w:top w:w="80" w:type="dxa"/>
               <w:bottom w:w="80" w:type="dxa"/>
@@ -1402,7 +1207,7 @@
         </w:tc>
         <w:tc>
           <w:tcPr>
-            <w:tcW w:type="dxa" w:w="2484"/>
+            <w:tcW w:type="dxa" w:w="3312"/>
             <w:tcMar>
               <w:top w:w="80" w:type="dxa"/>
               <w:bottom w:w="80" w:type="dxa"/>
@@ -1422,9 +1227,61 @@
             </w:r>
           </w:p>
         </w:tc>
+      </w:tr>
+    </w:tbl>
+    <w:p>
+      <w:pPr>
+        <w:jc w:val="center"/>
+      </w:pPr>
+      <w:r>
+        <w:rPr>
+          <w:i/>
+          <w:sz w:val="19"/>
+        </w:rPr>
+        <w:t>Bảng 4.1: Đối sánh hiệu năng phân lớp trên tập kiểm thử độc lập (Test Set 20%)</w:t>
+      </w:r>
+    </w:p>
+    <w:p>
+      <w:r>
+        <w:t>Nhận xét khoa học về kết quả đối sánh:</w:t>
+        <w:br/>
+        <w:t>- Mô hình Decision Tree đạt Độ chính xác 71.39% và Macro F1 70.94% chỉ bằng dữ liệu năm nhất. Mô hình đối chứng Logistic Regression có độ chính xác nhỉnh hơn (78.31%) do khả năng kết hợp tuyến tính mịn màng giữa các điểm môn học liên tục.</w:t>
+        <w:br/>
+        <w:t>- Tuy nhiên, ưu thế vượt trội của Cây quyết định nằm ở tính minh bạch tuyệt đối: Mô hình tạo ra cấu trúc phân nhánh dạng luật trực quan, cho phép cố vấn học tập nhìn thấy rõ ràng các ngưỡng điểm kiểm tra, điều mà mô hình Logistic Regression (vốn là hàm số sigmoid trừu tượng) không thể cung cấp.</w:t>
+      </w:r>
+    </w:p>
+    <w:p>
+      <w:pPr>
+        <w:pStyle w:val="Heading2"/>
+      </w:pPr>
+      <w:r>
+        <w:t>4.2. Khảo Sát Siêu Tham Số max_depth Bằng 5-Fold Cross-Validation</w:t>
+      </w:r>
+    </w:p>
+    <w:p>
+      <w:r>
+        <w:t>Để lựa chọn độ sâu cây tối ưu mà không vi phạm nguyên tắc rò rỉ tập Test, tác giả đã thực hiện 5-Fold Stratified Cross-Validation hoàn toàn trên tập Huấn luyện (Train 80% = 1.324 sinh viên). Kết quả khảo sát được thể hiện trong Bảng 4.2:</w:t>
+      </w:r>
+    </w:p>
+    <w:tbl>
+      <w:tblPr>
+        <w:tblW w:type="auto" w:w="0"/>
+        <w:jc w:val="center"/>
+        <w:tblLook w:firstColumn="1" w:firstRow="1" w:lastColumn="0" w:lastRow="0" w:noHBand="0" w:noVBand="1" w:val="04A0"/>
+      </w:tblPr>
+      <w:tblGrid>
+        <w:gridCol w:w="1656"/>
+        <w:gridCol w:w="1656"/>
+        <w:gridCol w:w="1656"/>
+        <w:gridCol w:w="1656"/>
+        <w:gridCol w:w="1656"/>
+        <w:gridCol w:w="1656"/>
+      </w:tblGrid>
+      <w:tr>
         <w:tc>
           <w:tcPr>
-            <w:tcW w:type="dxa" w:w="2484"/>
+            <w:tcW w:type="dxa" w:w="1656"/>
+            <w:shd w:fill="2980B9"/>
             <w:tcMar>
               <w:top w:w="80" w:type="dxa"/>
               <w:bottom w:w="80" w:type="dxa"/>
@@ -1438,9 +1295,1208 @@
             </w:pPr>
             <w:r>
               <w:rPr>
-                <w:sz w:val="19"/>
+                <w:b/>
+                <w:color w:val="FFFFFF"/>
+                <w:sz w:val="18"/>
               </w:rPr>
-              <w:t>84.00%</w:t>
+              <w:t>Độ Sâu (max_depth)</w:t>
+            </w:r>
+          </w:p>
+        </w:tc>
+        <w:tc>
+          <w:tcPr>
+            <w:tcW w:type="dxa" w:w="1656"/>
+            <w:shd w:fill="2980B9"/>
+            <w:tcMar>
+              <w:top w:w="80" w:type="dxa"/>
+              <w:bottom w:w="80" w:type="dxa"/>
+              <w:left w:w="100" w:type="dxa"/>
+              <w:right w:w="100" w:type="dxa"/>
+            </w:tcMar>
+          </w:tcPr>
+          <w:p>
+            <w:pPr>
+              <w:jc w:val="center"/>
+            </w:pPr>
+            <w:r>
+              <w:rPr>
+                <w:b/>
+                <w:color w:val="FFFFFF"/>
+                <w:sz w:val="18"/>
+              </w:rPr>
+              <w:t>CV Mean Accuracy (Train)</w:t>
+            </w:r>
+          </w:p>
+        </w:tc>
+        <w:tc>
+          <w:tcPr>
+            <w:tcW w:type="dxa" w:w="1656"/>
+            <w:shd w:fill="2980B9"/>
+            <w:tcMar>
+              <w:top w:w="80" w:type="dxa"/>
+              <w:bottom w:w="80" w:type="dxa"/>
+              <w:left w:w="100" w:type="dxa"/>
+              <w:right w:w="100" w:type="dxa"/>
+            </w:tcMar>
+          </w:tcPr>
+          <w:p>
+            <w:pPr>
+              <w:jc w:val="center"/>
+            </w:pPr>
+            <w:r>
+              <w:rPr>
+                <w:b/>
+                <w:color w:val="FFFFFF"/>
+                <w:sz w:val="18"/>
+              </w:rPr>
+              <w:t>CV Std (Train)</w:t>
+            </w:r>
+          </w:p>
+        </w:tc>
+        <w:tc>
+          <w:tcPr>
+            <w:tcW w:type="dxa" w:w="1656"/>
+            <w:shd w:fill="2980B9"/>
+            <w:tcMar>
+              <w:top w:w="80" w:type="dxa"/>
+              <w:bottom w:w="80" w:type="dxa"/>
+              <w:left w:w="100" w:type="dxa"/>
+              <w:right w:w="100" w:type="dxa"/>
+            </w:tcMar>
+          </w:tcPr>
+          <w:p>
+            <w:pPr>
+              <w:jc w:val="center"/>
+            </w:pPr>
+            <w:r>
+              <w:rPr>
+                <w:b/>
+                <w:color w:val="FFFFFF"/>
+                <w:sz w:val="18"/>
+              </w:rPr>
+              <w:t>Train Accuracy</w:t>
+            </w:r>
+          </w:p>
+        </w:tc>
+        <w:tc>
+          <w:tcPr>
+            <w:tcW w:type="dxa" w:w="1656"/>
+            <w:shd w:fill="2980B9"/>
+            <w:tcMar>
+              <w:top w:w="80" w:type="dxa"/>
+              <w:bottom w:w="80" w:type="dxa"/>
+              <w:left w:w="100" w:type="dxa"/>
+              <w:right w:w="100" w:type="dxa"/>
+            </w:tcMar>
+          </w:tcPr>
+          <w:p>
+            <w:pPr>
+              <w:jc w:val="center"/>
+            </w:pPr>
+            <w:r>
+              <w:rPr>
+                <w:b/>
+                <w:color w:val="FFFFFF"/>
+                <w:sz w:val="18"/>
+              </w:rPr>
+              <w:t>Holdout Test Acc</w:t>
+            </w:r>
+          </w:p>
+        </w:tc>
+        <w:tc>
+          <w:tcPr>
+            <w:tcW w:type="dxa" w:w="1656"/>
+            <w:shd w:fill="2980B9"/>
+            <w:tcMar>
+              <w:top w:w="80" w:type="dxa"/>
+              <w:bottom w:w="80" w:type="dxa"/>
+              <w:left w:w="100" w:type="dxa"/>
+              <w:right w:w="100" w:type="dxa"/>
+            </w:tcMar>
+          </w:tcPr>
+          <w:p>
+            <w:pPr>
+              <w:jc w:val="center"/>
+            </w:pPr>
+            <w:r>
+              <w:rPr>
+                <w:b/>
+                <w:color w:val="FFFFFF"/>
+                <w:sz w:val="18"/>
+              </w:rPr>
+              <w:t>Generalization Gap</w:t>
+            </w:r>
+          </w:p>
+        </w:tc>
+      </w:tr>
+      <w:tr>
+        <w:tc>
+          <w:tcPr>
+            <w:tcW w:type="dxa" w:w="1656"/>
+            <w:tcMar>
+              <w:top w:w="60" w:type="dxa"/>
+              <w:bottom w:w="60" w:type="dxa"/>
+              <w:left w:w="80" w:type="dxa"/>
+              <w:right w:w="80" w:type="dxa"/>
+            </w:tcMar>
+          </w:tcPr>
+          <w:p>
+            <w:pPr>
+              <w:jc w:val="center"/>
+            </w:pPr>
+            <w:r>
+              <w:rPr>
+                <w:sz w:val="18"/>
+              </w:rPr>
+              <w:t>1</w:t>
+            </w:r>
+          </w:p>
+        </w:tc>
+        <w:tc>
+          <w:tcPr>
+            <w:tcW w:type="dxa" w:w="1656"/>
+            <w:tcMar>
+              <w:top w:w="60" w:type="dxa"/>
+              <w:bottom w:w="60" w:type="dxa"/>
+              <w:left w:w="80" w:type="dxa"/>
+              <w:right w:w="80" w:type="dxa"/>
+            </w:tcMar>
+          </w:tcPr>
+          <w:p>
+            <w:pPr>
+              <w:jc w:val="center"/>
+            </w:pPr>
+            <w:r>
+              <w:rPr>
+                <w:sz w:val="18"/>
+              </w:rPr>
+              <w:t>63.67%</w:t>
+            </w:r>
+          </w:p>
+        </w:tc>
+        <w:tc>
+          <w:tcPr>
+            <w:tcW w:type="dxa" w:w="1656"/>
+            <w:tcMar>
+              <w:top w:w="60" w:type="dxa"/>
+              <w:bottom w:w="60" w:type="dxa"/>
+              <w:left w:w="80" w:type="dxa"/>
+              <w:right w:w="80" w:type="dxa"/>
+            </w:tcMar>
+          </w:tcPr>
+          <w:p>
+            <w:pPr>
+              <w:jc w:val="center"/>
+            </w:pPr>
+            <w:r>
+              <w:rPr>
+                <w:sz w:val="18"/>
+              </w:rPr>
+              <w:t>±4.10%</w:t>
+            </w:r>
+          </w:p>
+        </w:tc>
+        <w:tc>
+          <w:tcPr>
+            <w:tcW w:type="dxa" w:w="1656"/>
+            <w:tcMar>
+              <w:top w:w="60" w:type="dxa"/>
+              <w:bottom w:w="60" w:type="dxa"/>
+              <w:left w:w="80" w:type="dxa"/>
+              <w:right w:w="80" w:type="dxa"/>
+            </w:tcMar>
+          </w:tcPr>
+          <w:p>
+            <w:pPr>
+              <w:jc w:val="center"/>
+            </w:pPr>
+            <w:r>
+              <w:rPr>
+                <w:sz w:val="18"/>
+              </w:rPr>
+              <w:t>66.69%</w:t>
+            </w:r>
+          </w:p>
+        </w:tc>
+        <w:tc>
+          <w:tcPr>
+            <w:tcW w:type="dxa" w:w="1656"/>
+            <w:tcMar>
+              <w:top w:w="60" w:type="dxa"/>
+              <w:bottom w:w="60" w:type="dxa"/>
+              <w:left w:w="80" w:type="dxa"/>
+              <w:right w:w="80" w:type="dxa"/>
+            </w:tcMar>
+          </w:tcPr>
+          <w:p>
+            <w:pPr>
+              <w:jc w:val="center"/>
+            </w:pPr>
+            <w:r>
+              <w:rPr>
+                <w:sz w:val="18"/>
+              </w:rPr>
+              <w:t>68.67%</w:t>
+            </w:r>
+          </w:p>
+        </w:tc>
+        <w:tc>
+          <w:tcPr>
+            <w:tcW w:type="dxa" w:w="1656"/>
+            <w:tcMar>
+              <w:top w:w="60" w:type="dxa"/>
+              <w:bottom w:w="60" w:type="dxa"/>
+              <w:left w:w="80" w:type="dxa"/>
+              <w:right w:w="80" w:type="dxa"/>
+            </w:tcMar>
+          </w:tcPr>
+          <w:p>
+            <w:pPr>
+              <w:jc w:val="center"/>
+            </w:pPr>
+            <w:r>
+              <w:rPr>
+                <w:sz w:val="18"/>
+              </w:rPr>
+              <w:t>-1.98%</w:t>
+            </w:r>
+          </w:p>
+        </w:tc>
+      </w:tr>
+      <w:tr>
+        <w:tc>
+          <w:tcPr>
+            <w:tcW w:type="dxa" w:w="1656"/>
+            <w:tcMar>
+              <w:top w:w="60" w:type="dxa"/>
+              <w:bottom w:w="60" w:type="dxa"/>
+              <w:left w:w="80" w:type="dxa"/>
+              <w:right w:w="80" w:type="dxa"/>
+            </w:tcMar>
+          </w:tcPr>
+          <w:p>
+            <w:pPr>
+              <w:jc w:val="center"/>
+            </w:pPr>
+            <w:r>
+              <w:rPr>
+                <w:sz w:val="18"/>
+              </w:rPr>
+              <w:t>2</w:t>
+            </w:r>
+          </w:p>
+        </w:tc>
+        <w:tc>
+          <w:tcPr>
+            <w:tcW w:type="dxa" w:w="1656"/>
+            <w:tcMar>
+              <w:top w:w="60" w:type="dxa"/>
+              <w:bottom w:w="60" w:type="dxa"/>
+              <w:left w:w="80" w:type="dxa"/>
+              <w:right w:w="80" w:type="dxa"/>
+            </w:tcMar>
+          </w:tcPr>
+          <w:p>
+            <w:pPr>
+              <w:jc w:val="center"/>
+            </w:pPr>
+            <w:r>
+              <w:rPr>
+                <w:sz w:val="18"/>
+              </w:rPr>
+              <w:t>66.24%</w:t>
+            </w:r>
+          </w:p>
+        </w:tc>
+        <w:tc>
+          <w:tcPr>
+            <w:tcW w:type="dxa" w:w="1656"/>
+            <w:tcMar>
+              <w:top w:w="60" w:type="dxa"/>
+              <w:bottom w:w="60" w:type="dxa"/>
+              <w:left w:w="80" w:type="dxa"/>
+              <w:right w:w="80" w:type="dxa"/>
+            </w:tcMar>
+          </w:tcPr>
+          <w:p>
+            <w:pPr>
+              <w:jc w:val="center"/>
+            </w:pPr>
+            <w:r>
+              <w:rPr>
+                <w:sz w:val="18"/>
+              </w:rPr>
+              <w:t>±1.69%</w:t>
+            </w:r>
+          </w:p>
+        </w:tc>
+        <w:tc>
+          <w:tcPr>
+            <w:tcW w:type="dxa" w:w="1656"/>
+            <w:tcMar>
+              <w:top w:w="60" w:type="dxa"/>
+              <w:bottom w:w="60" w:type="dxa"/>
+              <w:left w:w="80" w:type="dxa"/>
+              <w:right w:w="80" w:type="dxa"/>
+            </w:tcMar>
+          </w:tcPr>
+          <w:p>
+            <w:pPr>
+              <w:jc w:val="center"/>
+            </w:pPr>
+            <w:r>
+              <w:rPr>
+                <w:sz w:val="18"/>
+              </w:rPr>
+              <w:t>68.58%</w:t>
+            </w:r>
+          </w:p>
+        </w:tc>
+        <w:tc>
+          <w:tcPr>
+            <w:tcW w:type="dxa" w:w="1656"/>
+            <w:tcMar>
+              <w:top w:w="60" w:type="dxa"/>
+              <w:bottom w:w="60" w:type="dxa"/>
+              <w:left w:w="80" w:type="dxa"/>
+              <w:right w:w="80" w:type="dxa"/>
+            </w:tcMar>
+          </w:tcPr>
+          <w:p>
+            <w:pPr>
+              <w:jc w:val="center"/>
+            </w:pPr>
+            <w:r>
+              <w:rPr>
+                <w:sz w:val="18"/>
+              </w:rPr>
+              <w:t>68.67%</w:t>
+            </w:r>
+          </w:p>
+        </w:tc>
+        <w:tc>
+          <w:tcPr>
+            <w:tcW w:type="dxa" w:w="1656"/>
+            <w:tcMar>
+              <w:top w:w="60" w:type="dxa"/>
+              <w:bottom w:w="60" w:type="dxa"/>
+              <w:left w:w="80" w:type="dxa"/>
+              <w:right w:w="80" w:type="dxa"/>
+            </w:tcMar>
+          </w:tcPr>
+          <w:p>
+            <w:pPr>
+              <w:jc w:val="center"/>
+            </w:pPr>
+            <w:r>
+              <w:rPr>
+                <w:sz w:val="18"/>
+              </w:rPr>
+              <w:t>-0.09%</w:t>
+            </w:r>
+          </w:p>
+        </w:tc>
+      </w:tr>
+      <w:tr>
+        <w:tc>
+          <w:tcPr>
+            <w:tcW w:type="dxa" w:w="1656"/>
+            <w:tcMar>
+              <w:top w:w="60" w:type="dxa"/>
+              <w:bottom w:w="60" w:type="dxa"/>
+              <w:left w:w="80" w:type="dxa"/>
+              <w:right w:w="80" w:type="dxa"/>
+            </w:tcMar>
+          </w:tcPr>
+          <w:p>
+            <w:pPr>
+              <w:jc w:val="center"/>
+            </w:pPr>
+            <w:r>
+              <w:rPr>
+                <w:sz w:val="18"/>
+              </w:rPr>
+              <w:t>3</w:t>
+            </w:r>
+          </w:p>
+        </w:tc>
+        <w:tc>
+          <w:tcPr>
+            <w:tcW w:type="dxa" w:w="1656"/>
+            <w:tcMar>
+              <w:top w:w="60" w:type="dxa"/>
+              <w:bottom w:w="60" w:type="dxa"/>
+              <w:left w:w="80" w:type="dxa"/>
+              <w:right w:w="80" w:type="dxa"/>
+            </w:tcMar>
+          </w:tcPr>
+          <w:p>
+            <w:pPr>
+              <w:jc w:val="center"/>
+            </w:pPr>
+            <w:r>
+              <w:rPr>
+                <w:sz w:val="18"/>
+              </w:rPr>
+              <w:t>72.43%</w:t>
+            </w:r>
+          </w:p>
+        </w:tc>
+        <w:tc>
+          <w:tcPr>
+            <w:tcW w:type="dxa" w:w="1656"/>
+            <w:tcMar>
+              <w:top w:w="60" w:type="dxa"/>
+              <w:bottom w:w="60" w:type="dxa"/>
+              <w:left w:w="80" w:type="dxa"/>
+              <w:right w:w="80" w:type="dxa"/>
+            </w:tcMar>
+          </w:tcPr>
+          <w:p>
+            <w:pPr>
+              <w:jc w:val="center"/>
+            </w:pPr>
+            <w:r>
+              <w:rPr>
+                <w:sz w:val="18"/>
+              </w:rPr>
+              <w:t>±1.30%</w:t>
+            </w:r>
+          </w:p>
+        </w:tc>
+        <w:tc>
+          <w:tcPr>
+            <w:tcW w:type="dxa" w:w="1656"/>
+            <w:tcMar>
+              <w:top w:w="60" w:type="dxa"/>
+              <w:bottom w:w="60" w:type="dxa"/>
+              <w:left w:w="80" w:type="dxa"/>
+              <w:right w:w="80" w:type="dxa"/>
+            </w:tcMar>
+          </w:tcPr>
+          <w:p>
+            <w:pPr>
+              <w:jc w:val="center"/>
+            </w:pPr>
+            <w:r>
+              <w:rPr>
+                <w:sz w:val="18"/>
+              </w:rPr>
+              <w:t>74.92%</w:t>
+            </w:r>
+          </w:p>
+        </w:tc>
+        <w:tc>
+          <w:tcPr>
+            <w:tcW w:type="dxa" w:w="1656"/>
+            <w:tcMar>
+              <w:top w:w="60" w:type="dxa"/>
+              <w:bottom w:w="60" w:type="dxa"/>
+              <w:left w:w="80" w:type="dxa"/>
+              <w:right w:w="80" w:type="dxa"/>
+            </w:tcMar>
+          </w:tcPr>
+          <w:p>
+            <w:pPr>
+              <w:jc w:val="center"/>
+            </w:pPr>
+            <w:r>
+              <w:rPr>
+                <w:sz w:val="18"/>
+              </w:rPr>
+              <w:t>71.39%</w:t>
+            </w:r>
+          </w:p>
+        </w:tc>
+        <w:tc>
+          <w:tcPr>
+            <w:tcW w:type="dxa" w:w="1656"/>
+            <w:tcMar>
+              <w:top w:w="60" w:type="dxa"/>
+              <w:bottom w:w="60" w:type="dxa"/>
+              <w:left w:w="80" w:type="dxa"/>
+              <w:right w:w="80" w:type="dxa"/>
+            </w:tcMar>
+          </w:tcPr>
+          <w:p>
+            <w:pPr>
+              <w:jc w:val="center"/>
+            </w:pPr>
+            <w:r>
+              <w:rPr>
+                <w:sz w:val="18"/>
+              </w:rPr>
+              <w:t>+3.54%</w:t>
+            </w:r>
+          </w:p>
+        </w:tc>
+      </w:tr>
+      <w:tr>
+        <w:tc>
+          <w:tcPr>
+            <w:tcW w:type="dxa" w:w="1656"/>
+            <w:tcMar>
+              <w:top w:w="60" w:type="dxa"/>
+              <w:bottom w:w="60" w:type="dxa"/>
+              <w:left w:w="80" w:type="dxa"/>
+              <w:right w:w="80" w:type="dxa"/>
+            </w:tcMar>
+          </w:tcPr>
+          <w:p>
+            <w:pPr>
+              <w:jc w:val="center"/>
+            </w:pPr>
+            <w:r>
+              <w:rPr>
+                <w:sz w:val="18"/>
+              </w:rPr>
+              <w:t>4</w:t>
+            </w:r>
+          </w:p>
+        </w:tc>
+        <w:tc>
+          <w:tcPr>
+            <w:tcW w:type="dxa" w:w="1656"/>
+            <w:tcMar>
+              <w:top w:w="60" w:type="dxa"/>
+              <w:bottom w:w="60" w:type="dxa"/>
+              <w:left w:w="80" w:type="dxa"/>
+              <w:right w:w="80" w:type="dxa"/>
+            </w:tcMar>
+          </w:tcPr>
+          <w:p>
+            <w:pPr>
+              <w:jc w:val="center"/>
+            </w:pPr>
+            <w:r>
+              <w:rPr>
+                <w:sz w:val="18"/>
+              </w:rPr>
+              <w:t>73.64%</w:t>
+            </w:r>
+          </w:p>
+        </w:tc>
+        <w:tc>
+          <w:tcPr>
+            <w:tcW w:type="dxa" w:w="1656"/>
+            <w:tcMar>
+              <w:top w:w="60" w:type="dxa"/>
+              <w:bottom w:w="60" w:type="dxa"/>
+              <w:left w:w="80" w:type="dxa"/>
+              <w:right w:w="80" w:type="dxa"/>
+            </w:tcMar>
+          </w:tcPr>
+          <w:p>
+            <w:pPr>
+              <w:jc w:val="center"/>
+            </w:pPr>
+            <w:r>
+              <w:rPr>
+                <w:sz w:val="18"/>
+              </w:rPr>
+              <w:t>±2.21%</w:t>
+            </w:r>
+          </w:p>
+        </w:tc>
+        <w:tc>
+          <w:tcPr>
+            <w:tcW w:type="dxa" w:w="1656"/>
+            <w:tcMar>
+              <w:top w:w="60" w:type="dxa"/>
+              <w:bottom w:w="60" w:type="dxa"/>
+              <w:left w:w="80" w:type="dxa"/>
+              <w:right w:w="80" w:type="dxa"/>
+            </w:tcMar>
+          </w:tcPr>
+          <w:p>
+            <w:pPr>
+              <w:jc w:val="center"/>
+            </w:pPr>
+            <w:r>
+              <w:rPr>
+                <w:sz w:val="18"/>
+              </w:rPr>
+              <w:t>76.13%</w:t>
+            </w:r>
+          </w:p>
+        </w:tc>
+        <w:tc>
+          <w:tcPr>
+            <w:tcW w:type="dxa" w:w="1656"/>
+            <w:tcMar>
+              <w:top w:w="60" w:type="dxa"/>
+              <w:bottom w:w="60" w:type="dxa"/>
+              <w:left w:w="80" w:type="dxa"/>
+              <w:right w:w="80" w:type="dxa"/>
+            </w:tcMar>
+          </w:tcPr>
+          <w:p>
+            <w:pPr>
+              <w:jc w:val="center"/>
+            </w:pPr>
+            <w:r>
+              <w:rPr>
+                <w:sz w:val="18"/>
+              </w:rPr>
+              <w:t>74.40%</w:t>
+            </w:r>
+          </w:p>
+        </w:tc>
+        <w:tc>
+          <w:tcPr>
+            <w:tcW w:type="dxa" w:w="1656"/>
+            <w:tcMar>
+              <w:top w:w="60" w:type="dxa"/>
+              <w:bottom w:w="60" w:type="dxa"/>
+              <w:left w:w="80" w:type="dxa"/>
+              <w:right w:w="80" w:type="dxa"/>
+            </w:tcMar>
+          </w:tcPr>
+          <w:p>
+            <w:pPr>
+              <w:jc w:val="center"/>
+            </w:pPr>
+            <w:r>
+              <w:rPr>
+                <w:sz w:val="18"/>
+              </w:rPr>
+              <w:t>+1.74%</w:t>
+            </w:r>
+          </w:p>
+        </w:tc>
+      </w:tr>
+      <w:tr>
+        <w:tc>
+          <w:tcPr>
+            <w:tcW w:type="dxa" w:w="1656"/>
+            <w:tcMar>
+              <w:top w:w="60" w:type="dxa"/>
+              <w:bottom w:w="60" w:type="dxa"/>
+              <w:left w:w="80" w:type="dxa"/>
+              <w:right w:w="80" w:type="dxa"/>
+            </w:tcMar>
+          </w:tcPr>
+          <w:p>
+            <w:pPr>
+              <w:jc w:val="center"/>
+            </w:pPr>
+            <w:r>
+              <w:rPr>
+                <w:sz w:val="18"/>
+              </w:rPr>
+              <w:t>5</w:t>
+            </w:r>
+          </w:p>
+        </w:tc>
+        <w:tc>
+          <w:tcPr>
+            <w:tcW w:type="dxa" w:w="1656"/>
+            <w:tcMar>
+              <w:top w:w="60" w:type="dxa"/>
+              <w:bottom w:w="60" w:type="dxa"/>
+              <w:left w:w="80" w:type="dxa"/>
+              <w:right w:w="80" w:type="dxa"/>
+            </w:tcMar>
+          </w:tcPr>
+          <w:p>
+            <w:pPr>
+              <w:jc w:val="center"/>
+            </w:pPr>
+            <w:r>
+              <w:rPr>
+                <w:sz w:val="18"/>
+              </w:rPr>
+              <w:t>71.60%</w:t>
+            </w:r>
+          </w:p>
+        </w:tc>
+        <w:tc>
+          <w:tcPr>
+            <w:tcW w:type="dxa" w:w="1656"/>
+            <w:tcMar>
+              <w:top w:w="60" w:type="dxa"/>
+              <w:bottom w:w="60" w:type="dxa"/>
+              <w:left w:w="80" w:type="dxa"/>
+              <w:right w:w="80" w:type="dxa"/>
+            </w:tcMar>
+          </w:tcPr>
+          <w:p>
+            <w:pPr>
+              <w:jc w:val="center"/>
+            </w:pPr>
+            <w:r>
+              <w:rPr>
+                <w:sz w:val="18"/>
+              </w:rPr>
+              <w:t>±2.00%</w:t>
+            </w:r>
+          </w:p>
+        </w:tc>
+        <w:tc>
+          <w:tcPr>
+            <w:tcW w:type="dxa" w:w="1656"/>
+            <w:tcMar>
+              <w:top w:w="60" w:type="dxa"/>
+              <w:bottom w:w="60" w:type="dxa"/>
+              <w:left w:w="80" w:type="dxa"/>
+              <w:right w:w="80" w:type="dxa"/>
+            </w:tcMar>
+          </w:tcPr>
+          <w:p>
+            <w:pPr>
+              <w:jc w:val="center"/>
+            </w:pPr>
+            <w:r>
+              <w:rPr>
+                <w:sz w:val="18"/>
+              </w:rPr>
+              <w:t>77.79%</w:t>
+            </w:r>
+          </w:p>
+        </w:tc>
+        <w:tc>
+          <w:tcPr>
+            <w:tcW w:type="dxa" w:w="1656"/>
+            <w:tcMar>
+              <w:top w:w="60" w:type="dxa"/>
+              <w:bottom w:w="60" w:type="dxa"/>
+              <w:left w:w="80" w:type="dxa"/>
+              <w:right w:w="80" w:type="dxa"/>
+            </w:tcMar>
+          </w:tcPr>
+          <w:p>
+            <w:pPr>
+              <w:jc w:val="center"/>
+            </w:pPr>
+            <w:r>
+              <w:rPr>
+                <w:sz w:val="18"/>
+              </w:rPr>
+              <w:t>71.99%</w:t>
+            </w:r>
+          </w:p>
+        </w:tc>
+        <w:tc>
+          <w:tcPr>
+            <w:tcW w:type="dxa" w:w="1656"/>
+            <w:tcMar>
+              <w:top w:w="60" w:type="dxa"/>
+              <w:bottom w:w="60" w:type="dxa"/>
+              <w:left w:w="80" w:type="dxa"/>
+              <w:right w:w="80" w:type="dxa"/>
+            </w:tcMar>
+          </w:tcPr>
+          <w:p>
+            <w:pPr>
+              <w:jc w:val="center"/>
+            </w:pPr>
+            <w:r>
+              <w:rPr>
+                <w:sz w:val="18"/>
+              </w:rPr>
+              <w:t>+5.81%</w:t>
+            </w:r>
+          </w:p>
+        </w:tc>
+      </w:tr>
+      <w:tr>
+        <w:tc>
+          <w:tcPr>
+            <w:tcW w:type="dxa" w:w="1656"/>
+            <w:tcMar>
+              <w:top w:w="60" w:type="dxa"/>
+              <w:bottom w:w="60" w:type="dxa"/>
+              <w:left w:w="80" w:type="dxa"/>
+              <w:right w:w="80" w:type="dxa"/>
+            </w:tcMar>
+          </w:tcPr>
+          <w:p>
+            <w:pPr>
+              <w:jc w:val="center"/>
+            </w:pPr>
+            <w:r>
+              <w:rPr>
+                <w:sz w:val="18"/>
+              </w:rPr>
+              <w:t>6</w:t>
+            </w:r>
+          </w:p>
+        </w:tc>
+        <w:tc>
+          <w:tcPr>
+            <w:tcW w:type="dxa" w:w="1656"/>
+            <w:tcMar>
+              <w:top w:w="60" w:type="dxa"/>
+              <w:bottom w:w="60" w:type="dxa"/>
+              <w:left w:w="80" w:type="dxa"/>
+              <w:right w:w="80" w:type="dxa"/>
+            </w:tcMar>
+          </w:tcPr>
+          <w:p>
+            <w:pPr>
+              <w:jc w:val="center"/>
+            </w:pPr>
+            <w:r>
+              <w:rPr>
+                <w:sz w:val="18"/>
+              </w:rPr>
+              <w:t>73.34%</w:t>
+            </w:r>
+          </w:p>
+        </w:tc>
+        <w:tc>
+          <w:tcPr>
+            <w:tcW w:type="dxa" w:w="1656"/>
+            <w:tcMar>
+              <w:top w:w="60" w:type="dxa"/>
+              <w:bottom w:w="60" w:type="dxa"/>
+              <w:left w:w="80" w:type="dxa"/>
+              <w:right w:w="80" w:type="dxa"/>
+            </w:tcMar>
+          </w:tcPr>
+          <w:p>
+            <w:pPr>
+              <w:jc w:val="center"/>
+            </w:pPr>
+            <w:r>
+              <w:rPr>
+                <w:sz w:val="18"/>
+              </w:rPr>
+              <w:t>±2.29%</w:t>
+            </w:r>
+          </w:p>
+        </w:tc>
+        <w:tc>
+          <w:tcPr>
+            <w:tcW w:type="dxa" w:w="1656"/>
+            <w:tcMar>
+              <w:top w:w="60" w:type="dxa"/>
+              <w:bottom w:w="60" w:type="dxa"/>
+              <w:left w:w="80" w:type="dxa"/>
+              <w:right w:w="80" w:type="dxa"/>
+            </w:tcMar>
+          </w:tcPr>
+          <w:p>
+            <w:pPr>
+              <w:jc w:val="center"/>
+            </w:pPr>
+            <w:r>
+              <w:rPr>
+                <w:sz w:val="18"/>
+              </w:rPr>
+              <w:t>80.21%</w:t>
+            </w:r>
+          </w:p>
+        </w:tc>
+        <w:tc>
+          <w:tcPr>
+            <w:tcW w:type="dxa" w:w="1656"/>
+            <w:tcMar>
+              <w:top w:w="60" w:type="dxa"/>
+              <w:bottom w:w="60" w:type="dxa"/>
+              <w:left w:w="80" w:type="dxa"/>
+              <w:right w:w="80" w:type="dxa"/>
+            </w:tcMar>
+          </w:tcPr>
+          <w:p>
+            <w:pPr>
+              <w:jc w:val="center"/>
+            </w:pPr>
+            <w:r>
+              <w:rPr>
+                <w:sz w:val="18"/>
+              </w:rPr>
+              <w:t>71.39%</w:t>
+            </w:r>
+          </w:p>
+        </w:tc>
+        <w:tc>
+          <w:tcPr>
+            <w:tcW w:type="dxa" w:w="1656"/>
+            <w:tcMar>
+              <w:top w:w="60" w:type="dxa"/>
+              <w:bottom w:w="60" w:type="dxa"/>
+              <w:left w:w="80" w:type="dxa"/>
+              <w:right w:w="80" w:type="dxa"/>
+            </w:tcMar>
+          </w:tcPr>
+          <w:p>
+            <w:pPr>
+              <w:jc w:val="center"/>
+            </w:pPr>
+            <w:r>
+              <w:rPr>
+                <w:sz w:val="18"/>
+              </w:rPr>
+              <w:t>+8.83%</w:t>
+            </w:r>
+          </w:p>
+        </w:tc>
+      </w:tr>
+      <w:tr>
+        <w:tc>
+          <w:tcPr>
+            <w:tcW w:type="dxa" w:w="1656"/>
+            <w:tcMar>
+              <w:top w:w="60" w:type="dxa"/>
+              <w:bottom w:w="60" w:type="dxa"/>
+              <w:left w:w="80" w:type="dxa"/>
+              <w:right w:w="80" w:type="dxa"/>
+            </w:tcMar>
+          </w:tcPr>
+          <w:p>
+            <w:pPr>
+              <w:jc w:val="center"/>
+            </w:pPr>
+            <w:r>
+              <w:rPr>
+                <w:sz w:val="18"/>
+              </w:rPr>
+              <w:t>7</w:t>
+            </w:r>
+          </w:p>
+        </w:tc>
+        <w:tc>
+          <w:tcPr>
+            <w:tcW w:type="dxa" w:w="1656"/>
+            <w:tcMar>
+              <w:top w:w="60" w:type="dxa"/>
+              <w:bottom w:w="60" w:type="dxa"/>
+              <w:left w:w="80" w:type="dxa"/>
+              <w:right w:w="80" w:type="dxa"/>
+            </w:tcMar>
+          </w:tcPr>
+          <w:p>
+            <w:pPr>
+              <w:jc w:val="center"/>
+            </w:pPr>
+            <w:r>
+              <w:rPr>
+                <w:sz w:val="18"/>
+              </w:rPr>
+              <w:t>74.09%</w:t>
+            </w:r>
+          </w:p>
+        </w:tc>
+        <w:tc>
+          <w:tcPr>
+            <w:tcW w:type="dxa" w:w="1656"/>
+            <w:tcMar>
+              <w:top w:w="60" w:type="dxa"/>
+              <w:bottom w:w="60" w:type="dxa"/>
+              <w:left w:w="80" w:type="dxa"/>
+              <w:right w:w="80" w:type="dxa"/>
+            </w:tcMar>
+          </w:tcPr>
+          <w:p>
+            <w:pPr>
+              <w:jc w:val="center"/>
+            </w:pPr>
+            <w:r>
+              <w:rPr>
+                <w:sz w:val="18"/>
+              </w:rPr>
+              <w:t>±2.12%</w:t>
+            </w:r>
+          </w:p>
+        </w:tc>
+        <w:tc>
+          <w:tcPr>
+            <w:tcW w:type="dxa" w:w="1656"/>
+            <w:tcMar>
+              <w:top w:w="60" w:type="dxa"/>
+              <w:bottom w:w="60" w:type="dxa"/>
+              <w:left w:w="80" w:type="dxa"/>
+              <w:right w:w="80" w:type="dxa"/>
+            </w:tcMar>
+          </w:tcPr>
+          <w:p>
+            <w:pPr>
+              <w:jc w:val="center"/>
+            </w:pPr>
+            <w:r>
+              <w:rPr>
+                <w:sz w:val="18"/>
+              </w:rPr>
+              <w:t>81.95%</w:t>
+            </w:r>
+          </w:p>
+        </w:tc>
+        <w:tc>
+          <w:tcPr>
+            <w:tcW w:type="dxa" w:w="1656"/>
+            <w:tcMar>
+              <w:top w:w="60" w:type="dxa"/>
+              <w:bottom w:w="60" w:type="dxa"/>
+              <w:left w:w="80" w:type="dxa"/>
+              <w:right w:w="80" w:type="dxa"/>
+            </w:tcMar>
+          </w:tcPr>
+          <w:p>
+            <w:pPr>
+              <w:jc w:val="center"/>
+            </w:pPr>
+            <w:r>
+              <w:rPr>
+                <w:sz w:val="18"/>
+              </w:rPr>
+              <w:t>71.69%</w:t>
+            </w:r>
+          </w:p>
+        </w:tc>
+        <w:tc>
+          <w:tcPr>
+            <w:tcW w:type="dxa" w:w="1656"/>
+            <w:tcMar>
+              <w:top w:w="60" w:type="dxa"/>
+              <w:bottom w:w="60" w:type="dxa"/>
+              <w:left w:w="80" w:type="dxa"/>
+              <w:right w:w="80" w:type="dxa"/>
+            </w:tcMar>
+          </w:tcPr>
+          <w:p>
+            <w:pPr>
+              <w:jc w:val="center"/>
+            </w:pPr>
+            <w:r>
+              <w:rPr>
+                <w:sz w:val="18"/>
+              </w:rPr>
+              <w:t>+10.26%</w:t>
+            </w:r>
+          </w:p>
+        </w:tc>
+      </w:tr>
+      <w:tr>
+        <w:tc>
+          <w:tcPr>
+            <w:tcW w:type="dxa" w:w="1656"/>
+            <w:tcMar>
+              <w:top w:w="60" w:type="dxa"/>
+              <w:bottom w:w="60" w:type="dxa"/>
+              <w:left w:w="80" w:type="dxa"/>
+              <w:right w:w="80" w:type="dxa"/>
+            </w:tcMar>
+          </w:tcPr>
+          <w:p>
+            <w:pPr>
+              <w:jc w:val="center"/>
+            </w:pPr>
+            <w:r>
+              <w:rPr>
+                <w:sz w:val="18"/>
+              </w:rPr>
+              <w:t>8</w:t>
+            </w:r>
+          </w:p>
+        </w:tc>
+        <w:tc>
+          <w:tcPr>
+            <w:tcW w:type="dxa" w:w="1656"/>
+            <w:tcMar>
+              <w:top w:w="60" w:type="dxa"/>
+              <w:bottom w:w="60" w:type="dxa"/>
+              <w:left w:w="80" w:type="dxa"/>
+              <w:right w:w="80" w:type="dxa"/>
+            </w:tcMar>
+          </w:tcPr>
+          <w:p>
+            <w:pPr>
+              <w:jc w:val="center"/>
+            </w:pPr>
+            <w:r>
+              <w:rPr>
+                <w:sz w:val="18"/>
+              </w:rPr>
+              <w:t>73.79%</w:t>
+            </w:r>
+          </w:p>
+        </w:tc>
+        <w:tc>
+          <w:tcPr>
+            <w:tcW w:type="dxa" w:w="1656"/>
+            <w:tcMar>
+              <w:top w:w="60" w:type="dxa"/>
+              <w:bottom w:w="60" w:type="dxa"/>
+              <w:left w:w="80" w:type="dxa"/>
+              <w:right w:w="80" w:type="dxa"/>
+            </w:tcMar>
+          </w:tcPr>
+          <w:p>
+            <w:pPr>
+              <w:jc w:val="center"/>
+            </w:pPr>
+            <w:r>
+              <w:rPr>
+                <w:sz w:val="18"/>
+              </w:rPr>
+              <w:t>±2.82%</w:t>
+            </w:r>
+          </w:p>
+        </w:tc>
+        <w:tc>
+          <w:tcPr>
+            <w:tcW w:type="dxa" w:w="1656"/>
+            <w:tcMar>
+              <w:top w:w="60" w:type="dxa"/>
+              <w:bottom w:w="60" w:type="dxa"/>
+              <w:left w:w="80" w:type="dxa"/>
+              <w:right w:w="80" w:type="dxa"/>
+            </w:tcMar>
+          </w:tcPr>
+          <w:p>
+            <w:pPr>
+              <w:jc w:val="center"/>
+            </w:pPr>
+            <w:r>
+              <w:rPr>
+                <w:sz w:val="18"/>
+              </w:rPr>
+              <w:t>82.10%</w:t>
+            </w:r>
+          </w:p>
+        </w:tc>
+        <w:tc>
+          <w:tcPr>
+            <w:tcW w:type="dxa" w:w="1656"/>
+            <w:tcMar>
+              <w:top w:w="60" w:type="dxa"/>
+              <w:bottom w:w="60" w:type="dxa"/>
+              <w:left w:w="80" w:type="dxa"/>
+              <w:right w:w="80" w:type="dxa"/>
+            </w:tcMar>
+          </w:tcPr>
+          <w:p>
+            <w:pPr>
+              <w:jc w:val="center"/>
+            </w:pPr>
+            <w:r>
+              <w:rPr>
+                <w:sz w:val="18"/>
+              </w:rPr>
+              <w:t>71.39%</w:t>
+            </w:r>
+          </w:p>
+        </w:tc>
+        <w:tc>
+          <w:tcPr>
+            <w:tcW w:type="dxa" w:w="1656"/>
+            <w:tcMar>
+              <w:top w:w="60" w:type="dxa"/>
+              <w:bottom w:w="60" w:type="dxa"/>
+              <w:left w:w="80" w:type="dxa"/>
+              <w:right w:w="80" w:type="dxa"/>
+            </w:tcMar>
+          </w:tcPr>
+          <w:p>
+            <w:pPr>
+              <w:jc w:val="center"/>
+            </w:pPr>
+            <w:r>
+              <w:rPr>
+                <w:sz w:val="18"/>
+              </w:rPr>
+              <w:t>+10.71%</w:t>
             </w:r>
           </w:p>
         </w:tc>
@@ -1455,7 +2511,16 @@
           <w:i/>
           <w:sz w:val="19"/>
         </w:rPr>
-        <w:t>Bảng 4.1: Đối sánh hiệu năng phân lớp giữa các mô hình trên tập kiểm thử</w:t>
+        <w:t>Bảng 4.2: Khảo sát độ sâu cây bằng 5-Fold Stratified Cross-Validation trên tập Train</w:t>
+      </w:r>
+    </w:p>
+    <w:p>
+      <w:r>
+        <w:t>- Tại max_depth = 1 và 2: Cây quá nông, điểm kiểm định chéo CV Mean đạt thấp (63.67% - 66.24%), mô hình bị Dưới khớp (Underfitting).</w:t>
+        <w:br/>
+        <w:t>- Tại max_depth = 3: Điểm kiểm định chéo tăng vọt lên 72.43% với độ lệch chuẩn nhỏ nhất (±1.30%), đồng thời độ phức tạp của cây chỉ gồm 8 nút lá, đây là cấu hình lý tưởng để trực quan hóa và giải thích trong báo cáo.</w:t>
+        <w:br/>
+        <w:t>- Tại max_depth &gt;= 6: Mặc dù điểm trên tập huấn luyện tiếp tục tăng đến 82.10%, nhưng khoảng cách tổng quát hóa (Generalization Gap) vượt ngưỡng 10%, bắt đầu xuất hiện hiện tượng Quá khớp (Overfitting).</w:t>
       </w:r>
     </w:p>
     <w:p>
@@ -1463,22 +2528,22 @@
         <w:pStyle w:val="Heading2"/>
       </w:pPr>
       <w:r>
-        <w:t>4.2. Phân Tích Ma Trận Nhầm Lẫn (Confusion Matrix)</w:t>
+        <w:t>4.3. Phân Tích Ma Trận Nhầm Lẫn (Confusion Matrix)</w:t>
       </w:r>
     </w:p>
     <w:p>
       <w:r>
-        <w:t>Ma trận nhầm lẫn của mô hình Decision Tree (Kịch bản Năm 1) ghi nhận trên 332 sinh viên kiểm thử gồm:</w:t>
+        <w:t>Ma trận nhầm lẫn của mô hình Cây quyết định trên 332 sinh viên kiểm thử (Hình 4.1) ghi nhận:</w:t>
         <w:br/>
-        <w:t>- True Negative (TN): 139 sinh viên thực tế xếp loại Trung bình-Yếu và mô hình dự đoán chính xác.</w:t>
+        <w:t>- True Negative (TN): 139 sinh viên thực tế xếp loại Trung bình-Yếu được dự đoán chính xác.</w:t>
         <w:br/>
-        <w:t>- True Positive (TP): 98 sinh viên thực tế xếp loại Khá-Giỏi và mô hình dự đoán chính xác.</w:t>
+        <w:t>- True Positive (TP): 98 sinh viên thực tế xếp loại Khá-Giỏi được dự đoán chính xác.</w:t>
         <w:br/>
-        <w:t>- False Positive (FP - Sai loại 1): 34 sinh viên thực tế Trung bình-Yếu nhưng mô hình đoán nhầm là Khá-Giỏi.</w:t>
+        <w:t>- False Positive (FP - Sai loại 1): 34 sinh viên thực tế Trung bình-Yếu nhưng mô hình dự đoán nhầm là Khá-Giỏi.</w:t>
         <w:br/>
-        <w:t>- False Negative (FN - Sai loại 2): 61 sinh viên thực tế Khá-Giỏi nhưng mô hình đoán nhầm là Trung bình-Yếu.</w:t>
+        <w:t>- False Negative (FN - Sai loại 2): 61 sinh viên thực tế Khá-Giỏi nhưng mô hình dự đoán nhầm là Trung bình-Yếu.</w:t>
         <w:br/>
-        <w:t>Mô hình đạt độ chuẩn xác Precision lớp Khá-Giỏi đạt 74.24%, chứng tỏ khi mô hình dự báo sinh viên sẽ đạt bằng Khá/Giỏi thì độ tin cậy đạt tới xấp xỉ 3/4.</w:t>
+        <w:t>Độ chuẩn xác Precision đạt 74.24%, bảo đảm độ tin cậy khi hệ thống đưa ra nhận định sinh viên sẽ đạt loại Khá/Giỏi.</w:t>
       </w:r>
     </w:p>
     <w:p>
@@ -1534,18 +2599,18 @@
         <w:pStyle w:val="Heading2"/>
       </w:pPr>
       <w:r>
-        <w:t>4.3. Phân Tích Cấu Trúc Cây Quyết Định &amp; Các Quy Tắc Phân Lớp</w:t>
+        <w:t>4.4. Phân Tích Cấu Trúc Cây Quyết Định &amp; Các Quy Tắc Phân Lớp</w:t>
       </w:r>
     </w:p>
     <w:p>
       <w:r>
-        <w:t>Trực quan hóa cấu trúc Cây quyết định (Hình 4.2) đem lại cái nhìn trong sáng về các điều kiện rẽ nhánh thực tế:</w:t>
+        <w:t>Cấu trúc Cây quyết định (Hình 4.2) thể hiện rõ ràng các điều kiện rẽ nhánh thực tế từ dữ liệu:</w:t>
         <w:br/>
-        <w:t>1. Nút gốc (Root Node): Thuật toán chọn môn 'Điện - Điện tử ô tô' với ngưỡng điểm 2.25 làm nút phân chia đầu tiên. Nếu sinh viên có điểm môn này &lt;= 2.25, xác suất rơi vào nhóm Trung bình-Yếu chiếm ưu thế áp đảo.</w:t>
+        <w:t>1. Nút gốc (Root Node): Thuật toán chọn môn 'Điện - Điện tử ô tô' với ngưỡng điểm 2.25 làm nút phân chia đầu tiên. Nếu điểm môn này &lt;= 2.25, xác suất sinh viên rơi vào nhóm Trung bình-Yếu chiếm ưu thế rõ rệt.</w:t>
         <w:br/>
-        <w:t>2. Tầng rẽ nhánh thứ hai: Tại nhánh điểm cao, thuật toán tiếp tục kiểm tra điểm môn 'Vật liệu học' (ngưỡng 2.75) và môn 'Tiếng Anh 2' (ngưỡng 2.25). Những sinh viên vượt qua cả hai ngưỡng này có xác suất đạt bằng Khá/Giỏi lên tới trên 85%.</w:t>
+        <w:t>2. Tầng rẽ nhánh kế tiếp: Tại nhánh điểm cao (&gt; 2.25), thuật toán tiếp tục kiểm tra điểm môn 'Vật liệu học' (ngưỡng 2.75) và môn 'Tiếng Anh 2' (ngưỡng 2.25). Những sinh viên vượt qua cả hai ngưỡng này có tỷ lệ đạt bằng Khá/Giỏi trên 85%.</w:t>
         <w:br/>
-        <w:t>Quy tắc này phản ánh trung thực thực tế đào tạo kỹ thuật: Sinh viên có tư duy kỹ thuật nền tảng và năng lực ngoại ngữ vững vàng ở năm 1 sẽ duy trì phong độ học tập rất ổn định ở các năm tiếp theo.</w:t>
+        <w:t>Quy tắc này phản ánh trung thực thực tế đào tạo kỹ thuật: Sinh viên có tư duy kỹ thuật nền tảng vững vàng và năng lực ngoại ngữ tốt ở năm 1 sẽ duy trì kết quả học tập rất ổn định ở các năm tiếp theo.</w:t>
       </w:r>
     </w:p>
     <w:p>
@@ -1593,7 +2658,7 @@
           <w:i/>
           <w:sz w:val="19"/>
         </w:rPr>
-        <w:t>Hình 4.2: Cấu trúc Cây quyết định dự đoán kết quả học tập sinh viên HaUI</w:t>
+        <w:t>Hình 4.2: Cấu trúc Cây quyết định dự đoán sớm kết quả học tập</w:t>
       </w:r>
     </w:p>
     <w:p>
@@ -1601,22 +2666,22 @@
         <w:pStyle w:val="Heading2"/>
       </w:pPr>
       <w:r>
-        <w:t>4.4. Xếp Hạng Mức Độ Quan Trọng Của Các Môn Học (Feature Importance)</w:t>
+        <w:t>4.5. Xếp Hạng Mức Độ Quan Trọng Của Các Môn Học Năm 1 (Feature Importance)</w:t>
       </w:r>
     </w:p>
     <w:p>
       <w:r>
-        <w:t>Mức độ quan trọng Gini (Gini Importance) của các môn học Năm 1 trong việc phân tách học lực sinh viên được mô tả ở Hình 4.3:</w:t>
+        <w:t>Mức độ quan trọng Gini (Gini Importance) của các môn học Năm 1 trong việc phân tách học lực sinh viên được thể hiện ở Hình 4.3:</w:t>
         <w:br/>
-        <w:t>- Điện - Điện tử ô tô (Automotive Electrical and Electronics): Đóng góp tới 44.46% trọng số phân loại, là môn học mang tính bản lề.</w:t>
+        <w:t>- Điện - Điện tử ô tô: Đóng góp 44.46% trọng số phân loại, là môn học mang tính bản lề hàng đầu.</w:t>
         <w:br/>
-        <w:t>- Vật liệu học (Materials Science): Đóng góp 24.85% trọng số.</w:t>
+        <w:t>- Vật liệu học: Đóng góp 24.85% trọng số.</w:t>
         <w:br/>
-        <w:t>- Tiếng Anh 2 (English 2): Đóng góp 21.97% trọng số, chứng minh tầm quan trọng sống còn của ngoại ngữ trong việc tiếp cận tài liệu kỹ thuật.</w:t>
+        <w:t>- Tiếng Anh 2: Đóng góp 21.97% trọng số, chứng minh vai trò then chốt của ngoại ngữ trong việc tiếp cận giáo trình chuyên ngành.</w:t>
         <w:br/>
-        <w:t>- Nhiệt kỹ thuật (Engineering Thermodynamics): Đóng góp 6.69%.</w:t>
+        <w:t>- Nhiệt kỹ thuật: Đóng góp 6.69%.</w:t>
         <w:br/>
-        <w:t>- Tiếng Anh 1 (English 1): Đóng góp 2.02%.</w:t>
+        <w:t>- Tiếng Anh 1: Đóng góp 2.02%.</w:t>
       </w:r>
     </w:p>
     <w:p>
@@ -1664,7 +2729,7 @@
           <w:i/>
           <w:sz w:val="19"/>
         </w:rPr>
-        <w:t>Hình 4.3: Top các môn học có mức độ ảnh hưởng lớn nhất đến kết quả học tập</w:t>
+        <w:t>Hình 4.3: Top các môn học Năm 1 có ảnh hưởng lớn nhất đến kết quả học tập</w:t>
       </w:r>
     </w:p>
     <w:p>
@@ -1672,1054 +2737,28 @@
         <w:pStyle w:val="Heading2"/>
       </w:pPr>
       <w:r>
-        <w:t>4.5. Khảo Sát Độ Sâu Cây (Tránh Hiện Tượng Overfitting)</w:t>
+        <w:t>4.6. Phân Tích Định Lượng Nguyên Nhân Dự Đoán Sai (Near-Threshold Error Analysis)</w:t>
       </w:r>
     </w:p>
     <w:p>
       <w:r>
-        <w:t>Nhằm tìm ra cấu hình cây tối ưu và minh họa định luật cân bằng Bias-Variance, nhóm đã khảo sát sự biến thiên của độ chính xác trên tập Train và tập Test khi thay đổi độ sâu max_depth từ 1 đến 8 (Bảng 4.2):</w:t>
-      </w:r>
-    </w:p>
-    <w:tbl>
-      <w:tblPr>
-        <w:tblW w:type="auto" w:w="0"/>
-        <w:jc w:val="center"/>
-        <w:tblLook w:firstColumn="1" w:firstRow="1" w:lastColumn="0" w:lastRow="0" w:noHBand="0" w:noVBand="1" w:val="04A0"/>
-      </w:tblPr>
-      <w:tblGrid>
-        <w:gridCol w:w="1987"/>
-        <w:gridCol w:w="1987"/>
-        <w:gridCol w:w="1987"/>
-        <w:gridCol w:w="1987"/>
-        <w:gridCol w:w="1987"/>
-      </w:tblGrid>
-      <w:tr>
-        <w:tc>
-          <w:tcPr>
-            <w:tcW w:type="dxa" w:w="1987"/>
-            <w:shd w:fill="2980B9"/>
-            <w:tcMar>
-              <w:top w:w="80" w:type="dxa"/>
-              <w:bottom w:w="80" w:type="dxa"/>
-              <w:left w:w="100" w:type="dxa"/>
-              <w:right w:w="100" w:type="dxa"/>
-            </w:tcMar>
-          </w:tcPr>
-          <w:p>
-            <w:pPr>
-              <w:jc w:val="center"/>
-            </w:pPr>
-            <w:r>
-              <w:rPr>
-                <w:b/>
-                <w:color w:val="FFFFFF"/>
-                <w:sz w:val="18"/>
-              </w:rPr>
-              <w:t>Độ Sâu (max_depth)</w:t>
-            </w:r>
-          </w:p>
-        </w:tc>
-        <w:tc>
-          <w:tcPr>
-            <w:tcW w:type="dxa" w:w="1987"/>
-            <w:shd w:fill="2980B9"/>
-            <w:tcMar>
-              <w:top w:w="80" w:type="dxa"/>
-              <w:bottom w:w="80" w:type="dxa"/>
-              <w:left w:w="100" w:type="dxa"/>
-              <w:right w:w="100" w:type="dxa"/>
-            </w:tcMar>
-          </w:tcPr>
-          <w:p>
-            <w:pPr>
-              <w:jc w:val="center"/>
-            </w:pPr>
-            <w:r>
-              <w:rPr>
-                <w:b/>
-                <w:color w:val="FFFFFF"/>
-                <w:sz w:val="18"/>
-              </w:rPr>
-              <w:t>Train Accuracy</w:t>
-            </w:r>
-          </w:p>
-        </w:tc>
-        <w:tc>
-          <w:tcPr>
-            <w:tcW w:type="dxa" w:w="1987"/>
-            <w:shd w:fill="2980B9"/>
-            <w:tcMar>
-              <w:top w:w="80" w:type="dxa"/>
-              <w:bottom w:w="80" w:type="dxa"/>
-              <w:left w:w="100" w:type="dxa"/>
-              <w:right w:w="100" w:type="dxa"/>
-            </w:tcMar>
-          </w:tcPr>
-          <w:p>
-            <w:pPr>
-              <w:jc w:val="center"/>
-            </w:pPr>
-            <w:r>
-              <w:rPr>
-                <w:b/>
-                <w:color w:val="FFFFFF"/>
-                <w:sz w:val="18"/>
-              </w:rPr>
-              <w:t>Test Accuracy</w:t>
-            </w:r>
-          </w:p>
-        </w:tc>
-        <w:tc>
-          <w:tcPr>
-            <w:tcW w:type="dxa" w:w="1987"/>
-            <w:shd w:fill="2980B9"/>
-            <w:tcMar>
-              <w:top w:w="80" w:type="dxa"/>
-              <w:bottom w:w="80" w:type="dxa"/>
-              <w:left w:w="100" w:type="dxa"/>
-              <w:right w:w="100" w:type="dxa"/>
-            </w:tcMar>
-          </w:tcPr>
-          <w:p>
-            <w:pPr>
-              <w:jc w:val="center"/>
-            </w:pPr>
-            <w:r>
-              <w:rPr>
-                <w:b/>
-                <w:color w:val="FFFFFF"/>
-                <w:sz w:val="18"/>
-              </w:rPr>
-              <w:t>Khoảng Cách (Gap)</w:t>
-            </w:r>
-          </w:p>
-        </w:tc>
-        <w:tc>
-          <w:tcPr>
-            <w:tcW w:type="dxa" w:w="1987"/>
-            <w:shd w:fill="2980B9"/>
-            <w:tcMar>
-              <w:top w:w="80" w:type="dxa"/>
-              <w:bottom w:w="80" w:type="dxa"/>
-              <w:left w:w="100" w:type="dxa"/>
-              <w:right w:w="100" w:type="dxa"/>
-            </w:tcMar>
-          </w:tcPr>
-          <w:p>
-            <w:pPr>
-              <w:jc w:val="center"/>
-            </w:pPr>
-            <w:r>
-              <w:rPr>
-                <w:b/>
-                <w:color w:val="FFFFFF"/>
-                <w:sz w:val="18"/>
-              </w:rPr>
-              <w:t>Nhận Xét Học Thuật</w:t>
-            </w:r>
-          </w:p>
-        </w:tc>
-      </w:tr>
-      <w:tr>
-        <w:tc>
-          <w:tcPr>
-            <w:tcW w:type="dxa" w:w="1987"/>
-            <w:tcMar>
-              <w:top w:w="60" w:type="dxa"/>
-              <w:bottom w:w="60" w:type="dxa"/>
-              <w:left w:w="80" w:type="dxa"/>
-              <w:right w:w="80" w:type="dxa"/>
-            </w:tcMar>
-          </w:tcPr>
-          <w:p>
-            <w:pPr>
-              <w:jc w:val="center"/>
-            </w:pPr>
-            <w:r>
-              <w:rPr>
-                <w:sz w:val="18"/>
-              </w:rPr>
-              <w:t>1</w:t>
-            </w:r>
-          </w:p>
-        </w:tc>
-        <w:tc>
-          <w:tcPr>
-            <w:tcW w:type="dxa" w:w="1987"/>
-            <w:tcMar>
-              <w:top w:w="60" w:type="dxa"/>
-              <w:bottom w:w="60" w:type="dxa"/>
-              <w:left w:w="80" w:type="dxa"/>
-              <w:right w:w="80" w:type="dxa"/>
-            </w:tcMar>
-          </w:tcPr>
-          <w:p>
-            <w:pPr>
-              <w:jc w:val="center"/>
-            </w:pPr>
-            <w:r>
-              <w:rPr>
-                <w:sz w:val="18"/>
-              </w:rPr>
-              <w:t>66.69%</w:t>
-            </w:r>
-          </w:p>
-        </w:tc>
-        <w:tc>
-          <w:tcPr>
-            <w:tcW w:type="dxa" w:w="1987"/>
-            <w:tcMar>
-              <w:top w:w="60" w:type="dxa"/>
-              <w:bottom w:w="60" w:type="dxa"/>
-              <w:left w:w="80" w:type="dxa"/>
-              <w:right w:w="80" w:type="dxa"/>
-            </w:tcMar>
-          </w:tcPr>
-          <w:p>
-            <w:pPr>
-              <w:jc w:val="center"/>
-            </w:pPr>
-            <w:r>
-              <w:rPr>
-                <w:sz w:val="18"/>
-              </w:rPr>
-              <w:t>68.67%</w:t>
-            </w:r>
-          </w:p>
-        </w:tc>
-        <w:tc>
-          <w:tcPr>
-            <w:tcW w:type="dxa" w:w="1987"/>
-            <w:tcMar>
-              <w:top w:w="60" w:type="dxa"/>
-              <w:bottom w:w="60" w:type="dxa"/>
-              <w:left w:w="80" w:type="dxa"/>
-              <w:right w:w="80" w:type="dxa"/>
-            </w:tcMar>
-          </w:tcPr>
-          <w:p>
-            <w:pPr>
-              <w:jc w:val="center"/>
-            </w:pPr>
-            <w:r>
-              <w:rPr>
-                <w:sz w:val="18"/>
-              </w:rPr>
-              <w:t>-1.98%</w:t>
-            </w:r>
-          </w:p>
-        </w:tc>
-        <w:tc>
-          <w:tcPr>
-            <w:tcW w:type="dxa" w:w="1987"/>
-            <w:tcMar>
-              <w:top w:w="60" w:type="dxa"/>
-              <w:bottom w:w="60" w:type="dxa"/>
-              <w:left w:w="80" w:type="dxa"/>
-              <w:right w:w="80" w:type="dxa"/>
-            </w:tcMar>
-          </w:tcPr>
-          <w:p>
-            <w:r>
-              <w:rPr>
-                <w:sz w:val="18"/>
-              </w:rPr>
-              <w:t>Dưới khớp (Underfitting), cây quá nông</w:t>
-            </w:r>
-          </w:p>
-        </w:tc>
-      </w:tr>
-      <w:tr>
-        <w:tc>
-          <w:tcPr>
-            <w:tcW w:type="dxa" w:w="1987"/>
-            <w:tcMar>
-              <w:top w:w="60" w:type="dxa"/>
-              <w:bottom w:w="60" w:type="dxa"/>
-              <w:left w:w="80" w:type="dxa"/>
-              <w:right w:w="80" w:type="dxa"/>
-            </w:tcMar>
-          </w:tcPr>
-          <w:p>
-            <w:pPr>
-              <w:jc w:val="center"/>
-            </w:pPr>
-            <w:r>
-              <w:rPr>
-                <w:sz w:val="18"/>
-              </w:rPr>
-              <w:t>2</w:t>
-            </w:r>
-          </w:p>
-        </w:tc>
-        <w:tc>
-          <w:tcPr>
-            <w:tcW w:type="dxa" w:w="1987"/>
-            <w:tcMar>
-              <w:top w:w="60" w:type="dxa"/>
-              <w:bottom w:w="60" w:type="dxa"/>
-              <w:left w:w="80" w:type="dxa"/>
-              <w:right w:w="80" w:type="dxa"/>
-            </w:tcMar>
-          </w:tcPr>
-          <w:p>
-            <w:pPr>
-              <w:jc w:val="center"/>
-            </w:pPr>
-            <w:r>
-              <w:rPr>
-                <w:sz w:val="18"/>
-              </w:rPr>
-              <w:t>68.58%</w:t>
-            </w:r>
-          </w:p>
-        </w:tc>
-        <w:tc>
-          <w:tcPr>
-            <w:tcW w:type="dxa" w:w="1987"/>
-            <w:tcMar>
-              <w:top w:w="60" w:type="dxa"/>
-              <w:bottom w:w="60" w:type="dxa"/>
-              <w:left w:w="80" w:type="dxa"/>
-              <w:right w:w="80" w:type="dxa"/>
-            </w:tcMar>
-          </w:tcPr>
-          <w:p>
-            <w:pPr>
-              <w:jc w:val="center"/>
-            </w:pPr>
-            <w:r>
-              <w:rPr>
-                <w:sz w:val="18"/>
-              </w:rPr>
-              <w:t>68.67%</w:t>
-            </w:r>
-          </w:p>
-        </w:tc>
-        <w:tc>
-          <w:tcPr>
-            <w:tcW w:type="dxa" w:w="1987"/>
-            <w:tcMar>
-              <w:top w:w="60" w:type="dxa"/>
-              <w:bottom w:w="60" w:type="dxa"/>
-              <w:left w:w="80" w:type="dxa"/>
-              <w:right w:w="80" w:type="dxa"/>
-            </w:tcMar>
-          </w:tcPr>
-          <w:p>
-            <w:pPr>
-              <w:jc w:val="center"/>
-            </w:pPr>
-            <w:r>
-              <w:rPr>
-                <w:sz w:val="18"/>
-              </w:rPr>
-              <w:t>-0.09%</w:t>
-            </w:r>
-          </w:p>
-        </w:tc>
-        <w:tc>
-          <w:tcPr>
-            <w:tcW w:type="dxa" w:w="1987"/>
-            <w:tcMar>
-              <w:top w:w="60" w:type="dxa"/>
-              <w:bottom w:w="60" w:type="dxa"/>
-              <w:left w:w="80" w:type="dxa"/>
-              <w:right w:w="80" w:type="dxa"/>
-            </w:tcMar>
-          </w:tcPr>
-          <w:p>
-            <w:r>
-              <w:rPr>
-                <w:sz w:val="18"/>
-              </w:rPr>
-              <w:t>Dưới khớp, chưa nắm bắt đủ đặc trưng</w:t>
-            </w:r>
-          </w:p>
-        </w:tc>
-      </w:tr>
-      <w:tr>
-        <w:tc>
-          <w:tcPr>
-            <w:tcW w:type="dxa" w:w="1987"/>
-            <w:tcMar>
-              <w:top w:w="60" w:type="dxa"/>
-              <w:bottom w:w="60" w:type="dxa"/>
-              <w:left w:w="80" w:type="dxa"/>
-              <w:right w:w="80" w:type="dxa"/>
-            </w:tcMar>
-          </w:tcPr>
-          <w:p>
-            <w:pPr>
-              <w:jc w:val="center"/>
-            </w:pPr>
-            <w:r>
-              <w:rPr>
-                <w:sz w:val="18"/>
-              </w:rPr>
-              <w:t>3</w:t>
-            </w:r>
-          </w:p>
-        </w:tc>
-        <w:tc>
-          <w:tcPr>
-            <w:tcW w:type="dxa" w:w="1987"/>
-            <w:tcMar>
-              <w:top w:w="60" w:type="dxa"/>
-              <w:bottom w:w="60" w:type="dxa"/>
-              <w:left w:w="80" w:type="dxa"/>
-              <w:right w:w="80" w:type="dxa"/>
-            </w:tcMar>
-          </w:tcPr>
-          <w:p>
-            <w:pPr>
-              <w:jc w:val="center"/>
-            </w:pPr>
-            <w:r>
-              <w:rPr>
-                <w:sz w:val="18"/>
-              </w:rPr>
-              <w:t>74.92%</w:t>
-            </w:r>
-          </w:p>
-        </w:tc>
-        <w:tc>
-          <w:tcPr>
-            <w:tcW w:type="dxa" w:w="1987"/>
-            <w:tcMar>
-              <w:top w:w="60" w:type="dxa"/>
-              <w:bottom w:w="60" w:type="dxa"/>
-              <w:left w:w="80" w:type="dxa"/>
-              <w:right w:w="80" w:type="dxa"/>
-            </w:tcMar>
-          </w:tcPr>
-          <w:p>
-            <w:pPr>
-              <w:jc w:val="center"/>
-            </w:pPr>
-            <w:r>
-              <w:rPr>
-                <w:sz w:val="18"/>
-              </w:rPr>
-              <w:t>71.39%</w:t>
-            </w:r>
-          </w:p>
-        </w:tc>
-        <w:tc>
-          <w:tcPr>
-            <w:tcW w:type="dxa" w:w="1987"/>
-            <w:tcMar>
-              <w:top w:w="60" w:type="dxa"/>
-              <w:bottom w:w="60" w:type="dxa"/>
-              <w:left w:w="80" w:type="dxa"/>
-              <w:right w:w="80" w:type="dxa"/>
-            </w:tcMar>
-          </w:tcPr>
-          <w:p>
-            <w:pPr>
-              <w:jc w:val="center"/>
-            </w:pPr>
-            <w:r>
-              <w:rPr>
-                <w:sz w:val="18"/>
-              </w:rPr>
-              <w:t>+3.54%</w:t>
-            </w:r>
-          </w:p>
-        </w:tc>
-        <w:tc>
-          <w:tcPr>
-            <w:tcW w:type="dxa" w:w="1987"/>
-            <w:tcMar>
-              <w:top w:w="60" w:type="dxa"/>
-              <w:bottom w:w="60" w:type="dxa"/>
-              <w:left w:w="80" w:type="dxa"/>
-              <w:right w:w="80" w:type="dxa"/>
-            </w:tcMar>
-          </w:tcPr>
-          <w:p>
-            <w:r>
-              <w:rPr>
-                <w:sz w:val="18"/>
-              </w:rPr>
-              <w:t>Điểm cân bằng tối ưu, cây sáng sủa dễ giải thích</w:t>
-            </w:r>
-          </w:p>
-        </w:tc>
-      </w:tr>
-      <w:tr>
-        <w:tc>
-          <w:tcPr>
-            <w:tcW w:type="dxa" w:w="1987"/>
-            <w:tcMar>
-              <w:top w:w="60" w:type="dxa"/>
-              <w:bottom w:w="60" w:type="dxa"/>
-              <w:left w:w="80" w:type="dxa"/>
-              <w:right w:w="80" w:type="dxa"/>
-            </w:tcMar>
-          </w:tcPr>
-          <w:p>
-            <w:pPr>
-              <w:jc w:val="center"/>
-            </w:pPr>
-            <w:r>
-              <w:rPr>
-                <w:sz w:val="18"/>
-              </w:rPr>
-              <w:t>4</w:t>
-            </w:r>
-          </w:p>
-        </w:tc>
-        <w:tc>
-          <w:tcPr>
-            <w:tcW w:type="dxa" w:w="1987"/>
-            <w:tcMar>
-              <w:top w:w="60" w:type="dxa"/>
-              <w:bottom w:w="60" w:type="dxa"/>
-              <w:left w:w="80" w:type="dxa"/>
-              <w:right w:w="80" w:type="dxa"/>
-            </w:tcMar>
-          </w:tcPr>
-          <w:p>
-            <w:pPr>
-              <w:jc w:val="center"/>
-            </w:pPr>
-            <w:r>
-              <w:rPr>
-                <w:sz w:val="18"/>
-              </w:rPr>
-              <w:t>76.13%</w:t>
-            </w:r>
-          </w:p>
-        </w:tc>
-        <w:tc>
-          <w:tcPr>
-            <w:tcW w:type="dxa" w:w="1987"/>
-            <w:tcMar>
-              <w:top w:w="60" w:type="dxa"/>
-              <w:bottom w:w="60" w:type="dxa"/>
-              <w:left w:w="80" w:type="dxa"/>
-              <w:right w:w="80" w:type="dxa"/>
-            </w:tcMar>
-          </w:tcPr>
-          <w:p>
-            <w:pPr>
-              <w:jc w:val="center"/>
-            </w:pPr>
-            <w:r>
-              <w:rPr>
-                <w:sz w:val="18"/>
-              </w:rPr>
-              <w:t>74.40%</w:t>
-            </w:r>
-          </w:p>
-        </w:tc>
-        <w:tc>
-          <w:tcPr>
-            <w:tcW w:type="dxa" w:w="1987"/>
-            <w:tcMar>
-              <w:top w:w="60" w:type="dxa"/>
-              <w:bottom w:w="60" w:type="dxa"/>
-              <w:left w:w="80" w:type="dxa"/>
-              <w:right w:w="80" w:type="dxa"/>
-            </w:tcMar>
-          </w:tcPr>
-          <w:p>
-            <w:pPr>
-              <w:jc w:val="center"/>
-            </w:pPr>
-            <w:r>
-              <w:rPr>
-                <w:sz w:val="18"/>
-              </w:rPr>
-              <w:t>+1.74%</w:t>
-            </w:r>
-          </w:p>
-        </w:tc>
-        <w:tc>
-          <w:tcPr>
-            <w:tcW w:type="dxa" w:w="1987"/>
-            <w:tcMar>
-              <w:top w:w="60" w:type="dxa"/>
-              <w:bottom w:w="60" w:type="dxa"/>
-              <w:left w:w="80" w:type="dxa"/>
-              <w:right w:w="80" w:type="dxa"/>
-            </w:tcMar>
-          </w:tcPr>
-          <w:p>
-            <w:r>
-              <w:rPr>
-                <w:sz w:val="18"/>
-              </w:rPr>
-              <w:t>Độ chính xác Test cao nhất (74.40%)</w:t>
-            </w:r>
-          </w:p>
-        </w:tc>
-      </w:tr>
-      <w:tr>
-        <w:tc>
-          <w:tcPr>
-            <w:tcW w:type="dxa" w:w="1987"/>
-            <w:tcMar>
-              <w:top w:w="60" w:type="dxa"/>
-              <w:bottom w:w="60" w:type="dxa"/>
-              <w:left w:w="80" w:type="dxa"/>
-              <w:right w:w="80" w:type="dxa"/>
-            </w:tcMar>
-          </w:tcPr>
-          <w:p>
-            <w:pPr>
-              <w:jc w:val="center"/>
-            </w:pPr>
-            <w:r>
-              <w:rPr>
-                <w:sz w:val="18"/>
-              </w:rPr>
-              <w:t>5</w:t>
-            </w:r>
-          </w:p>
-        </w:tc>
-        <w:tc>
-          <w:tcPr>
-            <w:tcW w:type="dxa" w:w="1987"/>
-            <w:tcMar>
-              <w:top w:w="60" w:type="dxa"/>
-              <w:bottom w:w="60" w:type="dxa"/>
-              <w:left w:w="80" w:type="dxa"/>
-              <w:right w:w="80" w:type="dxa"/>
-            </w:tcMar>
-          </w:tcPr>
-          <w:p>
-            <w:pPr>
-              <w:jc w:val="center"/>
-            </w:pPr>
-            <w:r>
-              <w:rPr>
-                <w:sz w:val="18"/>
-              </w:rPr>
-              <w:t>77.79%</w:t>
-            </w:r>
-          </w:p>
-        </w:tc>
-        <w:tc>
-          <w:tcPr>
-            <w:tcW w:type="dxa" w:w="1987"/>
-            <w:tcMar>
-              <w:top w:w="60" w:type="dxa"/>
-              <w:bottom w:w="60" w:type="dxa"/>
-              <w:left w:w="80" w:type="dxa"/>
-              <w:right w:w="80" w:type="dxa"/>
-            </w:tcMar>
-          </w:tcPr>
-          <w:p>
-            <w:pPr>
-              <w:jc w:val="center"/>
-            </w:pPr>
-            <w:r>
-              <w:rPr>
-                <w:sz w:val="18"/>
-              </w:rPr>
-              <w:t>71.99%</w:t>
-            </w:r>
-          </w:p>
-        </w:tc>
-        <w:tc>
-          <w:tcPr>
-            <w:tcW w:type="dxa" w:w="1987"/>
-            <w:tcMar>
-              <w:top w:w="60" w:type="dxa"/>
-              <w:bottom w:w="60" w:type="dxa"/>
-              <w:left w:w="80" w:type="dxa"/>
-              <w:right w:w="80" w:type="dxa"/>
-            </w:tcMar>
-          </w:tcPr>
-          <w:p>
-            <w:pPr>
-              <w:jc w:val="center"/>
-            </w:pPr>
-            <w:r>
-              <w:rPr>
-                <w:sz w:val="18"/>
-              </w:rPr>
-              <w:t>+5.81%</w:t>
-            </w:r>
-          </w:p>
-        </w:tc>
-        <w:tc>
-          <w:tcPr>
-            <w:tcW w:type="dxa" w:w="1987"/>
-            <w:tcMar>
-              <w:top w:w="60" w:type="dxa"/>
-              <w:bottom w:w="60" w:type="dxa"/>
-              <w:left w:w="80" w:type="dxa"/>
-              <w:right w:w="80" w:type="dxa"/>
-            </w:tcMar>
-          </w:tcPr>
-          <w:p>
-            <w:r>
-              <w:rPr>
-                <w:sz w:val="18"/>
-              </w:rPr>
-              <w:t>Bắt đầu xuất hiện phân nhánh dư thừa</w:t>
-            </w:r>
-          </w:p>
-        </w:tc>
-      </w:tr>
-      <w:tr>
-        <w:tc>
-          <w:tcPr>
-            <w:tcW w:type="dxa" w:w="1987"/>
-            <w:tcMar>
-              <w:top w:w="60" w:type="dxa"/>
-              <w:bottom w:w="60" w:type="dxa"/>
-              <w:left w:w="80" w:type="dxa"/>
-              <w:right w:w="80" w:type="dxa"/>
-            </w:tcMar>
-          </w:tcPr>
-          <w:p>
-            <w:pPr>
-              <w:jc w:val="center"/>
-            </w:pPr>
-            <w:r>
-              <w:rPr>
-                <w:sz w:val="18"/>
-              </w:rPr>
-              <w:t>6</w:t>
-            </w:r>
-          </w:p>
-        </w:tc>
-        <w:tc>
-          <w:tcPr>
-            <w:tcW w:type="dxa" w:w="1987"/>
-            <w:tcMar>
-              <w:top w:w="60" w:type="dxa"/>
-              <w:bottom w:w="60" w:type="dxa"/>
-              <w:left w:w="80" w:type="dxa"/>
-              <w:right w:w="80" w:type="dxa"/>
-            </w:tcMar>
-          </w:tcPr>
-          <w:p>
-            <w:pPr>
-              <w:jc w:val="center"/>
-            </w:pPr>
-            <w:r>
-              <w:rPr>
-                <w:sz w:val="18"/>
-              </w:rPr>
-              <w:t>80.21%</w:t>
-            </w:r>
-          </w:p>
-        </w:tc>
-        <w:tc>
-          <w:tcPr>
-            <w:tcW w:type="dxa" w:w="1987"/>
-            <w:tcMar>
-              <w:top w:w="60" w:type="dxa"/>
-              <w:bottom w:w="60" w:type="dxa"/>
-              <w:left w:w="80" w:type="dxa"/>
-              <w:right w:w="80" w:type="dxa"/>
-            </w:tcMar>
-          </w:tcPr>
-          <w:p>
-            <w:pPr>
-              <w:jc w:val="center"/>
-            </w:pPr>
-            <w:r>
-              <w:rPr>
-                <w:sz w:val="18"/>
-              </w:rPr>
-              <w:t>71.39%</w:t>
-            </w:r>
-          </w:p>
-        </w:tc>
-        <w:tc>
-          <w:tcPr>
-            <w:tcW w:type="dxa" w:w="1987"/>
-            <w:tcMar>
-              <w:top w:w="60" w:type="dxa"/>
-              <w:bottom w:w="60" w:type="dxa"/>
-              <w:left w:w="80" w:type="dxa"/>
-              <w:right w:w="80" w:type="dxa"/>
-            </w:tcMar>
-          </w:tcPr>
-          <w:p>
-            <w:pPr>
-              <w:jc w:val="center"/>
-            </w:pPr>
-            <w:r>
-              <w:rPr>
-                <w:sz w:val="18"/>
-              </w:rPr>
-              <w:t>+8.83%</w:t>
-            </w:r>
-          </w:p>
-        </w:tc>
-        <w:tc>
-          <w:tcPr>
-            <w:tcW w:type="dxa" w:w="1987"/>
-            <w:tcMar>
-              <w:top w:w="60" w:type="dxa"/>
-              <w:bottom w:w="60" w:type="dxa"/>
-              <w:left w:w="80" w:type="dxa"/>
-              <w:right w:w="80" w:type="dxa"/>
-            </w:tcMar>
-          </w:tcPr>
-          <w:p>
-            <w:r>
-              <w:rPr>
-                <w:sz w:val="18"/>
-              </w:rPr>
-              <w:t>Bắt đầu quá khớp, độ chính xác test giảm</w:t>
-            </w:r>
-          </w:p>
-        </w:tc>
-      </w:tr>
-      <w:tr>
-        <w:tc>
-          <w:tcPr>
-            <w:tcW w:type="dxa" w:w="1987"/>
-            <w:tcMar>
-              <w:top w:w="60" w:type="dxa"/>
-              <w:bottom w:w="60" w:type="dxa"/>
-              <w:left w:w="80" w:type="dxa"/>
-              <w:right w:w="80" w:type="dxa"/>
-            </w:tcMar>
-          </w:tcPr>
-          <w:p>
-            <w:pPr>
-              <w:jc w:val="center"/>
-            </w:pPr>
-            <w:r>
-              <w:rPr>
-                <w:sz w:val="18"/>
-              </w:rPr>
-              <w:t>7</w:t>
-            </w:r>
-          </w:p>
-        </w:tc>
-        <w:tc>
-          <w:tcPr>
-            <w:tcW w:type="dxa" w:w="1987"/>
-            <w:tcMar>
-              <w:top w:w="60" w:type="dxa"/>
-              <w:bottom w:w="60" w:type="dxa"/>
-              <w:left w:w="80" w:type="dxa"/>
-              <w:right w:w="80" w:type="dxa"/>
-            </w:tcMar>
-          </w:tcPr>
-          <w:p>
-            <w:pPr>
-              <w:jc w:val="center"/>
-            </w:pPr>
-            <w:r>
-              <w:rPr>
-                <w:sz w:val="18"/>
-              </w:rPr>
-              <w:t>81.95%</w:t>
-            </w:r>
-          </w:p>
-        </w:tc>
-        <w:tc>
-          <w:tcPr>
-            <w:tcW w:type="dxa" w:w="1987"/>
-            <w:tcMar>
-              <w:top w:w="60" w:type="dxa"/>
-              <w:bottom w:w="60" w:type="dxa"/>
-              <w:left w:w="80" w:type="dxa"/>
-              <w:right w:w="80" w:type="dxa"/>
-            </w:tcMar>
-          </w:tcPr>
-          <w:p>
-            <w:pPr>
-              <w:jc w:val="center"/>
-            </w:pPr>
-            <w:r>
-              <w:rPr>
-                <w:sz w:val="18"/>
-              </w:rPr>
-              <w:t>71.69%</w:t>
-            </w:r>
-          </w:p>
-        </w:tc>
-        <w:tc>
-          <w:tcPr>
-            <w:tcW w:type="dxa" w:w="1987"/>
-            <w:tcMar>
-              <w:top w:w="60" w:type="dxa"/>
-              <w:bottom w:w="60" w:type="dxa"/>
-              <w:left w:w="80" w:type="dxa"/>
-              <w:right w:w="80" w:type="dxa"/>
-            </w:tcMar>
-          </w:tcPr>
-          <w:p>
-            <w:pPr>
-              <w:jc w:val="center"/>
-            </w:pPr>
-            <w:r>
-              <w:rPr>
-                <w:sz w:val="18"/>
-              </w:rPr>
-              <w:t>+10.26%</w:t>
-            </w:r>
-          </w:p>
-        </w:tc>
-        <w:tc>
-          <w:tcPr>
-            <w:tcW w:type="dxa" w:w="1987"/>
-            <w:tcMar>
-              <w:top w:w="60" w:type="dxa"/>
-              <w:bottom w:w="60" w:type="dxa"/>
-              <w:left w:w="80" w:type="dxa"/>
-              <w:right w:w="80" w:type="dxa"/>
-            </w:tcMar>
-          </w:tcPr>
-          <w:p>
-            <w:r>
-              <w:rPr>
-                <w:sz w:val="18"/>
-              </w:rPr>
-              <w:t>Khoảng cách Train-Test vượt ngưỡng 10%</w:t>
-            </w:r>
-          </w:p>
-        </w:tc>
-      </w:tr>
-      <w:tr>
-        <w:tc>
-          <w:tcPr>
-            <w:tcW w:type="dxa" w:w="1987"/>
-            <w:tcMar>
-              <w:top w:w="60" w:type="dxa"/>
-              <w:bottom w:w="60" w:type="dxa"/>
-              <w:left w:w="80" w:type="dxa"/>
-              <w:right w:w="80" w:type="dxa"/>
-            </w:tcMar>
-          </w:tcPr>
-          <w:p>
-            <w:pPr>
-              <w:jc w:val="center"/>
-            </w:pPr>
-            <w:r>
-              <w:rPr>
-                <w:sz w:val="18"/>
-              </w:rPr>
-              <w:t>8</w:t>
-            </w:r>
-          </w:p>
-        </w:tc>
-        <w:tc>
-          <w:tcPr>
-            <w:tcW w:type="dxa" w:w="1987"/>
-            <w:tcMar>
-              <w:top w:w="60" w:type="dxa"/>
-              <w:bottom w:w="60" w:type="dxa"/>
-              <w:left w:w="80" w:type="dxa"/>
-              <w:right w:w="80" w:type="dxa"/>
-            </w:tcMar>
-          </w:tcPr>
-          <w:p>
-            <w:pPr>
-              <w:jc w:val="center"/>
-            </w:pPr>
-            <w:r>
-              <w:rPr>
-                <w:sz w:val="18"/>
-              </w:rPr>
-              <w:t>82.10%</w:t>
-            </w:r>
-          </w:p>
-        </w:tc>
-        <w:tc>
-          <w:tcPr>
-            <w:tcW w:type="dxa" w:w="1987"/>
-            <w:tcMar>
-              <w:top w:w="60" w:type="dxa"/>
-              <w:bottom w:w="60" w:type="dxa"/>
-              <w:left w:w="80" w:type="dxa"/>
-              <w:right w:w="80" w:type="dxa"/>
-            </w:tcMar>
-          </w:tcPr>
-          <w:p>
-            <w:pPr>
-              <w:jc w:val="center"/>
-            </w:pPr>
-            <w:r>
-              <w:rPr>
-                <w:sz w:val="18"/>
-              </w:rPr>
-              <w:t>71.39%</w:t>
-            </w:r>
-          </w:p>
-        </w:tc>
-        <w:tc>
-          <w:tcPr>
-            <w:tcW w:type="dxa" w:w="1987"/>
-            <w:tcMar>
-              <w:top w:w="60" w:type="dxa"/>
-              <w:bottom w:w="60" w:type="dxa"/>
-              <w:left w:w="80" w:type="dxa"/>
-              <w:right w:w="80" w:type="dxa"/>
-            </w:tcMar>
-          </w:tcPr>
-          <w:p>
-            <w:pPr>
-              <w:jc w:val="center"/>
-            </w:pPr>
-            <w:r>
-              <w:rPr>
-                <w:sz w:val="18"/>
-              </w:rPr>
-              <w:t>+10.71%</w:t>
-            </w:r>
-          </w:p>
-        </w:tc>
-        <w:tc>
-          <w:tcPr>
-            <w:tcW w:type="dxa" w:w="1987"/>
-            <w:tcMar>
-              <w:top w:w="60" w:type="dxa"/>
-              <w:bottom w:w="60" w:type="dxa"/>
-              <w:left w:w="80" w:type="dxa"/>
-              <w:right w:w="80" w:type="dxa"/>
-            </w:tcMar>
-          </w:tcPr>
-          <w:p>
-            <w:r>
-              <w:rPr>
-                <w:sz w:val="18"/>
-              </w:rPr>
-              <w:t>Quá khớp rõ rệt (Overfitting), học thuộc lòng tập Train</w:t>
-            </w:r>
-          </w:p>
-        </w:tc>
-      </w:tr>
-    </w:tbl>
-    <w:p>
-      <w:pPr>
-        <w:jc w:val="center"/>
-      </w:pPr>
-      <w:r>
-        <w:rPr>
-          <w:i/>
-          <w:sz w:val="19"/>
-        </w:rPr>
-        <w:t>Bảng 4.2: Khảo sát ảnh hưởng của max_depth đến hiện tượng Overfitting</w:t>
-      </w:r>
-    </w:p>
-    <w:p>
-      <w:pPr>
-        <w:pStyle w:val="Heading2"/>
-      </w:pPr>
-      <w:r>
-        <w:t>4.6. Phân Tích Nguyên Nhân Dự Đoán Sai (Error Analysis)</w:t>
-      </w:r>
-    </w:p>
-    <w:p>
-      <w:r>
-        <w:t>Tổng cộng có 95 ca dự đoán sai trên 332 mẫu kiểm thử (28.61% sai số):</w:t>
+        <w:t>Tổng cộng có 95 ca dự đoán sai trên 332 mẫu kiểm thử (28.61% sai số toàn cục). Thay vì đưa ra các phỏng đoán cảm tính ngoài phạm vi dữ liệu, tác giả đã tiến hành phân tích định lượng phân bố điểm GPA của các ca sai:</w:t>
         <w:br/>
-        <w:t>1. Lỗi False Positive (34 ca): Sinh viên thực tế có GPA &lt; 2.5 nhưng mô hình đoán là Khá-Giỏi. Khảo sát chi tiết cho thấy các sinh viên này có điểm năm nhất khá tốt ở các môn lý thuyết nhưng sa sút mạnh ở các học kỳ cuối do gặp khó khăn ở các đồ án chuyên ngành nặng tính thực hành xưởng hoặc do lơ là khi đi làm thêm.</w:t>
+        <w:t>1. Phân tích nhóm False Positive (34 ca - Thực tế TB-Yếu nhưng đoán Khá-Giỏi):</w:t>
         <w:br/>
-        <w:t>2. Lỗi False Negative (61 ca): Sinh viên thực tế đạt Khá-Giỏi nhưng mô hình đoán là Trung bình-Yếu. Đây là nhóm sinh viên 'bứt phá': năm thứ nhất bị bỡ ngỡ với phương pháp học đại học nên điểm môn cơ sở thấp, nhưng từ năm thứ hai đã nỗ lực cải thiện phương pháp học tập và giành điểm cao ở các môn chuyên ngành và khóa luận tốt nghiệp.</w:t>
+        <w:t xml:space="preserve">   - Điểm GPA trung vị thực tế của nhóm này đạt 2.388 (trung bình: 2.306).</w:t>
+        <w:br/>
+        <w:t xml:space="preserve">   - Trong đó có tới 24 / 34 sinh viên (70.59%) có GPA &gt;= 2.30, tức chỉ kém ngưỡng phân định 2.50 từ 0.05 đến 0.20 điểm.</w:t>
+        <w:br/>
+        <w:t>2. Phân tích nhóm False Negative (61 ca - Thực tế Khá-Giỏi nhưng đoán TB-Yếu):</w:t>
+        <w:br/>
+        <w:t xml:space="preserve">   - Điểm GPA trung vị thực tế của nhóm này đạt 2.595 (trung bình: 2.643).</w:t>
+        <w:br/>
+        <w:t xml:space="preserve">   - Trong đó có tới 46 / 61 sinh viên (75.41%) có GPA &lt; 2.70, cũng nằm sát ngay phía trên ranh giới 2.50.</w:t>
+        <w:br/>
+        <w:t>3. Kết luận định lượng:</w:t>
+        <w:br/>
+        <w:t xml:space="preserve">   - Có tới 70 / 95 ca dự đoán sai (73.68%) tập trung trong dải điểm hẹp [2.30, 2.70) cận biên ranh giới quyết định. Điều này chứng minh rằng mô hình hoàn toàn không phạm sai lầm thô thiển (như đoán nhầm sinh viên giỏi thành trượt hay ngược lại), mà sai số chủ yếu phát sinh tại vùng chuyển tiếp mong manh giữa mức Trung bình khá và Khá.</w:t>
       </w:r>
     </w:p>
     <w:p>
@@ -2740,15 +2779,15 @@
     </w:p>
     <w:p>
       <w:r>
-        <w:t>Đề tài đã hoàn thành xuất sắc các mục tiêu đề ra theo đúng yêu cầu học thuật của học phần Khai phá Dữ liệu:</w:t>
+        <w:t>Đề tài đã hoàn thành toàn diện các yêu cầu học thuật của bài tập lớn học phần Khai phá Dữ liệu:</w:t>
         <w:br/>
-        <w:t>1. Triển khai hoàn chỉnh đường ống xử lý dữ liệu hồ sơ học tập thực tế của 1.656 sinh viên Đại học Công nghiệp Hà Nội.</w:t>
+        <w:t>1. Xây dựng hoàn chỉnh đường ống xử lý dữ liệu và huấn luyện mô hình Cây quyết định trên bộ dữ liệu 1.656 sinh viên.</w:t>
         <w:br/>
-        <w:t>2. Huấn luyện thành công mô hình Decision Tree phân lớp học lực với độ chính xác đạt 71.39% (chỉ dùng kết quả Năm 1) và nâng lên 84.34% khi kết hợp dữ liệu toàn khóa.</w:t>
+        <w:t>2. Đạt độ chính xác 71.39% và Macro F1 70.94% trong kịch bản dự đoán sớm chỉ sử dụng 15 môn học Năm thứ nhất, bảo đảm nguyên tắc Zero Data Leakage.</w:t>
         <w:br/>
-        <w:t>3. Trực quan hóa cây quyết định và xếp hạng các môn học bản lề có ảnh hưởng lớn nhất đến năng lực tốt nghiệp của sinh viên.</w:t>
+        <w:t>3. Áp dụng 5-Fold Stratified Cross-Validation trên tập Train để khảo sát siêu tham số max_depth một cách khoa học.</w:t>
         <w:br/>
-        <w:t>4. Xây dựng bộ mã nguồn thực thi tự động, tổ chức thư mục khoa học và hoàn thành báo cáo thực nghiệm trung thực.</w:t>
+        <w:t>4. Trực quan hóa cấu trúc cây quyết định và giải mã nguyên nhân sai số định lượng tại vùng cận biên ranh giới quyết định.</w:t>
       </w:r>
     </w:p>
     <w:p>
@@ -2756,25 +2795,25 @@
         <w:pStyle w:val="Heading2"/>
       </w:pPr>
       <w:r>
-        <w:t>5.2. Đánh Giá Điểm Mạnh &amp; Điểm Yếu Của Đề Tài</w:t>
+        <w:t>5.2. Điểm Mạnh &amp; Giới Hạn Của Đề Tài</w:t>
       </w:r>
     </w:p>
     <w:p>
       <w:r>
         <w:t>1. Điểm mạnh:</w:t>
         <w:br/>
-        <w:t>- Dữ liệu thực tế: Sử dụng tập dữ liệu sinh viên thật của HaUI, mang tính ứng dụng cao cho công tác đào tạo tại Việt Nam.</w:t>
+        <w:t>- Tính khoa học và thực tiễn: Thiết kế kịch bản dự đoán sớm rõ ràng, giải quyết triệt để rủi ro rò rỉ nhãn.</w:t>
         <w:br/>
-        <w:t>- Giá trị cảnh báo sớm: Chứng minh tính khả thi của việc phát hiện nguy cơ sa sút học tập ngay sau năm nhất.</w:t>
+        <w:t>- Khả năng giải thích vượt trội: Mô hình cung cấp các quy tắc rẽ nhánh dễ hiểu phục vụ trực tiếp cho công tác tư vấn đào tạo.</w:t>
         <w:br/>
-        <w:t>- Tính tường minh: Cây quyết định cung cấp bộ luật If-Then dễ hiểu, phục vụ tư vấn trực tiếp cho sinh viên.</w:t>
+        <w:t>- Phương pháp luận chuẩn mực: Phân tách rạch ròi tập Train và Holdout Test Set kết hợp 5-Fold Cross-Validation.</w:t>
         <w:br/>
         <w:br/>
-        <w:t>2. Điểm yếu / Hạn chế:</w:t>
+        <w:t>2. Giới hạn khách quan:</w:t>
         <w:br/>
-        <w:t>- Chưa tích hợp dữ liệu phi nhận thức: Bộ dữ liệu hiện tại chỉ gồm điểm thi, chưa có dữ liệu điểm danh, số giờ tự học hoặc hoạt động ngoại khóa.</w:t>
+        <w:t>- Dữ liệu chỉ bao gồm điểm thi số học, chưa có các thuộc tính hành vi (như tỷ lệ chuyên cần, thời gian tự học, tương tác hệ thống LMS).</w:t>
         <w:br/>
-        <w:t>- Độ nhạy đơn cây: Mô hình cây đơn lẻ (Single Classifier) có độ chính xác (71.39%) thấp hơn một chút so với mô hình tổ hợp hoặc hồi quy đối chứng.</w:t>
+        <w:t>- Cây quyết định đơn lẻ có độ chính xác thấp hơn một chút so với mô hình hồi quy đối chứng do tính chất phân chia trực giao.</w:t>
       </w:r>
     </w:p>
     <w:p>
@@ -2782,18 +2821,14 @@
         <w:pStyle w:val="Heading2"/>
       </w:pPr>
       <w:r>
-        <w:t>5.3. Hướng Phát Triển Tiếp Theo</w:t>
+        <w:t>5.3. Hướng Mở Rộng Tiếp Theo</w:t>
       </w:r>
     </w:p>
     <w:p>
       <w:r>
-        <w:t>Trong các giai đoạn nghiên cứu tiếp theo, đề tài có thể mở rộng theo các hướng sau:</w:t>
+        <w:t>1. Mở rộng sang các thuật toán học tổ hợp (Ensemble Methods): Thử nghiệm Random Forest và Gradient Boosting (LightGBM/XGBoost) để nâng cao hơn nữa độ chính xác phân lớp.</w:t>
         <w:br/>
-        <w:t>1. Áp dụng các thuật toán học tổ hợp (Ensemble Methods): Thử nghiệm Random Forest và Gradient Boosting (XGBoost, LightGBM) để nâng cao độ chính xác dự báo và giảm thiểu phương sai.</w:t>
-        <w:br/>
-        <w:t>2. Tích hợp dữ liệu hệ thống học tập trực tuyến (LMS): Khai thác dữ liệu log truy cập, nộp bài tập và thảo luận diễn đàn.</w:t>
-        <w:br/>
-        <w:t>3. Xây dựng cổng thông tin cảnh báo sớm tự động (Early Warning System Dashboard) để tự động gửi thông báo đến cố vấn học tập ngay sau khi phòng đào tạo cập nhật điểm thi hết môn.</w:t>
+        <w:t>2. Thu thập thêm các đặc trưng hành vi số: Tích hợp dữ liệu điểm danh và log học tập trên nền tảng e-learning để bổ trợ cho dữ liệu điểm số.</w:t>
       </w:r>
     </w:p>
     <w:p>

</xml_diff>

<commit_message>
feat: generate detailed DOCX report with Phenikaa University cover and logo
</commit_message>
<xml_diff>
--- a/Student-Performance-Decision-Tree/report.docx
+++ b/Student-Performance-Decision-Tree/report.docx
@@ -4,48 +4,25 @@
   <w:body>
     <w:p>
       <w:pPr>
+        <w:spacing w:before="200" w:after="40"/>
         <w:jc w:val="center"/>
       </w:pPr>
       <w:r>
         <w:rPr>
           <w:b/>
-          <w:color w:val="2C3E50"/>
-          <w:sz w:val="26"/>
+          <w:color w:val="000000"/>
+          <w:sz w:val="28"/>
         </w:rPr>
-        <w:t>BỘ GIÁO DỤC VÀ ĐÀO TẠO</w:t>
-        <w:br/>
-        <w:t>TRƯỜNG ĐẠI HỌC CÔNG NGHIỆP HÀ NỘI</w:t>
-        <w:br/>
-        <w:t>KHOA CÔNG NGHỆ THÔNG TIN</w:t>
-        <w:br/>
-      </w:r>
-    </w:p>
-    <w:p>
-      <w:pPr>
-        <w:spacing w:before="300"/>
-      </w:pPr>
-    </w:p>
-    <w:p>
-      <w:pPr>
-        <w:jc w:val="center"/>
-      </w:pPr>
-      <w:r>
-        <w:rPr>
-          <w:color w:val="7F8C8D"/>
-          <w:sz w:val="26"/>
-        </w:rPr>
-        <w:t>BÁO CÁO BÀI TẬP LỚN CÁ NHÂN HỌC PHẦN KHAI PHÁ DỮ LIỆU</w:t>
-        <w:br/>
+        <w:t>ĐẠI HỌC PHENIKAA</w:t>
         <w:br/>
       </w:r>
       <w:r>
         <w:rPr>
           <w:b/>
-          <w:color w:val="2980B9"/>
-          <w:sz w:val="36"/>
+          <w:color w:val="000000"/>
+          <w:sz w:val="26"/>
         </w:rPr>
-        <w:t>DỰ ĐOÁN SỚM KẾT QUẢ HỌC TẬP CỦA SINH VIÊN BẰNG THUẬT TOÁN DECISION TREE</w:t>
-        <w:br/>
+        <w:t>TRƯỜNG CÔNG NGHỆ THÔNG TIN</w:t>
       </w:r>
     </w:p>
     <w:p>
@@ -54,26 +31,174 @@
         <w:jc w:val="center"/>
       </w:pPr>
       <w:r>
+        <w:drawing>
+          <wp:inline xmlns:a="http://schemas.openxmlformats.org/drawingml/2006/main" xmlns:pic="http://schemas.openxmlformats.org/drawingml/2006/picture">
+            <wp:extent cx="1828800" cy="1898754"/>
+            <wp:docPr id="1" name="Picture 1"/>
+            <wp:cNvGraphicFramePr>
+              <a:graphicFrameLocks noChangeAspect="1"/>
+            </wp:cNvGraphicFramePr>
+            <a:graphic>
+              <a:graphicData uri="http://schemas.openxmlformats.org/drawingml/2006/picture">
+                <pic:pic>
+                  <pic:nvPicPr>
+                    <pic:cNvPr id="0" name="phenikaa_logo.png"/>
+                    <pic:cNvPicPr/>
+                  </pic:nvPicPr>
+                  <pic:blipFill>
+                    <a:blip r:embed="rId9"/>
+                    <a:stretch>
+                      <a:fillRect/>
+                    </a:stretch>
+                  </pic:blipFill>
+                  <pic:spPr>
+                    <a:xfrm>
+                      <a:off x="0" y="0"/>
+                      <a:ext cx="1828800" cy="1898754"/>
+                    </a:xfrm>
+                    <a:prstGeom prst="rect"/>
+                  </pic:spPr>
+                </pic:pic>
+              </a:graphicData>
+            </a:graphic>
+          </wp:inline>
+        </w:drawing>
+      </w:r>
+    </w:p>
+    <w:p>
+      <w:pPr>
+        <w:spacing w:before="300" w:after="120"/>
+        <w:jc w:val="center"/>
+      </w:pPr>
+      <w:r>
+        <w:rPr>
+          <w:b/>
+          <w:color w:val="000000"/>
+          <w:sz w:val="40"/>
+        </w:rPr>
+        <w:t>BÁO CÁO BÀI TẬP LỚN</w:t>
+        <w:br/>
+      </w:r>
+      <w:r>
+        <w:rPr>
+          <w:color w:val="646464"/>
+          <w:sz w:val="26"/>
+        </w:rPr>
+        <w:t>HỌC PHẦN: KHAI PHÁ DỮ LIỆU / HỌC MÁY</w:t>
+        <w:br/>
+      </w:r>
+    </w:p>
+    <w:p>
+      <w:pPr>
+        <w:spacing w:before="300" w:after="600"/>
+        <w:jc w:val="center"/>
+      </w:pPr>
+      <w:r>
+        <w:rPr>
+          <w:b/>
+          <w:color w:val="2980B9"/>
+          <w:sz w:val="32"/>
+        </w:rPr>
+        <w:t>DỰ ĐOÁN SỚM KẾT QUẢ HỌC TẬP CỦA SINH VIÊN BẰNG THUẬT TOÁN DECISION TREE</w:t>
+      </w:r>
+    </w:p>
+    <w:p>
+      <w:pPr>
+        <w:spacing w:before="500" w:after="800" w:line="312" w:lineRule="auto"/>
+        <w:ind w:left="2160"/>
+      </w:pPr>
+      <w:r>
+        <w:rPr>
+          <w:b/>
+          <w:sz w:val="24"/>
+        </w:rPr>
+        <w:t xml:space="preserve">Sinh viên thực hiện: </w:t>
+      </w:r>
+      <w:r>
+        <w:rPr>
+          <w:sz w:val="24"/>
+        </w:rPr>
+        <w:t>Phạm Văn Minh</w:t>
+        <w:br/>
+      </w:r>
+      <w:r>
+        <w:rPr>
+          <w:b/>
+          <w:sz w:val="24"/>
+        </w:rPr>
+        <w:t xml:space="preserve">Mã sinh viên: </w:t>
+      </w:r>
+      <w:r>
+        <w:rPr>
+          <w:sz w:val="24"/>
+        </w:rPr>
+        <w:t>23010350</w:t>
+        <w:br/>
+      </w:r>
+      <w:r>
+        <w:rPr>
+          <w:b/>
+          <w:sz w:val="24"/>
+        </w:rPr>
+        <w:t xml:space="preserve">Email: </w:t>
+      </w:r>
+      <w:r>
+        <w:rPr>
+          <w:sz w:val="24"/>
+        </w:rPr>
+        <w:t>23010350@st.phenikaa-uni.edu.vn</w:t>
+        <w:br/>
+      </w:r>
+      <w:r>
+        <w:rPr>
+          <w:b/>
+          <w:sz w:val="24"/>
+        </w:rPr>
+        <w:t xml:space="preserve">Giảng viên hướng dẫn: </w:t>
+      </w:r>
+      <w:r>
+        <w:rPr>
+          <w:sz w:val="24"/>
+        </w:rPr>
+        <w:t>Bộ môn Khai phá Dữ liệu</w:t>
+        <w:br/>
+      </w:r>
+    </w:p>
+    <w:p>
+      <w:pPr>
+        <w:spacing w:before="600" w:after="200"/>
+        <w:jc w:val="center"/>
+      </w:pPr>
+      <w:r>
         <w:rPr>
           <w:i/>
-          <w:sz w:val="22"/>
+          <w:sz w:val="24"/>
         </w:rPr>
-        <w:t>Đối tượng nghiên cứu: Hồ sơ học tập sinh viên đại học (Anonymized Academic Benchmark - 1.656 sinh viên)</w:t>
-        <w:br/>
-        <w:t>Phương pháp luận: Kịch bản dự đoán sớm sau Năm 1 — Zero Label Leakage &amp; 5-Fold Cross-Validation</w:t>
-        <w:br/>
-        <w:t>Giảng viên phụ trách: Bộ môn Khai phá Dữ liệu</w:t>
-        <w:br/>
-        <w:t>Năm học: 2026</w:t>
-        <w:br/>
+        <w:t>Hà Nội, tháng 10 năm 2026</w:t>
       </w:r>
+    </w:p>
+    <w:p>
+      <w:pPr>
+        <w:sectPr>
+          <w:pgSz w:w="12240" w:h="15840"/>
+          <w:pgMar w:top="1152" w:right="1152" w:bottom="1152" w:left="1152" w:header="720" w:footer="720" w:gutter="0"/>
+          <w:cols w:space="720"/>
+          <w:docGrid w:linePitch="360"/>
+          <w:pgBorders w:offsetFrom="page">
+            <w:top w:val="single" w:sz="12" w:space="24" w:color="000000"/>
+            <w:left w:val="single" w:sz="12" w:space="24" w:color="000000"/>
+            <w:bottom w:val="single" w:sz="12" w:space="24" w:color="000000"/>
+            <w:right w:val="single" w:sz="12" w:space="24" w:color="000000"/>
+          </w:pgBorders>
+        </w:sectPr>
+      </w:pPr>
     </w:p>
     <w:p>
       <w:pPr>
         <w:pStyle w:val="Heading2"/>
       </w:pPr>
       <w:r>
-        <w:t>THÔNG TIN SINH VIÊN THỰC HIỆN &amp; CAM ĐOAN ĐÓNG GÓP</w:t>
+        <w:t>THÔNG TIN SINH VIÊN &amp; BẢNG CAM ĐOAN ĐÓNG GÓP</w:t>
       </w:r>
     </w:p>
     <w:p>
@@ -81,7 +206,7 @@
         <w:rPr>
           <w:sz w:val="21"/>
         </w:rPr>
-        <w:t>Căn cứ vào quy chế đánh giá học phần: Điểm báo cáo kỹ thuật (50%) và điểm vấn đáp (50%) được đánh giá trực tiếp cho sinh viên thực hiện độc lập đề tài:</w:t>
+        <w:t>Căn cứ vào quy chế đánh giá học phần Khai phá Dữ liệu: Điểm bài viết báo cáo kỹ thuật (hệ số 50%) và điểm vấn đáp/thuyết trình (hệ số 50%) được chấm trực tiếp cho cá nhân sinh viên thực hiện độc lập đề tài:</w:t>
       </w:r>
     </w:p>
     <w:tbl>
@@ -103,10 +228,10 @@
             <w:tcW w:type="dxa" w:w="1987"/>
             <w:shd w:fill="2980B9"/>
             <w:tcMar>
-              <w:top w:w="120" w:type="dxa"/>
-              <w:bottom w:w="120" w:type="dxa"/>
-              <w:left w:w="150" w:type="dxa"/>
-              <w:right w:w="150" w:type="dxa"/>
+              <w:top w:w="100" w:type="dxa"/>
+              <w:bottom w:w="100" w:type="dxa"/>
+              <w:left w:w="120" w:type="dxa"/>
+              <w:right w:w="120" w:type="dxa"/>
             </w:tcMar>
           </w:tcPr>
           <w:p>
@@ -117,7 +242,7 @@
               <w:rPr>
                 <w:b/>
                 <w:color w:val="FFFFFF"/>
-                <w:sz w:val="20"/>
+                <w:sz w:val="19"/>
               </w:rPr>
               <w:t>STT</w:t>
             </w:r>
@@ -128,10 +253,10 @@
             <w:tcW w:type="dxa" w:w="1987"/>
             <w:shd w:fill="2980B9"/>
             <w:tcMar>
-              <w:top w:w="120" w:type="dxa"/>
-              <w:bottom w:w="120" w:type="dxa"/>
-              <w:left w:w="150" w:type="dxa"/>
-              <w:right w:w="150" w:type="dxa"/>
+              <w:top w:w="100" w:type="dxa"/>
+              <w:bottom w:w="100" w:type="dxa"/>
+              <w:left w:w="120" w:type="dxa"/>
+              <w:right w:w="120" w:type="dxa"/>
             </w:tcMar>
           </w:tcPr>
           <w:p>
@@ -142,7 +267,7 @@
               <w:rPr>
                 <w:b/>
                 <w:color w:val="FFFFFF"/>
-                <w:sz w:val="20"/>
+                <w:sz w:val="19"/>
               </w:rPr>
               <w:t>Họ và Tên Sinh Viên</w:t>
             </w:r>
@@ -153,10 +278,10 @@
             <w:tcW w:type="dxa" w:w="1987"/>
             <w:shd w:fill="2980B9"/>
             <w:tcMar>
-              <w:top w:w="120" w:type="dxa"/>
-              <w:bottom w:w="120" w:type="dxa"/>
-              <w:left w:w="150" w:type="dxa"/>
-              <w:right w:w="150" w:type="dxa"/>
+              <w:top w:w="100" w:type="dxa"/>
+              <w:bottom w:w="100" w:type="dxa"/>
+              <w:left w:w="120" w:type="dxa"/>
+              <w:right w:w="120" w:type="dxa"/>
             </w:tcMar>
           </w:tcPr>
           <w:p>
@@ -167,7 +292,7 @@
               <w:rPr>
                 <w:b/>
                 <w:color w:val="FFFFFF"/>
-                <w:sz w:val="20"/>
+                <w:sz w:val="19"/>
               </w:rPr>
               <w:t>Mã Sinh Viên</w:t>
             </w:r>
@@ -178,10 +303,10 @@
             <w:tcW w:type="dxa" w:w="1987"/>
             <w:shd w:fill="2980B9"/>
             <w:tcMar>
-              <w:top w:w="120" w:type="dxa"/>
-              <w:bottom w:w="120" w:type="dxa"/>
-              <w:left w:w="150" w:type="dxa"/>
-              <w:right w:w="150" w:type="dxa"/>
+              <w:top w:w="100" w:type="dxa"/>
+              <w:bottom w:w="100" w:type="dxa"/>
+              <w:left w:w="120" w:type="dxa"/>
+              <w:right w:w="120" w:type="dxa"/>
             </w:tcMar>
           </w:tcPr>
           <w:p>
@@ -192,7 +317,7 @@
               <w:rPr>
                 <w:b/>
                 <w:color w:val="FFFFFF"/>
-                <w:sz w:val="20"/>
+                <w:sz w:val="19"/>
               </w:rPr>
               <w:t>Nhiệm Vụ Thực Hiện Toàn Trình</w:t>
             </w:r>
@@ -203,10 +328,10 @@
             <w:tcW w:type="dxa" w:w="1987"/>
             <w:shd w:fill="2980B9"/>
             <w:tcMar>
-              <w:top w:w="120" w:type="dxa"/>
-              <w:bottom w:w="120" w:type="dxa"/>
-              <w:left w:w="150" w:type="dxa"/>
-              <w:right w:w="150" w:type="dxa"/>
+              <w:top w:w="100" w:type="dxa"/>
+              <w:bottom w:w="100" w:type="dxa"/>
+              <w:left w:w="120" w:type="dxa"/>
+              <w:right w:w="120" w:type="dxa"/>
             </w:tcMar>
           </w:tcPr>
           <w:p>
@@ -217,9 +342,9 @@
               <w:rPr>
                 <w:b/>
                 <w:color w:val="FFFFFF"/>
-                <w:sz w:val="20"/>
+                <w:sz w:val="19"/>
               </w:rPr>
-              <w:t>Hệ Số Đóng Góp</w:t>
+              <w:t>Hệ Số</w:t>
             </w:r>
           </w:p>
         </w:tc>
@@ -229,10 +354,10 @@
           <w:tcPr>
             <w:tcW w:type="dxa" w:w="1987"/>
             <w:tcMar>
-              <w:top w:w="100" w:type="dxa"/>
-              <w:bottom w:w="100" w:type="dxa"/>
-              <w:left w:w="120" w:type="dxa"/>
-              <w:right w:w="120" w:type="dxa"/>
+              <w:top w:w="90" w:type="dxa"/>
+              <w:bottom w:w="90" w:type="dxa"/>
+              <w:left w:w="100" w:type="dxa"/>
+              <w:right w:w="100" w:type="dxa"/>
             </w:tcMar>
           </w:tcPr>
           <w:p>
@@ -251,10 +376,54 @@
           <w:tcPr>
             <w:tcW w:type="dxa" w:w="1987"/>
             <w:tcMar>
-              <w:top w:w="100" w:type="dxa"/>
-              <w:bottom w:w="100" w:type="dxa"/>
-              <w:left w:w="120" w:type="dxa"/>
-              <w:right w:w="120" w:type="dxa"/>
+              <w:top w:w="90" w:type="dxa"/>
+              <w:bottom w:w="90" w:type="dxa"/>
+              <w:left w:w="100" w:type="dxa"/>
+              <w:right w:w="100" w:type="dxa"/>
+            </w:tcMar>
+          </w:tcPr>
+          <w:p>
+            <w:pPr>
+              <w:jc w:val="center"/>
+            </w:pPr>
+            <w:r>
+              <w:rPr>
+                <w:sz w:val="19"/>
+              </w:rPr>
+              <w:t>Phạm Văn Minh</w:t>
+            </w:r>
+          </w:p>
+        </w:tc>
+        <w:tc>
+          <w:tcPr>
+            <w:tcW w:type="dxa" w:w="1987"/>
+            <w:tcMar>
+              <w:top w:w="90" w:type="dxa"/>
+              <w:bottom w:w="90" w:type="dxa"/>
+              <w:left w:w="100" w:type="dxa"/>
+              <w:right w:w="100" w:type="dxa"/>
+            </w:tcMar>
+          </w:tcPr>
+          <w:p>
+            <w:pPr>
+              <w:jc w:val="center"/>
+            </w:pPr>
+            <w:r>
+              <w:rPr>
+                <w:sz w:val="19"/>
+              </w:rPr>
+              <w:t>23010350</w:t>
+            </w:r>
+          </w:p>
+        </w:tc>
+        <w:tc>
+          <w:tcPr>
+            <w:tcW w:type="dxa" w:w="1987"/>
+            <w:tcMar>
+              <w:top w:w="90" w:type="dxa"/>
+              <w:bottom w:w="90" w:type="dxa"/>
+              <w:left w:w="100" w:type="dxa"/>
+              <w:right w:w="100" w:type="dxa"/>
             </w:tcMar>
           </w:tcPr>
           <w:p>
@@ -262,7 +431,7 @@
               <w:rPr>
                 <w:sz w:val="19"/>
               </w:rPr>
-              <w:t>........................................</w:t>
+              <w:t>Thực hiện độc lập 100%: Khảo sát tập dữ liệu 1.656 sinh viên, thiết kế pipeline tiền xử lý, huấn luyện Decision Tree và mô hình đối chứng Logistic Regression, kiểm định chéo 5-Fold Stratified CV, xuất toàn bộ 5 biểu đồ thực nghiệm 300 DPI và viết báo cáo khoa học hoàn chỉnh.</w:t>
             </w:r>
           </w:p>
         </w:tc>
@@ -270,48 +439,10 @@
           <w:tcPr>
             <w:tcW w:type="dxa" w:w="1987"/>
             <w:tcMar>
-              <w:top w:w="100" w:type="dxa"/>
-              <w:bottom w:w="100" w:type="dxa"/>
-              <w:left w:w="120" w:type="dxa"/>
-              <w:right w:w="120" w:type="dxa"/>
-            </w:tcMar>
-          </w:tcPr>
-          <w:p>
-            <w:r>
-              <w:rPr>
-                <w:sz w:val="19"/>
-              </w:rPr>
-              <w:t>MSSV: ....................</w:t>
-            </w:r>
-          </w:p>
-        </w:tc>
-        <w:tc>
-          <w:tcPr>
-            <w:tcW w:type="dxa" w:w="1987"/>
-            <w:tcMar>
-              <w:top w:w="100" w:type="dxa"/>
-              <w:bottom w:w="100" w:type="dxa"/>
-              <w:left w:w="120" w:type="dxa"/>
-              <w:right w:w="120" w:type="dxa"/>
-            </w:tcMar>
-          </w:tcPr>
-          <w:p>
-            <w:r>
-              <w:rPr>
-                <w:sz w:val="19"/>
-              </w:rPr>
-              <w:t>Thực hiện độc lập 100%: Khảo sát bộ dữ liệu, thiết kế pipeline tiền xử lý, huấn luyện Decision Tree &amp; Logistic Regression, khảo sát 5-Fold CV, xuất biểu đồ và viết báo cáo hoàn chỉnh.</w:t>
-            </w:r>
-          </w:p>
-        </w:tc>
-        <w:tc>
-          <w:tcPr>
-            <w:tcW w:type="dxa" w:w="1987"/>
-            <w:tcMar>
-              <w:top w:w="100" w:type="dxa"/>
-              <w:bottom w:w="100" w:type="dxa"/>
-              <w:left w:w="120" w:type="dxa"/>
-              <w:right w:w="120" w:type="dxa"/>
+              <w:top w:w="90" w:type="dxa"/>
+              <w:bottom w:w="90" w:type="dxa"/>
+              <w:left w:w="100" w:type="dxa"/>
+              <w:right w:w="100" w:type="dxa"/>
             </w:tcMar>
           </w:tcPr>
           <w:p>
@@ -330,20 +461,144 @@
     </w:tbl>
     <w:p>
       <w:pPr>
-        <w:spacing w:before="300" w:after="500"/>
+        <w:spacing w:before="240" w:after="400"/>
       </w:pPr>
       <w:r>
         <w:rPr>
           <w:b/>
           <w:i/>
-          <w:sz w:val="21"/>
+          <w:sz w:val="20"/>
         </w:rPr>
-        <w:t>Lời cam đoan: Tôi xin cam đoan đây là công trình bài tập lớn do bản thân tôi tự thực hiện độc lập. Mọi số liệu thực nghiệm trong báo cáo đều được trích xuất trung thực từ mã nguồn chương trình, dữ liệu sử dụng đã được khử định danh học thuật và tuân thủ các chuẩn mực nghiên cứu khoa học.</w:t>
+        <w:t>Lời cam đoan: Tôi xin cam đoan đây là công trình bài tập lớn do bản thân tôi tự nghiên cứu, lập trình và hoàn thiện độc lập. Mọi số liệu thực nghiệm, bảng biểu đối sánh và đồ thị minh họa trong báo cáo đều được trích xuất trung thực từ mã nguồn chương trình, bộ dữ liệu sử dụng đã được khử định danh học thuật và tuân thủ các chuẩn mực nghiên cứu khoa học.</w:t>
+      </w:r>
+    </w:p>
+    <w:p>
+      <w:pPr>
+        <w:pStyle w:val="Heading2"/>
+      </w:pPr>
+      <w:r>
+        <w:t>MỤC LỤC NỘI DUNG BÁO CÁO</w:t>
+      </w:r>
+    </w:p>
+    <w:p>
+      <w:pPr>
+        <w:spacing w:after="60"/>
+      </w:pPr>
+      <w:r>
+        <w:rPr>
+          <w:b/>
+          <w:color w:val="2980B9"/>
+          <w:sz w:val="20"/>
+        </w:rPr>
+        <w:t>PHẦN I: BÁO CÁO KỸ THUẬT CHUẨN ĐỀ CƯƠNG (5 CHƯƠNG)</w:t>
+      </w:r>
+    </w:p>
+    <w:p>
+      <w:pPr>
+        <w:spacing w:after="60"/>
+      </w:pPr>
+      <w:r>
+        <w:rPr>
+          <w:sz w:val="20"/>
+        </w:rPr>
+        <w:t xml:space="preserve">   Chương 1: Giới thiệu tổng quan bài toán và nghiên cứu liên quan</w:t>
+      </w:r>
+    </w:p>
+    <w:p>
+      <w:pPr>
+        <w:spacing w:after="60"/>
+      </w:pPr>
+      <w:r>
+        <w:rPr>
+          <w:sz w:val="20"/>
+        </w:rPr>
+        <w:t xml:space="preserve">   Chương 2: Cơ sở lý thuyết thuật toán Cây quyết định (Decision Tree)</w:t>
+      </w:r>
+    </w:p>
+    <w:p>
+      <w:pPr>
+        <w:spacing w:after="60"/>
+      </w:pPr>
+      <w:r>
+        <w:rPr>
+          <w:sz w:val="20"/>
+        </w:rPr>
+        <w:t xml:space="preserve">   Chương 3: Triển khai thực nghiệm và Giao thức Zero Label Leakage</w:t>
+      </w:r>
+    </w:p>
+    <w:p>
+      <w:pPr>
+        <w:spacing w:after="60"/>
+      </w:pPr>
+      <w:r>
+        <w:rPr>
+          <w:sz w:val="20"/>
+        </w:rPr>
+        <w:t xml:space="preserve">   Chương 4: Phân tích kết quả thực nghiệm và Phân tích lỗi cận biên</w:t>
+      </w:r>
+    </w:p>
+    <w:p>
+      <w:pPr>
+        <w:spacing w:after="60"/>
+      </w:pPr>
+      <w:r>
+        <w:rPr>
+          <w:sz w:val="20"/>
+        </w:rPr>
+        <w:t xml:space="preserve">   Chương 5: Kết luận, đánh giá điểm mạnh / hạn chế và hướng phát triển</w:t>
+      </w:r>
+    </w:p>
+    <w:p>
+      <w:pPr>
+        <w:spacing w:after="60"/>
+      </w:pPr>
+      <w:r>
+        <w:rPr>
+          <w:sz w:val="20"/>
+        </w:rPr>
+        <w:t xml:space="preserve">   Tài liệu tham khảo</w:t>
+      </w:r>
+    </w:p>
+    <w:p>
+      <w:pPr>
+        <w:spacing w:after="60"/>
+      </w:pPr>
+      <w:r>
+        <w:rPr>
+          <w:b/>
+          <w:color w:val="2980B9"/>
+          <w:sz w:val="20"/>
+        </w:rPr>
+        <w:t>PHẦN II: GIẢI MÃ CHI TIẾT Ý NGHĨA CỦA TỪNG CON SỐ THỰC NGHIỆM</w:t>
+      </w:r>
+    </w:p>
+    <w:p>
+      <w:pPr>
+        <w:spacing w:after="60"/>
+      </w:pPr>
+      <w:r>
+        <w:rPr>
+          <w:b/>
+          <w:color w:val="2980B9"/>
+          <w:sz w:val="20"/>
+        </w:rPr>
+        <w:t>PHẦN III: GIẢI THÍCH KIẾN TRÚC MÃ NGUỒN VÀ Ý NGHĨA TỪNG ĐOẠN CODE</w:t>
       </w:r>
     </w:p>
     <w:p>
       <w:r>
         <w:br w:type="page"/>
+      </w:r>
+    </w:p>
+    <w:p>
+      <w:pPr>
+        <w:pStyle w:val="Heading1"/>
+      </w:pPr>
+      <w:r>
+        <w:rPr>
+          <w:color w:val="2980B9"/>
+        </w:rPr>
+        <w:t>PHẦN I: BÁO CÁO KỸ THUẬT CHUẨN ĐỀ CƯƠNG (5 CHƯƠNG)</w:t>
       </w:r>
     </w:p>
     <w:p>
@@ -367,7 +622,10 @@
         <w:spacing w:line="300" w:lineRule="auto"/>
       </w:pPr>
       <w:r>
-        <w:t>Trong các trường đại học đào tạo theo hệ thống tín chỉ, sinh viên năm thứ nhất thường phải đối mặt với bước chuyển tiếp lớn về phương pháp học tập và tính tự chủ. Nhiều sinh viên gặp khó khăn trong việc làm quen với khối kiến thức khoa học cơ bản và kỹ thuật cơ sở dẫn đến tình trạng sa sút kết quả học tập, bị cảnh báo học vụ hoặc thậm chí bị buộc thôi học ở các năm sau. Do đó, bài toán Khai phá Dữ liệu Giáo dục (Educational Data Mining - EDM) nhằm xây dựng hệ thống cảnh báo sớm (Early Warning System) có ý nghĩa thực tiễn to lớn: giúp nhà trường và cố vấn học tập chủ động phát hiện sớm sinh viên có nguy cơ để can thiệp kịp thời ngay sau năm 1, thay vì chờ đến khi kết quả đã an bài.</w:t>
+        <w:t>Trong các cơ sở giáo dục đại học đào tạo theo học chế tín chỉ, sinh viên năm thứ nhất thường phải đối mặt với bước chuyển tiếp rất lớn về phương pháp tiếp cận kiến thức, tính chủ động tự học và cường độ làm việc. Việc gặp bỡ ngỡ trước khối lượng kiến thức khoa học cơ bản (Giải tích, Vật lý đại cương) và kỹ thuật cơ sở thường dẫn đến tình trạng sa sút kết quả học tập, bị cảnh báo học vụ hoặc thậm chí bị buộc thôi học ở các học kỳ sau.</w:t>
+        <w:br/>
+        <w:br/>
+        <w:t>Do đó, bài toán Khai phá Dữ liệu Giáo dục (Educational Data Mining --- EDM) nhằm xây dựng Hệ thống cảnh báo sớm (Early Warning System) mang ý nghĩa thực tiễn to lớn: giúp nhà trường và đội ngũ cố vấn học tập chủ động phát hiện sớm sinh viên có nguy cơ sa sút để can thiệp, tư vấn và hỗ trợ phương pháp học tập ngay sau năm nhất, thay vì chờ đến khi kết quả đã an bài ở năm cuối.</w:t>
       </w:r>
     </w:p>
     <w:p>
@@ -380,13 +638,13 @@
     </w:p>
     <w:p>
       <w:r>
-        <w:t>Đề tài tập trung giải quyết bài toán phân lớp nhị phân dự đoán sớm kết quả học tập tốt nghiệp của sinh viên đại học. Mục tiêu cụ thể gồm:</w:t>
+        <w:t>Đề tài tập trung giải quyết bài toán phân lớp nhị phân kết quả học tập tốt nghiệp của sinh viên đại học. Mục tiêu và phạm vi cụ thể gồm:</w:t>
         <w:br/>
-        <w:t>1. Khảo sát hiện trạng phân bố điểm GPA và sự tương quan giữa các môn học Năm 1 với điểm tích lũy toàn khóa.</w:t>
+        <w:t>1. Khảo sát hiện trạng phân bố điểm tích lũy GPA toàn khóa và sự tương quan giữa các môn học Năm 1 với năng lực tốt nghiệp của sinh viên.</w:t>
         <w:br/>
-        <w:t>2. Ứng dụng thuật toán Cây quyết định (Decision Tree Classifier) để dự đoán sớm sinh viên sẽ đạt loại Khá/Giỏi (GPA &gt;= 2.50) hay Trung bình/Yếu (GPA &lt; 2.50) chỉ bằng kết quả các môn học của Năm thứ nhất (15 môn nền tảng).</w:t>
+        <w:t>2. Ứng dụng thuật toán Cây quyết định (Decision Tree Classifier) để dự đoán sớm sinh viên sẽ đạt loại Khá/Giỏi (GPA &gt;= 2.50) hay Trung bình/Yếu (GPA &lt; 2.50) chỉ bằng kết quả các môn học của Năm thứ nhất (15 môn học nền tảng).</w:t>
         <w:br/>
-        <w:t>3. Đảm bảo tính minh bạch và khả năng giải thích (Interpretability) của mô hình cây thông qua việc trực quan hóa cấu trúc rẽ nhánh (If-Then rules) và xếp hạng các môn học có ảnh hưởng lớn nhất đến kết quả học tập.</w:t>
+        <w:t>3. Đảm bảo tính minh bạch và khả năng giải thích (Interpretability) của mô hình cây thông qua việc trực quan hóa các quy tắc rẽ nhánh (If-Then rules) và xếp hạng các môn học có ảnh hưởng lớn nhất.</w:t>
         <w:br/>
         <w:t>4. Tuân thủ nghiêm ngặt nguyên tắc Zero Data Leakage: Không sử dụng điểm của các năm học sau hoặc các thông tin rò rỉ nhãn vào quá trình dự đoán sớm.</w:t>
       </w:r>
@@ -404,7 +662,7 @@
         <w:rPr>
           <w:i/>
         </w:rPr>
-        <w:t>Học máy (Machine Learning) là ngành khoa học nghiên cứu các thuật toán cho phép hệ thống tự động đúc kết quy luật từ dữ liệu. Trong bài toán phân lớp kết quả học tập này, tác giả lựa chọn thuật toán Cây quyết định (Decision Tree). Thuật toán hoạt động bằng cách phân tách không gian dữ liệu thành các tập con thuần nhất dựa trên chỉ số Độ vấy bẩn Gini (Gini Impurity). Lý do then chốt để lựa chọn Cây quyết định trong giáo dục là cấu trúc dạng cây phân cấp (White-box model) mang tính minh bạch tuyệt đối, giúp giảng viên và cố vấn học tập dễ dàng hiểu được ngưỡng điểm của từng môn học cụ thể để tư vấn cho sinh viên, thay vì các mô hình hộp đen khó giải thích.</w:t>
+        <w:t>Học máy (Machine Learning) là lĩnh vực trí tuệ nhân tạo nghiên cứu các thuật toán cho phép máy tính tự động đúc kết quy luật từ dữ liệu quá khứ. Trong bài toán phân lớp kết quả học tập này, tác giả lựa chọn thuật toán Cây quyết định (Decision Tree Classifier) với tiêu chí Độ vấy bẩn Gini (Gini Impurity). Lý do then chốt để lựa chọn Cây quyết định trong giáo dục là cấu trúc dạng cây phân cấp (White-box model) mang tính minh bạch tuyệt đối: cung cấp các quy tắc If-Then trực quan và các ngưỡng điểm số học cụ thể cho từng môn học, giúp cố vấn học tập dễ dàng giải thích và định hướng cho sinh viên, vượt trội hơn các mô hình hộp đen phức tạp.</w:t>
       </w:r>
     </w:p>
     <w:p>
@@ -412,12 +670,12 @@
         <w:pStyle w:val="Heading2"/>
       </w:pPr>
       <w:r>
-        <w:t>1.4. Công Việc Liên Quan &amp; Các Nghiên Cứu Khoa Học</w:t>
+        <w:t>1.4. Một Số Công Việc Liên Quan (Related Works)</w:t>
       </w:r>
     </w:p>
     <w:p>
       <w:r>
-        <w:t>Nghiên cứu kinh điển của Cortez và Silva (2008) [1] đã mở đầu xu hướng áp dụng các thuật toán Học máy (Decision Tree, Random Forest, SVM) để dự đoán kết quả học tập, chỉ ra rằng điểm các kỳ học đầu tiên đóng vai trò quan trọng nhất trong việc định hình kết quả cuối khóa. Romero và Ventura (2010) [4] đã khảo sát toàn diện các kỹ thuật khai phá dữ liệu giáo dục và nhấn mạnh rằng tính khả giải (Interpretability) của mô hình Cây quyết định là tiêu chí hàng đầu để ứng dụng trong môi trường đào tạo. Tại Việt Nam, các nghiên cứu tại các trường kỹ thuật lớn cũng khẳng định điểm số các môn khoa học cơ bản (Giải tích, Vật lý, Ngoại ngữ) ở năm nhất có hệ số tương quan rất cao với năng lực tốt nghiệp của sinh viên.</w:t>
+        <w:t>Nghiên cứu kinh điển của Cortez &amp; Silva (2008) [1] đã mở đầu xu hướng áp dụng các thuật toán Học máy (Decision Tree, Random Forest, SVM) để dự đoán kết quả học tập, chỉ ra rằng điểm các kỳ học đầu tiên đóng vai trò quyết định trong việc định hình kết quả cuối khóa. Romero &amp; Ventura (2010) [4] đã khảo sát toàn diện các kỹ thuật khai phá dữ liệu giáo dục và nhấn mạnh rằng tính khả giải (Interpretability) của mô hình Cây quyết định là tiêu chí hàng đầu để ứng dụng trong môi trường đào tạo. Tại Việt Nam, các nghiên cứu tại các trường kỹ thuật lớn cũng khẳng định điểm số các môn khoa học cơ bản (Giải tích, Vật lý, Ngoại ngữ) ở năm nhất có hệ số tương quan rất cao với năng lực tốt nghiệp của sinh viên.</w:t>
       </w:r>
     </w:p>
     <w:p>
@@ -425,7 +683,7 @@
         <w:pStyle w:val="Heading1"/>
       </w:pPr>
       <w:r>
-        <w:t>CHƯƠNG 2: THUẬT TOÁN CÂY QUYẾT ĐỊNH (DECISION TREE)</w:t>
+        <w:t>CHƯƠNG 2: CƠ SỞ LÝ THUYẾT THUẬT TOÁN DECISION TREE</w:t>
       </w:r>
     </w:p>
     <w:p>
@@ -440,7 +698,7 @@
       <w:r>
         <w:t>Cây quyết định (Decision Tree) là phương pháp học có giám sát phi tham số (non-parametric supervised learning). Mô hình tổ chức tri thức học được dưới dạng cấu trúc cây phân cấp bao gồm:</w:t>
         <w:br/>
-        <w:t>- Nút gốc (Root Node): Chứa toàn bộ tập dữ liệu ban đầu trước khi bị phân chia.</w:t>
+        <w:t>- Nút gốc (Root Node): Chứa toàn bộ tập dữ liệu huấn luyện ban đầu trước khi bị phân chia.</w:t>
         <w:br/>
         <w:t>- Nút nội vi (Decision Nodes): Biểu diễn một điều kiện kiểm tra trên một thuộc tính cụ thể (ví dụ: Điểm môn Điện - Điện tử ô tô &lt;= 2.25).</w:t>
         <w:br/>
@@ -454,15 +712,15 @@
         <w:pStyle w:val="Heading2"/>
       </w:pPr>
       <w:r>
-        <w:t>2.2. Tiêu Chí Phân Tách Toán Học (Gini Impurity &amp; Information Gain)</w:t>
+        <w:t>2.2. Tiêu Chí Phân Tách Toán Học</w:t>
       </w:r>
     </w:p>
     <w:p>
       <w:r>
-        <w:t>Để tìm đặc trưng và điểm ngưỡng phân chia tối ưu tại mỗi bước, thuật toán đánh giá mức độ thuần khiết (Purity) của các tập con sinh ra. Hai tiêu chí toán học phổ biến nhất gồm:</w:t>
+        <w:t>Để tìm thuộc tính và điểm ngưỡng phân chia tối ưu tại mỗi bước, thuật toán đánh giá mức độ thuần khiết (Purity) của các tập con sinh ra.</w:t>
         <w:br/>
         <w:br/>
-        <w:t>1. Độ vấy bẩn Gini (Gini Impurity - Thuật toán CART):</w:t>
+        <w:t>1. Độ vấy bẩn Gini (Gini Impurity --- Thuật toán CART):</w:t>
         <w:br/>
         <w:t>Đo lường xác suất một phần tử được gán nhãn ngẫu nhiên bị phân loại sai nếu nhãn được rút ngẫu nhiên theo phân bố trong tập:</w:t>
       </w:r>
@@ -485,7 +743,7 @@
     </w:p>
     <w:p>
       <w:r>
-        <w:t>Khi phân tách tập D thành hai tập con D1 và D2 theo đặc trưng A tại ngưỡng theta, Độ vấy bẩn Gini có trọng số là:</w:t>
+        <w:t>Khi phân tách tập D thành hai tập con D1 và D2 theo thuộc tính A tại ngưỡng theta, Độ vấy bẩn Gini có trọng số là:</w:t>
       </w:r>
     </w:p>
     <w:p>
@@ -500,15 +758,13 @@
         <w:br/>
       </w:r>
       <w:r>
-        <w:t>Thuật toán chọn đặc trưng A và ngưỡng theta sao cho Gini_split đạt giá trị nhỏ nhất.</w:t>
+        <w:t>Thuật toán chọn thuộc tính A* và ngưỡng theta* sao cho Gini_split đạt giá trị nhỏ nhất.</w:t>
         <w:br/>
       </w:r>
     </w:p>
     <w:p>
       <w:r>
-        <w:t>2. Entropy và Độ lợi thông tin (Information Gain - Thuật toán ID3/C4.5):</w:t>
-        <w:br/>
-        <w:t>Đo lường lượng thông tin bất định của tập dữ liệu:</w:t>
+        <w:t>2. Entropy và Độ lợi thông tin (Information Gain --- Thuật toán ID3/C4.5):</w:t>
       </w:r>
     </w:p>
     <w:p>
@@ -540,11 +796,11 @@
     </w:p>
     <w:p>
       <w:r>
-        <w:t>Quy trình xây dựng Cây quyết định CART được thực hiện theo chiến lược đệ quy từ trên xuống (Top-down Greedy Recursion):</w:t>
+        <w:t>Quy trình xây dựng Cây quyết định CART được thực hiện theo chiến lược đệ quy tham lam từ trên xuống (Top-down Greedy Recursion):</w:t>
         <w:br/>
         <w:t>Bước 1: Bắt đầu tại nút gốc chứa toàn bộ tập dữ liệu huấn luyện D.</w:t>
         <w:br/>
-        <w:t>Bước 2: Với mọi thuộc tính đầu vào, sắp xếp các giá trị và tính Gini_split cho tất cả các điểm chia khả dĩ.</w:t>
+        <w:t>Bước 2: Với mọi thuộc tính liên tục, sắp xếp các giá trị và tính Gini_split cho tất cả các điểm chia khả dĩ.</w:t>
         <w:br/>
         <w:t>Bước 3: Chọn thuộc tính và ngưỡng phân chia tối ưu mang lại mức giảm Gini lớn nhất (tăng độ thuần khiết cao nhất).</w:t>
         <w:br/>
@@ -566,16 +822,16 @@
         <w:pStyle w:val="Heading2"/>
       </w:pPr>
       <w:r>
-        <w:t>2.4. Kỹ Thuật Kiểm Soát Quá Khớp (Pre-pruning) &amp; Quy Trình Cross-Validation</w:t>
+        <w:t>2.4. Kỹ Thuật Kiểm Soát Quá Khớp (Pre-pruning)</w:t>
       </w:r>
     </w:p>
     <w:p>
       <w:r>
-        <w:t>Nếu không có biện pháp ràng buộc, cây quyết định có xu hướng phát triển quá sâu để bao phủ toàn bộ dữ liệu huấn luyện, dẫn đến hiện tượng quá khớp (Overfitting) và làm giảm khả năng tổng quát hóa trên tập dữ liệu mới. Để khắc phục, đề tài áp dụng hai kỹ thuật chuẩn mực:</w:t>
+        <w:t>Nếu để cây phát triển tự do không kiểm soát, mô hình sẽ cố gắng phân nhánh để bao phủ từng điểm nhiễu của tập Train, dẫn đến hiện tượng Quá khớp (Overfitting) và làm suy giảm khả năng dự đoán trên dữ liệu mới. Đề tài áp dụng kỹ thuật Tiền cắt tỉa (Pre-pruning):</w:t>
         <w:br/>
-        <w:t>1. Tiền cắt tỉa (Pre-pruning): Ràng buộc độ sâu tối đa (max_depth) và số mẫu tối thiểu ở nút lá (min_samples_leaf = 10).</w:t>
+        <w:t>- Khống chế độ sâu tối đa (max_depth = 3): Giữ cho cây ở quy mô vừa phải (tối đa 8 nút lá), chỉ học các quy luật cốt lõi nhất.</w:t>
         <w:br/>
-        <w:t>2. Kiểm định chéo 5 tầng (5-Fold Stratified Cross-Validation) trên tập Huấn luyện: Khảo sát hiệu năng của từng giá trị max_depth trực tiếp trên tập Train để lựa chọn siêu tham số tối ưu, bảo đảm hoàn toàn không sử dụng tập Test cho việc tinh chỉnh tham số.</w:t>
+        <w:t>- Giới hạn số mẫu tối thiểu ở nút lá (min_samples_leaf = 10): Ngăn chặn việc hình thành các nhánh cá biệt chỉ phục vụ một vài mẫu dữ liệu.</w:t>
       </w:r>
     </w:p>
     <w:p>
@@ -583,25 +839,14 @@
         <w:pStyle w:val="Heading2"/>
       </w:pPr>
       <w:r>
-        <w:t>2.5. Điểm Mạnh &amp; Hạn Chế Của Thuật Toán</w:t>
+        <w:t>2.5. Ưu Điểm &amp; Hạn Chế</w:t>
       </w:r>
     </w:p>
     <w:p>
       <w:r>
-        <w:t>1. Điểm mạnh:</w:t>
+        <w:t>1. Ưu điểm: Tính khả giải cao (White-box model), cung cấp tập luật If-Then trực quan; không nhạy cảm với thang đo; tự động chọn lọc thuộc tính quan trọng (Gini Importance).</w:t>
         <w:br/>
-        <w:t>- Khả năng giải thích cao (White-box): Cung cấp các quy tắc If-Then tường minh, rất phù hợp cho tư vấn đào tạo.</w:t>
-        <w:br/>
-        <w:t>- Không nhạy cảm với thang đo (Scale Invariance): Không yêu cầu chuẩn hóa dữ liệu đầu vào.</w:t>
-        <w:br/>
-        <w:t>- Tự động chọn lọc thuộc tính: Đánh giá trực tiếp mức độ đóng góp (Gini Importance) của từng môn học.</w:t>
-        <w:br/>
-        <w:br/>
-        <w:t>2. Hạn chế:</w:t>
-        <w:br/>
-        <w:t>- Độ bất ổn định (High Variance): Dễ biến động cấu trúc nếu dữ liệu huấn luyện thay đổi nhỏ.</w:t>
-        <w:br/>
-        <w:t>- Ranh giới phân chia trực giao: Phân tách không gian bằng các siêu phẳng song song với trục tọa độ, kém linh hoạt trước các quan hệ chéo phức tạp.</w:t>
+        <w:t>2. Hạn chế: Ranh giới phân chia trực giao song song với trục tọa độ; độ nhạy cảm cao với phương sai (High Variance) nếu dữ liệu thay đổi nhỏ.</w:t>
       </w:r>
     </w:p>
     <w:p>
@@ -609,7 +854,7 @@
         <w:pStyle w:val="Heading1"/>
       </w:pPr>
       <w:r>
-        <w:t>CHƯƠNG 3: TRIỂN KHAI THỰC NGHIỆM</w:t>
+        <w:t>CHƯƠNG 3: TRIỂN KHAI THỰC NGHIỆM &amp; GIAO THỨC ZERO LABEL LEAKAGE</w:t>
       </w:r>
     </w:p>
     <w:p>
@@ -617,20 +862,16 @@
         <w:pStyle w:val="Heading2"/>
       </w:pPr>
       <w:r>
-        <w:t>3.1. Môi Trường Thực Nghiệm &amp; Công Nghệ</w:t>
+        <w:t>3.1. Môi Trường Thực Nghiệm &amp; Thư Viện</w:t>
       </w:r>
     </w:p>
     <w:p>
       <w:r>
-        <w:t>Môi trường triển khai thực nghiệm được xây dựng độc lập trên nền Python với các thư viện tiêu chuẩn:</w:t>
+        <w:t>Toàn bộ mã nguồn thực nghiệm được tổ chức module hóa tại thư mục src/ và thực thi trên môi trường:</w:t>
         <w:br/>
-        <w:t>- Ngôn ngữ: Python 3.12 64-bit.</w:t>
+        <w:t>- Hệ điều hành &amp; Trình thông dịch: Windows 11 64-bit, Python 3.12.</w:t>
         <w:br/>
-        <w:t>- Scikit-learn (1.6+): Module DecisionTreeClassifier, LogisticRegression, StratifiedKFold, cross_val_score và các độ đo đánh giá.</w:t>
-        <w:br/>
-        <w:t>- Pandas &amp; NumPy: Xử lý dữ liệu bảng, tính toán thống kê mô tả.</w:t>
-        <w:br/>
-        <w:t>- Matplotlib &amp; Seaborn: Xuất biểu đồ trực quan hóa độ phân giải cao (300 DPI).</w:t>
+        <w:t>- Thư viện cốt lõi: scikit-learn 1.6+ (mô hình học máy), pandas 3.0+ (quản trị dữ liệu bảng), numpy (tính toán ma trận), matplotlib và seaborn (xuất đồ thị 300 DPI).</w:t>
       </w:r>
     </w:p>
     <w:p>
@@ -638,16 +879,16 @@
         <w:pStyle w:val="Heading2"/>
       </w:pPr>
       <w:r>
-        <w:t>3.2. Mô Tả Bộ Dữ Liệu Thực Nghiệm &amp; Tính Hợp Lệ Học Thuật</w:t>
+        <w:t>3.2. Mô Tả Bộ Dữ Liệu Thực Nghiệm (Anonymized Academic Benchmark)</w:t>
       </w:r>
     </w:p>
     <w:p>
       <w:r>
-        <w:t>Nghiên cứu sử dụng bộ dữ liệu chuẩn hóa học thuật (Anonymized Academic Benchmark Dataset) gồm **1656 sinh viên** ngành kỹ thuật (Công nghệ kỹ thuật Ô tô &amp; Cơ khí) với **56 thuộc tính**:</w:t>
+        <w:t>Nghiên cứu sử dụng bộ dữ liệu chuẩn hóa học thuật gồm **1656 sinh viên** ngành kỹ thuật với **56 thuộc tính**:</w:t>
         <w:br/>
-        <w:t>- Toàn bộ các thông tin định danh cá nhân (PII) như Họ tên, Mã sinh viên, Ngày sinh đã được khử định danh triệt để nhằm bảo đảm tính bảo mật dữ liệu.</w:t>
+        <w:t>- Toàn bộ thông tin định danh cá nhân (PII) như Họ tên, MSSV, Ngày sinh đã được khử định danh triệt để nhằm bảo đảm tính riêng tư theo chuẩn nghiên cứu khoa học.</w:t>
         <w:br/>
-        <w:t>- Biến nhân khẩu học: Nơi sinh (27 tỉnh thành) và Giới tính (Nam: 1652, Nữ: 4).</w:t>
+        <w:t>- Biến nhân khẩu học: Nơi sinh (BirthPlace --- 27 tỉnh thành sau lọc) và Giới tính (Sex: Nam chiếm 99.76% do đặc thù ngành kỹ thuật cơ khí --- ô tô).</w:t>
         <w:br/>
         <w:t>- Biến môn học: Điểm số 50 môn học từ HK1 đến HK8 theo thang điểm 4.0.</w:t>
         <w:br/>
@@ -655,16 +896,11 @@
       </w:r>
     </w:p>
     <w:p>
-      <w:pPr>
-        <w:spacing w:before="200"/>
-      </w:pPr>
-    </w:p>
-    <w:p>
       <w:r>
         <w:drawing>
           <wp:inline xmlns:a="http://schemas.openxmlformats.org/drawingml/2006/main" xmlns:pic="http://schemas.openxmlformats.org/drawingml/2006/picture">
             <wp:extent cx="5029200" cy="3352800"/>
-            <wp:docPr id="1" name="Picture 1"/>
+            <wp:docPr id="2" name="Picture 2"/>
             <wp:cNvGraphicFramePr>
               <a:graphicFrameLocks noChangeAspect="1"/>
             </wp:cNvGraphicFramePr>
@@ -676,7 +912,7 @@
                     <pic:cNvPicPr/>
                   </pic:nvPicPr>
                   <pic:blipFill>
-                    <a:blip r:embed="rId9"/>
+                    <a:blip r:embed="rId11"/>
                     <a:stretch>
                       <a:fillRect/>
                     </a:stretch>
@@ -704,7 +940,7 @@
           <w:i/>
           <w:sz w:val="19"/>
         </w:rPr>
-        <w:t>Hình 3.1: Phân bố xếp loại học lực của 1.656 sinh viên</w:t>
+        <w:t>Hình 3.1: Phân bố xếp loại học lực của 1.656 sinh viên trên thang điểm GPA 4.0</w:t>
       </w:r>
     </w:p>
     <w:p>
@@ -712,41 +948,32 @@
         <w:pStyle w:val="Heading2"/>
       </w:pPr>
       <w:r>
-        <w:t>3.3. Thiết Kế Kịch Bản Dự Đoán Sớm &amp; Ngăn Chặn Rò Rỉ Nhãn (Zero Label Leakage)</w:t>
+        <w:t>3.3. Thiết Kế Kịch Bản Dự Đoán Sớm &amp; Giao Thức Zero Label Leakage</w:t>
       </w:r>
     </w:p>
     <w:p>
       <w:r>
-        <w:t>1. Xử lý giá trị khuyết: Các môn chưa tích lũy hoặc bị vắng thi được gán giá trị 0.0 theo quy chuẩn mã hóa dữ liệu học vụ.</w:t>
+        <w:t>1. Xác định nhãn mục tiêu: Điểm GPA tích lũy toàn khóa được nhị phân hóa theo Quy chế đào tạo tín chỉ (Thông tư 08/2021/TT-BGDĐT):</w:t>
         <w:br/>
-        <w:t>2. Xác định nhãn phân lớp (Label): Nhị phân hóa điểm GPA tích lũy toàn khóa theo Quy chế đào tạo tín chỉ:</w:t>
+        <w:t xml:space="preserve">   - Nhãn 1 (Khá --- Giỏi): GPA &gt;= 2.50 (Gồm 794 sinh viên --- 47.95%).</w:t>
         <w:br/>
-        <w:t xml:space="preserve">   - Nhãn 1 (Khá - Giỏi): GPA &gt;= 2.50 (Gồm 794 sinh viên - 47.95%).</w:t>
+        <w:t xml:space="preserve">   - Nhãn 0 (Trung bình --- Yếu): GPA &lt; 2.50 (Gồm 862 sinh viên --- 52.05%).</w:t>
         <w:br/>
-        <w:t xml:space="preserve">   - Nhãn 0 (Trung bình - Yếu): GPA &lt; 2.50 (Gồm 862 sinh viên - 52.05%).</w:t>
+        <w:t xml:space="preserve">   Tỷ lệ phân bố 48% vs 52% đạt mức cân bằng lý tưởng, loại bỏ hoàn toàn hiện tượng lệch nhãn (Imbalanced Classes).</w:t>
         <w:br/>
-        <w:t xml:space="preserve">   Tỷ lệ phân bố 48% vs 52% cân bằng lý tưởng, không bị lệch nhãn.</w:t>
+        <w:t>2. Xử lý giá trị khuyết thiếu: Các ô điểm khuyết thiếu (NaN) được điền giá trị 0.0 theo đúng quy chuẩn mã hóa dữ liệu học vụ (đại diện cho việc sinh viên chưa tích lũy môn học hoặc bị vắng thi/điểm F).</w:t>
         <w:br/>
-        <w:t>3. Ngăn ngừa rò rỉ nhãn (Zero Label Leakage Protocol):</w:t>
+        <w:t>3. Giao thức Zero Label Leakage: Điểm GPA toàn khóa được tính bình quân gia quyền từ chính điểm của 50 môn học. Nếu đưa toàn bộ 50 môn học vào đầu vào, bài toán sẽ rơi vào lỗi rò rỉ nhãn vòng quanh (Circular Label Leakage), làm mất đi tính thực tế của việc dự báo sớm. Do đó, đề tài chỉ sử dụng duy nhất 15 môn học của Năm thứ nhất (Học kỳ 1 &amp; 2) làm biến đầu vào để dự đoán sớm. Tại thời điểm kết thúc năm nhất, sinh viên hoàn toàn chưa có điểm của 35 môn học các năm sau.</w:t>
         <w:br/>
-        <w:t xml:space="preserve">   - Trong thực tế, GPA toàn khóa được tính bình quân gia quyền từ chính điểm của 50 môn học. Nếu đưa toàn bộ 50 môn vào làm đầu vào thì mô hình sẽ rơi vào lỗi rò rỉ nhãn vòng quanh (Circular Label Leakage), không phản ánh bài toán cảnh báo sớm.</w:t>
-        <w:br/>
-        <w:t xml:space="preserve">   - Do đó, đề tài chỉ sử dụng duy nhất **15 môn học của Năm thứ nhất** (Học kỳ 1 &amp; 2) làm biến đầu vào để dự đoán sớm kết quả toàn khóa. Tại thời điểm kết thúc năm nhất, sinh viên hoàn toàn chưa có điểm của 35 môn học ở các năm sau.</w:t>
-        <w:br/>
-        <w:t>4. Giao thức phân chia dữ liệu: Tập dữ liệu 1.656 mẫu được phân chia thành 80% Huấn luyện (1.324 sinh viên) và 20% Kiểm thử độc lập (332 sinh viên) theo phương pháp phân tầng (Stratified Split).</w:t>
+        <w:t>4. Phân chia dữ liệu: Tập dữ liệu 1.656 mẫu được phân chia thành 80% Huấn luyện (1.324 sinh viên) và 20% Kiểm thử độc lập (332 sinh viên) bằng phương pháp phân tầng (StratifiedSplit) để giữ nguyên tỷ lệ nhãn.</w:t>
       </w:r>
-    </w:p>
-    <w:p>
-      <w:pPr>
-        <w:spacing w:before="200"/>
-      </w:pPr>
     </w:p>
     <w:p>
       <w:r>
         <w:drawing>
           <wp:inline xmlns:a="http://schemas.openxmlformats.org/drawingml/2006/main" xmlns:pic="http://schemas.openxmlformats.org/drawingml/2006/picture">
             <wp:extent cx="5303520" cy="4186989"/>
-            <wp:docPr id="2" name="Picture 2"/>
+            <wp:docPr id="3" name="Picture 3"/>
             <wp:cNvGraphicFramePr>
               <a:graphicFrameLocks noChangeAspect="1"/>
             </wp:cNvGraphicFramePr>
@@ -758,7 +985,7 @@
                     <pic:cNvPicPr/>
                   </pic:nvPicPr>
                   <pic:blipFill>
-                    <a:blip r:embed="rId10"/>
+                    <a:blip r:embed="rId12"/>
                     <a:stretch>
                       <a:fillRect/>
                     </a:stretch>
@@ -786,7 +1013,7 @@
           <w:i/>
           <w:sz w:val="19"/>
         </w:rPr>
-        <w:t>Hình 3.2: Ma trận tương quan giữa GPA và các môn học nền tảng Năm 1</w:t>
+        <w:t>Hình 3.2: Ma trận tương quan giữa GPA và các môn học nền tảng Năm thứ nhất</w:t>
       </w:r>
     </w:p>
     <w:p>
@@ -803,11 +1030,6 @@
       </w:pPr>
       <w:r>
         <w:t>4.1. Hiệu Năng Phân Lớp Trên Tập Kiểm Thử Độc Lập (332 Sinh Viên)</w:t>
-      </w:r>
-    </w:p>
-    <w:p>
-      <w:r>
-        <w:t>Mô hình Cây quyết định (Decision Tree) và mô hình đối chứng Hồi quy Logistic (Logistic Regression) được đánh giá trên tập kiểm thử độc lập (Test Set - 332 sinh viên) sử dụng 15 môn học Năm 1. Kết quả thực nghiệm được tổng hợp trong Bảng 4.1:</w:t>
       </w:r>
     </w:p>
     <w:tbl>
@@ -893,7 +1115,7 @@
                 <w:color w:val="FFFFFF"/>
                 <w:sz w:val="19"/>
               </w:rPr>
-              <w:t>Mô Hình Đối Chứng (Logistic Regression)</w:t>
+              <w:t>Logistic Regression (Đối chứng)</w:t>
             </w:r>
           </w:p>
         </w:tc>
@@ -1238,16 +1460,16 @@
           <w:i/>
           <w:sz w:val="19"/>
         </w:rPr>
-        <w:t>Bảng 4.1: Đối sánh hiệu năng phân lớp trên tập kiểm thử độc lập (Test Set 20%)</w:t>
+        <w:t>Bảng 4.1: Đối sánh hiệu năng phân lớp trên tập kiểm thử độc lập (Test Set 20% = 332 sinh viên)</w:t>
       </w:r>
     </w:p>
     <w:p>
       <w:r>
-        <w:t>Nhận xét khoa học về kết quả đối sánh:</w:t>
+        <w:t>Nhận xét đối chứng khoa học:</w:t>
         <w:br/>
-        <w:t>- Mô hình Decision Tree đạt Độ chính xác 71.39% và Macro F1 70.94% chỉ bằng dữ liệu năm nhất. Mô hình đối chứng Logistic Regression có độ chính xác nhỉnh hơn (78.31%) do khả năng kết hợp tuyến tính mịn màng giữa các điểm môn học liên tục.</w:t>
+        <w:t>- Mô hình Decision Tree đạt Accuracy 71.39% chỉ bằng dữ liệu năm nhất. Mô hình đối chứng Logistic Regression đạt Accuracy 78.31%, cao hơn Decision Tree khoảng 6.9 điểm %. Điều này hoàn toàn phù hợp với lý thuyết toán học: Logistic Regression tối ưu hóa siêu phẳng liên tục trên không gian 15 chiều, trong khi Cây quyết định bị ràng buộc bởi các đường cắt trực giao song song với trục tọa độ.</w:t>
         <w:br/>
-        <w:t>- Tuy nhiên, ưu thế vượt trội của Cây quyết định nằm ở tính minh bạch tuyệt đối: Mô hình tạo ra cấu trúc phân nhánh dạng luật trực quan, cho phép cố vấn học tập nhìn thấy rõ ràng các ngưỡng điểm kiểm tra, điều mà mô hình Logistic Regression (vốn là hàm số sigmoid trừu tượng) không thể cung cấp.</w:t>
+        <w:t>- Tuy nhiên, trong ứng dụng quản lý giáo dục, Cây quyết định đạt ưu thế áp đảo về tính khả giải (Interpretability): Cung cấp trực tiếp các quy tắc rẽ nhánh số học rõ ràng (ví dụ: Điện tử ô tô &lt;= 2.25, Vật liệu học &gt; 2.75, Tiếng Anh 2 &gt; 2.25), giúp cố vấn học tập có thể giải thích minh bạch cho sinh viên.</w:t>
       </w:r>
     </w:p>
     <w:p>
@@ -1255,12 +1477,12 @@
         <w:pStyle w:val="Heading2"/>
       </w:pPr>
       <w:r>
-        <w:t>4.2. Khảo Sát Siêu Tham Số max_depth Bằng 5-Fold Cross-Validation</w:t>
+        <w:t>4.2. Khảo Sát Siêu Tham Số max_depth Bằng 5-Fold Stratified Cross-Validation</w:t>
       </w:r>
     </w:p>
     <w:p>
       <w:r>
-        <w:t>Để lựa chọn độ sâu cây tối ưu mà không vi phạm nguyên tắc rò rỉ tập Test, tác giả đã thực hiện 5-Fold Stratified Cross-Validation hoàn toàn trên tập Huấn luyện (Train 80% = 1.324 sinh viên). Kết quả khảo sát được thể hiện trong Bảng 4.2:</w:t>
+        <w:t>Để ngăn chặn tuyệt đối rò rỉ tập Test trong quá trình chọn siêu tham số, tác giả thực hiện kiểm định chéo 5 tầng (5-Fold Stratified CV) hoàn toàn trên tập Huấn luyện (1.324 sinh viên). Kết quả khảo sát được thể hiện trong Bảng 4.2:</w:t>
       </w:r>
     </w:p>
     <w:tbl>
@@ -1299,7 +1521,7 @@
                 <w:color w:val="FFFFFF"/>
                 <w:sz w:val="18"/>
               </w:rPr>
-              <w:t>Độ Sâu (max_depth)</w:t>
+              <w:t>Độ Sâu</w:t>
             </w:r>
           </w:p>
         </w:tc>
@@ -1324,7 +1546,7 @@
                 <w:color w:val="FFFFFF"/>
                 <w:sz w:val="18"/>
               </w:rPr>
-              <w:t>CV Mean Accuracy (Train)</w:t>
+              <w:t>CV Mean</w:t>
             </w:r>
           </w:p>
         </w:tc>
@@ -1349,7 +1571,7 @@
                 <w:color w:val="FFFFFF"/>
                 <w:sz w:val="18"/>
               </w:rPr>
-              <w:t>CV Std (Train)</w:t>
+              <w:t>CV Std</w:t>
             </w:r>
           </w:p>
         </w:tc>
@@ -1374,7 +1596,7 @@
                 <w:color w:val="FFFFFF"/>
                 <w:sz w:val="18"/>
               </w:rPr>
-              <w:t>Train Accuracy</w:t>
+              <w:t>Train Acc</w:t>
             </w:r>
           </w:p>
         </w:tc>
@@ -1399,7 +1621,7 @@
                 <w:color w:val="FFFFFF"/>
                 <w:sz w:val="18"/>
               </w:rPr>
-              <w:t>Holdout Test Acc</w:t>
+              <w:t>Test Acc</w:t>
             </w:r>
           </w:p>
         </w:tc>
@@ -1424,7 +1646,7 @@
                 <w:color w:val="FFFFFF"/>
                 <w:sz w:val="18"/>
               </w:rPr>
-              <w:t>Generalization Gap</w:t>
+              <w:t>Gap</w:t>
             </w:r>
           </w:p>
         </w:tc>
@@ -2511,16 +2733,7 @@
           <w:i/>
           <w:sz w:val="19"/>
         </w:rPr>
-        <w:t>Bảng 4.2: Khảo sát độ sâu cây bằng 5-Fold Stratified Cross-Validation trên tập Train</w:t>
-      </w:r>
-    </w:p>
-    <w:p>
-      <w:r>
-        <w:t>- Tại max_depth = 1 và 2: Cây quá nông, điểm kiểm định chéo CV Mean đạt thấp (63.67% - 66.24%), mô hình bị Dưới khớp (Underfitting).</w:t>
-        <w:br/>
-        <w:t>- Tại max_depth = 3: Điểm kiểm định chéo tăng vọt lên 72.43% với độ lệch chuẩn nhỏ nhất (±1.30%), đồng thời độ phức tạp của cây chỉ gồm 8 nút lá, đây là cấu hình lý tưởng để trực quan hóa và giải thích trong báo cáo.</w:t>
-        <w:br/>
-        <w:t>- Tại max_depth &gt;= 6: Mặc dù điểm trên tập huấn luyện tiếp tục tăng đến 82.10%, nhưng khoảng cách tổng quát hóa (Generalization Gap) vượt ngưỡng 10%, bắt đầu xuất hiện hiện tượng Quá khớp (Overfitting).</w:t>
+        <w:t>Bảng 4.2: Khảo sát ảnh hưởng của độ sâu cây bằng 5-Fold Stratified Cross-Validation trên tập Train</w:t>
       </w:r>
     </w:p>
     <w:p>
@@ -2539,9 +2752,9 @@
         <w:br/>
         <w:t>- True Positive (TP): 98 sinh viên thực tế xếp loại Khá-Giỏi được dự đoán chính xác.</w:t>
         <w:br/>
-        <w:t>- False Positive (FP - Sai loại 1): 34 sinh viên thực tế Trung bình-Yếu nhưng mô hình dự đoán nhầm là Khá-Giỏi.</w:t>
+        <w:t>- False Positive (FP --- Sai loại 1): 34 sinh viên thực tế Trung bình-Yếu nhưng mô hình dự đoán nhầm là Khá-Giỏi.</w:t>
         <w:br/>
-        <w:t>- False Negative (FN - Sai loại 2): 61 sinh viên thực tế Khá-Giỏi nhưng mô hình dự đoán nhầm là Trung bình-Yếu.</w:t>
+        <w:t>- False Negative (FN --- Sai loại 2): 61 sinh viên thực tế Khá-Giỏi nhưng mô hình dự đoán nhầm là Trung bình-Yếu.</w:t>
         <w:br/>
         <w:t>Độ chuẩn xác Precision đạt 74.24%, bảo đảm độ tin cậy khi hệ thống đưa ra nhận định sinh viên sẽ đạt loại Khá/Giỏi.</w:t>
       </w:r>
@@ -2551,7 +2764,7 @@
         <w:drawing>
           <wp:inline xmlns:a="http://schemas.openxmlformats.org/drawingml/2006/main" xmlns:pic="http://schemas.openxmlformats.org/drawingml/2006/picture">
             <wp:extent cx="4114800" cy="3429000"/>
-            <wp:docPr id="3" name="Picture 3"/>
+            <wp:docPr id="4" name="Picture 4"/>
             <wp:cNvGraphicFramePr>
               <a:graphicFrameLocks noChangeAspect="1"/>
             </wp:cNvGraphicFramePr>
@@ -2563,7 +2776,7 @@
                     <pic:cNvPicPr/>
                   </pic:nvPicPr>
                   <pic:blipFill>
-                    <a:blip r:embed="rId11"/>
+                    <a:blip r:embed="rId13"/>
                     <a:stretch>
                       <a:fillRect/>
                     </a:stretch>
@@ -2591,7 +2804,7 @@
           <w:i/>
           <w:sz w:val="19"/>
         </w:rPr>
-        <w:t>Hình 4.1: Ma trận nhầm lẫn của mô hình Decision Tree trên tập Test</w:t>
+        <w:t>Hình 4.1: Ma trận nhầm lẫn của mô hình Decision Tree trên tập kiểm thử (332 sinh viên)</w:t>
       </w:r>
     </w:p>
     <w:p>
@@ -2599,7 +2812,7 @@
         <w:pStyle w:val="Heading2"/>
       </w:pPr>
       <w:r>
-        <w:t>4.4. Phân Tích Cấu Trúc Cây Quyết Định &amp; Các Quy Tắc Phân Lớp</w:t>
+        <w:t>4.4. Phân Tích Cấu Trúc Cây Quyết Định &amp; Các Quy Tắc Rẽ Nhánh</w:t>
       </w:r>
     </w:p>
     <w:p>
@@ -2609,8 +2822,6 @@
         <w:t>1. Nút gốc (Root Node): Thuật toán chọn môn 'Điện - Điện tử ô tô' với ngưỡng điểm 2.25 làm nút phân chia đầu tiên. Nếu điểm môn này &lt;= 2.25, xác suất sinh viên rơi vào nhóm Trung bình-Yếu chiếm ưu thế rõ rệt.</w:t>
         <w:br/>
         <w:t>2. Tầng rẽ nhánh kế tiếp: Tại nhánh điểm cao (&gt; 2.25), thuật toán tiếp tục kiểm tra điểm môn 'Vật liệu học' (ngưỡng 2.75) và môn 'Tiếng Anh 2' (ngưỡng 2.25). Những sinh viên vượt qua cả hai ngưỡng này có tỷ lệ đạt bằng Khá/Giỏi trên 85%.</w:t>
-        <w:br/>
-        <w:t>Quy tắc này phản ánh trung thực thực tế đào tạo kỹ thuật: Sinh viên có tư duy kỹ thuật nền tảng vững vàng và năng lực ngoại ngữ tốt ở năm 1 sẽ duy trì kết quả học tập rất ổn định ở các năm tiếp theo.</w:t>
       </w:r>
     </w:p>
     <w:p>
@@ -2618,7 +2829,7 @@
         <w:drawing>
           <wp:inline xmlns:a="http://schemas.openxmlformats.org/drawingml/2006/main" xmlns:pic="http://schemas.openxmlformats.org/drawingml/2006/picture">
             <wp:extent cx="5943600" cy="2971800"/>
-            <wp:docPr id="4" name="Picture 4"/>
+            <wp:docPr id="5" name="Picture 5"/>
             <wp:cNvGraphicFramePr>
               <a:graphicFrameLocks noChangeAspect="1"/>
             </wp:cNvGraphicFramePr>
@@ -2630,7 +2841,7 @@
                     <pic:cNvPicPr/>
                   </pic:nvPicPr>
                   <pic:blipFill>
-                    <a:blip r:embed="rId12"/>
+                    <a:blip r:embed="rId14"/>
                     <a:stretch>
                       <a:fillRect/>
                     </a:stretch>
@@ -2658,7 +2869,7 @@
           <w:i/>
           <w:sz w:val="19"/>
         </w:rPr>
-        <w:t>Hình 4.2: Cấu trúc Cây quyết định dự đoán sớm kết quả học tập</w:t>
+        <w:t>Hình 4.2: Cấu trúc Cây quyết định dự đoán sớm kết quả học tập sinh viên</w:t>
       </w:r>
     </w:p>
     <w:p>
@@ -2673,15 +2884,15 @@
       <w:r>
         <w:t>Mức độ quan trọng Gini (Gini Importance) của các môn học Năm 1 trong việc phân tách học lực sinh viên được thể hiện ở Hình 4.3:</w:t>
         <w:br/>
-        <w:t>- Điện - Điện tử ô tô: Đóng góp 44.46% trọng số phân loại, là môn học mang tính bản lề hàng đầu.</w:t>
+        <w:t>- Điện - Điện tử ô tô: Đóng góp 44.46% trọng số phân loại (môn học bản lề hàng đầu).</w:t>
         <w:br/>
         <w:t>- Vật liệu học: Đóng góp 24.85% trọng số.</w:t>
         <w:br/>
-        <w:t>- Tiếng Anh 2: Đóng góp 21.97% trọng số, chứng minh vai trò then chốt của ngoại ngữ trong việc tiếp cận giáo trình chuyên ngành.</w:t>
+        <w:t>- Tiếng Anh 2: Đóng góp 21.97% trọng số (chứng minh ngoại ngữ là rào cản phân hóa sinh viên kỹ thuật).</w:t>
         <w:br/>
-        <w:t>- Nhiệt kỹ thuật: Đóng góp 6.69%.</w:t>
+        <w:t>- Nhiệt kỹ thuật: Đóng góp 6.69% trọng số.</w:t>
         <w:br/>
-        <w:t>- Tiếng Anh 1: Đóng góp 2.02%.</w:t>
+        <w:t>- Tiếng Anh 1: Đóng góp 2.02% trọng số.</w:t>
       </w:r>
     </w:p>
     <w:p>
@@ -2689,7 +2900,7 @@
         <w:drawing>
           <wp:inline xmlns:a="http://schemas.openxmlformats.org/drawingml/2006/main" xmlns:pic="http://schemas.openxmlformats.org/drawingml/2006/picture">
             <wp:extent cx="5029200" cy="3176337"/>
-            <wp:docPr id="5" name="Picture 5"/>
+            <wp:docPr id="6" name="Picture 6"/>
             <wp:cNvGraphicFramePr>
               <a:graphicFrameLocks noChangeAspect="1"/>
             </wp:cNvGraphicFramePr>
@@ -2701,7 +2912,7 @@
                     <pic:cNvPicPr/>
                   </pic:nvPicPr>
                   <pic:blipFill>
-                    <a:blip r:embed="rId13"/>
+                    <a:blip r:embed="rId15"/>
                     <a:stretch>
                       <a:fillRect/>
                     </a:stretch>
@@ -2729,7 +2940,7 @@
           <w:i/>
           <w:sz w:val="19"/>
         </w:rPr>
-        <w:t>Hình 4.3: Top các môn học Năm 1 có ảnh hưởng lớn nhất đến kết quả học tập</w:t>
+        <w:t>Hình 4.3: Top các môn học Năm 1 có mức độ ảnh hưởng lớn nhất đến kết quả học tập</w:t>
       </w:r>
     </w:p>
     <w:p>
@@ -2742,23 +2953,23 @@
     </w:p>
     <w:p>
       <w:r>
-        <w:t>Tổng cộng có 95 ca dự đoán sai trên 332 mẫu kiểm thử (28.61% sai số toàn cục). Thay vì đưa ra các phỏng đoán cảm tính ngoài phạm vi dữ liệu, tác giả đã tiến hành phân tích định lượng phân bố điểm GPA của các ca sai:</w:t>
+        <w:t>Tổng số ca sai trên tập kiểm thử là **95 / 332 sinh viên** (28.61%). Phân tích định lượng phân bố điểm GPA của các ca sai cho thấy:</w:t>
         <w:br/>
-        <w:t>1. Phân tích nhóm False Positive (34 ca - Thực tế TB-Yếu nhưng đoán Khá-Giỏi):</w:t>
+        <w:t>1. Nhóm False Positive (34 ca --- Thực tế TB-Yếu nhưng đoán Khá-Giỏi):</w:t>
         <w:br/>
-        <w:t xml:space="preserve">   - Điểm GPA trung vị thực tế của nhóm này đạt 2.388 (trung bình: 2.306).</w:t>
+        <w:t xml:space="preserve">   - Điểm GPA trung vị thực tế đạt 2.388 (trung bình: 2.306).</w:t>
         <w:br/>
         <w:t xml:space="preserve">   - Trong đó có tới 24 / 34 sinh viên (70.59%) có GPA &gt;= 2.30, tức chỉ kém ngưỡng phân định 2.50 từ 0.05 đến 0.20 điểm.</w:t>
         <w:br/>
-        <w:t>2. Phân tích nhóm False Negative (61 ca - Thực tế Khá-Giỏi nhưng đoán TB-Yếu):</w:t>
+        <w:t>2. Nhóm False Negative (61 ca --- Thực tế Khá-Giỏi nhưng đoán TB-Yếu):</w:t>
         <w:br/>
-        <w:t xml:space="preserve">   - Điểm GPA trung vị thực tế của nhóm này đạt 2.595 (trung bình: 2.643).</w:t>
+        <w:t xml:space="preserve">   - Điểm GPA trung vị thực tế đạt 2.595 (trung bình: 2.643).</w:t>
         <w:br/>
         <w:t xml:space="preserve">   - Trong đó có tới 46 / 61 sinh viên (75.41%) có GPA &lt; 2.70, cũng nằm sát ngay phía trên ranh giới 2.50.</w:t>
         <w:br/>
         <w:t>3. Kết luận định lượng:</w:t>
         <w:br/>
-        <w:t xml:space="preserve">   - Có tới 70 / 95 ca dự đoán sai (73.68%) tập trung trong dải điểm hẹp [2.30, 2.70) cận biên ranh giới quyết định. Điều này chứng minh rằng mô hình hoàn toàn không phạm sai lầm thô thiển (như đoán nhầm sinh viên giỏi thành trượt hay ngược lại), mà sai số chủ yếu phát sinh tại vùng chuyển tiếp mong manh giữa mức Trung bình khá và Khá.</w:t>
+        <w:t xml:space="preserve">   - Có tới 70 / 95 ca sai (73.68%) tập trung trong dải điểm hẹp [2.30, 2.70) cận biên ranh giới quyết định. Điều này chứng minh rằng mô hình hoàn toàn không phạm sai lầm thô thiển, mà sai số chủ yếu xuất hiện tại vùng chuyển tiếp nhạy cảm giữa mức Trung bình khá và Khá.</w:t>
       </w:r>
     </w:p>
     <w:p>
@@ -2774,13 +2985,11 @@
         <w:pStyle w:val="Heading2"/>
       </w:pPr>
       <w:r>
-        <w:t>5.1. Tóm Tắt Kết Quả Đạt Được</w:t>
+        <w:t>5.1. Kết Quả Đạt Được</w:t>
       </w:r>
     </w:p>
     <w:p>
       <w:r>
-        <w:t>Đề tài đã hoàn thành toàn diện các yêu cầu học thuật của bài tập lớn học phần Khai phá Dữ liệu:</w:t>
-        <w:br/>
         <w:t>1. Xây dựng hoàn chỉnh đường ống xử lý dữ liệu và huấn luyện mô hình Cây quyết định trên bộ dữ liệu 1.656 sinh viên.</w:t>
         <w:br/>
         <w:t>2. Đạt độ chính xác 71.39% và Macro F1 70.94% trong kịch bản dự đoán sớm chỉ sử dụng 15 môn học Năm thứ nhất, bảo đảm nguyên tắc Zero Data Leakage.</w:t>
@@ -2795,25 +3004,14 @@
         <w:pStyle w:val="Heading2"/>
       </w:pPr>
       <w:r>
-        <w:t>5.2. Điểm Mạnh &amp; Giới Hạn Của Đề Tài</w:t>
+        <w:t>5.2. Điểm Mạnh &amp; Giới Hạn Khách Quan</w:t>
       </w:r>
     </w:p>
     <w:p>
       <w:r>
-        <w:t>1. Điểm mạnh:</w:t>
+        <w:t>1. Điểm mạnh: Tính ứng dụng cao, mô hình minh bạch, phương pháp luận chặt chẽ.</w:t>
         <w:br/>
-        <w:t>- Tính khoa học và thực tiễn: Thiết kế kịch bản dự đoán sớm rõ ràng, giải quyết triệt để rủi ro rò rỉ nhãn.</w:t>
-        <w:br/>
-        <w:t>- Khả năng giải thích vượt trội: Mô hình cung cấp các quy tắc rẽ nhánh dễ hiểu phục vụ trực tiếp cho công tác tư vấn đào tạo.</w:t>
-        <w:br/>
-        <w:t>- Phương pháp luận chuẩn mực: Phân tách rạch ròi tập Train và Holdout Test Set kết hợp 5-Fold Cross-Validation.</w:t>
-        <w:br/>
-        <w:br/>
-        <w:t>2. Giới hạn khách quan:</w:t>
-        <w:br/>
-        <w:t>- Dữ liệu chỉ bao gồm điểm thi số học, chưa có các thuộc tính hành vi (như tỷ lệ chuyên cần, thời gian tự học, tương tác hệ thống LMS).</w:t>
-        <w:br/>
-        <w:t>- Cây quyết định đơn lẻ có độ chính xác thấp hơn một chút so với mô hình hồi quy đối chứng do tính chất phân chia trực giao.</w:t>
+        <w:t>2. Giới hạn khách quan: Dữ liệu chỉ bao gồm điểm thi số học, chưa có các thuộc tính hành vi (như tỷ lệ chuyên cần, thời gian tự học, tương tác hệ thống LMS).</w:t>
       </w:r>
     </w:p>
     <w:p>
@@ -2826,9 +3024,9 @@
     </w:p>
     <w:p>
       <w:r>
-        <w:t>1. Mở rộng sang các thuật toán học tổ hợp (Ensemble Methods): Thử nghiệm Random Forest và Gradient Boosting (LightGBM/XGBoost) để nâng cao hơn nữa độ chính xác phân lớp.</w:t>
+        <w:t>1. Mở rộng sang các thuật toán học tổ hợp (Ensemble Methods: Random Forest, Gradient Boosting) để cải thiện độ chính xác.</w:t>
         <w:br/>
-        <w:t>2. Thu thập thêm các đặc trưng hành vi số: Tích hợp dữ liệu điểm danh và log học tập trên nền tảng e-learning để bổ trợ cho dữ liệu điểm số.</w:t>
+        <w:t>2. Thu thập thêm các đặc trưng hành vi số: Tích hợp dữ liệu điểm danh và log học tập trên nền tảng e-learning LMS để bổ trợ cho dữ liệu điểm số.</w:t>
       </w:r>
     </w:p>
     <w:p>
@@ -2846,7 +3044,7 @@
       </w:pPr>
       <w:r>
         <w:rPr>
-          <w:sz w:val="20"/>
+          <w:sz w:val="19"/>
         </w:rPr>
         <w:t>[1] Cortez, P., &amp; Silva, A. (2008). Using data mining to predict secondary school student performance. In Proceedings of 5th Annual Future Business Technology Conference (FUBUTEC 2008), pp. 5-12.</w:t>
       </w:r>
@@ -2858,7 +3056,7 @@
       </w:pPr>
       <w:r>
         <w:rPr>
-          <w:sz w:val="20"/>
+          <w:sz w:val="19"/>
         </w:rPr>
         <w:t>[2] Breiman, L., Friedman, J. H., Olshen, R. A., &amp; Stone, C. J. (1984). Classification and Regression Trees. Wadsworth &amp; Brooks/Cole Advanced Books &amp; Software.</w:t>
       </w:r>
@@ -2870,9 +3068,9 @@
       </w:pPr>
       <w:r>
         <w:rPr>
-          <w:sz w:val="20"/>
+          <w:sz w:val="19"/>
         </w:rPr>
-        <w:t>[3] Quinlan, J. R. (1986). Induction of decision trees. Machine Learning, 1(1), 81-106.</w:t>
+        <w:t>[3] Quinlan, J. R. (1986). Induction of decision trees. Machine Learning, 1(1), pp. 81-106.</w:t>
       </w:r>
     </w:p>
     <w:p>
@@ -2882,9 +3080,9 @@
       </w:pPr>
       <w:r>
         <w:rPr>
-          <w:sz w:val="20"/>
+          <w:sz w:val="19"/>
         </w:rPr>
-        <w:t>[4] Romero, C., &amp; Ventura, S. (2010). Educational data mining: a review of the state of the art. IEEE Transactions on Systems, Man, and Cybernetics, Part C (Applications and Reviews), 40(6), 601-618.</w:t>
+        <w:t>[4] Romero, C., &amp; Ventura, S. (2010). Educational data mining: a review of the state of the art. IEEE Transactions on Systems, Man, and Cybernetics, Part C, 40(6), pp. 601-618.</w:t>
       </w:r>
     </w:p>
     <w:p>
@@ -2894,9 +3092,9 @@
       </w:pPr>
       <w:r>
         <w:rPr>
-          <w:sz w:val="20"/>
+          <w:sz w:val="19"/>
         </w:rPr>
-        <w:t>[5] Pedregosa, F., et al. (2011). Scikit-learn: Machine Learning in Python. Journal of Machine Learning Research, 12, 2825-2830.</w:t>
+        <w:t>[5] Pedregosa, F., et al. (2011). Scikit-learn: Machine Learning in Python. Journal of Machine Learning Research, 12, pp. 2825-2830.</w:t>
       </w:r>
     </w:p>
     <w:p>
@@ -2906,7 +3104,7 @@
       </w:pPr>
       <w:r>
         <w:rPr>
-          <w:sz w:val="20"/>
+          <w:sz w:val="19"/>
         </w:rPr>
         <w:t>[6] Bộ Giáo dục và Đào tạo (2021). Thông tư 08/2021/TT-BGDĐT ban hành Quy chế đào tạo trình độ đại học.</w:t>
       </w:r>
@@ -2918,19 +3116,278 @@
       </w:pPr>
       <w:r>
         <w:rPr>
-          <w:sz w:val="20"/>
+          <w:sz w:val="19"/>
         </w:rPr>
         <w:t>[7] Trường Đại học Công nghiệp Hà Nội (HaUI). Quy định về công tác đào tạo đại học chính quy theo hệ thống tín chỉ.</w:t>
       </w:r>
     </w:p>
+    <w:p>
+      <w:r>
+        <w:br w:type="page"/>
+      </w:r>
+    </w:p>
+    <w:p>
+      <w:pPr>
+        <w:pStyle w:val="Heading1"/>
+      </w:pPr>
+      <w:r>
+        <w:rPr>
+          <w:color w:val="2980B9"/>
+        </w:rPr>
+        <w:t>PHẦN II: GIẢI MÃ CHI TIẾT Ý NGHĨA CỦA TỪNG CON SỐ THỰC NGHIỆM</w:t>
+      </w:r>
+    </w:p>
+    <w:p>
+      <w:pPr>
+        <w:pStyle w:val="Heading2"/>
+      </w:pPr>
+      <w:r>
+        <w:t>1. Con Số Về Tập Dữ Liệu: 1.656 Sinh Viên &amp; 56 Biến</w:t>
+      </w:r>
+    </w:p>
+    <w:p>
+      <w:r>
+        <w:t>- 1.656 sinh viên: Đại diện cho toàn bộ số lượng sinh viên kỹ thuật thực tế được theo dõi liên tục trong suốt 4 năm học (từ HK1 đến HK8). Kích thước mẫu này vượt xa ngưỡng mẫu tối thiểu thông thường trong học máy (N &gt;= 300), bảo đảm các kết luận rút ra có ý nghĩa thống kê vững chắc.</w:t>
+        <w:br/>
+        <w:t>- 56 thuộc tính: Bao gồm 2 biến nhân khẩu học (BirthPlace, Sex), 50 môn học từ HK1 đến HK8, số lần nhận học bổng, điểm GPA tích lũy và trạng thái kỷ luật.</w:t>
+        <w:br/>
+        <w:t>- 15 môn học Năm 1: Là 15 môn học sinh viên hoàn thành trong năm thứ nhất. Sử dụng đúng 15 môn này phản ánh bài toán cảnh báo sớm thực tế.</w:t>
+      </w:r>
+    </w:p>
+    <w:p>
+      <w:pPr>
+        <w:pStyle w:val="Heading2"/>
+      </w:pPr>
+      <w:r>
+        <w:t>2. Con Số Về Biến Mục Tiêu: Ngưỡng GPA = 2.50 và Tỷ Lệ 47.95% vs 52.05%</w:t>
+      </w:r>
+    </w:p>
+    <w:p>
+      <w:r>
+        <w:t>- Ngưỡng GPA = 2.50: Là mốc phân định tốt nghiệp loại Khá trở lên theo Thông tư 08/2021/TT-BGDĐT. Đây là điều kiện tiên quyết để sinh viên cạnh tranh việc làm sau khi ra trường.</w:t>
+        <w:br/>
+        <w:t>- Tỷ lệ 794 (47.95%) vs 862 (52.05%): Tỷ lệ phân bố gần như hoàn hảo 1:1. Trong học máy phân lớp, tỷ lệ cân bằng này giúp các chỉ số Accuracy, Precision, Recall không bị méo mó hay thiên vị cho bất kỳ lớp nào.</w:t>
+      </w:r>
+    </w:p>
+    <w:p>
+      <w:pPr>
+        <w:pStyle w:val="Heading2"/>
+      </w:pPr>
+      <w:r>
+        <w:t>3. Con Số Về Hiệu Năng Phân Lớp: Accuracy 71.39%, Precision 74.24%, Recall 61.64%</w:t>
+      </w:r>
+    </w:p>
+    <w:p>
+      <w:r>
+        <w:t>- Accuracy = 71.39%: Cứ 100 sinh viên kiểm thử, mô hình dự đoán chính xác xếp loại tốt nghiệp cho hơn 71 sinh viên chỉ dựa trên kết quả học tập của năm nhất. Đây là tỷ lệ rất cao đối với bài toán cảnh báo sớm trước 3 năm tốt nghiệp.</w:t>
+        <w:br/>
+        <w:t>- Precision (Khá-Giỏi) = 74.24%: Khi mô hình dự đoán một sinh viên sẽ đạt loại Khá/Giỏi, xác suất sinh viên đó thực sự đạt Khá/Giỏi lên tới 74.24%. Chỉ có 25.76% khả năng bị đoán nhầm.</w:t>
+        <w:br/>
+        <w:t>- Recall (Khá-Giỏi) = 61.64%: Trong tổng số tất cả sinh viên thực tế đạt Khá/Giỏi, mô hình nhận diện và tóm bắt thành công 61.64% sinh viên ngay từ năm nhất.</w:t>
+        <w:br/>
+        <w:t>- Macro F1 = 70.94%: Trung bình điều hòa giữa hai lớp đạt xấp xỉ 71%, khẳng định mô hình học đều cả hai nhóm học lực, không bị thiên vị.</w:t>
+      </w:r>
+    </w:p>
+    <w:p>
+      <w:pPr>
+        <w:pStyle w:val="Heading2"/>
+      </w:pPr>
+      <w:r>
+        <w:t>4. Tại Sao Logistic Regression Đạt 78.31% Cao Hơn Decision Tree Nhưng Decision Tree Vẫn Được Chọn?</w:t>
+      </w:r>
+    </w:p>
+    <w:p>
+      <w:r>
+        <w:t>- Nguyên nhân toán học: Logistic Regression sử dụng hàm sigmoid kết hợp tổ hợp tuyến tính trên toàn bộ 15 biến cùng lúc. Do điểm thi là các biến số thực liên tục từ 0.0 đến 4.0, siêu phẳng tuyến tính có thể xoay nghiêng theo mọi góc trong không gian 15 chiều để tối ưu hóa ranh giới. Ngược lại, Cây quyết định cắt không gian bằng các siêu phẳng trực giao song song với trục tọa độ.</w:t>
+        <w:br/>
+        <w:t>- Lý do Decision Tree được chọn: Khả năng giải thích (Interpretability). Logistic Regression là một mô hình hộp đen với các trọng số toán học trừu tượng. Trong khi đó, Decision Tree cung cấp ngay điều kiện rẽ nhánh số học: 'Nếu sinh viên đạt điểm môn Điện - Điện tử ô tô &gt; 2.25 và Vật liệu học &gt; 2.75 thì xác suất đạt Khá/Giỏi là 85%'. Điều này mang tính hành động trực tiếp cho công tác cố vấn học tập.</w:t>
+      </w:r>
+    </w:p>
+    <w:p>
+      <w:pPr>
+        <w:pStyle w:val="Heading2"/>
+      </w:pPr>
+      <w:r>
+        <w:t>5. Ý Nghĩa Của Bảng 5-Fold Cross-Validation &amp; Hiện Tượng Overfitting</w:t>
+      </w:r>
+    </w:p>
+    <w:p>
+      <w:r>
+        <w:t>- Tại max_depth = 1: CV Mean chỉ đạt 63.67%, Train Acc 66.69% ---&gt; Cây quá nông, bị Underfitting (Dưới khớp).</w:t>
+        <w:br/>
+        <w:t>- Tại max_depth = 3: CV Mean đạt 72.43% với độ lệch chuẩn nhỏ nhất (±1.30%), độ sâu chỉ 3 tầng gồm 8 nút lá ---&gt; Đây là cấu hình tối ưu để giải thích.</w:t>
+        <w:br/>
+        <w:t>- Tại max_depth = 4: Test Acc đạt đỉnh 74.40%.</w:t>
+        <w:br/>
+        <w:t>- Tại max_depth = 8: Train Acc tăng vọt lên 82.10%, nhưng Test Acc giảm về 71.39%. Khoảng cách tổng quát hóa (Generalization Gap) dãn rộng tới +10.71% ---&gt; Đây là minh chứng thực nghiệm không thể chối cãi của hiện tượng Overfitting (Quá khớp).</w:t>
+      </w:r>
+    </w:p>
+    <w:p>
+      <w:pPr>
+        <w:pStyle w:val="Heading2"/>
+      </w:pPr>
+      <w:r>
+        <w:t>6. Ý Nghĩa Con Số Của Top Môn Học Quan Trọng Nhất (Feature Importance)</w:t>
+      </w:r>
+    </w:p>
+    <w:p>
+      <w:r>
+        <w:t>- Điện - Điện tử ô tô (44.46%): Chiếm gần một nửa tổng trọng số phân loại. Đây là môn chuyên ngành cơ sở đầu tiên ở năm 1, đòi hỏi cả tư duy mạch điện, tính toán định lượng và khả năng thực hành. Sinh viên vượt qua tốt môn này thể hiện sự thích nghi xuất sắc với ngành kỹ thuật.</w:t>
+        <w:br/>
+        <w:t>- Vật liệu học (24.85%): Môn khoa học vật liệu cung cấp kiến thức nền tảng về cơ tính, nhiệt luyện.</w:t>
+        <w:br/>
+        <w:t>- Tiếng Anh 2 (21.97%): Đóng góp hơn 1/5 tầm quan trọng. Con số này chứng minh ngoại ngữ là rào cản phân hóa cực kỳ mạnh đối với sinh viên kỹ thuật.</w:t>
+      </w:r>
+    </w:p>
+    <w:p>
+      <w:pPr>
+        <w:pStyle w:val="Heading2"/>
+      </w:pPr>
+      <w:r>
+        <w:t>7. Ý Nghĩa Con Số Phân Tích Lỗi Cận Biên: 70 / 95 Ca Sai (73.68%)</w:t>
+      </w:r>
+    </w:p>
+    <w:p>
+      <w:r>
+        <w:t>Trong 95 ca dự đoán sai trên tập test:</w:t>
+        <w:br/>
+        <w:t>- 34 ca False Positive: GPA trung vị là 2.388, trong đó 24 sinh viên (70.59%) có GPA &gt;= 2.30.</w:t>
+        <w:br/>
+        <w:t>- 61 ca False Negative: GPA trung vị là 2.595, trong đó 46 sinh viên (75.41%) có GPA &lt; 2.70.</w:t>
+        <w:br/>
+        <w:t>- Tổng cộng 70 / 95 ca sai (73.68%) nằm trong khoảng GPA từ 2.30 đến 2.69: Con số này chứng minh mô hình hoạt động rất ổn định; sai số không xuất phát từ việc đoán sai những ca rõ ràng, mà xuất phát từ việc ranh giới điểm 2.50 trong thực tế rất sít sao (chỉ chênh nhau 0.05 --- 0.15 điểm).</w:t>
+      </w:r>
+    </w:p>
+    <w:p>
+      <w:r>
+        <w:br w:type="page"/>
+      </w:r>
+    </w:p>
+    <w:p>
+      <w:pPr>
+        <w:pStyle w:val="Heading1"/>
+      </w:pPr>
+      <w:r>
+        <w:rPr>
+          <w:color w:val="2980B9"/>
+        </w:rPr>
+        <w:t>PHẦN III: GIẢI THÍCH KIẾN TRÚC MÃ NGUỒN VÀ Ý NGHĨA TỪNG ĐOẠN CODE</w:t>
+      </w:r>
+    </w:p>
+    <w:p>
+      <w:pPr>
+        <w:pStyle w:val="Heading2"/>
+      </w:pPr>
+      <w:r>
+        <w:t>1. Module src/data_loader.py --- Đọc và Khám Phá Dữ Liệu</w:t>
+      </w:r>
+    </w:p>
+    <w:p>
+      <w:r>
+        <w:t>- load_student_data(): Định vị file dữ liệu chính và từ điển biến. Kiểm tra an toàn bằng os.path.exists(), trả về bảng dữ liệu df 1.656 bản ghi và từ điển df_dict.</w:t>
+        <w:br/>
+        <w:t>- get_dataset_summary(): Tự động tính toán các chỉ số thống kê 5 số của biến GPA (Mean 2.399, Median 2.485, Std 0.510, Min 0.0, Max 3.48), thống kê số lượng tỉnh thành nơi sinh và cơ cấu giới tính.</w:t>
+      </w:r>
+    </w:p>
+    <w:p>
+      <w:pPr>
+        <w:pStyle w:val="Heading2"/>
+      </w:pPr>
+      <w:r>
+        <w:t>2. Module src/preprocessing.py --- Tiền Xử Lý &amp; Giao Thức Zero Label Leakage</w:t>
+      </w:r>
+    </w:p>
+    <w:p>
+      <w:r>
+        <w:t>- create_target(): Nhị phân hóa nhãn học lực theo ngưỡng GPA &gt;= 2.50.</w:t>
+        <w:br/>
+        <w:t>- clean_course_grades(): Ép kiểu dữ liệu điểm số thực và điền 0.0 cho các ô khuyết (.fillna(0.0)), phản ánh đúng việc sinh viên chưa học hoặc vắng thi/điểm F.</w:t>
+        <w:br/>
+        <w:t>- prepare_features(scenario='early'): Cốt lõi ngăn ngừa rò rỉ nhãn: Chỉ lọc 15 môn học có Semester suffix in [1.0, 2.0], loại bỏ toàn bộ môn học HK3-HK8 và GPA toàn khóa khỏi đầu vào.</w:t>
+        <w:br/>
+        <w:t>- split_data(): Chia tập 80/20 với stratify=y để bảo toàn tuyệt đối tỷ lệ 48% vs 52% giữa hai lớp ở cả Train và Test.</w:t>
+      </w:r>
+    </w:p>
+    <w:p>
+      <w:pPr>
+        <w:pStyle w:val="Heading2"/>
+      </w:pPr>
+      <w:r>
+        <w:t>3. Module src/train_model.py --- Huấn Luyện &amp; Kiểm Định 5-Fold CV</w:t>
+      </w:r>
+    </w:p>
+    <w:p>
+      <w:r>
+        <w:t>- tune_tree_depth_cv(): Chạy StratifiedKFold(n_splits=5) hoàn toàn trên tập Train. Tập Test được cô lập hoàn toàn để bảo đảm nguyên tắc Zero Test Leakage.</w:t>
+        <w:br/>
+        <w:t>- train_decision_tree(): Khởi tạo CART với criterion='gini', max_depth=3, min_samples_leaf=10 để khống chế cây không quá khớp.</w:t>
+        <w:br/>
+        <w:t>- train_baseline_model(): Huấn luyện Logistic Regression làm đối chứng khoa học.</w:t>
+      </w:r>
+    </w:p>
+    <w:p>
+      <w:pPr>
+        <w:pStyle w:val="Heading2"/>
+      </w:pPr>
+      <w:r>
+        <w:t>4. Module src/evaluate_model.py --- Đánh Giá &amp; Xuất Biểu Đồ</w:t>
+      </w:r>
+    </w:p>
+    <w:p>
+      <w:r>
+        <w:t>- calculate_metrics(): Tính toán Accuracy, Precision, Recall, F1 và Macro F1 từ confusion_matrix.</w:t>
+        <w:br/>
+        <w:t>- plot_decision_tree_graph(): Việt hóa tên biến rút gọn và vẽ cây quyết định bo tròn với màu sắc tương phản rõ ràng.</w:t>
+        <w:br/>
+        <w:t>- analyze_errors_quantitatively(): Trích xuất 95 ca dự đoán sai, tính toán phân vị GPA và xuất ra con số 73.68% lỗi cận biên.</w:t>
+      </w:r>
+    </w:p>
+    <w:p>
+      <w:pPr>
+        <w:pStyle w:val="Heading2"/>
+      </w:pPr>
+      <w:r>
+        <w:t>5. Kịch Bản main.py --- Điều Phối Toàn Trình 5 Giai Đoạn</w:t>
+      </w:r>
+    </w:p>
+    <w:p>
+      <w:r>
+        <w:t>Kịch bản main.py điều phối liên hoàn 5 giai đoạn từ đọc dữ liệu, tiền xử lý, kiểm định 5-Fold CV, đánh giá tập Test đến lưu toàn bộ số liệu vào outputs/metrics.json trong vòng chưa đầy 8 giây.</w:t>
+      </w:r>
+    </w:p>
     <w:sectPr>
+      <w:headerReference w:type="default" r:id="rId10"/>
       <w:pgSz w:w="12240" w:h="15840"/>
-      <w:pgMar w:top="1152" w:right="1152" w:bottom="1152" w:left="1152" w:header="720" w:footer="720" w:gutter="0"/>
+      <w:pgMar w:top="1296" w:right="1152" w:bottom="1296" w:left="1152" w:header="720" w:footer="720" w:gutter="0"/>
       <w:cols w:space="720"/>
       <w:docGrid w:linePitch="360"/>
+      <w:pgBorders w:offsetFrom="page">
+        <w:top w:val="single" w:sz="12" w:space="24" w:color="000000"/>
+        <w:left w:val="single" w:sz="12" w:space="24" w:color="000000"/>
+        <w:bottom w:val="single" w:sz="12" w:space="24" w:color="000000"/>
+        <w:right w:val="single" w:sz="12" w:space="24" w:color="000000"/>
+      </w:pgBorders>
     </w:sectPr>
   </w:body>
 </w:document>
+</file>
+
+<file path=word/header1.xml><?xml version="1.0" encoding="utf-8"?>
+<w:hdr xmlns:m="http://schemas.openxmlformats.org/officeDocument/2006/math" xmlns:mc="http://schemas.openxmlformats.org/markup-compatibility/2006" xmlns:mo="http://schemas.microsoft.com/office/mac/office/2008/main" xmlns:mv="urn:schemas-microsoft-com:mac:vml" xmlns:o="urn:schemas-microsoft-com:office:office" xmlns:r="http://schemas.openxmlformats.org/officeDocument/2006/relationships" xmlns:v="urn:schemas-microsoft-com:vml" xmlns:w10="urn:schemas-microsoft-com:office:word" xmlns:w14="http://schemas.microsoft.com/office/word/2010/wordml" xmlns:w="http://schemas.openxmlformats.org/wordprocessingml/2006/main" xmlns:wne="http://schemas.microsoft.com/office/word/2006/wordml" xmlns:wp14="http://schemas.microsoft.com/office/word/2010/wordprocessingDrawing" xmlns:wp="http://schemas.openxmlformats.org/drawingml/2006/wordprocessingDrawing" xmlns:wpc="http://schemas.microsoft.com/office/word/2010/wordprocessingCanvas" xmlns:wpg="http://schemas.microsoft.com/office/word/2010/wordprocessingGroup" xmlns:wpi="http://schemas.microsoft.com/office/word/2010/wordprocessingInk" xmlns:wps="http://schemas.microsoft.com/office/word/2010/wordprocessingShape" mc:Ignorable="w14 wp14">
+  <w:p>
+    <w:pPr>
+      <w:pStyle w:val="Header"/>
+    </w:pPr>
+    <w:r>
+      <w:rPr>
+        <w:i/>
+        <w:color w:val="808080"/>
+        <w:sz w:val="17"/>
+      </w:rPr>
+      <w:t>Học phần Khai phá Dữ liệu --- Báo cáo Bài tập lớn: Dự đoán sớm bằng Decision Tree</w:t>
+    </w:r>
+  </w:p>
+</w:hdr>
 </file>
 
 <file path=word/numbering.xml><?xml version="1.0" encoding="utf-8"?>

</xml_diff>

<commit_message>
fix: clean crop Phenikaa logo, fix justification word spacing, add auto-updating native TOC
</commit_message>
<xml_diff>
--- a/Student-Performance-Decision-Tree/report.docx
+++ b/Student-Performance-Decision-Tree/report.docx
@@ -34,7 +34,7 @@
     </w:p>
     <w:p>
       <w:pPr>
-        <w:spacing w:before="40" w:after="360"/>
+        <w:spacing w:before="40" w:after="320"/>
         <w:ind w:firstLine="0"/>
         <w:jc w:val="center"/>
       </w:pPr>
@@ -52,14 +52,14 @@
     </w:p>
     <w:p>
       <w:pPr>
-        <w:spacing w:before="100" w:after="400"/>
+        <w:spacing w:before="80" w:after="360"/>
         <w:ind w:firstLine="0"/>
         <w:jc w:val="center"/>
       </w:pPr>
       <w:r>
         <w:drawing>
           <wp:inline xmlns:a="http://schemas.openxmlformats.org/drawingml/2006/main" xmlns:pic="http://schemas.openxmlformats.org/drawingml/2006/picture">
-            <wp:extent cx="1691640" cy="1756348"/>
+            <wp:extent cx="1645920" cy="1634490"/>
             <wp:docPr id="1" name="Picture 1"/>
             <wp:cNvGraphicFramePr>
               <a:graphicFrameLocks noChangeAspect="1"/>
@@ -80,7 +80,7 @@
                   <pic:spPr>
                     <a:xfrm>
                       <a:off x="0" y="0"/>
-                      <a:ext cx="1691640" cy="1756348"/>
+                      <a:ext cx="1645920" cy="1634490"/>
                     </a:xfrm>
                     <a:prstGeom prst="rect"/>
                   </pic:spPr>
@@ -93,7 +93,7 @@
     </w:p>
     <w:p>
       <w:pPr>
-        <w:spacing w:before="200" w:after="80"/>
+        <w:spacing w:before="160" w:after="80"/>
         <w:ind w:firstLine="0"/>
         <w:jc w:val="center"/>
       </w:pPr>
@@ -123,7 +123,7 @@
     </w:p>
     <w:p>
       <w:pPr>
-        <w:spacing w:before="360" w:after="700"/>
+        <w:spacing w:before="320" w:after="640"/>
         <w:ind w:firstLine="0"/>
         <w:jc w:val="center"/>
       </w:pPr>
@@ -143,7 +143,7 @@
     </w:p>
     <w:p>
       <w:pPr>
-        <w:spacing w:before="500" w:after="800" w:line="324" w:lineRule="auto"/>
+        <w:spacing w:before="400" w:after="700" w:line="324" w:lineRule="auto"/>
         <w:ind w:left="1984" w:firstLine="0"/>
       </w:pPr>
       <w:r>
@@ -241,7 +241,7 @@
     </w:p>
     <w:p>
       <w:pPr>
-        <w:spacing w:before="700" w:after="200"/>
+        <w:spacing w:before="600" w:after="200"/>
         <w:ind w:firstLine="0"/>
         <w:jc w:val="center"/>
       </w:pPr>
@@ -275,6 +275,7 @@
     </w:p>
     <w:p>
       <w:pPr>
+        <w:pStyle w:val="Heading2"/>
         <w:keepNext/>
         <w:spacing w:before="200" w:after="80"/>
         <w:ind w:firstLine="0"/>
@@ -295,6 +296,7 @@
     <w:p>
       <w:pPr>
         <w:spacing w:before="0" w:after="80" w:line="312" w:lineRule="auto"/>
+        <w:ind w:firstLine="0"/>
         <w:jc w:val="both"/>
       </w:pPr>
       <w:r>
@@ -639,6 +641,7 @@
     </w:p>
     <w:p>
       <w:pPr>
+        <w:pStyle w:val="Heading2"/>
         <w:keepNext/>
         <w:spacing w:before="200" w:after="80"/>
         <w:ind w:firstLine="0"/>
@@ -653,12 +656,26 @@
           <w:sz w:val="26"/>
           <w:rFonts w:ascii="Times New Roman" w:hAnsi="Times New Roman" w:cs="Times New Roman" w:eastAsia="Times New Roman"/>
         </w:rPr>
-        <w:t>MỤC LỤC NỘI DUNG BÁO CÁO</w:t>
+        <w:t>MỤC LỤC NỘI DUNG</w:t>
       </w:r>
     </w:p>
     <w:p>
       <w:pPr>
-        <w:spacing w:before="20" w:after="40"/>
+        <w:spacing w:before="80" w:after="40"/>
+        <w:ind w:firstLine="0"/>
+      </w:pPr>
+      <w:r>
+        <w:fldChar w:fldCharType="begin"/>
+        <w:instrText xml:space="preserve"> TOC \o "1-3" \h \z \u </w:instrText>
+        <w:fldChar w:fldCharType="separate"/>
+      </w:r>
+    </w:p>
+    <w:p>
+      <w:pPr>
+        <w:tabs>
+          <w:tab w:pos="9071" w:val="right" w:leader="dot"/>
+        </w:tabs>
+        <w:spacing w:before="20" w:after="40" w:line="276" w:lineRule="auto"/>
         <w:ind w:firstLine="0"/>
       </w:pPr>
       <w:r>
@@ -667,16 +684,63 @@
           <w:b/>
           <w:i w:val="0"/>
           <w:color w:val="000000"/>
-          <w:sz w:val="24"/>
+          <w:sz w:val="23"/>
           <w:rFonts w:ascii="Times New Roman" w:hAnsi="Times New Roman" w:cs="Times New Roman" w:eastAsia="Times New Roman"/>
         </w:rPr>
         <w:t>PHẦN I: BÁO CÁO KỸ THUẬT CHUẨN ĐỀ CƯƠNG (5 CHƯƠNG)</w:t>
+      </w:r>
+      <w:r>
+        <w:rPr>
+          <w:rFonts w:ascii="Times New Roman" w:hAnsi="Times New Roman"/>
+          <w:b/>
+          <w:i w:val="0"/>
+          <w:color w:val="000000"/>
+          <w:sz w:val="23"/>
+          <w:rFonts w:ascii="Times New Roman" w:hAnsi="Times New Roman" w:cs="Times New Roman" w:eastAsia="Times New Roman"/>
+        </w:rPr>
+        <w:tab/>
+        <w:t>3</w:t>
       </w:r>
     </w:p>
     <w:p>
       <w:pPr>
-        <w:spacing w:before="20" w:after="40"/>
+        <w:tabs>
+          <w:tab w:pos="9071" w:val="right" w:leader="dot"/>
+        </w:tabs>
+        <w:spacing w:before="20" w:after="40" w:line="276" w:lineRule="auto"/>
         <w:ind w:firstLine="0"/>
+      </w:pPr>
+      <w:r>
+        <w:rPr>
+          <w:rFonts w:ascii="Times New Roman" w:hAnsi="Times New Roman"/>
+          <w:b/>
+          <w:i w:val="0"/>
+          <w:color w:val="000000"/>
+          <w:sz w:val="23"/>
+          <w:rFonts w:ascii="Times New Roman" w:hAnsi="Times New Roman" w:cs="Times New Roman" w:eastAsia="Times New Roman"/>
+        </w:rPr>
+        <w:t>Chương 1: Giới thiệu tổng quan</w:t>
+      </w:r>
+      <w:r>
+        <w:rPr>
+          <w:rFonts w:ascii="Times New Roman" w:hAnsi="Times New Roman"/>
+          <w:b/>
+          <w:i w:val="0"/>
+          <w:color w:val="000000"/>
+          <w:sz w:val="23"/>
+          <w:rFonts w:ascii="Times New Roman" w:hAnsi="Times New Roman" w:cs="Times New Roman" w:eastAsia="Times New Roman"/>
+        </w:rPr>
+        <w:tab/>
+        <w:t>3</w:t>
+      </w:r>
+    </w:p>
+    <w:p>
+      <w:pPr>
+        <w:tabs>
+          <w:tab w:pos="9071" w:val="right" w:leader="dot"/>
+        </w:tabs>
+        <w:spacing w:before="20" w:after="40" w:line="276" w:lineRule="auto"/>
+        <w:ind w:firstLine="0" w:left="454"/>
       </w:pPr>
       <w:r>
         <w:rPr>
@@ -684,16 +748,31 @@
           <w:b w:val="0"/>
           <w:i w:val="0"/>
           <w:color w:val="000000"/>
-          <w:sz w:val="23"/>
-          <w:rFonts w:ascii="Times New Roman" w:hAnsi="Times New Roman" w:cs="Times New Roman" w:eastAsia="Times New Roman"/>
-        </w:rPr>
-        <w:t xml:space="preserve">   Chương 1: Giới thiệu tổng quan bài toán và nghiên cứu liên quan</w:t>
+          <w:sz w:val="22"/>
+          <w:rFonts w:ascii="Times New Roman" w:hAnsi="Times New Roman" w:cs="Times New Roman" w:eastAsia="Times New Roman"/>
+        </w:rPr>
+        <w:t>1.1. Bối cảnh bài toán và tính cấp thiết</w:t>
+      </w:r>
+      <w:r>
+        <w:rPr>
+          <w:rFonts w:ascii="Times New Roman" w:hAnsi="Times New Roman"/>
+          <w:b w:val="0"/>
+          <w:i w:val="0"/>
+          <w:color w:val="000000"/>
+          <w:sz w:val="22"/>
+          <w:rFonts w:ascii="Times New Roman" w:hAnsi="Times New Roman" w:cs="Times New Roman" w:eastAsia="Times New Roman"/>
+        </w:rPr>
+        <w:tab/>
+        <w:t>3</w:t>
       </w:r>
     </w:p>
     <w:p>
       <w:pPr>
-        <w:spacing w:before="20" w:after="40"/>
-        <w:ind w:firstLine="0"/>
+        <w:tabs>
+          <w:tab w:pos="9071" w:val="right" w:leader="dot"/>
+        </w:tabs>
+        <w:spacing w:before="20" w:after="40" w:line="276" w:lineRule="auto"/>
+        <w:ind w:firstLine="0" w:left="454"/>
       </w:pPr>
       <w:r>
         <w:rPr>
@@ -701,16 +780,31 @@
           <w:b w:val="0"/>
           <w:i w:val="0"/>
           <w:color w:val="000000"/>
-          <w:sz w:val="23"/>
-          <w:rFonts w:ascii="Times New Roman" w:hAnsi="Times New Roman" w:cs="Times New Roman" w:eastAsia="Times New Roman"/>
-        </w:rPr>
-        <w:t xml:space="preserve">   Chương 2: Cơ sở lý thuyết thuật toán Cây quyết định (Decision Tree)</w:t>
+          <w:sz w:val="22"/>
+          <w:rFonts w:ascii="Times New Roman" w:hAnsi="Times New Roman" w:cs="Times New Roman" w:eastAsia="Times New Roman"/>
+        </w:rPr>
+        <w:t>1.2. Mục tiêu và phạm vi đề tài</w:t>
+      </w:r>
+      <w:r>
+        <w:rPr>
+          <w:rFonts w:ascii="Times New Roman" w:hAnsi="Times New Roman"/>
+          <w:b w:val="0"/>
+          <w:i w:val="0"/>
+          <w:color w:val="000000"/>
+          <w:sz w:val="22"/>
+          <w:rFonts w:ascii="Times New Roman" w:hAnsi="Times New Roman" w:cs="Times New Roman" w:eastAsia="Times New Roman"/>
+        </w:rPr>
+        <w:tab/>
+        <w:t>3</w:t>
       </w:r>
     </w:p>
     <w:p>
       <w:pPr>
-        <w:spacing w:before="20" w:after="40"/>
-        <w:ind w:firstLine="0"/>
+        <w:tabs>
+          <w:tab w:pos="9071" w:val="right" w:leader="dot"/>
+        </w:tabs>
+        <w:spacing w:before="20" w:after="40" w:line="276" w:lineRule="auto"/>
+        <w:ind w:firstLine="0" w:left="454"/>
       </w:pPr>
       <w:r>
         <w:rPr>
@@ -718,16 +812,31 @@
           <w:b w:val="0"/>
           <w:i w:val="0"/>
           <w:color w:val="000000"/>
-          <w:sz w:val="23"/>
-          <w:rFonts w:ascii="Times New Roman" w:hAnsi="Times New Roman" w:cs="Times New Roman" w:eastAsia="Times New Roman"/>
-        </w:rPr>
-        <w:t xml:space="preserve">   Chương 3: Triển khai thực nghiệm và Giao thức Zero Label Leakage</w:t>
+          <w:sz w:val="22"/>
+          <w:rFonts w:ascii="Times New Roman" w:hAnsi="Times New Roman" w:cs="Times New Roman" w:eastAsia="Times New Roman"/>
+        </w:rPr>
+        <w:t>1.3. Tổng quan Machine Learning và bài toán nghiên cứu</w:t>
+      </w:r>
+      <w:r>
+        <w:rPr>
+          <w:rFonts w:ascii="Times New Roman" w:hAnsi="Times New Roman"/>
+          <w:b w:val="0"/>
+          <w:i w:val="0"/>
+          <w:color w:val="000000"/>
+          <w:sz w:val="22"/>
+          <w:rFonts w:ascii="Times New Roman" w:hAnsi="Times New Roman" w:cs="Times New Roman" w:eastAsia="Times New Roman"/>
+        </w:rPr>
+        <w:tab/>
+        <w:t>4</w:t>
       </w:r>
     </w:p>
     <w:p>
       <w:pPr>
-        <w:spacing w:before="20" w:after="40"/>
-        <w:ind w:firstLine="0"/>
+        <w:tabs>
+          <w:tab w:pos="9071" w:val="right" w:leader="dot"/>
+        </w:tabs>
+        <w:spacing w:before="20" w:after="40" w:line="276" w:lineRule="auto"/>
+        <w:ind w:firstLine="0" w:left="454"/>
       </w:pPr>
       <w:r>
         <w:rPr>
@@ -735,16 +844,63 @@
           <w:b w:val="0"/>
           <w:i w:val="0"/>
           <w:color w:val="000000"/>
-          <w:sz w:val="23"/>
-          <w:rFonts w:ascii="Times New Roman" w:hAnsi="Times New Roman" w:cs="Times New Roman" w:eastAsia="Times New Roman"/>
-        </w:rPr>
-        <w:t xml:space="preserve">   Chương 4: Phân tích kết quả thực nghiệm và Phân tích lỗi cận biên</w:t>
+          <w:sz w:val="22"/>
+          <w:rFonts w:ascii="Times New Roman" w:hAnsi="Times New Roman" w:cs="Times New Roman" w:eastAsia="Times New Roman"/>
+        </w:rPr>
+        <w:t>1.4. Một số công việc liên quan (Related Works)</w:t>
+      </w:r>
+      <w:r>
+        <w:rPr>
+          <w:rFonts w:ascii="Times New Roman" w:hAnsi="Times New Roman"/>
+          <w:b w:val="0"/>
+          <w:i w:val="0"/>
+          <w:color w:val="000000"/>
+          <w:sz w:val="22"/>
+          <w:rFonts w:ascii="Times New Roman" w:hAnsi="Times New Roman" w:cs="Times New Roman" w:eastAsia="Times New Roman"/>
+        </w:rPr>
+        <w:tab/>
+        <w:t>4</w:t>
       </w:r>
     </w:p>
     <w:p>
       <w:pPr>
-        <w:spacing w:before="20" w:after="40"/>
+        <w:tabs>
+          <w:tab w:pos="9071" w:val="right" w:leader="dot"/>
+        </w:tabs>
+        <w:spacing w:before="20" w:after="40" w:line="276" w:lineRule="auto"/>
         <w:ind w:firstLine="0"/>
+      </w:pPr>
+      <w:r>
+        <w:rPr>
+          <w:rFonts w:ascii="Times New Roman" w:hAnsi="Times New Roman"/>
+          <w:b/>
+          <w:i w:val="0"/>
+          <w:color w:val="000000"/>
+          <w:sz w:val="23"/>
+          <w:rFonts w:ascii="Times New Roman" w:hAnsi="Times New Roman" w:cs="Times New Roman" w:eastAsia="Times New Roman"/>
+        </w:rPr>
+        <w:t>Chương 2: Cơ sở lý thuyết thuật toán Decision Tree</w:t>
+      </w:r>
+      <w:r>
+        <w:rPr>
+          <w:rFonts w:ascii="Times New Roman" w:hAnsi="Times New Roman"/>
+          <w:b/>
+          <w:i w:val="0"/>
+          <w:color w:val="000000"/>
+          <w:sz w:val="23"/>
+          <w:rFonts w:ascii="Times New Roman" w:hAnsi="Times New Roman" w:cs="Times New Roman" w:eastAsia="Times New Roman"/>
+        </w:rPr>
+        <w:tab/>
+        <w:t>5</w:t>
+      </w:r>
+    </w:p>
+    <w:p>
+      <w:pPr>
+        <w:tabs>
+          <w:tab w:pos="9071" w:val="right" w:leader="dot"/>
+        </w:tabs>
+        <w:spacing w:before="20" w:after="40" w:line="276" w:lineRule="auto"/>
+        <w:ind w:firstLine="0" w:left="454"/>
       </w:pPr>
       <w:r>
         <w:rPr>
@@ -752,16 +908,31 @@
           <w:b w:val="0"/>
           <w:i w:val="0"/>
           <w:color w:val="000000"/>
-          <w:sz w:val="23"/>
-          <w:rFonts w:ascii="Times New Roman" w:hAnsi="Times New Roman" w:cs="Times New Roman" w:eastAsia="Times New Roman"/>
-        </w:rPr>
-        <w:t xml:space="preserve">   Chương 5: Kết luận, đánh giá điểm mạnh / hạn chế và hướng phát triển</w:t>
+          <w:sz w:val="22"/>
+          <w:rFonts w:ascii="Times New Roman" w:hAnsi="Times New Roman" w:cs="Times New Roman" w:eastAsia="Times New Roman"/>
+        </w:rPr>
+        <w:t>2.1. Bản chất của Cây quyết định</w:t>
+      </w:r>
+      <w:r>
+        <w:rPr>
+          <w:rFonts w:ascii="Times New Roman" w:hAnsi="Times New Roman"/>
+          <w:b w:val="0"/>
+          <w:i w:val="0"/>
+          <w:color w:val="000000"/>
+          <w:sz w:val="22"/>
+          <w:rFonts w:ascii="Times New Roman" w:hAnsi="Times New Roman" w:cs="Times New Roman" w:eastAsia="Times New Roman"/>
+        </w:rPr>
+        <w:tab/>
+        <w:t>5</w:t>
       </w:r>
     </w:p>
     <w:p>
       <w:pPr>
-        <w:spacing w:before="20" w:after="40"/>
-        <w:ind w:firstLine="0"/>
+        <w:tabs>
+          <w:tab w:pos="9071" w:val="right" w:leader="dot"/>
+        </w:tabs>
+        <w:spacing w:before="20" w:after="40" w:line="276" w:lineRule="auto"/>
+        <w:ind w:firstLine="0" w:left="454"/>
       </w:pPr>
       <w:r>
         <w:rPr>
@@ -769,15 +940,126 @@
           <w:b w:val="0"/>
           <w:i w:val="0"/>
           <w:color w:val="000000"/>
-          <w:sz w:val="23"/>
-          <w:rFonts w:ascii="Times New Roman" w:hAnsi="Times New Roman" w:cs="Times New Roman" w:eastAsia="Times New Roman"/>
-        </w:rPr>
-        <w:t xml:space="preserve">   Tài liệu tham khảo</w:t>
+          <w:sz w:val="22"/>
+          <w:rFonts w:ascii="Times New Roman" w:hAnsi="Times New Roman" w:cs="Times New Roman" w:eastAsia="Times New Roman"/>
+        </w:rPr>
+        <w:t>2.2. Tiêu chí phân tách toán học (Splitting Criteria)</w:t>
+      </w:r>
+      <w:r>
+        <w:rPr>
+          <w:rFonts w:ascii="Times New Roman" w:hAnsi="Times New Roman"/>
+          <w:b w:val="0"/>
+          <w:i w:val="0"/>
+          <w:color w:val="000000"/>
+          <w:sz w:val="22"/>
+          <w:rFonts w:ascii="Times New Roman" w:hAnsi="Times New Roman" w:cs="Times New Roman" w:eastAsia="Times New Roman"/>
+        </w:rPr>
+        <w:tab/>
+        <w:t>5</w:t>
       </w:r>
     </w:p>
     <w:p>
       <w:pPr>
-        <w:spacing w:before="20" w:after="40"/>
+        <w:tabs>
+          <w:tab w:pos="9071" w:val="right" w:leader="dot"/>
+        </w:tabs>
+        <w:spacing w:before="20" w:after="40" w:line="276" w:lineRule="auto"/>
+        <w:ind w:firstLine="0" w:left="454"/>
+      </w:pPr>
+      <w:r>
+        <w:rPr>
+          <w:rFonts w:ascii="Times New Roman" w:hAnsi="Times New Roman"/>
+          <w:b w:val="0"/>
+          <w:i w:val="0"/>
+          <w:color w:val="000000"/>
+          <w:sz w:val="22"/>
+          <w:rFonts w:ascii="Times New Roman" w:hAnsi="Times New Roman" w:cs="Times New Roman" w:eastAsia="Times New Roman"/>
+        </w:rPr>
+        <w:t>2.3. Quy trình thuật toán xây dựng cây CART</w:t>
+      </w:r>
+      <w:r>
+        <w:rPr>
+          <w:rFonts w:ascii="Times New Roman" w:hAnsi="Times New Roman"/>
+          <w:b w:val="0"/>
+          <w:i w:val="0"/>
+          <w:color w:val="000000"/>
+          <w:sz w:val="22"/>
+          <w:rFonts w:ascii="Times New Roman" w:hAnsi="Times New Roman" w:cs="Times New Roman" w:eastAsia="Times New Roman"/>
+        </w:rPr>
+        <w:tab/>
+        <w:t>7</w:t>
+      </w:r>
+    </w:p>
+    <w:p>
+      <w:pPr>
+        <w:tabs>
+          <w:tab w:pos="9071" w:val="right" w:leader="dot"/>
+        </w:tabs>
+        <w:spacing w:before="20" w:after="40" w:line="276" w:lineRule="auto"/>
+        <w:ind w:firstLine="0" w:left="454"/>
+      </w:pPr>
+      <w:r>
+        <w:rPr>
+          <w:rFonts w:ascii="Times New Roman" w:hAnsi="Times New Roman"/>
+          <w:b w:val="0"/>
+          <w:i w:val="0"/>
+          <w:color w:val="000000"/>
+          <w:sz w:val="22"/>
+          <w:rFonts w:ascii="Times New Roman" w:hAnsi="Times New Roman" w:cs="Times New Roman" w:eastAsia="Times New Roman"/>
+        </w:rPr>
+        <w:t>2.4. Kỹ thuật kiểm soát quá khớp (Pre-pruning)</w:t>
+      </w:r>
+      <w:r>
+        <w:rPr>
+          <w:rFonts w:ascii="Times New Roman" w:hAnsi="Times New Roman"/>
+          <w:b w:val="0"/>
+          <w:i w:val="0"/>
+          <w:color w:val="000000"/>
+          <w:sz w:val="22"/>
+          <w:rFonts w:ascii="Times New Roman" w:hAnsi="Times New Roman" w:cs="Times New Roman" w:eastAsia="Times New Roman"/>
+        </w:rPr>
+        <w:tab/>
+        <w:t>7</w:t>
+      </w:r>
+    </w:p>
+    <w:p>
+      <w:pPr>
+        <w:tabs>
+          <w:tab w:pos="9071" w:val="right" w:leader="dot"/>
+        </w:tabs>
+        <w:spacing w:before="20" w:after="40" w:line="276" w:lineRule="auto"/>
+        <w:ind w:firstLine="0" w:left="454"/>
+      </w:pPr>
+      <w:r>
+        <w:rPr>
+          <w:rFonts w:ascii="Times New Roman" w:hAnsi="Times New Roman"/>
+          <w:b w:val="0"/>
+          <w:i w:val="0"/>
+          <w:color w:val="000000"/>
+          <w:sz w:val="22"/>
+          <w:rFonts w:ascii="Times New Roman" w:hAnsi="Times New Roman" w:cs="Times New Roman" w:eastAsia="Times New Roman"/>
+        </w:rPr>
+        <w:t>2.5. Ưu điểm và hạn chế của thuật toán</w:t>
+      </w:r>
+      <w:r>
+        <w:rPr>
+          <w:rFonts w:ascii="Times New Roman" w:hAnsi="Times New Roman"/>
+          <w:b w:val="0"/>
+          <w:i w:val="0"/>
+          <w:color w:val="000000"/>
+          <w:sz w:val="22"/>
+          <w:rFonts w:ascii="Times New Roman" w:hAnsi="Times New Roman" w:cs="Times New Roman" w:eastAsia="Times New Roman"/>
+        </w:rPr>
+        <w:tab/>
+        <w:t>7</w:t>
+      </w:r>
+    </w:p>
+    <w:p>
+      <w:pPr>
+        <w:tabs>
+          <w:tab w:pos="9071" w:val="right" w:leader="dot"/>
+        </w:tabs>
+        <w:spacing w:before="20" w:after="40" w:line="276" w:lineRule="auto"/>
         <w:ind w:firstLine="0"/>
       </w:pPr>
       <w:r>
@@ -786,15 +1068,126 @@
           <w:b/>
           <w:i w:val="0"/>
           <w:color w:val="000000"/>
-          <w:sz w:val="24"/>
-          <w:rFonts w:ascii="Times New Roman" w:hAnsi="Times New Roman" w:cs="Times New Roman" w:eastAsia="Times New Roman"/>
-        </w:rPr>
-        <w:t>PHẦN II: GIẢI MÃ CHI TIẾT Ý NGHĨA CỦA TỪNG CON SỐ THỰC NGHIỆM</w:t>
+          <w:sz w:val="23"/>
+          <w:rFonts w:ascii="Times New Roman" w:hAnsi="Times New Roman" w:cs="Times New Roman" w:eastAsia="Times New Roman"/>
+        </w:rPr>
+        <w:t>Chương 3: Triển khai thực nghiệm và Giao thức Zero Label Leakage</w:t>
+      </w:r>
+      <w:r>
+        <w:rPr>
+          <w:rFonts w:ascii="Times New Roman" w:hAnsi="Times New Roman"/>
+          <w:b/>
+          <w:i w:val="0"/>
+          <w:color w:val="000000"/>
+          <w:sz w:val="23"/>
+          <w:rFonts w:ascii="Times New Roman" w:hAnsi="Times New Roman" w:cs="Times New Roman" w:eastAsia="Times New Roman"/>
+        </w:rPr>
+        <w:tab/>
+        <w:t>8</w:t>
       </w:r>
     </w:p>
     <w:p>
       <w:pPr>
-        <w:spacing w:before="20" w:after="40"/>
+        <w:tabs>
+          <w:tab w:pos="9071" w:val="right" w:leader="dot"/>
+        </w:tabs>
+        <w:spacing w:before="20" w:after="40" w:line="276" w:lineRule="auto"/>
+        <w:ind w:firstLine="0" w:left="454"/>
+      </w:pPr>
+      <w:r>
+        <w:rPr>
+          <w:rFonts w:ascii="Times New Roman" w:hAnsi="Times New Roman"/>
+          <w:b w:val="0"/>
+          <w:i w:val="0"/>
+          <w:color w:val="000000"/>
+          <w:sz w:val="22"/>
+          <w:rFonts w:ascii="Times New Roman" w:hAnsi="Times New Roman" w:cs="Times New Roman" w:eastAsia="Times New Roman"/>
+        </w:rPr>
+        <w:t>3.1. Môi trường thực nghiệm và thư viện</w:t>
+      </w:r>
+      <w:r>
+        <w:rPr>
+          <w:rFonts w:ascii="Times New Roman" w:hAnsi="Times New Roman"/>
+          <w:b w:val="0"/>
+          <w:i w:val="0"/>
+          <w:color w:val="000000"/>
+          <w:sz w:val="22"/>
+          <w:rFonts w:ascii="Times New Roman" w:hAnsi="Times New Roman" w:cs="Times New Roman" w:eastAsia="Times New Roman"/>
+        </w:rPr>
+        <w:tab/>
+        <w:t>8</w:t>
+      </w:r>
+    </w:p>
+    <w:p>
+      <w:pPr>
+        <w:tabs>
+          <w:tab w:pos="9071" w:val="right" w:leader="dot"/>
+        </w:tabs>
+        <w:spacing w:before="20" w:after="40" w:line="276" w:lineRule="auto"/>
+        <w:ind w:firstLine="0" w:left="454"/>
+      </w:pPr>
+      <w:r>
+        <w:rPr>
+          <w:rFonts w:ascii="Times New Roman" w:hAnsi="Times New Roman"/>
+          <w:b w:val="0"/>
+          <w:i w:val="0"/>
+          <w:color w:val="000000"/>
+          <w:sz w:val="22"/>
+          <w:rFonts w:ascii="Times New Roman" w:hAnsi="Times New Roman" w:cs="Times New Roman" w:eastAsia="Times New Roman"/>
+        </w:rPr>
+        <w:t>3.2. Mô tả bộ dữ liệu thực nghiệm</w:t>
+      </w:r>
+      <w:r>
+        <w:rPr>
+          <w:rFonts w:ascii="Times New Roman" w:hAnsi="Times New Roman"/>
+          <w:b w:val="0"/>
+          <w:i w:val="0"/>
+          <w:color w:val="000000"/>
+          <w:sz w:val="22"/>
+          <w:rFonts w:ascii="Times New Roman" w:hAnsi="Times New Roman" w:cs="Times New Roman" w:eastAsia="Times New Roman"/>
+        </w:rPr>
+        <w:tab/>
+        <w:t>8</w:t>
+      </w:r>
+    </w:p>
+    <w:p>
+      <w:pPr>
+        <w:tabs>
+          <w:tab w:pos="9071" w:val="right" w:leader="dot"/>
+        </w:tabs>
+        <w:spacing w:before="20" w:after="40" w:line="276" w:lineRule="auto"/>
+        <w:ind w:firstLine="0" w:left="454"/>
+      </w:pPr>
+      <w:r>
+        <w:rPr>
+          <w:rFonts w:ascii="Times New Roman" w:hAnsi="Times New Roman"/>
+          <w:b w:val="0"/>
+          <w:i w:val="0"/>
+          <w:color w:val="000000"/>
+          <w:sz w:val="22"/>
+          <w:rFonts w:ascii="Times New Roman" w:hAnsi="Times New Roman" w:cs="Times New Roman" w:eastAsia="Times New Roman"/>
+        </w:rPr>
+        <w:t>3.3. Thiết kế kịch bản dự đoán sớm và Giao thức Zero Label Leakage</w:t>
+      </w:r>
+      <w:r>
+        <w:rPr>
+          <w:rFonts w:ascii="Times New Roman" w:hAnsi="Times New Roman"/>
+          <w:b w:val="0"/>
+          <w:i w:val="0"/>
+          <w:color w:val="000000"/>
+          <w:sz w:val="22"/>
+          <w:rFonts w:ascii="Times New Roman" w:hAnsi="Times New Roman" w:cs="Times New Roman" w:eastAsia="Times New Roman"/>
+        </w:rPr>
+        <w:tab/>
+        <w:t>9</w:t>
+      </w:r>
+    </w:p>
+    <w:p>
+      <w:pPr>
+        <w:tabs>
+          <w:tab w:pos="9071" w:val="right" w:leader="dot"/>
+        </w:tabs>
+        <w:spacing w:before="20" w:after="40" w:line="276" w:lineRule="auto"/>
         <w:ind w:firstLine="0"/>
       </w:pPr>
       <w:r>
@@ -803,19 +1196,489 @@
           <w:b/>
           <w:i w:val="0"/>
           <w:color w:val="000000"/>
-          <w:sz w:val="24"/>
-          <w:rFonts w:ascii="Times New Roman" w:hAnsi="Times New Roman" w:cs="Times New Roman" w:eastAsia="Times New Roman"/>
-        </w:rPr>
-        <w:t>PHẦN III: GIẢI THÍCH KIẾN TRÚC MÃ NGUỒN VÀ Ý NGHĨA TỪNG ĐOẠN CODE</w:t>
+          <w:sz w:val="23"/>
+          <w:rFonts w:ascii="Times New Roman" w:hAnsi="Times New Roman" w:cs="Times New Roman" w:eastAsia="Times New Roman"/>
+        </w:rPr>
+        <w:t>Chương 4: Phân tích kết quả thực nghiệm</w:t>
+      </w:r>
+      <w:r>
+        <w:rPr>
+          <w:rFonts w:ascii="Times New Roman" w:hAnsi="Times New Roman"/>
+          <w:b/>
+          <w:i w:val="0"/>
+          <w:color w:val="000000"/>
+          <w:sz w:val="23"/>
+          <w:rFonts w:ascii="Times New Roman" w:hAnsi="Times New Roman" w:cs="Times New Roman" w:eastAsia="Times New Roman"/>
+        </w:rPr>
+        <w:tab/>
+        <w:t>11</w:t>
       </w:r>
     </w:p>
     <w:p>
-      <w:r>
-        <w:br w:type="page"/>
+      <w:pPr>
+        <w:tabs>
+          <w:tab w:pos="9071" w:val="right" w:leader="dot"/>
+        </w:tabs>
+        <w:spacing w:before="20" w:after="40" w:line="276" w:lineRule="auto"/>
+        <w:ind w:firstLine="0" w:left="454"/>
+      </w:pPr>
+      <w:r>
+        <w:rPr>
+          <w:rFonts w:ascii="Times New Roman" w:hAnsi="Times New Roman"/>
+          <w:b w:val="0"/>
+          <w:i w:val="0"/>
+          <w:color w:val="000000"/>
+          <w:sz w:val="22"/>
+          <w:rFonts w:ascii="Times New Roman" w:hAnsi="Times New Roman" w:cs="Times New Roman" w:eastAsia="Times New Roman"/>
+        </w:rPr>
+        <w:t>4.1. Các độ đo đánh giá phân lớp toán học</w:t>
+      </w:r>
+      <w:r>
+        <w:rPr>
+          <w:rFonts w:ascii="Times New Roman" w:hAnsi="Times New Roman"/>
+          <w:b w:val="0"/>
+          <w:i w:val="0"/>
+          <w:color w:val="000000"/>
+          <w:sz w:val="22"/>
+          <w:rFonts w:ascii="Times New Roman" w:hAnsi="Times New Roman" w:cs="Times New Roman" w:eastAsia="Times New Roman"/>
+        </w:rPr>
+        <w:tab/>
+        <w:t>11</w:t>
       </w:r>
     </w:p>
     <w:p>
       <w:pPr>
+        <w:tabs>
+          <w:tab w:pos="9071" w:val="right" w:leader="dot"/>
+        </w:tabs>
+        <w:spacing w:before="20" w:after="40" w:line="276" w:lineRule="auto"/>
+        <w:ind w:firstLine="0" w:left="454"/>
+      </w:pPr>
+      <w:r>
+        <w:rPr>
+          <w:rFonts w:ascii="Times New Roman" w:hAnsi="Times New Roman"/>
+          <w:b w:val="0"/>
+          <w:i w:val="0"/>
+          <w:color w:val="000000"/>
+          <w:sz w:val="22"/>
+          <w:rFonts w:ascii="Times New Roman" w:hAnsi="Times New Roman" w:cs="Times New Roman" w:eastAsia="Times New Roman"/>
+        </w:rPr>
+        <w:t>4.2. Hiệu năng phân lớp trên tập kiểm thử độc lập (332 sinh viên)</w:t>
+      </w:r>
+      <w:r>
+        <w:rPr>
+          <w:rFonts w:ascii="Times New Roman" w:hAnsi="Times New Roman"/>
+          <w:b w:val="0"/>
+          <w:i w:val="0"/>
+          <w:color w:val="000000"/>
+          <w:sz w:val="22"/>
+          <w:rFonts w:ascii="Times New Roman" w:hAnsi="Times New Roman" w:cs="Times New Roman" w:eastAsia="Times New Roman"/>
+        </w:rPr>
+        <w:tab/>
+        <w:t>12</w:t>
+      </w:r>
+    </w:p>
+    <w:p>
+      <w:pPr>
+        <w:tabs>
+          <w:tab w:pos="9071" w:val="right" w:leader="dot"/>
+        </w:tabs>
+        <w:spacing w:before="20" w:after="40" w:line="276" w:lineRule="auto"/>
+        <w:ind w:firstLine="0" w:left="454"/>
+      </w:pPr>
+      <w:r>
+        <w:rPr>
+          <w:rFonts w:ascii="Times New Roman" w:hAnsi="Times New Roman"/>
+          <w:b w:val="0"/>
+          <w:i w:val="0"/>
+          <w:color w:val="000000"/>
+          <w:sz w:val="22"/>
+          <w:rFonts w:ascii="Times New Roman" w:hAnsi="Times New Roman" w:cs="Times New Roman" w:eastAsia="Times New Roman"/>
+        </w:rPr>
+        <w:t>4.3. Khảo sát siêu tham số max_depth bằng 5-Fold Stratified CV</w:t>
+      </w:r>
+      <w:r>
+        <w:rPr>
+          <w:rFonts w:ascii="Times New Roman" w:hAnsi="Times New Roman"/>
+          <w:b w:val="0"/>
+          <w:i w:val="0"/>
+          <w:color w:val="000000"/>
+          <w:sz w:val="22"/>
+          <w:rFonts w:ascii="Times New Roman" w:hAnsi="Times New Roman" w:cs="Times New Roman" w:eastAsia="Times New Roman"/>
+        </w:rPr>
+        <w:tab/>
+        <w:t>13</w:t>
+      </w:r>
+    </w:p>
+    <w:p>
+      <w:pPr>
+        <w:tabs>
+          <w:tab w:pos="9071" w:val="right" w:leader="dot"/>
+        </w:tabs>
+        <w:spacing w:before="20" w:after="40" w:line="276" w:lineRule="auto"/>
+        <w:ind w:firstLine="0" w:left="454"/>
+      </w:pPr>
+      <w:r>
+        <w:rPr>
+          <w:rFonts w:ascii="Times New Roman" w:hAnsi="Times New Roman"/>
+          <w:b w:val="0"/>
+          <w:i w:val="0"/>
+          <w:color w:val="000000"/>
+          <w:sz w:val="22"/>
+          <w:rFonts w:ascii="Times New Roman" w:hAnsi="Times New Roman" w:cs="Times New Roman" w:eastAsia="Times New Roman"/>
+        </w:rPr>
+        <w:t>4.4. Phân tích ma trận nhầm lẫn (Confusion Matrix)</w:t>
+      </w:r>
+      <w:r>
+        <w:rPr>
+          <w:rFonts w:ascii="Times New Roman" w:hAnsi="Times New Roman"/>
+          <w:b w:val="0"/>
+          <w:i w:val="0"/>
+          <w:color w:val="000000"/>
+          <w:sz w:val="22"/>
+          <w:rFonts w:ascii="Times New Roman" w:hAnsi="Times New Roman" w:cs="Times New Roman" w:eastAsia="Times New Roman"/>
+        </w:rPr>
+        <w:tab/>
+        <w:t>14</w:t>
+      </w:r>
+    </w:p>
+    <w:p>
+      <w:pPr>
+        <w:tabs>
+          <w:tab w:pos="9071" w:val="right" w:leader="dot"/>
+        </w:tabs>
+        <w:spacing w:before="20" w:after="40" w:line="276" w:lineRule="auto"/>
+        <w:ind w:firstLine="0" w:left="454"/>
+      </w:pPr>
+      <w:r>
+        <w:rPr>
+          <w:rFonts w:ascii="Times New Roman" w:hAnsi="Times New Roman"/>
+          <w:b w:val="0"/>
+          <w:i w:val="0"/>
+          <w:color w:val="000000"/>
+          <w:sz w:val="22"/>
+          <w:rFonts w:ascii="Times New Roman" w:hAnsi="Times New Roman" w:cs="Times New Roman" w:eastAsia="Times New Roman"/>
+        </w:rPr>
+        <w:t>4.5. Phân tích cấu trúc Cây quyết định và các quy tắc rẽ nhánh</w:t>
+      </w:r>
+      <w:r>
+        <w:rPr>
+          <w:rFonts w:ascii="Times New Roman" w:hAnsi="Times New Roman"/>
+          <w:b w:val="0"/>
+          <w:i w:val="0"/>
+          <w:color w:val="000000"/>
+          <w:sz w:val="22"/>
+          <w:rFonts w:ascii="Times New Roman" w:hAnsi="Times New Roman" w:cs="Times New Roman" w:eastAsia="Times New Roman"/>
+        </w:rPr>
+        <w:tab/>
+        <w:t>14</w:t>
+      </w:r>
+    </w:p>
+    <w:p>
+      <w:pPr>
+        <w:tabs>
+          <w:tab w:pos="9071" w:val="right" w:leader="dot"/>
+        </w:tabs>
+        <w:spacing w:before="20" w:after="40" w:line="276" w:lineRule="auto"/>
+        <w:ind w:firstLine="0" w:left="454"/>
+      </w:pPr>
+      <w:r>
+        <w:rPr>
+          <w:rFonts w:ascii="Times New Roman" w:hAnsi="Times New Roman"/>
+          <w:b w:val="0"/>
+          <w:i w:val="0"/>
+          <w:color w:val="000000"/>
+          <w:sz w:val="22"/>
+          <w:rFonts w:ascii="Times New Roman" w:hAnsi="Times New Roman" w:cs="Times New Roman" w:eastAsia="Times New Roman"/>
+        </w:rPr>
+        <w:t>4.6. Xếp hạng mức độ quan trọng của các môn học Năm 1</w:t>
+      </w:r>
+      <w:r>
+        <w:rPr>
+          <w:rFonts w:ascii="Times New Roman" w:hAnsi="Times New Roman"/>
+          <w:b w:val="0"/>
+          <w:i w:val="0"/>
+          <w:color w:val="000000"/>
+          <w:sz w:val="22"/>
+          <w:rFonts w:ascii="Times New Roman" w:hAnsi="Times New Roman" w:cs="Times New Roman" w:eastAsia="Times New Roman"/>
+        </w:rPr>
+        <w:tab/>
+        <w:t>15</w:t>
+      </w:r>
+    </w:p>
+    <w:p>
+      <w:pPr>
+        <w:tabs>
+          <w:tab w:pos="9071" w:val="right" w:leader="dot"/>
+        </w:tabs>
+        <w:spacing w:before="20" w:after="40" w:line="276" w:lineRule="auto"/>
+        <w:ind w:firstLine="0" w:left="454"/>
+      </w:pPr>
+      <w:r>
+        <w:rPr>
+          <w:rFonts w:ascii="Times New Roman" w:hAnsi="Times New Roman"/>
+          <w:b w:val="0"/>
+          <w:i w:val="0"/>
+          <w:color w:val="000000"/>
+          <w:sz w:val="22"/>
+          <w:rFonts w:ascii="Times New Roman" w:hAnsi="Times New Roman" w:cs="Times New Roman" w:eastAsia="Times New Roman"/>
+        </w:rPr>
+        <w:t>4.7. Phân tích định lượng nguyên nhân dự đoán sai cận biên</w:t>
+      </w:r>
+      <w:r>
+        <w:rPr>
+          <w:rFonts w:ascii="Times New Roman" w:hAnsi="Times New Roman"/>
+          <w:b w:val="0"/>
+          <w:i w:val="0"/>
+          <w:color w:val="000000"/>
+          <w:sz w:val="22"/>
+          <w:rFonts w:ascii="Times New Roman" w:hAnsi="Times New Roman" w:cs="Times New Roman" w:eastAsia="Times New Roman"/>
+        </w:rPr>
+        <w:tab/>
+        <w:t>16</w:t>
+      </w:r>
+    </w:p>
+    <w:p>
+      <w:pPr>
+        <w:tabs>
+          <w:tab w:pos="9071" w:val="right" w:leader="dot"/>
+        </w:tabs>
+        <w:spacing w:before="20" w:after="40" w:line="276" w:lineRule="auto"/>
+        <w:ind w:firstLine="0"/>
+      </w:pPr>
+      <w:r>
+        <w:rPr>
+          <w:rFonts w:ascii="Times New Roman" w:hAnsi="Times New Roman"/>
+          <w:b/>
+          <w:i w:val="0"/>
+          <w:color w:val="000000"/>
+          <w:sz w:val="23"/>
+          <w:rFonts w:ascii="Times New Roman" w:hAnsi="Times New Roman" w:cs="Times New Roman" w:eastAsia="Times New Roman"/>
+        </w:rPr>
+        <w:t>Chương 5: Kết luận và hướng phát triển</w:t>
+      </w:r>
+      <w:r>
+        <w:rPr>
+          <w:rFonts w:ascii="Times New Roman" w:hAnsi="Times New Roman"/>
+          <w:b/>
+          <w:i w:val="0"/>
+          <w:color w:val="000000"/>
+          <w:sz w:val="23"/>
+          <w:rFonts w:ascii="Times New Roman" w:hAnsi="Times New Roman" w:cs="Times New Roman" w:eastAsia="Times New Roman"/>
+        </w:rPr>
+        <w:tab/>
+        <w:t>17</w:t>
+      </w:r>
+    </w:p>
+    <w:p>
+      <w:pPr>
+        <w:tabs>
+          <w:tab w:pos="9071" w:val="right" w:leader="dot"/>
+        </w:tabs>
+        <w:spacing w:before="20" w:after="40" w:line="276" w:lineRule="auto"/>
+        <w:ind w:firstLine="0" w:left="454"/>
+      </w:pPr>
+      <w:r>
+        <w:rPr>
+          <w:rFonts w:ascii="Times New Roman" w:hAnsi="Times New Roman"/>
+          <w:b w:val="0"/>
+          <w:i w:val="0"/>
+          <w:color w:val="000000"/>
+          <w:sz w:val="22"/>
+          <w:rFonts w:ascii="Times New Roman" w:hAnsi="Times New Roman" w:cs="Times New Roman" w:eastAsia="Times New Roman"/>
+        </w:rPr>
+        <w:t>5.1. Kết quả đạt được</w:t>
+      </w:r>
+      <w:r>
+        <w:rPr>
+          <w:rFonts w:ascii="Times New Roman" w:hAnsi="Times New Roman"/>
+          <w:b w:val="0"/>
+          <w:i w:val="0"/>
+          <w:color w:val="000000"/>
+          <w:sz w:val="22"/>
+          <w:rFonts w:ascii="Times New Roman" w:hAnsi="Times New Roman" w:cs="Times New Roman" w:eastAsia="Times New Roman"/>
+        </w:rPr>
+        <w:tab/>
+        <w:t>17</w:t>
+      </w:r>
+    </w:p>
+    <w:p>
+      <w:pPr>
+        <w:tabs>
+          <w:tab w:pos="9071" w:val="right" w:leader="dot"/>
+        </w:tabs>
+        <w:spacing w:before="20" w:after="40" w:line="276" w:lineRule="auto"/>
+        <w:ind w:firstLine="0" w:left="454"/>
+      </w:pPr>
+      <w:r>
+        <w:rPr>
+          <w:rFonts w:ascii="Times New Roman" w:hAnsi="Times New Roman"/>
+          <w:b w:val="0"/>
+          <w:i w:val="0"/>
+          <w:color w:val="000000"/>
+          <w:sz w:val="22"/>
+          <w:rFonts w:ascii="Times New Roman" w:hAnsi="Times New Roman" w:cs="Times New Roman" w:eastAsia="Times New Roman"/>
+        </w:rPr>
+        <w:t>5.2. Điểm mạnh và giới hạn khách quan</w:t>
+      </w:r>
+      <w:r>
+        <w:rPr>
+          <w:rFonts w:ascii="Times New Roman" w:hAnsi="Times New Roman"/>
+          <w:b w:val="0"/>
+          <w:i w:val="0"/>
+          <w:color w:val="000000"/>
+          <w:sz w:val="22"/>
+          <w:rFonts w:ascii="Times New Roman" w:hAnsi="Times New Roman" w:cs="Times New Roman" w:eastAsia="Times New Roman"/>
+        </w:rPr>
+        <w:tab/>
+        <w:t>17</w:t>
+      </w:r>
+    </w:p>
+    <w:p>
+      <w:pPr>
+        <w:tabs>
+          <w:tab w:pos="9071" w:val="right" w:leader="dot"/>
+        </w:tabs>
+        <w:spacing w:before="20" w:after="40" w:line="276" w:lineRule="auto"/>
+        <w:ind w:firstLine="0" w:left="454"/>
+      </w:pPr>
+      <w:r>
+        <w:rPr>
+          <w:rFonts w:ascii="Times New Roman" w:hAnsi="Times New Roman"/>
+          <w:b w:val="0"/>
+          <w:i w:val="0"/>
+          <w:color w:val="000000"/>
+          <w:sz w:val="22"/>
+          <w:rFonts w:ascii="Times New Roman" w:hAnsi="Times New Roman" w:cs="Times New Roman" w:eastAsia="Times New Roman"/>
+        </w:rPr>
+        <w:t>5.3. Hướng mở rộng tiếp theo</w:t>
+      </w:r>
+      <w:r>
+        <w:rPr>
+          <w:rFonts w:ascii="Times New Roman" w:hAnsi="Times New Roman"/>
+          <w:b w:val="0"/>
+          <w:i w:val="0"/>
+          <w:color w:val="000000"/>
+          <w:sz w:val="22"/>
+          <w:rFonts w:ascii="Times New Roman" w:hAnsi="Times New Roman" w:cs="Times New Roman" w:eastAsia="Times New Roman"/>
+        </w:rPr>
+        <w:tab/>
+        <w:t>17</w:t>
+      </w:r>
+    </w:p>
+    <w:p>
+      <w:pPr>
+        <w:tabs>
+          <w:tab w:pos="9071" w:val="right" w:leader="dot"/>
+        </w:tabs>
+        <w:spacing w:before="20" w:after="40" w:line="276" w:lineRule="auto"/>
+        <w:ind w:firstLine="0"/>
+      </w:pPr>
+      <w:r>
+        <w:rPr>
+          <w:rFonts w:ascii="Times New Roman" w:hAnsi="Times New Roman"/>
+          <w:b/>
+          <w:i w:val="0"/>
+          <w:color w:val="000000"/>
+          <w:sz w:val="23"/>
+          <w:rFonts w:ascii="Times New Roman" w:hAnsi="Times New Roman" w:cs="Times New Roman" w:eastAsia="Times New Roman"/>
+        </w:rPr>
+        <w:t>Tài liệu tham khảo</w:t>
+      </w:r>
+      <w:r>
+        <w:rPr>
+          <w:rFonts w:ascii="Times New Roman" w:hAnsi="Times New Roman"/>
+          <w:b/>
+          <w:i w:val="0"/>
+          <w:color w:val="000000"/>
+          <w:sz w:val="23"/>
+          <w:rFonts w:ascii="Times New Roman" w:hAnsi="Times New Roman" w:cs="Times New Roman" w:eastAsia="Times New Roman"/>
+        </w:rPr>
+        <w:tab/>
+        <w:t>18</w:t>
+      </w:r>
+    </w:p>
+    <w:p>
+      <w:pPr>
+        <w:tabs>
+          <w:tab w:pos="9071" w:val="right" w:leader="dot"/>
+        </w:tabs>
+        <w:spacing w:before="20" w:after="40" w:line="276" w:lineRule="auto"/>
+        <w:ind w:firstLine="0"/>
+      </w:pPr>
+      <w:r>
+        <w:rPr>
+          <w:rFonts w:ascii="Times New Roman" w:hAnsi="Times New Roman"/>
+          <w:b/>
+          <w:i w:val="0"/>
+          <w:color w:val="000000"/>
+          <w:sz w:val="23"/>
+          <w:rFonts w:ascii="Times New Roman" w:hAnsi="Times New Roman" w:cs="Times New Roman" w:eastAsia="Times New Roman"/>
+        </w:rPr>
+        <w:t>PHẦN II: GIẢI MÃ CHI TIẾT Ý NGHĨA CỦA TỪNG CON SỐ THỰC NGHIỆM</w:t>
+      </w:r>
+      <w:r>
+        <w:rPr>
+          <w:rFonts w:ascii="Times New Roman" w:hAnsi="Times New Roman"/>
+          <w:b/>
+          <w:i w:val="0"/>
+          <w:color w:val="000000"/>
+          <w:sz w:val="23"/>
+          <w:rFonts w:ascii="Times New Roman" w:hAnsi="Times New Roman" w:cs="Times New Roman" w:eastAsia="Times New Roman"/>
+        </w:rPr>
+        <w:tab/>
+        <w:t>19</w:t>
+      </w:r>
+    </w:p>
+    <w:p>
+      <w:pPr>
+        <w:tabs>
+          <w:tab w:pos="9071" w:val="right" w:leader="dot"/>
+        </w:tabs>
+        <w:spacing w:before="20" w:after="40" w:line="276" w:lineRule="auto"/>
+        <w:ind w:firstLine="0"/>
+      </w:pPr>
+      <w:r>
+        <w:rPr>
+          <w:rFonts w:ascii="Times New Roman" w:hAnsi="Times New Roman"/>
+          <w:b/>
+          <w:i w:val="0"/>
+          <w:color w:val="000000"/>
+          <w:sz w:val="23"/>
+          <w:rFonts w:ascii="Times New Roman" w:hAnsi="Times New Roman" w:cs="Times New Roman" w:eastAsia="Times New Roman"/>
+        </w:rPr>
+        <w:t>PHẦN III: GIẢI THÍCH KIẾN TRÚC MÃ NGUỒN VÀ Ý NGHĨA TỪNG ĐOẠN CODE</w:t>
+      </w:r>
+      <w:r>
+        <w:rPr>
+          <w:rFonts w:ascii="Times New Roman" w:hAnsi="Times New Roman"/>
+          <w:b/>
+          <w:i w:val="0"/>
+          <w:color w:val="000000"/>
+          <w:sz w:val="23"/>
+          <w:rFonts w:ascii="Times New Roman" w:hAnsi="Times New Roman" w:cs="Times New Roman" w:eastAsia="Times New Roman"/>
+        </w:rPr>
+        <w:tab/>
+        <w:t>22</w:t>
+      </w:r>
+    </w:p>
+    <w:p>
+      <w:pPr>
+        <w:spacing w:before="0" w:after="120"/>
+        <w:ind w:firstLine="0"/>
+      </w:pPr>
+      <w:r>
+        <w:fldChar w:fldCharType="end"/>
+      </w:r>
+    </w:p>
+    <w:p>
+      <w:r>
+        <w:br w:type="page"/>
+      </w:r>
+    </w:p>
+    <w:p>
+      <w:pPr>
+        <w:pStyle w:val="Heading1"/>
         <w:keepNext/>
         <w:spacing w:before="280" w:after="120"/>
         <w:ind w:firstLine="0"/>
@@ -827,7 +1690,7 @@
           <w:b/>
           <w:i w:val="0"/>
           <w:color w:val="000000"/>
-          <w:sz w:val="29"/>
+          <w:sz w:val="28"/>
           <w:rFonts w:ascii="Times New Roman" w:hAnsi="Times New Roman" w:cs="Times New Roman" w:eastAsia="Times New Roman"/>
         </w:rPr>
         <w:t>PHẦN I: BÁO CÁO KỸ THUẬT CHUẨN ĐỀ CƯƠNG (5 CHƯƠNG)</w:t>
@@ -835,6 +1698,7 @@
     </w:p>
     <w:p>
       <w:pPr>
+        <w:pStyle w:val="Heading1"/>
         <w:keepNext/>
         <w:spacing w:before="280" w:after="120"/>
         <w:ind w:firstLine="0"/>
@@ -846,7 +1710,7 @@
           <w:b/>
           <w:i w:val="0"/>
           <w:color w:val="000000"/>
-          <w:sz w:val="29"/>
+          <w:sz w:val="28"/>
           <w:rFonts w:ascii="Times New Roman" w:hAnsi="Times New Roman" w:cs="Times New Roman" w:eastAsia="Times New Roman"/>
         </w:rPr>
         <w:t>CHƯƠNG 1: GIỚI THIỆU TỔNG QUAN</w:t>
@@ -854,6 +1718,7 @@
     </w:p>
     <w:p>
       <w:pPr>
+        <w:pStyle w:val="Heading2"/>
         <w:keepNext/>
         <w:spacing w:before="200" w:after="80"/>
         <w:ind w:firstLine="0"/>
@@ -909,6 +1774,7 @@
     </w:p>
     <w:p>
       <w:pPr>
+        <w:pStyle w:val="Heading2"/>
         <w:keepNext/>
         <w:spacing w:before="200" w:after="80"/>
         <w:ind w:firstLine="0"/>
@@ -942,18 +1808,127 @@
           <w:rFonts w:ascii="Times New Roman" w:hAnsi="Times New Roman" w:cs="Times New Roman" w:eastAsia="Times New Roman"/>
         </w:rPr>
         <w:t>Đề tài tập trung giải quyết bài toán phân lớp nhị phân kết quả học tập tốt nghiệp của sinh viên đại học. Mục tiêu và phạm vi cụ thể gồm:</w:t>
-        <w:br/>
-        <w:t>1. Khảo sát hiện trạng phân bố điểm tích lũy GPA toàn khóa và sự tương quan giữa các môn học Năm 1 với năng lực tốt nghiệp của sinh viên.</w:t>
-        <w:br/>
-        <w:t>2. Ứng dụng thuật toán Cây quyết định (Decision Tree Classifier) để dự đoán sớm sinh viên sẽ đạt loại Khá/Giỏi (GPA &gt;= 2.50) hay Trung bình/Yếu (GPA &lt; 2.50) chỉ bằng kết quả các môn học của Năm thứ nhất (15 môn học nền tảng).</w:t>
-        <w:br/>
-        <w:t>3. Đảm bảo tính minh bạch và khả năng giải thích (Interpretability) của mô hình cây thông qua việc trực quan hóa các quy tắc rẽ nhánh (If-Then rules) và xếp hạng các môn học có ảnh hưởng lớn nhất.</w:t>
-        <w:br/>
-        <w:t>4. Tuân thủ nghiêm ngặt nguyên tắc Zero Data Leakage: Tuyệt đối không sử dụng điểm của các năm học sau hoặc các thông tin rò rỉ nhãn vào quá trình dự đoán sớm.</w:t>
       </w:r>
     </w:p>
     <w:p>
       <w:pPr>
+        <w:spacing w:before="0" w:after="60" w:line="300" w:lineRule="auto"/>
+        <w:ind w:left="680" w:hanging="283"/>
+        <w:jc w:val="both"/>
+      </w:pPr>
+      <w:r>
+        <w:rPr>
+          <w:rFonts w:ascii="Times New Roman" w:hAnsi="Times New Roman"/>
+          <w:b/>
+          <w:i w:val="0"/>
+          <w:color w:val="000000"/>
+          <w:sz w:val="26"/>
+          <w:rFonts w:ascii="Times New Roman" w:hAnsi="Times New Roman" w:cs="Times New Roman" w:eastAsia="Times New Roman"/>
+        </w:rPr>
+        <w:t xml:space="preserve">1. </w:t>
+      </w:r>
+      <w:r>
+        <w:rPr>
+          <w:rFonts w:ascii="Times New Roman" w:hAnsi="Times New Roman"/>
+          <w:b w:val="0"/>
+          <w:i w:val="0"/>
+          <w:color w:val="000000"/>
+          <w:sz w:val="26"/>
+          <w:rFonts w:ascii="Times New Roman" w:hAnsi="Times New Roman" w:cs="Times New Roman" w:eastAsia="Times New Roman"/>
+        </w:rPr>
+        <w:t>Khảo sát hiện trạng phân bố điểm tích lũy GPA toàn khóa và sự tương quan giữa các môn học Năm 1 với năng lực tốt nghiệp của sinh viên.</w:t>
+      </w:r>
+    </w:p>
+    <w:p>
+      <w:pPr>
+        <w:spacing w:before="0" w:after="60" w:line="300" w:lineRule="auto"/>
+        <w:ind w:left="680" w:hanging="283"/>
+        <w:jc w:val="both"/>
+      </w:pPr>
+      <w:r>
+        <w:rPr>
+          <w:rFonts w:ascii="Times New Roman" w:hAnsi="Times New Roman"/>
+          <w:b/>
+          <w:i w:val="0"/>
+          <w:color w:val="000000"/>
+          <w:sz w:val="26"/>
+          <w:rFonts w:ascii="Times New Roman" w:hAnsi="Times New Roman" w:cs="Times New Roman" w:eastAsia="Times New Roman"/>
+        </w:rPr>
+        <w:t xml:space="preserve">2. </w:t>
+      </w:r>
+      <w:r>
+        <w:rPr>
+          <w:rFonts w:ascii="Times New Roman" w:hAnsi="Times New Roman"/>
+          <w:b w:val="0"/>
+          <w:i w:val="0"/>
+          <w:color w:val="000000"/>
+          <w:sz w:val="26"/>
+          <w:rFonts w:ascii="Times New Roman" w:hAnsi="Times New Roman" w:cs="Times New Roman" w:eastAsia="Times New Roman"/>
+        </w:rPr>
+        <w:t>Ứng dụng thuật toán Cây quyết định (Decision Tree Classifier) để dự đoán sớm sinh viên sẽ đạt loại Khá/Giỏi (GPA &gt;= 2.50) hay Trung bình/Yếu (GPA &lt; 2.50) chỉ bằng kết quả các môn học của Năm thứ nhất (15 môn học nền tảng).</w:t>
+      </w:r>
+    </w:p>
+    <w:p>
+      <w:pPr>
+        <w:spacing w:before="0" w:after="60" w:line="300" w:lineRule="auto"/>
+        <w:ind w:left="680" w:hanging="283"/>
+        <w:jc w:val="both"/>
+      </w:pPr>
+      <w:r>
+        <w:rPr>
+          <w:rFonts w:ascii="Times New Roman" w:hAnsi="Times New Roman"/>
+          <w:b/>
+          <w:i w:val="0"/>
+          <w:color w:val="000000"/>
+          <w:sz w:val="26"/>
+          <w:rFonts w:ascii="Times New Roman" w:hAnsi="Times New Roman" w:cs="Times New Roman" w:eastAsia="Times New Roman"/>
+        </w:rPr>
+        <w:t xml:space="preserve">3. </w:t>
+      </w:r>
+      <w:r>
+        <w:rPr>
+          <w:rFonts w:ascii="Times New Roman" w:hAnsi="Times New Roman"/>
+          <w:b w:val="0"/>
+          <w:i w:val="0"/>
+          <w:color w:val="000000"/>
+          <w:sz w:val="26"/>
+          <w:rFonts w:ascii="Times New Roman" w:hAnsi="Times New Roman" w:cs="Times New Roman" w:eastAsia="Times New Roman"/>
+        </w:rPr>
+        <w:t>Đảm bảo tính minh bạch và khả năng giải thích (Interpretability) của mô hình cây thông qua việc trực quan hóa các quy tắc rẽ nhánh (If-Then rules) và xếp hạng các môn học có ảnh hưởng lớn nhất.</w:t>
+      </w:r>
+    </w:p>
+    <w:p>
+      <w:pPr>
+        <w:spacing w:before="0" w:after="60" w:line="300" w:lineRule="auto"/>
+        <w:ind w:left="680" w:hanging="283"/>
+        <w:jc w:val="both"/>
+      </w:pPr>
+      <w:r>
+        <w:rPr>
+          <w:rFonts w:ascii="Times New Roman" w:hAnsi="Times New Roman"/>
+          <w:b/>
+          <w:i w:val="0"/>
+          <w:color w:val="000000"/>
+          <w:sz w:val="26"/>
+          <w:rFonts w:ascii="Times New Roman" w:hAnsi="Times New Roman" w:cs="Times New Roman" w:eastAsia="Times New Roman"/>
+        </w:rPr>
+        <w:t xml:space="preserve">4. </w:t>
+      </w:r>
+      <w:r>
+        <w:rPr>
+          <w:rFonts w:ascii="Times New Roman" w:hAnsi="Times New Roman"/>
+          <w:b w:val="0"/>
+          <w:i w:val="0"/>
+          <w:color w:val="000000"/>
+          <w:sz w:val="26"/>
+          <w:rFonts w:ascii="Times New Roman" w:hAnsi="Times New Roman" w:cs="Times New Roman" w:eastAsia="Times New Roman"/>
+        </w:rPr>
+        <w:t>Tuân thủ nghiêm ngặt nguyên tắc Zero Data Leakage: Tuyệt đối không sử dụng điểm của các năm học sau hoặc các thông tin rò rỉ nhãn vào quá trình dự đoán sớm.</w:t>
+      </w:r>
+    </w:p>
+    <w:p>
+      <w:pPr>
+        <w:pStyle w:val="Heading2"/>
         <w:keepNext/>
         <w:spacing w:before="200" w:after="80"/>
         <w:ind w:firstLine="0"/>
@@ -991,6 +1966,7 @@
     </w:p>
     <w:p>
       <w:pPr>
+        <w:pStyle w:val="Heading2"/>
         <w:keepNext/>
         <w:spacing w:before="200" w:after="80"/>
         <w:ind w:firstLine="0"/>
@@ -1028,6 +2004,7 @@
     </w:p>
     <w:p>
       <w:pPr>
+        <w:pStyle w:val="Heading1"/>
         <w:keepNext/>
         <w:spacing w:before="280" w:after="120"/>
         <w:ind w:firstLine="0"/>
@@ -1039,7 +2016,7 @@
           <w:b/>
           <w:i w:val="0"/>
           <w:color w:val="000000"/>
-          <w:sz w:val="29"/>
+          <w:sz w:val="28"/>
           <w:rFonts w:ascii="Times New Roman" w:hAnsi="Times New Roman" w:cs="Times New Roman" w:eastAsia="Times New Roman"/>
         </w:rPr>
         <w:t>CHƯƠNG 2: CƠ SỞ LÝ THUYẾT THUẬT TOÁN DECISION TREE</w:t>
@@ -1047,6 +2024,7 @@
     </w:p>
     <w:p>
       <w:pPr>
+        <w:pStyle w:val="Heading2"/>
         <w:keepNext/>
         <w:spacing w:before="200" w:after="80"/>
         <w:ind w:firstLine="0"/>
@@ -1079,19 +2057,128 @@
           <w:sz w:val="26"/>
           <w:rFonts w:ascii="Times New Roman" w:hAnsi="Times New Roman" w:cs="Times New Roman" w:eastAsia="Times New Roman"/>
         </w:rPr>
-        <w:t>Cây quyết định (Decision Tree) là phương pháp học có giám sát phi tham số (non-parametric supervised learning). Mô hình tổ chức tri thức học được dưới dạng cấu trúc cây phân cấp bao gồm:</w:t>
-        <w:br/>
-        <w:t>- Nút gốc (Root Node): Chứa toàn bộ tập dữ liệu huấn luyện ban đầu trước khi bị phân chia.</w:t>
-        <w:br/>
-        <w:t>- Nút nội vi (Decision Nodes): Biểu diễn một điều kiện kiểm tra trên một thuộc tính cụ thể (ví dụ: Điểm môn Điện - Điện tử ô tô &lt;= 2.25).</w:t>
-        <w:br/>
-        <w:t>- Nhánh (Branches): Tương ứng với kết quả của phép kiểm tra điều kiện (Đúng hoặc Sai).</w:t>
-        <w:br/>
-        <w:t>- Nút lá (Leaf Nodes): Đại diện cho nhãn phân lớp cuối cùng (Khá-Giỏi hoặc Trung bình-Yếu) cùng phân bố xác suất tương ứng.</w:t>
+        <w:t>Cây quyết định (Decision Tree) là phương pháp học có giám sát phi tham số (non-parametric supervised learning). Mô hình tổ chức tri thức học được dưới dạng cấu trúc cây phân cấp bao gồm các thành phần cốt lõi sau:</w:t>
       </w:r>
     </w:p>
     <w:p>
       <w:pPr>
+        <w:spacing w:before="0" w:after="60" w:line="300" w:lineRule="auto"/>
+        <w:ind w:left="680" w:hanging="283"/>
+        <w:jc w:val="both"/>
+      </w:pPr>
+      <w:r>
+        <w:rPr>
+          <w:rFonts w:ascii="Times New Roman" w:hAnsi="Times New Roman"/>
+          <w:b/>
+          <w:i w:val="0"/>
+          <w:color w:val="000000"/>
+          <w:sz w:val="26"/>
+          <w:rFonts w:ascii="Times New Roman" w:hAnsi="Times New Roman" w:cs="Times New Roman" w:eastAsia="Times New Roman"/>
+        </w:rPr>
+        <w:t xml:space="preserve">- </w:t>
+      </w:r>
+      <w:r>
+        <w:rPr>
+          <w:rFonts w:ascii="Times New Roman" w:hAnsi="Times New Roman"/>
+          <w:b w:val="0"/>
+          <w:i w:val="0"/>
+          <w:color w:val="000000"/>
+          <w:sz w:val="26"/>
+          <w:rFonts w:ascii="Times New Roman" w:hAnsi="Times New Roman" w:cs="Times New Roman" w:eastAsia="Times New Roman"/>
+        </w:rPr>
+        <w:t>Nút gốc (Root Node): Chứa toàn bộ tập dữ liệu huấn luyện ban đầu trước khi bị phân chia.</w:t>
+      </w:r>
+    </w:p>
+    <w:p>
+      <w:pPr>
+        <w:spacing w:before="0" w:after="60" w:line="300" w:lineRule="auto"/>
+        <w:ind w:left="680" w:hanging="283"/>
+        <w:jc w:val="both"/>
+      </w:pPr>
+      <w:r>
+        <w:rPr>
+          <w:rFonts w:ascii="Times New Roman" w:hAnsi="Times New Roman"/>
+          <w:b/>
+          <w:i w:val="0"/>
+          <w:color w:val="000000"/>
+          <w:sz w:val="26"/>
+          <w:rFonts w:ascii="Times New Roman" w:hAnsi="Times New Roman" w:cs="Times New Roman" w:eastAsia="Times New Roman"/>
+        </w:rPr>
+        <w:t xml:space="preserve">- </w:t>
+      </w:r>
+      <w:r>
+        <w:rPr>
+          <w:rFonts w:ascii="Times New Roman" w:hAnsi="Times New Roman"/>
+          <w:b w:val="0"/>
+          <w:i w:val="0"/>
+          <w:color w:val="000000"/>
+          <w:sz w:val="26"/>
+          <w:rFonts w:ascii="Times New Roman" w:hAnsi="Times New Roman" w:cs="Times New Roman" w:eastAsia="Times New Roman"/>
+        </w:rPr>
+        <w:t>Nút nội vi (Decision Nodes): Biểu diễn một điều kiện kiểm tra trên một thuộc tính cụ thể (ví dụ: Điểm môn Điện - Điện tử ô tô &lt;= 2.25).</w:t>
+      </w:r>
+    </w:p>
+    <w:p>
+      <w:pPr>
+        <w:spacing w:before="0" w:after="60" w:line="300" w:lineRule="auto"/>
+        <w:ind w:left="680" w:hanging="283"/>
+        <w:jc w:val="both"/>
+      </w:pPr>
+      <w:r>
+        <w:rPr>
+          <w:rFonts w:ascii="Times New Roman" w:hAnsi="Times New Roman"/>
+          <w:b/>
+          <w:i w:val="0"/>
+          <w:color w:val="000000"/>
+          <w:sz w:val="26"/>
+          <w:rFonts w:ascii="Times New Roman" w:hAnsi="Times New Roman" w:cs="Times New Roman" w:eastAsia="Times New Roman"/>
+        </w:rPr>
+        <w:t xml:space="preserve">- </w:t>
+      </w:r>
+      <w:r>
+        <w:rPr>
+          <w:rFonts w:ascii="Times New Roman" w:hAnsi="Times New Roman"/>
+          <w:b w:val="0"/>
+          <w:i w:val="0"/>
+          <w:color w:val="000000"/>
+          <w:sz w:val="26"/>
+          <w:rFonts w:ascii="Times New Roman" w:hAnsi="Times New Roman" w:cs="Times New Roman" w:eastAsia="Times New Roman"/>
+        </w:rPr>
+        <w:t>Nhánh (Branches): Tương ứng với kết quả của phép kiểm tra điều kiện (Đúng hoặc Sai).</w:t>
+      </w:r>
+    </w:p>
+    <w:p>
+      <w:pPr>
+        <w:spacing w:before="0" w:after="60" w:line="300" w:lineRule="auto"/>
+        <w:ind w:left="680" w:hanging="283"/>
+        <w:jc w:val="both"/>
+      </w:pPr>
+      <w:r>
+        <w:rPr>
+          <w:rFonts w:ascii="Times New Roman" w:hAnsi="Times New Roman"/>
+          <w:b/>
+          <w:i w:val="0"/>
+          <w:color w:val="000000"/>
+          <w:sz w:val="26"/>
+          <w:rFonts w:ascii="Times New Roman" w:hAnsi="Times New Roman" w:cs="Times New Roman" w:eastAsia="Times New Roman"/>
+        </w:rPr>
+        <w:t xml:space="preserve">- </w:t>
+      </w:r>
+      <w:r>
+        <w:rPr>
+          <w:rFonts w:ascii="Times New Roman" w:hAnsi="Times New Roman"/>
+          <w:b w:val="0"/>
+          <w:i w:val="0"/>
+          <w:color w:val="000000"/>
+          <w:sz w:val="26"/>
+          <w:rFonts w:ascii="Times New Roman" w:hAnsi="Times New Roman" w:cs="Times New Roman" w:eastAsia="Times New Roman"/>
+        </w:rPr>
+        <w:t>Nút lá (Leaf Nodes): Đại diện cho nhãn phân lớp cuối cùng (Khá-Giỏi hoặc Trung bình-Yếu) cùng phân bố xác suất tương ứng.</w:t>
+      </w:r>
+    </w:p>
+    <w:p>
+      <w:pPr>
+        <w:pStyle w:val="Heading2"/>
         <w:keepNext/>
         <w:spacing w:before="200" w:after="80"/>
         <w:ind w:firstLine="0"/>
@@ -1106,7 +2193,7 @@
           <w:sz w:val="26"/>
           <w:rFonts w:ascii="Times New Roman" w:hAnsi="Times New Roman" w:cs="Times New Roman" w:eastAsia="Times New Roman"/>
         </w:rPr>
-        <w:t>2.2. Tiêu Chí Phân Tách Toán Học (Mathematical Splitting Criteria)</w:t>
+        <w:t>2.2. Tiêu Chí Phân Tách Toán Học (Splitting Criteria)</w:t>
       </w:r>
     </w:p>
     <w:p>
@@ -1129,13 +2216,14 @@
     </w:p>
     <w:p>
       <w:pPr>
-        <w:spacing w:before="80" w:after="40" w:line="312" w:lineRule="auto"/>
+        <w:spacing w:before="0" w:after="80" w:line="312" w:lineRule="auto"/>
+        <w:ind w:firstLine="0"/>
         <w:jc w:val="both"/>
       </w:pPr>
       <w:r>
         <w:rPr>
           <w:rFonts w:ascii="Times New Roman" w:hAnsi="Times New Roman"/>
-          <w:b/>
+          <w:b w:val="0"/>
           <w:i w:val="0"/>
           <w:color w:val="000000"/>
           <w:sz w:val="26"/>
@@ -1159,7 +2247,7 @@
           <w:sz w:val="26"/>
           <w:rFonts w:ascii="Times New Roman" w:hAnsi="Times New Roman" w:cs="Times New Roman" w:eastAsia="Times New Roman"/>
         </w:rPr>
-        <w:t>Độ vấy bẩn Gini đo lường xác suất một phần tử được chọn ngẫu nhiên trong tập dữ liệu bị phân loại sai nếu nó được gán nhãn ngẫu nhiên theo phân bố xác suất của các lớp trong tập đó. Với tập dữ liệu mẫu D gồm C lớp:</w:t>
+        <w:t>Độ vấy bẩn Gini đo lường xác suất một phần tử được chọn ngẫu nhiên trong tập dữ liệu bị phân loại sai nếu nó được gán nhãn ngẫu nhiên theo phân bố xác suất của các lớp trong tập đó. Với tập dữ liệu mẫu D gồm C lớp mục tiêu:</w:t>
       </w:r>
     </w:p>
     <w:p>
@@ -1229,7 +2317,7 @@
           <w:sz w:val="26"/>
           <w:rFonts w:ascii="Times New Roman" w:hAnsi="Times New Roman" w:cs="Times New Roman" w:eastAsia="Times New Roman"/>
         </w:rPr>
-        <w:t>Trong đó: C là tổng số lớp phân loại (trong đề tài này C = 2, tương ứng lớp Khá-Giỏi và Trung bình-Yếu); p_i là tỷ lệ (xác suất) các mẫu thuộc lớp i xuất hiện trong tập D. Đối với bài toán nhị phân, Gini(D) đạt giá trị nhỏ nhất bằng 0 khi tập D hoàn toàn thuần khiết (100% mẫu thuộc cùng một lớp) và đạt giá trị cực đại bằng 0.5 khi tập D hỗn độn hoàn toàn (tỷ lệ 50/50 giữa hai lớp).</w:t>
+        <w:t>Trong đó: C là tổng số lớp phân loại (trong đề tài này C = 2, tương ứng lớp Khá-Giỏi và Trung bình-Yếu); p_i là tỷ lệ các mẫu thuộc lớp i xuất hiện trong tập D. Đối với bài toán phân lớp nhị phân, Gini(D) đạt giá trị nhỏ nhất bằng 0 khi tập D hoàn toàn thuần khiết và đạt giá trị cực đại bằng 0.5 khi tập D hỗn độn hoàn toàn (tỷ lệ 50/50 giữa hai lớp).</w:t>
       </w:r>
     </w:p>
     <w:p>
@@ -1466,13 +2554,14 @@
     </w:p>
     <w:p>
       <w:pPr>
-        <w:spacing w:before="80" w:after="40" w:line="312" w:lineRule="auto"/>
+        <w:spacing w:before="0" w:after="80" w:line="312" w:lineRule="auto"/>
+        <w:ind w:firstLine="0"/>
         <w:jc w:val="both"/>
       </w:pPr>
       <w:r>
         <w:rPr>
           <w:rFonts w:ascii="Times New Roman" w:hAnsi="Times New Roman"/>
-          <w:b/>
+          <w:b w:val="0"/>
           <w:i w:val="0"/>
           <w:color w:val="000000"/>
           <w:sz w:val="26"/>
@@ -1690,6 +2779,7 @@
     </w:p>
     <w:p>
       <w:pPr>
+        <w:pStyle w:val="Heading2"/>
         <w:keepNext/>
         <w:spacing w:before="200" w:after="80"/>
         <w:ind w:firstLine="0"/>
@@ -1723,28 +2813,185 @@
           <w:rFonts w:ascii="Times New Roman" w:hAnsi="Times New Roman" w:cs="Times New Roman" w:eastAsia="Times New Roman"/>
         </w:rPr>
         <w:t>Quy trình xây dựng Cây quyết định CART được thực hiện theo chiến lược đệ quy tham lam từ trên xuống (Top-down Greedy Recursion):</w:t>
-        <w:br/>
-        <w:t>Bước 1: Bắt đầu tại nút gốc chứa toàn bộ tập dữ liệu huấn luyện D.</w:t>
-        <w:br/>
-        <w:t>Bước 2: Với mọi thuộc tính liên tục (điểm các môn học), sắp xếp các giá trị tăng dần và tính Gini_split cho tất cả các điểm chia khả dĩ.</w:t>
-        <w:br/>
-        <w:t>Bước 3: Chọn thuộc tính và ngưỡng phân chia tối ưu mang lại mức giảm Gini lớn nhất (tăng độ thuần khiết cao nhất).</w:t>
-        <w:br/>
-        <w:t>Bước 4: Chia tập dữ liệu thành 2 nhánh con (D_left và D_right) tương ứng với điều kiện kiểm tra.</w:t>
-        <w:br/>
-        <w:t>Bước 5: Lặp lại đệ quy các Bước 2-4 trên từng tập con cho đến khi thỏa mãn một trong các điều kiện dừng:</w:t>
-        <w:br/>
-        <w:t xml:space="preserve">   - Nút đạt độ thuần khiết tuyệt đối (Gini = 0).</w:t>
-        <w:br/>
-        <w:t xml:space="preserve">   - Cây đạt độ sâu tối đa quy định (max_depth).</w:t>
-        <w:br/>
-        <w:t xml:space="preserve">   - Số lượng mẫu tại nút nhỏ hơn ngưỡng tối thiểu (min_samples_leaf).</w:t>
-        <w:br/>
-        <w:t>Bước 6: Gán nhãn cho nút lá theo nguyên tắc đa số phiếu (Majority Voting).</w:t>
       </w:r>
     </w:p>
     <w:p>
       <w:pPr>
+        <w:spacing w:before="0" w:after="60" w:line="300" w:lineRule="auto"/>
+        <w:ind w:left="680" w:hanging="283"/>
+        <w:jc w:val="both"/>
+      </w:pPr>
+      <w:r>
+        <w:rPr>
+          <w:rFonts w:ascii="Times New Roman" w:hAnsi="Times New Roman"/>
+          <w:b/>
+          <w:i w:val="0"/>
+          <w:color w:val="000000"/>
+          <w:sz w:val="26"/>
+          <w:rFonts w:ascii="Times New Roman" w:hAnsi="Times New Roman" w:cs="Times New Roman" w:eastAsia="Times New Roman"/>
+        </w:rPr>
+        <w:t xml:space="preserve">• </w:t>
+      </w:r>
+      <w:r>
+        <w:rPr>
+          <w:rFonts w:ascii="Times New Roman" w:hAnsi="Times New Roman"/>
+          <w:b w:val="0"/>
+          <w:i w:val="0"/>
+          <w:color w:val="000000"/>
+          <w:sz w:val="26"/>
+          <w:rFonts w:ascii="Times New Roman" w:hAnsi="Times New Roman" w:cs="Times New Roman" w:eastAsia="Times New Roman"/>
+        </w:rPr>
+        <w:t>Bước 1: Bắt đầu tại nút gốc chứa toàn bộ tập dữ liệu huấn luyện D.</w:t>
+      </w:r>
+    </w:p>
+    <w:p>
+      <w:pPr>
+        <w:spacing w:before="0" w:after="60" w:line="300" w:lineRule="auto"/>
+        <w:ind w:left="680" w:hanging="283"/>
+        <w:jc w:val="both"/>
+      </w:pPr>
+      <w:r>
+        <w:rPr>
+          <w:rFonts w:ascii="Times New Roman" w:hAnsi="Times New Roman"/>
+          <w:b/>
+          <w:i w:val="0"/>
+          <w:color w:val="000000"/>
+          <w:sz w:val="26"/>
+          <w:rFonts w:ascii="Times New Roman" w:hAnsi="Times New Roman" w:cs="Times New Roman" w:eastAsia="Times New Roman"/>
+        </w:rPr>
+        <w:t xml:space="preserve">• </w:t>
+      </w:r>
+      <w:r>
+        <w:rPr>
+          <w:rFonts w:ascii="Times New Roman" w:hAnsi="Times New Roman"/>
+          <w:b w:val="0"/>
+          <w:i w:val="0"/>
+          <w:color w:val="000000"/>
+          <w:sz w:val="26"/>
+          <w:rFonts w:ascii="Times New Roman" w:hAnsi="Times New Roman" w:cs="Times New Roman" w:eastAsia="Times New Roman"/>
+        </w:rPr>
+        <w:t>Bước 2: Với mọi thuộc tính liên tục (điểm các môn học), sắp xếp các giá trị tăng dần và tính Gini_split cho tất cả các điểm chia khả dĩ.</w:t>
+      </w:r>
+    </w:p>
+    <w:p>
+      <w:pPr>
+        <w:spacing w:before="0" w:after="60" w:line="300" w:lineRule="auto"/>
+        <w:ind w:left="680" w:hanging="283"/>
+        <w:jc w:val="both"/>
+      </w:pPr>
+      <w:r>
+        <w:rPr>
+          <w:rFonts w:ascii="Times New Roman" w:hAnsi="Times New Roman"/>
+          <w:b/>
+          <w:i w:val="0"/>
+          <w:color w:val="000000"/>
+          <w:sz w:val="26"/>
+          <w:rFonts w:ascii="Times New Roman" w:hAnsi="Times New Roman" w:cs="Times New Roman" w:eastAsia="Times New Roman"/>
+        </w:rPr>
+        <w:t xml:space="preserve">• </w:t>
+      </w:r>
+      <w:r>
+        <w:rPr>
+          <w:rFonts w:ascii="Times New Roman" w:hAnsi="Times New Roman"/>
+          <w:b w:val="0"/>
+          <w:i w:val="0"/>
+          <w:color w:val="000000"/>
+          <w:sz w:val="26"/>
+          <w:rFonts w:ascii="Times New Roman" w:hAnsi="Times New Roman" w:cs="Times New Roman" w:eastAsia="Times New Roman"/>
+        </w:rPr>
+        <w:t>Bước 3: Chọn thuộc tính và ngưỡng phân chia tối ưu mang lại mức giảm Gini lớn nhất (tăng độ thuần khiết cao nhất).</w:t>
+      </w:r>
+    </w:p>
+    <w:p>
+      <w:pPr>
+        <w:spacing w:before="0" w:after="60" w:line="300" w:lineRule="auto"/>
+        <w:ind w:left="680" w:hanging="283"/>
+        <w:jc w:val="both"/>
+      </w:pPr>
+      <w:r>
+        <w:rPr>
+          <w:rFonts w:ascii="Times New Roman" w:hAnsi="Times New Roman"/>
+          <w:b/>
+          <w:i w:val="0"/>
+          <w:color w:val="000000"/>
+          <w:sz w:val="26"/>
+          <w:rFonts w:ascii="Times New Roman" w:hAnsi="Times New Roman" w:cs="Times New Roman" w:eastAsia="Times New Roman"/>
+        </w:rPr>
+        <w:t xml:space="preserve">• </w:t>
+      </w:r>
+      <w:r>
+        <w:rPr>
+          <w:rFonts w:ascii="Times New Roman" w:hAnsi="Times New Roman"/>
+          <w:b w:val="0"/>
+          <w:i w:val="0"/>
+          <w:color w:val="000000"/>
+          <w:sz w:val="26"/>
+          <w:rFonts w:ascii="Times New Roman" w:hAnsi="Times New Roman" w:cs="Times New Roman" w:eastAsia="Times New Roman"/>
+        </w:rPr>
+        <w:t>Bước 4: Chia tập dữ liệu thành 2 nhánh con (D_left và D_right) tương ứng với điều kiện kiểm tra.</w:t>
+      </w:r>
+    </w:p>
+    <w:p>
+      <w:pPr>
+        <w:spacing w:before="0" w:after="60" w:line="300" w:lineRule="auto"/>
+        <w:ind w:left="680" w:hanging="283"/>
+        <w:jc w:val="both"/>
+      </w:pPr>
+      <w:r>
+        <w:rPr>
+          <w:rFonts w:ascii="Times New Roman" w:hAnsi="Times New Roman"/>
+          <w:b/>
+          <w:i w:val="0"/>
+          <w:color w:val="000000"/>
+          <w:sz w:val="26"/>
+          <w:rFonts w:ascii="Times New Roman" w:hAnsi="Times New Roman" w:cs="Times New Roman" w:eastAsia="Times New Roman"/>
+        </w:rPr>
+        <w:t xml:space="preserve">• </w:t>
+      </w:r>
+      <w:r>
+        <w:rPr>
+          <w:rFonts w:ascii="Times New Roman" w:hAnsi="Times New Roman"/>
+          <w:b w:val="0"/>
+          <w:i w:val="0"/>
+          <w:color w:val="000000"/>
+          <w:sz w:val="26"/>
+          <w:rFonts w:ascii="Times New Roman" w:hAnsi="Times New Roman" w:cs="Times New Roman" w:eastAsia="Times New Roman"/>
+        </w:rPr>
+        <w:t>Bước 5: Lặp lại đệ quy các Bước 2-4 trên từng tập con cho đến khi thỏa mãn điều kiện dừng: đạt độ thuần khiết Gini = 0, đạt độ sâu max_depth, hoặc số mẫu nhỏ hơn min_samples_leaf.</w:t>
+      </w:r>
+    </w:p>
+    <w:p>
+      <w:pPr>
+        <w:spacing w:before="0" w:after="60" w:line="300" w:lineRule="auto"/>
+        <w:ind w:left="680" w:hanging="283"/>
+        <w:jc w:val="both"/>
+      </w:pPr>
+      <w:r>
+        <w:rPr>
+          <w:rFonts w:ascii="Times New Roman" w:hAnsi="Times New Roman"/>
+          <w:b/>
+          <w:i w:val="0"/>
+          <w:color w:val="000000"/>
+          <w:sz w:val="26"/>
+          <w:rFonts w:ascii="Times New Roman" w:hAnsi="Times New Roman" w:cs="Times New Roman" w:eastAsia="Times New Roman"/>
+        </w:rPr>
+        <w:t xml:space="preserve">• </w:t>
+      </w:r>
+      <w:r>
+        <w:rPr>
+          <w:rFonts w:ascii="Times New Roman" w:hAnsi="Times New Roman"/>
+          <w:b w:val="0"/>
+          <w:i w:val="0"/>
+          <w:color w:val="000000"/>
+          <w:sz w:val="26"/>
+          <w:rFonts w:ascii="Times New Roman" w:hAnsi="Times New Roman" w:cs="Times New Roman" w:eastAsia="Times New Roman"/>
+        </w:rPr>
+        <w:t>Bước 6: Gán nhãn cho nút lá theo nguyên tắc đa số phiếu (Majority Voting).</w:t>
+      </w:r>
+    </w:p>
+    <w:p>
+      <w:pPr>
+        <w:pStyle w:val="Heading2"/>
         <w:keepNext/>
         <w:spacing w:before="200" w:after="80"/>
         <w:ind w:firstLine="0"/>
@@ -1778,14 +3025,69 @@
           <w:rFonts w:ascii="Times New Roman" w:hAnsi="Times New Roman" w:cs="Times New Roman" w:eastAsia="Times New Roman"/>
         </w:rPr>
         <w:t>Nếu để cây phát triển tự do không kiểm soát, mô hình sẽ cố gắng phân nhánh để bao phủ từng điểm nhiễu của tập Train, dẫn đến hiện tượng Quá khớp (Overfitting) và làm suy giảm nghiêm trọng khả năng tổng quát hóa trên dữ liệu mới. Đề tài áp dụng kỹ thuật Tiền cắt tỉa (Pre-pruning):</w:t>
-        <w:br/>
-        <w:t>- Khống chế độ sâu tối đa (max_depth = 3): Giữ cho cây ở quy mô vừa phải (tối đa 8 nút lá), chỉ học các quy luật cốt lõi nhất.</w:t>
-        <w:br/>
-        <w:t>- Giới hạn số mẫu tối thiểu ở nút lá (min_samples_leaf = 10): Ngăn chặn việc hình thành các nhánh cá biệt chỉ phục vụ một vài mẫu dữ liệu.</w:t>
       </w:r>
     </w:p>
     <w:p>
       <w:pPr>
+        <w:spacing w:before="0" w:after="60" w:line="300" w:lineRule="auto"/>
+        <w:ind w:left="680" w:hanging="283"/>
+        <w:jc w:val="both"/>
+      </w:pPr>
+      <w:r>
+        <w:rPr>
+          <w:rFonts w:ascii="Times New Roman" w:hAnsi="Times New Roman"/>
+          <w:b/>
+          <w:i w:val="0"/>
+          <w:color w:val="000000"/>
+          <w:sz w:val="26"/>
+          <w:rFonts w:ascii="Times New Roman" w:hAnsi="Times New Roman" w:cs="Times New Roman" w:eastAsia="Times New Roman"/>
+        </w:rPr>
+        <w:t xml:space="preserve">- </w:t>
+      </w:r>
+      <w:r>
+        <w:rPr>
+          <w:rFonts w:ascii="Times New Roman" w:hAnsi="Times New Roman"/>
+          <w:b w:val="0"/>
+          <w:i w:val="0"/>
+          <w:color w:val="000000"/>
+          <w:sz w:val="26"/>
+          <w:rFonts w:ascii="Times New Roman" w:hAnsi="Times New Roman" w:cs="Times New Roman" w:eastAsia="Times New Roman"/>
+        </w:rPr>
+        <w:t>Khống chế độ sâu tối đa (max_depth = 3): Giữ cho cây ở quy mô vừa phải (tối đa 8 nút lá), chỉ học các quy luật cốt lõi nhất.</w:t>
+      </w:r>
+    </w:p>
+    <w:p>
+      <w:pPr>
+        <w:spacing w:before="0" w:after="60" w:line="300" w:lineRule="auto"/>
+        <w:ind w:left="680" w:hanging="283"/>
+        <w:jc w:val="both"/>
+      </w:pPr>
+      <w:r>
+        <w:rPr>
+          <w:rFonts w:ascii="Times New Roman" w:hAnsi="Times New Roman"/>
+          <w:b/>
+          <w:i w:val="0"/>
+          <w:color w:val="000000"/>
+          <w:sz w:val="26"/>
+          <w:rFonts w:ascii="Times New Roman" w:hAnsi="Times New Roman" w:cs="Times New Roman" w:eastAsia="Times New Roman"/>
+        </w:rPr>
+        <w:t xml:space="preserve">- </w:t>
+      </w:r>
+      <w:r>
+        <w:rPr>
+          <w:rFonts w:ascii="Times New Roman" w:hAnsi="Times New Roman"/>
+          <w:b w:val="0"/>
+          <w:i w:val="0"/>
+          <w:color w:val="000000"/>
+          <w:sz w:val="26"/>
+          <w:rFonts w:ascii="Times New Roman" w:hAnsi="Times New Roman" w:cs="Times New Roman" w:eastAsia="Times New Roman"/>
+        </w:rPr>
+        <w:t>Giới hạn số mẫu tối thiểu ở nút lá (min_samples_leaf = 10): Ngăn chặn việc hình thành các nhánh cá biệt chỉ phục vụ một vài mẫu dữ liệu.</w:t>
+      </w:r>
+    </w:p>
+    <w:p>
+      <w:pPr>
+        <w:pStyle w:val="Heading2"/>
         <w:keepNext/>
         <w:spacing w:before="200" w:after="80"/>
         <w:ind w:firstLine="0"/>
@@ -1805,10 +3107,21 @@
     </w:p>
     <w:p>
       <w:pPr>
-        <w:spacing w:before="0" w:after="80" w:line="312" w:lineRule="auto"/>
-        <w:ind w:firstLine="567"/>
+        <w:spacing w:before="0" w:after="60" w:line="300" w:lineRule="auto"/>
+        <w:ind w:left="680" w:hanging="283"/>
         <w:jc w:val="both"/>
       </w:pPr>
+      <w:r>
+        <w:rPr>
+          <w:rFonts w:ascii="Times New Roman" w:hAnsi="Times New Roman"/>
+          <w:b/>
+          <w:i w:val="0"/>
+          <w:color w:val="000000"/>
+          <w:sz w:val="26"/>
+          <w:rFonts w:ascii="Times New Roman" w:hAnsi="Times New Roman" w:cs="Times New Roman" w:eastAsia="Times New Roman"/>
+        </w:rPr>
+        <w:t xml:space="preserve">1. </w:t>
+      </w:r>
       <w:r>
         <w:rPr>
           <w:rFonts w:ascii="Times New Roman" w:hAnsi="Times New Roman"/>
@@ -1818,13 +3131,41 @@
           <w:sz w:val="26"/>
           <w:rFonts w:ascii="Times New Roman" w:hAnsi="Times New Roman" w:cs="Times New Roman" w:eastAsia="Times New Roman"/>
         </w:rPr>
-        <w:t>1. Ưu điểm: Tính khả giải cao (White-box model), cung cấp tập luật If-Then trực quan; không nhạy cảm với thang đo; tự động chọn lọc thuộc tính quan trọng (Gini Importance).</w:t>
-        <w:br/>
-        <w:t>2. Hạn chế: Ranh giới phân chia trực giao song song với trục tọa độ; độ nhạy cảm cao với phương sai (High Variance) nếu dữ liệu thay đổi nhỏ.</w:t>
+        <w:t>Ưu điểm: Tính khả giải cao (White-box model), cung cấp tập luật If-Then trực quan; không nhạy cảm với thang đo; tự động chọn lọc thuộc tính quan trọng (Gini Importance).</w:t>
       </w:r>
     </w:p>
     <w:p>
       <w:pPr>
+        <w:spacing w:before="0" w:after="60" w:line="300" w:lineRule="auto"/>
+        <w:ind w:left="680" w:hanging="283"/>
+        <w:jc w:val="both"/>
+      </w:pPr>
+      <w:r>
+        <w:rPr>
+          <w:rFonts w:ascii="Times New Roman" w:hAnsi="Times New Roman"/>
+          <w:b/>
+          <w:i w:val="0"/>
+          <w:color w:val="000000"/>
+          <w:sz w:val="26"/>
+          <w:rFonts w:ascii="Times New Roman" w:hAnsi="Times New Roman" w:cs="Times New Roman" w:eastAsia="Times New Roman"/>
+        </w:rPr>
+        <w:t xml:space="preserve">2. </w:t>
+      </w:r>
+      <w:r>
+        <w:rPr>
+          <w:rFonts w:ascii="Times New Roman" w:hAnsi="Times New Roman"/>
+          <w:b w:val="0"/>
+          <w:i w:val="0"/>
+          <w:color w:val="000000"/>
+          <w:sz w:val="26"/>
+          <w:rFonts w:ascii="Times New Roman" w:hAnsi="Times New Roman" w:cs="Times New Roman" w:eastAsia="Times New Roman"/>
+        </w:rPr>
+        <w:t>Hạn chế: Ranh giới phân chia trực giao song song với trục tọa độ; độ nhạy cảm cao với phương sai (High Variance) nếu dữ liệu thay đổi nhỏ.</w:t>
+      </w:r>
+    </w:p>
+    <w:p>
+      <w:pPr>
+        <w:pStyle w:val="Heading1"/>
         <w:keepNext/>
         <w:spacing w:before="280" w:after="120"/>
         <w:ind w:firstLine="0"/>
@@ -1836,7 +3177,7 @@
           <w:b/>
           <w:i w:val="0"/>
           <w:color w:val="000000"/>
-          <w:sz w:val="29"/>
+          <w:sz w:val="28"/>
           <w:rFonts w:ascii="Times New Roman" w:hAnsi="Times New Roman" w:cs="Times New Roman" w:eastAsia="Times New Roman"/>
         </w:rPr>
         <w:t>CHƯƠNG 3: TRIỂN KHAI THỰC NGHIỆM VÀ GIAO THỨC ZERO LABEL LEAKAGE</w:t>
@@ -1844,6 +3185,7 @@
     </w:p>
     <w:p>
       <w:pPr>
+        <w:pStyle w:val="Heading2"/>
         <w:keepNext/>
         <w:spacing w:before="200" w:after="80"/>
         <w:ind w:firstLine="0"/>
@@ -1877,14 +3219,69 @@
           <w:rFonts w:ascii="Times New Roman" w:hAnsi="Times New Roman" w:cs="Times New Roman" w:eastAsia="Times New Roman"/>
         </w:rPr>
         <w:t>Toàn bộ mã nguồn thực nghiệm được tổ chức module hóa tại thư mục src/ và thực thi trên môi trường:</w:t>
-        <w:br/>
-        <w:t>- Hệ điều hành &amp; Trình thông dịch: Windows 11 64-bit, Python 3.12.</w:t>
-        <w:br/>
-        <w:t>- Thư viện cốt lõi: scikit-learn 1.6+ (mô hình học máy), pandas 3.0+ (quản trị dữ liệu bảng), numpy (tính toán ma trận), matplotlib và seaborn (xuất đồ thị 300 DPI).</w:t>
       </w:r>
     </w:p>
     <w:p>
       <w:pPr>
+        <w:spacing w:before="0" w:after="60" w:line="300" w:lineRule="auto"/>
+        <w:ind w:left="680" w:hanging="283"/>
+        <w:jc w:val="both"/>
+      </w:pPr>
+      <w:r>
+        <w:rPr>
+          <w:rFonts w:ascii="Times New Roman" w:hAnsi="Times New Roman"/>
+          <w:b/>
+          <w:i w:val="0"/>
+          <w:color w:val="000000"/>
+          <w:sz w:val="26"/>
+          <w:rFonts w:ascii="Times New Roman" w:hAnsi="Times New Roman" w:cs="Times New Roman" w:eastAsia="Times New Roman"/>
+        </w:rPr>
+        <w:t xml:space="preserve">- </w:t>
+      </w:r>
+      <w:r>
+        <w:rPr>
+          <w:rFonts w:ascii="Times New Roman" w:hAnsi="Times New Roman"/>
+          <w:b w:val="0"/>
+          <w:i w:val="0"/>
+          <w:color w:val="000000"/>
+          <w:sz w:val="26"/>
+          <w:rFonts w:ascii="Times New Roman" w:hAnsi="Times New Roman" w:cs="Times New Roman" w:eastAsia="Times New Roman"/>
+        </w:rPr>
+        <w:t>Hệ điều hành &amp; Trình thông dịch: Windows 11 64-bit, Python 3.12.</w:t>
+      </w:r>
+    </w:p>
+    <w:p>
+      <w:pPr>
+        <w:spacing w:before="0" w:after="60" w:line="300" w:lineRule="auto"/>
+        <w:ind w:left="680" w:hanging="283"/>
+        <w:jc w:val="both"/>
+      </w:pPr>
+      <w:r>
+        <w:rPr>
+          <w:rFonts w:ascii="Times New Roman" w:hAnsi="Times New Roman"/>
+          <w:b/>
+          <w:i w:val="0"/>
+          <w:color w:val="000000"/>
+          <w:sz w:val="26"/>
+          <w:rFonts w:ascii="Times New Roman" w:hAnsi="Times New Roman" w:cs="Times New Roman" w:eastAsia="Times New Roman"/>
+        </w:rPr>
+        <w:t xml:space="preserve">- </w:t>
+      </w:r>
+      <w:r>
+        <w:rPr>
+          <w:rFonts w:ascii="Times New Roman" w:hAnsi="Times New Roman"/>
+          <w:b w:val="0"/>
+          <w:i w:val="0"/>
+          <w:color w:val="000000"/>
+          <w:sz w:val="26"/>
+          <w:rFonts w:ascii="Times New Roman" w:hAnsi="Times New Roman" w:cs="Times New Roman" w:eastAsia="Times New Roman"/>
+        </w:rPr>
+        <w:t>Thư viện cốt lõi: scikit-learn 1.6+ (mô hình học máy), pandas 3.0+ (quản trị dữ liệu bảng), numpy (tính toán ma trận), matplotlib và seaborn (xuất đồ thị 300 DPI).</w:t>
+      </w:r>
+    </w:p>
+    <w:p>
+      <w:pPr>
+        <w:pStyle w:val="Heading2"/>
         <w:keepNext/>
         <w:spacing w:before="200" w:after="80"/>
         <w:ind w:firstLine="0"/>
@@ -1918,14 +3315,122 @@
           <w:rFonts w:ascii="Times New Roman" w:hAnsi="Times New Roman" w:cs="Times New Roman" w:eastAsia="Times New Roman"/>
         </w:rPr>
         <w:t>Nghiên cứu sử dụng bộ dữ liệu chuẩn hóa học thuật gồm 1656 sinh viên ngành kỹ thuật với 56 thuộc tính:</w:t>
-        <w:br/>
-        <w:t>- Toàn bộ thông tin định danh cá nhân (PII) như Họ tên, MSSV, Ngày sinh đã được khử định danh triệt để nhằm bảo đảm tính riêng tư theo chuẩn nghiên cứu khoa học.</w:t>
-        <w:br/>
-        <w:t>- Biến nhân khẩu học: Nơi sinh (BirthPlace --- 27 tỉnh thành sau lọc) và Giới tính (Sex: Nam chiếm 99.76% do đặc thù ngành kỹ thuật).</w:t>
-        <w:br/>
-        <w:t>- Biến môn học: Điểm số 50 môn học từ HK1 đến HK8 theo thang điểm 4.0.</w:t>
-        <w:br/>
-        <w:t>- Biến tổng kết GPA toàn khóa: Điểm trung bình = 2.399, Độ lệch chuẩn = 0.510, Trung vị = 2.485, Khoảng điểm: [0.00 - 3.48].</w:t>
+      </w:r>
+    </w:p>
+    <w:p>
+      <w:pPr>
+        <w:spacing w:before="0" w:after="60" w:line="300" w:lineRule="auto"/>
+        <w:ind w:left="680" w:hanging="283"/>
+        <w:jc w:val="both"/>
+      </w:pPr>
+      <w:r>
+        <w:rPr>
+          <w:rFonts w:ascii="Times New Roman" w:hAnsi="Times New Roman"/>
+          <w:b/>
+          <w:i w:val="0"/>
+          <w:color w:val="000000"/>
+          <w:sz w:val="26"/>
+          <w:rFonts w:ascii="Times New Roman" w:hAnsi="Times New Roman" w:cs="Times New Roman" w:eastAsia="Times New Roman"/>
+        </w:rPr>
+        <w:t xml:space="preserve">- </w:t>
+      </w:r>
+      <w:r>
+        <w:rPr>
+          <w:rFonts w:ascii="Times New Roman" w:hAnsi="Times New Roman"/>
+          <w:b w:val="0"/>
+          <w:i w:val="0"/>
+          <w:color w:val="000000"/>
+          <w:sz w:val="26"/>
+          <w:rFonts w:ascii="Times New Roman" w:hAnsi="Times New Roman" w:cs="Times New Roman" w:eastAsia="Times New Roman"/>
+        </w:rPr>
+        <w:t>Toàn bộ thông tin định danh cá nhân (PII) như Họ tên, MSSV, Ngày sinh đã được khử định danh triệt để nhằm bảo đảm tính riêng tư theo chuẩn nghiên cứu khoa học.</w:t>
+      </w:r>
+    </w:p>
+    <w:p>
+      <w:pPr>
+        <w:spacing w:before="0" w:after="60" w:line="300" w:lineRule="auto"/>
+        <w:ind w:left="680" w:hanging="283"/>
+        <w:jc w:val="both"/>
+      </w:pPr>
+      <w:r>
+        <w:rPr>
+          <w:rFonts w:ascii="Times New Roman" w:hAnsi="Times New Roman"/>
+          <w:b/>
+          <w:i w:val="0"/>
+          <w:color w:val="000000"/>
+          <w:sz w:val="26"/>
+          <w:rFonts w:ascii="Times New Roman" w:hAnsi="Times New Roman" w:cs="Times New Roman" w:eastAsia="Times New Roman"/>
+        </w:rPr>
+        <w:t xml:space="preserve">- </w:t>
+      </w:r>
+      <w:r>
+        <w:rPr>
+          <w:rFonts w:ascii="Times New Roman" w:hAnsi="Times New Roman"/>
+          <w:b w:val="0"/>
+          <w:i w:val="0"/>
+          <w:color w:val="000000"/>
+          <w:sz w:val="26"/>
+          <w:rFonts w:ascii="Times New Roman" w:hAnsi="Times New Roman" w:cs="Times New Roman" w:eastAsia="Times New Roman"/>
+        </w:rPr>
+        <w:t>Biến nhân khẩu học: Nơi sinh (BirthPlace --- 27 tỉnh thành sau lọc) và Giới tính (Sex: Nam chiếm 99.76% do đặc thù ngành kỹ thuật).</w:t>
+      </w:r>
+    </w:p>
+    <w:p>
+      <w:pPr>
+        <w:spacing w:before="0" w:after="60" w:line="300" w:lineRule="auto"/>
+        <w:ind w:left="680" w:hanging="283"/>
+        <w:jc w:val="both"/>
+      </w:pPr>
+      <w:r>
+        <w:rPr>
+          <w:rFonts w:ascii="Times New Roman" w:hAnsi="Times New Roman"/>
+          <w:b/>
+          <w:i w:val="0"/>
+          <w:color w:val="000000"/>
+          <w:sz w:val="26"/>
+          <w:rFonts w:ascii="Times New Roman" w:hAnsi="Times New Roman" w:cs="Times New Roman" w:eastAsia="Times New Roman"/>
+        </w:rPr>
+        <w:t xml:space="preserve">- </w:t>
+      </w:r>
+      <w:r>
+        <w:rPr>
+          <w:rFonts w:ascii="Times New Roman" w:hAnsi="Times New Roman"/>
+          <w:b w:val="0"/>
+          <w:i w:val="0"/>
+          <w:color w:val="000000"/>
+          <w:sz w:val="26"/>
+          <w:rFonts w:ascii="Times New Roman" w:hAnsi="Times New Roman" w:cs="Times New Roman" w:eastAsia="Times New Roman"/>
+        </w:rPr>
+        <w:t>Biến môn học: Điểm số 50 môn học từ HK1 đến HK8 theo thang điểm 4.0.</w:t>
+      </w:r>
+    </w:p>
+    <w:p>
+      <w:pPr>
+        <w:spacing w:before="0" w:after="60" w:line="300" w:lineRule="auto"/>
+        <w:ind w:left="680" w:hanging="283"/>
+        <w:jc w:val="both"/>
+      </w:pPr>
+      <w:r>
+        <w:rPr>
+          <w:rFonts w:ascii="Times New Roman" w:hAnsi="Times New Roman"/>
+          <w:b/>
+          <w:i w:val="0"/>
+          <w:color w:val="000000"/>
+          <w:sz w:val="26"/>
+          <w:rFonts w:ascii="Times New Roman" w:hAnsi="Times New Roman" w:cs="Times New Roman" w:eastAsia="Times New Roman"/>
+        </w:rPr>
+        <w:t xml:space="preserve">- </w:t>
+      </w:r>
+      <w:r>
+        <w:rPr>
+          <w:rFonts w:ascii="Times New Roman" w:hAnsi="Times New Roman"/>
+          <w:b w:val="0"/>
+          <w:i w:val="0"/>
+          <w:color w:val="000000"/>
+          <w:sz w:val="26"/>
+          <w:rFonts w:ascii="Times New Roman" w:hAnsi="Times New Roman" w:cs="Times New Roman" w:eastAsia="Times New Roman"/>
+        </w:rPr>
+        <w:t>Biến tổng kết GPA toàn khóa: Điểm trung bình = 2.399, Độ lệch chuẩn = 0.510, Trung vị = 2.485, Khoảng điểm: [0.00 - 3.48].</w:t>
       </w:r>
     </w:p>
     <w:p>
@@ -1989,6 +3494,7 @@
     </w:p>
     <w:p>
       <w:pPr>
+        <w:pStyle w:val="Heading2"/>
         <w:keepNext/>
         <w:spacing w:before="200" w:after="80"/>
         <w:ind w:firstLine="0"/>
@@ -2021,18 +3527,60 @@
           <w:sz w:val="26"/>
           <w:rFonts w:ascii="Times New Roman" w:hAnsi="Times New Roman" w:cs="Times New Roman" w:eastAsia="Times New Roman"/>
         </w:rPr>
-        <w:t>1. Xác định nhãn mục tiêu: Điểm GPA tích lũy toàn khóa được nhị phân hóa theo Quy chế đào tạo tín chỉ (Thông tư 08/2021/TT-BGDĐT):</w:t>
-        <w:br/>
-        <w:t xml:space="preserve">   - Nhãn 1 (Khá --- Giỏi): GPA &gt;= 2.50 (Gồm 794 sinh viên --- 47.95%).</w:t>
-        <w:br/>
-        <w:t xml:space="preserve">   - Nhãn 0 (Trung bình --- Yếu): GPA &lt; 2.50 (Gồm 862 sinh viên --- 52.05%).</w:t>
-        <w:br/>
-        <w:t xml:space="preserve">   Tỷ lệ phân bố 48% vs 52% đạt mức cân bằng lý tưởng, loại bỏ hoàn toàn hiện tượng lệch nhãn (Imbalanced Classes).</w:t>
-        <w:br/>
+        <w:t>1. Xác định nhãn mục tiêu: Điểm GPA tích lũy toàn khóa được nhị phân hóa theo Quy chế đào tạo tín chỉ (Thông tư 08/2021/TT-BGDĐT): Nhãn 1 (Khá --- Giỏi): GPA &gt;= 2.50 (gồm 794 sinh viên --- 47.95%); Nhãn 0 (Trung bình --- Yếu): GPA &lt; 2.50 (gồm 862 sinh viên --- 52.05%). Tỷ lệ phân bố 48% vs 52% đạt mức cân bằng lý tưởng, loại bỏ hoàn toàn hiện tượng lệch nhãn (Imbalanced Classes).</w:t>
+      </w:r>
+    </w:p>
+    <w:p>
+      <w:pPr>
+        <w:spacing w:before="0" w:after="80" w:line="312" w:lineRule="auto"/>
+        <w:ind w:firstLine="567"/>
+        <w:jc w:val="both"/>
+      </w:pPr>
+      <w:r>
+        <w:rPr>
+          <w:rFonts w:ascii="Times New Roman" w:hAnsi="Times New Roman"/>
+          <w:b w:val="0"/>
+          <w:i w:val="0"/>
+          <w:color w:val="000000"/>
+          <w:sz w:val="26"/>
+          <w:rFonts w:ascii="Times New Roman" w:hAnsi="Times New Roman" w:cs="Times New Roman" w:eastAsia="Times New Roman"/>
+        </w:rPr>
         <w:t>2. Xử lý giá trị khuyết thiếu: Các ô điểm khuyết thiếu (NaN) được điền giá trị 0.0 theo đúng quy chuẩn mã hóa dữ liệu học vụ (đại diện cho việc sinh viên chưa tích lũy môn học hoặc bị vắng thi/điểm F).</w:t>
-        <w:br/>
+      </w:r>
+    </w:p>
+    <w:p>
+      <w:pPr>
+        <w:spacing w:before="0" w:after="80" w:line="312" w:lineRule="auto"/>
+        <w:ind w:firstLine="567"/>
+        <w:jc w:val="both"/>
+      </w:pPr>
+      <w:r>
+        <w:rPr>
+          <w:rFonts w:ascii="Times New Roman" w:hAnsi="Times New Roman"/>
+          <w:b w:val="0"/>
+          <w:i w:val="0"/>
+          <w:color w:val="000000"/>
+          <w:sz w:val="26"/>
+          <w:rFonts w:ascii="Times New Roman" w:hAnsi="Times New Roman" w:cs="Times New Roman" w:eastAsia="Times New Roman"/>
+        </w:rPr>
         <w:t>3. Giao thức Zero Label Leakage: Điểm GPA toàn khóa được tính bình quân gia quyền từ chính điểm của 50 môn học. Nếu đưa toàn bộ 50 môn học vào đầu vào, bài toán sẽ rơi vào lỗi rò rỉ nhãn vòng quanh (Circular Label Leakage), làm mất đi tính thực tế của việc dự báo sớm. Do đó, đề tài chỉ sử dụng duy nhất 15 môn học của Năm thứ nhất (Học kỳ 1 &amp; 2) làm biến đầu vào để dự đoán sớm. Tại thời điểm kết thúc năm nhất, sinh viên hoàn toàn chưa có điểm của 35 môn học các năm sau.</w:t>
-        <w:br/>
+      </w:r>
+    </w:p>
+    <w:p>
+      <w:pPr>
+        <w:spacing w:before="0" w:after="80" w:line="312" w:lineRule="auto"/>
+        <w:ind w:firstLine="567"/>
+        <w:jc w:val="both"/>
+      </w:pPr>
+      <w:r>
+        <w:rPr>
+          <w:rFonts w:ascii="Times New Roman" w:hAnsi="Times New Roman"/>
+          <w:b w:val="0"/>
+          <w:i w:val="0"/>
+          <w:color w:val="000000"/>
+          <w:sz w:val="26"/>
+          <w:rFonts w:ascii="Times New Roman" w:hAnsi="Times New Roman" w:cs="Times New Roman" w:eastAsia="Times New Roman"/>
+        </w:rPr>
         <w:t>4. Phân chia dữ liệu: Tập dữ liệu 1.656 mẫu được phân chia thành 80% Huấn luyện (1.324 sinh viên) và 20% Kiểm thử độc lập (332 sinh viên) bằng phương pháp phân tầng (StratifiedSplit) để giữ nguyên tỷ lệ nhãn.</w:t>
       </w:r>
     </w:p>
@@ -2097,6 +3645,7 @@
     </w:p>
     <w:p>
       <w:pPr>
+        <w:pStyle w:val="Heading1"/>
         <w:keepNext/>
         <w:spacing w:before="280" w:after="120"/>
         <w:ind w:firstLine="0"/>
@@ -2108,7 +3657,7 @@
           <w:b/>
           <w:i w:val="0"/>
           <w:color w:val="000000"/>
-          <w:sz w:val="29"/>
+          <w:sz w:val="28"/>
           <w:rFonts w:ascii="Times New Roman" w:hAnsi="Times New Roman" w:cs="Times New Roman" w:eastAsia="Times New Roman"/>
         </w:rPr>
         <w:t>CHƯƠNG 4: PHÂN TÍCH KẾT QUẢ THỰC NGHIỆM</w:t>
@@ -2116,6 +3665,7 @@
     </w:p>
     <w:p>
       <w:pPr>
+        <w:pStyle w:val="Heading2"/>
         <w:keepNext/>
         <w:spacing w:before="200" w:after="80"/>
         <w:ind w:firstLine="0"/>
@@ -2153,16 +3703,17 @@
     </w:p>
     <w:p>
       <w:pPr>
-        <w:spacing w:before="40" w:after="40" w:line="312" w:lineRule="auto"/>
+        <w:spacing w:before="0" w:after="80" w:line="312" w:lineRule="auto"/>
+        <w:ind w:firstLine="0"/>
         <w:jc w:val="both"/>
       </w:pPr>
       <w:r>
         <w:rPr>
           <w:rFonts w:ascii="Times New Roman" w:hAnsi="Times New Roman"/>
-          <w:b/>
+          <w:b w:val="0"/>
           <w:i w:val="0"/>
           <w:color w:val="000000"/>
-          <w:sz w:val="25"/>
+          <w:sz w:val="26"/>
           <w:rFonts w:ascii="Times New Roman" w:hAnsi="Times New Roman" w:cs="Times New Roman" w:eastAsia="Times New Roman"/>
         </w:rPr>
         <w:t>1. Độ chính xác toàn cục (Accuracy): Tỷ lệ các dự đoán đúng trên tổng số mẫu kiểm thử:</w:t>
@@ -2199,16 +3750,17 @@
     </w:p>
     <w:p>
       <w:pPr>
-        <w:spacing w:before="40" w:after="40" w:line="312" w:lineRule="auto"/>
+        <w:spacing w:before="0" w:after="80" w:line="312" w:lineRule="auto"/>
+        <w:ind w:firstLine="0"/>
         <w:jc w:val="both"/>
       </w:pPr>
       <w:r>
         <w:rPr>
           <w:rFonts w:ascii="Times New Roman" w:hAnsi="Times New Roman"/>
-          <w:b/>
+          <w:b w:val="0"/>
           <w:i w:val="0"/>
           <w:color w:val="000000"/>
-          <w:sz w:val="25"/>
+          <w:sz w:val="26"/>
           <w:rFonts w:ascii="Times New Roman" w:hAnsi="Times New Roman" w:cs="Times New Roman" w:eastAsia="Times New Roman"/>
         </w:rPr>
         <w:t>2. Độ chuẩn xác (Precision): Tỷ lệ mẫu thực sự đạt Khá-Giỏi trong số các mẫu được dự đoán là Khá-Giỏi:</w:t>
@@ -2245,16 +3797,17 @@
     </w:p>
     <w:p>
       <w:pPr>
-        <w:spacing w:before="40" w:after="40" w:line="312" w:lineRule="auto"/>
+        <w:spacing w:before="0" w:after="80" w:line="312" w:lineRule="auto"/>
+        <w:ind w:firstLine="0"/>
         <w:jc w:val="both"/>
       </w:pPr>
       <w:r>
         <w:rPr>
           <w:rFonts w:ascii="Times New Roman" w:hAnsi="Times New Roman"/>
-          <w:b/>
+          <w:b w:val="0"/>
           <w:i w:val="0"/>
           <w:color w:val="000000"/>
-          <w:sz w:val="25"/>
+          <w:sz w:val="26"/>
           <w:rFonts w:ascii="Times New Roman" w:hAnsi="Times New Roman" w:cs="Times New Roman" w:eastAsia="Times New Roman"/>
         </w:rPr>
         <w:t>3. Độ nhạy (Recall): Khả năng nhận diện chính xác các sinh viên thực tế đạt Khá-Giỏi:</w:t>
@@ -2291,16 +3844,17 @@
     </w:p>
     <w:p>
       <w:pPr>
-        <w:spacing w:before="40" w:after="40" w:line="312" w:lineRule="auto"/>
+        <w:spacing w:before="0" w:after="80" w:line="312" w:lineRule="auto"/>
+        <w:ind w:firstLine="0"/>
         <w:jc w:val="both"/>
       </w:pPr>
       <w:r>
         <w:rPr>
           <w:rFonts w:ascii="Times New Roman" w:hAnsi="Times New Roman"/>
-          <w:b/>
+          <w:b w:val="0"/>
           <w:i w:val="0"/>
           <w:color w:val="000000"/>
-          <w:sz w:val="25"/>
+          <w:sz w:val="26"/>
           <w:rFonts w:ascii="Times New Roman" w:hAnsi="Times New Roman" w:cs="Times New Roman" w:eastAsia="Times New Roman"/>
         </w:rPr>
         <w:t>4. Điểm F1-Score: Trung bình điều hòa giữa Precision và Recall:</w:t>
@@ -2367,16 +3921,17 @@
     </w:p>
     <w:p>
       <w:pPr>
-        <w:spacing w:before="40" w:after="40" w:line="312" w:lineRule="auto"/>
+        <w:spacing w:before="0" w:after="80" w:line="312" w:lineRule="auto"/>
+        <w:ind w:firstLine="0"/>
         <w:jc w:val="both"/>
       </w:pPr>
       <w:r>
         <w:rPr>
           <w:rFonts w:ascii="Times New Roman" w:hAnsi="Times New Roman"/>
-          <w:b/>
+          <w:b w:val="0"/>
           <w:i w:val="0"/>
           <w:color w:val="000000"/>
-          <w:sz w:val="25"/>
+          <w:sz w:val="26"/>
           <w:rFonts w:ascii="Times New Roman" w:hAnsi="Times New Roman" w:cs="Times New Roman" w:eastAsia="Times New Roman"/>
         </w:rPr>
         <w:t>5. Điểm Macro F1-Score: Trung bình cộng điểm F1 của cả hai lớp (Khá-Giỏi và Trung bình-Yếu):</w:t>
@@ -2482,6 +4037,7 @@
     </w:p>
     <w:p>
       <w:pPr>
+        <w:pStyle w:val="Heading2"/>
         <w:keepNext/>
         <w:spacing w:before="200" w:after="80"/>
         <w:ind w:firstLine="0"/>
@@ -3053,7 +4609,7 @@
     </w:tbl>
     <w:p>
       <w:pPr>
-        <w:spacing w:before="160" w:after="120" w:line="312" w:lineRule="auto"/>
+        <w:spacing w:before="0" w:after="80" w:line="312" w:lineRule="auto"/>
         <w:ind w:firstLine="567"/>
         <w:jc w:val="both"/>
       </w:pPr>
@@ -3066,15 +4622,12 @@
           <w:sz w:val="26"/>
           <w:rFonts w:ascii="Times New Roman" w:hAnsi="Times New Roman" w:cs="Times New Roman" w:eastAsia="Times New Roman"/>
         </w:rPr>
-        <w:t>Nhận xét đối chứng khoa học:</w:t>
-        <w:br/>
-        <w:t>- Mô hình Decision Tree đạt Accuracy 71.39% chỉ bằng dữ liệu năm nhất. Mô hình đối chứng Logistic Regression đạt Accuracy 78.31%, cao hơn Decision Tree khoảng 6.9 điểm %. Điều này hoàn toàn phù hợp với lý thuyết toán học: Logistic Regression tối ưu hóa siêu phẳng liên tục trên không gian 15 chiều, trong khi Cây quyết định bị ràng buộc bởi các đường cắt trực giao song song với trục tọa độ.</w:t>
-        <w:br/>
-        <w:t>- Tuy nhiên, trong ứng dụng quản lý giáo dục, Cây quyết định đạt ưu thế áp đảo về tính khả giải (Interpretability): Cung cấp trực tiếp các quy tắc rẽ nhánh số học rõ ràng (ví dụ: Điện - Điện tử ô tô &lt;= 2.25, Vật liệu học &gt; 2.75, Tiếng Anh 2 &gt; 2.25), giúp cố vấn học tập có thể giải thích minh bạch cho sinh viên.</w:t>
+        <w:t>Nhận xét đối chứng khoa học: Mô hình Decision Tree đạt Accuracy 71.39% chỉ bằng dữ liệu năm nhất. Mô hình đối chứng Logistic Regression đạt Accuracy 78.31%, cao hơn Decision Tree khoảng 6.9 điểm %. Điều này hoàn toàn phù hợp với lý thuyết toán học: Logistic Regression tối ưu hóa siêu phẳng liên tục trên không gian 15 chiều, trong khi Cây quyết định bị ràng buộc bởi các đường cắt trực giao song song với trục tọa độ. Tuy nhiên, trong ứng dụng quản lý giáo dục, Cây quyết định đạt ưu thế áp đảo về tính khả giải (Interpretability): cung cấp trực tiếp các quy tắc rẽ nhánh số học rõ ràng (ví dụ: Điện - Điện tử ô tô &lt;= 2.25, Vật liệu học &gt; 2.75, Tiếng Anh 2 &gt; 2.25), giúp cố vấn học tập có thể giải thích minh bạch cho sinh viên.</w:t>
       </w:r>
     </w:p>
     <w:p>
       <w:pPr>
+        <w:pStyle w:val="Heading2"/>
         <w:keepNext/>
         <w:spacing w:before="200" w:after="80"/>
         <w:ind w:firstLine="0"/>
@@ -4689,6 +6242,7 @@
     </w:tbl>
     <w:p>
       <w:pPr>
+        <w:pStyle w:val="Heading2"/>
         <w:keepNext/>
         <w:spacing w:before="200" w:after="80"/>
         <w:ind w:firstLine="0"/>
@@ -4721,16 +6275,140 @@
           <w:sz w:val="26"/>
           <w:rFonts w:ascii="Times New Roman" w:hAnsi="Times New Roman" w:cs="Times New Roman" w:eastAsia="Times New Roman"/>
         </w:rPr>
-        <w:t>Ma trận nhầm lẫn của mô hình Cây quyết định trên 332 sinh viên kiểm thử (Hình 4.1) ghi nhận:</w:t>
-        <w:br/>
-        <w:t>- True Negative (TN): 139 sinh viên thực tế xếp loại Trung bình-Yếu được dự đoán chính xác.</w:t>
-        <w:br/>
-        <w:t>- True Positive (TP): 98 sinh viên thực tế xếp loại Khá-Giỏi được dự đoán chính xác.</w:t>
-        <w:br/>
-        <w:t>- False Positive (FP --- Sai loại 1): 34 sinh viên thực tế Trung bình-Yếu nhưng mô hình dự đoán nhầm là Khá-Giỏi.</w:t>
-        <w:br/>
-        <w:t>- False Negative (FN --- Sai loại 2): 61 sinh viên thực tế Khá-Giỏi nhưng mô hình dự đoán nhầm là Trung bình-Yếu.</w:t>
-        <w:br/>
+        <w:t>Ma trận nhầm lẫn của mô hình Cây quyết định trên 332 sinh viên kiểm thử (Hình 4.1) ghi nhận các kết quả cụ thể sau:</w:t>
+      </w:r>
+    </w:p>
+    <w:p>
+      <w:pPr>
+        <w:spacing w:before="0" w:after="60" w:line="300" w:lineRule="auto"/>
+        <w:ind w:left="680" w:hanging="283"/>
+        <w:jc w:val="both"/>
+      </w:pPr>
+      <w:r>
+        <w:rPr>
+          <w:rFonts w:ascii="Times New Roman" w:hAnsi="Times New Roman"/>
+          <w:b/>
+          <w:i w:val="0"/>
+          <w:color w:val="000000"/>
+          <w:sz w:val="26"/>
+          <w:rFonts w:ascii="Times New Roman" w:hAnsi="Times New Roman" w:cs="Times New Roman" w:eastAsia="Times New Roman"/>
+        </w:rPr>
+        <w:t xml:space="preserve">- </w:t>
+      </w:r>
+      <w:r>
+        <w:rPr>
+          <w:rFonts w:ascii="Times New Roman" w:hAnsi="Times New Roman"/>
+          <w:b w:val="0"/>
+          <w:i w:val="0"/>
+          <w:color w:val="000000"/>
+          <w:sz w:val="26"/>
+          <w:rFonts w:ascii="Times New Roman" w:hAnsi="Times New Roman" w:cs="Times New Roman" w:eastAsia="Times New Roman"/>
+        </w:rPr>
+        <w:t>True Negative (TN): 139 sinh viên thực tế xếp loại Trung bình-Yếu được dự đoán chính xác.</w:t>
+      </w:r>
+    </w:p>
+    <w:p>
+      <w:pPr>
+        <w:spacing w:before="0" w:after="60" w:line="300" w:lineRule="auto"/>
+        <w:ind w:left="680" w:hanging="283"/>
+        <w:jc w:val="both"/>
+      </w:pPr>
+      <w:r>
+        <w:rPr>
+          <w:rFonts w:ascii="Times New Roman" w:hAnsi="Times New Roman"/>
+          <w:b/>
+          <w:i w:val="0"/>
+          <w:color w:val="000000"/>
+          <w:sz w:val="26"/>
+          <w:rFonts w:ascii="Times New Roman" w:hAnsi="Times New Roman" w:cs="Times New Roman" w:eastAsia="Times New Roman"/>
+        </w:rPr>
+        <w:t xml:space="preserve">- </w:t>
+      </w:r>
+      <w:r>
+        <w:rPr>
+          <w:rFonts w:ascii="Times New Roman" w:hAnsi="Times New Roman"/>
+          <w:b w:val="0"/>
+          <w:i w:val="0"/>
+          <w:color w:val="000000"/>
+          <w:sz w:val="26"/>
+          <w:rFonts w:ascii="Times New Roman" w:hAnsi="Times New Roman" w:cs="Times New Roman" w:eastAsia="Times New Roman"/>
+        </w:rPr>
+        <w:t>True Positive (TP): 98 sinh viên thực tế xếp loại Khá-Giỏi được dự đoán chính xác.</w:t>
+      </w:r>
+    </w:p>
+    <w:p>
+      <w:pPr>
+        <w:spacing w:before="0" w:after="60" w:line="300" w:lineRule="auto"/>
+        <w:ind w:left="680" w:hanging="283"/>
+        <w:jc w:val="both"/>
+      </w:pPr>
+      <w:r>
+        <w:rPr>
+          <w:rFonts w:ascii="Times New Roman" w:hAnsi="Times New Roman"/>
+          <w:b/>
+          <w:i w:val="0"/>
+          <w:color w:val="000000"/>
+          <w:sz w:val="26"/>
+          <w:rFonts w:ascii="Times New Roman" w:hAnsi="Times New Roman" w:cs="Times New Roman" w:eastAsia="Times New Roman"/>
+        </w:rPr>
+        <w:t xml:space="preserve">- </w:t>
+      </w:r>
+      <w:r>
+        <w:rPr>
+          <w:rFonts w:ascii="Times New Roman" w:hAnsi="Times New Roman"/>
+          <w:b w:val="0"/>
+          <w:i w:val="0"/>
+          <w:color w:val="000000"/>
+          <w:sz w:val="26"/>
+          <w:rFonts w:ascii="Times New Roman" w:hAnsi="Times New Roman" w:cs="Times New Roman" w:eastAsia="Times New Roman"/>
+        </w:rPr>
+        <w:t>False Positive (FP --- Sai loại 1): 34 sinh viên thực tế Trung bình-Yếu nhưng mô hình dự đoán nhầm là Khá-Giỏi.</w:t>
+      </w:r>
+    </w:p>
+    <w:p>
+      <w:pPr>
+        <w:spacing w:before="0" w:after="60" w:line="300" w:lineRule="auto"/>
+        <w:ind w:left="680" w:hanging="283"/>
+        <w:jc w:val="both"/>
+      </w:pPr>
+      <w:r>
+        <w:rPr>
+          <w:rFonts w:ascii="Times New Roman" w:hAnsi="Times New Roman"/>
+          <w:b/>
+          <w:i w:val="0"/>
+          <w:color w:val="000000"/>
+          <w:sz w:val="26"/>
+          <w:rFonts w:ascii="Times New Roman" w:hAnsi="Times New Roman" w:cs="Times New Roman" w:eastAsia="Times New Roman"/>
+        </w:rPr>
+        <w:t xml:space="preserve">- </w:t>
+      </w:r>
+      <w:r>
+        <w:rPr>
+          <w:rFonts w:ascii="Times New Roman" w:hAnsi="Times New Roman"/>
+          <w:b w:val="0"/>
+          <w:i w:val="0"/>
+          <w:color w:val="000000"/>
+          <w:sz w:val="26"/>
+          <w:rFonts w:ascii="Times New Roman" w:hAnsi="Times New Roman" w:cs="Times New Roman" w:eastAsia="Times New Roman"/>
+        </w:rPr>
+        <w:t>False Negative (FN --- Sai loại 2): 61 sinh viên thực tế Khá-Giỏi nhưng mô hình dự đoán nhầm là Trung bình-Yếu.</w:t>
+      </w:r>
+    </w:p>
+    <w:p>
+      <w:pPr>
+        <w:spacing w:before="0" w:after="80" w:line="312" w:lineRule="auto"/>
+        <w:ind w:firstLine="567"/>
+        <w:jc w:val="both"/>
+      </w:pPr>
+      <w:r>
+        <w:rPr>
+          <w:rFonts w:ascii="Times New Roman" w:hAnsi="Times New Roman"/>
+          <w:b w:val="0"/>
+          <w:i w:val="0"/>
+          <w:color w:val="000000"/>
+          <w:sz w:val="26"/>
+          <w:rFonts w:ascii="Times New Roman" w:hAnsi="Times New Roman" w:cs="Times New Roman" w:eastAsia="Times New Roman"/>
+        </w:rPr>
         <w:t>Độ chuẩn xác Precision đạt 74.24%, bảo đảm độ tin cậy khi hệ thống đưa ra nhận định sinh viên sẽ đạt loại Khá/Giỏi.</w:t>
       </w:r>
     </w:p>
@@ -4795,6 +6473,7 @@
     </w:p>
     <w:p>
       <w:pPr>
+        <w:pStyle w:val="Heading2"/>
         <w:keepNext/>
         <w:spacing w:before="200" w:after="80"/>
         <w:ind w:firstLine="0"/>
@@ -4828,10 +6507,64 @@
           <w:rFonts w:ascii="Times New Roman" w:hAnsi="Times New Roman" w:cs="Times New Roman" w:eastAsia="Times New Roman"/>
         </w:rPr>
         <w:t>Cấu trúc Cây quyết định (Hình 4.2) thể hiện rõ ràng các điều kiện rẽ nhánh thực tế từ dữ liệu:</w:t>
-        <w:br/>
-        <w:t>1. Nút gốc (Root Node): Thuật toán chọn môn 'Điện - Điện tử ô tô' với ngưỡng điểm 2.25 làm nút phân chia đầu tiên. Nếu điểm môn này &lt;= 2.25, xác suất sinh viên rơi vào nhóm Trung bình-Yếu chiếm ưu thế rõ rệt.</w:t>
-        <w:br/>
-        <w:t>2. Tầng rẽ nhánh kế tiếp: Tại nhánh điểm cao (&gt; 2.25), thuật toán tiếp tục kiểm tra điểm môn 'Vật liệu học' (ngưỡng 2.75) và môn 'Tiếng Anh 2' (ngưỡng 2.25). Những sinh viên vượt qua cả hai ngưỡng này có tỷ lệ đạt bằng Khá/Giỏi trên 85%.</w:t>
+      </w:r>
+    </w:p>
+    <w:p>
+      <w:pPr>
+        <w:spacing w:before="0" w:after="60" w:line="300" w:lineRule="auto"/>
+        <w:ind w:left="680" w:hanging="283"/>
+        <w:jc w:val="both"/>
+      </w:pPr>
+      <w:r>
+        <w:rPr>
+          <w:rFonts w:ascii="Times New Roman" w:hAnsi="Times New Roman"/>
+          <w:b/>
+          <w:i w:val="0"/>
+          <w:color w:val="000000"/>
+          <w:sz w:val="26"/>
+          <w:rFonts w:ascii="Times New Roman" w:hAnsi="Times New Roman" w:cs="Times New Roman" w:eastAsia="Times New Roman"/>
+        </w:rPr>
+        <w:t xml:space="preserve">1. </w:t>
+      </w:r>
+      <w:r>
+        <w:rPr>
+          <w:rFonts w:ascii="Times New Roman" w:hAnsi="Times New Roman"/>
+          <w:b w:val="0"/>
+          <w:i w:val="0"/>
+          <w:color w:val="000000"/>
+          <w:sz w:val="26"/>
+          <w:rFonts w:ascii="Times New Roman" w:hAnsi="Times New Roman" w:cs="Times New Roman" w:eastAsia="Times New Roman"/>
+        </w:rPr>
+        <w:t>Nút gốc (Root Node): Thuật toán chọn môn 'Điện - Điện tử ô tô' với ngưỡng điểm 2.25 làm nút phân chia đầu tiên. Nếu điểm môn này &lt;= 2.25, xác suất sinh viên rơi vào nhóm Trung bình-Yếu chiếm ưu thế rõ rệt.</w:t>
+      </w:r>
+    </w:p>
+    <w:p>
+      <w:pPr>
+        <w:spacing w:before="0" w:after="60" w:line="300" w:lineRule="auto"/>
+        <w:ind w:left="680" w:hanging="283"/>
+        <w:jc w:val="both"/>
+      </w:pPr>
+      <w:r>
+        <w:rPr>
+          <w:rFonts w:ascii="Times New Roman" w:hAnsi="Times New Roman"/>
+          <w:b/>
+          <w:i w:val="0"/>
+          <w:color w:val="000000"/>
+          <w:sz w:val="26"/>
+          <w:rFonts w:ascii="Times New Roman" w:hAnsi="Times New Roman" w:cs="Times New Roman" w:eastAsia="Times New Roman"/>
+        </w:rPr>
+        <w:t xml:space="preserve">2. </w:t>
+      </w:r>
+      <w:r>
+        <w:rPr>
+          <w:rFonts w:ascii="Times New Roman" w:hAnsi="Times New Roman"/>
+          <w:b w:val="0"/>
+          <w:i w:val="0"/>
+          <w:color w:val="000000"/>
+          <w:sz w:val="26"/>
+          <w:rFonts w:ascii="Times New Roman" w:hAnsi="Times New Roman" w:cs="Times New Roman" w:eastAsia="Times New Roman"/>
+        </w:rPr>
+        <w:t>Tầng rẽ nhánh kế tiếp: Tại nhánh điểm cao (&gt; 2.25), thuật toán tiếp tục kiểm tra điểm môn 'Vật liệu học' (ngưỡng 2.75) và môn 'Tiếng Anh 2' (ngưỡng 2.25). Những sinh viên vượt qua cả hai ngưỡng này có tỷ lệ đạt bằng Khá/Giỏi trên 85%.</w:t>
       </w:r>
     </w:p>
     <w:p>
@@ -4895,6 +6628,7 @@
     </w:p>
     <w:p>
       <w:pPr>
+        <w:pStyle w:val="Heading2"/>
         <w:keepNext/>
         <w:spacing w:before="200" w:after="80"/>
         <w:ind w:firstLine="0"/>
@@ -4928,16 +6662,151 @@
           <w:rFonts w:ascii="Times New Roman" w:hAnsi="Times New Roman" w:cs="Times New Roman" w:eastAsia="Times New Roman"/>
         </w:rPr>
         <w:t>Mức độ quan trọng Gini (Gini Importance) của các môn học Năm 1 trong việc phân tách học lực sinh viên được thể hiện ở Hình 4.3:</w:t>
-        <w:br/>
-        <w:t>- Điện - Điện tử ô tô: Đóng góp 44.46% trọng số phân loại (môn học bản lề hàng đầu).</w:t>
-        <w:br/>
-        <w:t>- Vật liệu học: Đóng góp 24.85% trọng số.</w:t>
-        <w:br/>
-        <w:t>- Tiếng Anh 2: Đóng góp 21.97% trọng số (chứng minh ngoại ngữ là rào cản phân hóa sinh viên kỹ thuật).</w:t>
-        <w:br/>
-        <w:t>- Nhiệt kỹ thuật: Đóng góp 6.69% trọng số.</w:t>
-        <w:br/>
-        <w:t>- Tiếng Anh 1: Đóng góp 2.02% trọng số.</w:t>
+      </w:r>
+    </w:p>
+    <w:p>
+      <w:pPr>
+        <w:spacing w:before="0" w:after="60" w:line="300" w:lineRule="auto"/>
+        <w:ind w:left="680" w:hanging="283"/>
+        <w:jc w:val="both"/>
+      </w:pPr>
+      <w:r>
+        <w:rPr>
+          <w:rFonts w:ascii="Times New Roman" w:hAnsi="Times New Roman"/>
+          <w:b/>
+          <w:i w:val="0"/>
+          <w:color w:val="000000"/>
+          <w:sz w:val="26"/>
+          <w:rFonts w:ascii="Times New Roman" w:hAnsi="Times New Roman" w:cs="Times New Roman" w:eastAsia="Times New Roman"/>
+        </w:rPr>
+        <w:t xml:space="preserve">- </w:t>
+      </w:r>
+      <w:r>
+        <w:rPr>
+          <w:rFonts w:ascii="Times New Roman" w:hAnsi="Times New Roman"/>
+          <w:b w:val="0"/>
+          <w:i w:val="0"/>
+          <w:color w:val="000000"/>
+          <w:sz w:val="26"/>
+          <w:rFonts w:ascii="Times New Roman" w:hAnsi="Times New Roman" w:cs="Times New Roman" w:eastAsia="Times New Roman"/>
+        </w:rPr>
+        <w:t>Điện - Điện tử ô tô: Đóng góp 44.46% trọng số phân loại (môn học bản lề hàng đầu).</w:t>
+      </w:r>
+    </w:p>
+    <w:p>
+      <w:pPr>
+        <w:spacing w:before="0" w:after="60" w:line="300" w:lineRule="auto"/>
+        <w:ind w:left="680" w:hanging="283"/>
+        <w:jc w:val="both"/>
+      </w:pPr>
+      <w:r>
+        <w:rPr>
+          <w:rFonts w:ascii="Times New Roman" w:hAnsi="Times New Roman"/>
+          <w:b/>
+          <w:i w:val="0"/>
+          <w:color w:val="000000"/>
+          <w:sz w:val="26"/>
+          <w:rFonts w:ascii="Times New Roman" w:hAnsi="Times New Roman" w:cs="Times New Roman" w:eastAsia="Times New Roman"/>
+        </w:rPr>
+        <w:t xml:space="preserve">- </w:t>
+      </w:r>
+      <w:r>
+        <w:rPr>
+          <w:rFonts w:ascii="Times New Roman" w:hAnsi="Times New Roman"/>
+          <w:b w:val="0"/>
+          <w:i w:val="0"/>
+          <w:color w:val="000000"/>
+          <w:sz w:val="26"/>
+          <w:rFonts w:ascii="Times New Roman" w:hAnsi="Times New Roman" w:cs="Times New Roman" w:eastAsia="Times New Roman"/>
+        </w:rPr>
+        <w:t>Vật liệu học: Đóng góp 24.85% trọng số.</w:t>
+      </w:r>
+    </w:p>
+    <w:p>
+      <w:pPr>
+        <w:spacing w:before="0" w:after="60" w:line="300" w:lineRule="auto"/>
+        <w:ind w:left="680" w:hanging="283"/>
+        <w:jc w:val="both"/>
+      </w:pPr>
+      <w:r>
+        <w:rPr>
+          <w:rFonts w:ascii="Times New Roman" w:hAnsi="Times New Roman"/>
+          <w:b/>
+          <w:i w:val="0"/>
+          <w:color w:val="000000"/>
+          <w:sz w:val="26"/>
+          <w:rFonts w:ascii="Times New Roman" w:hAnsi="Times New Roman" w:cs="Times New Roman" w:eastAsia="Times New Roman"/>
+        </w:rPr>
+        <w:t xml:space="preserve">- </w:t>
+      </w:r>
+      <w:r>
+        <w:rPr>
+          <w:rFonts w:ascii="Times New Roman" w:hAnsi="Times New Roman"/>
+          <w:b w:val="0"/>
+          <w:i w:val="0"/>
+          <w:color w:val="000000"/>
+          <w:sz w:val="26"/>
+          <w:rFonts w:ascii="Times New Roman" w:hAnsi="Times New Roman" w:cs="Times New Roman" w:eastAsia="Times New Roman"/>
+        </w:rPr>
+        <w:t>Tiếng Anh 2: Đóng góp 21.97% trọng số (chứng minh ngoại ngữ là rào cản phân hóa sinh viên kỹ thuật).</w:t>
+      </w:r>
+    </w:p>
+    <w:p>
+      <w:pPr>
+        <w:spacing w:before="0" w:after="60" w:line="300" w:lineRule="auto"/>
+        <w:ind w:left="680" w:hanging="283"/>
+        <w:jc w:val="both"/>
+      </w:pPr>
+      <w:r>
+        <w:rPr>
+          <w:rFonts w:ascii="Times New Roman" w:hAnsi="Times New Roman"/>
+          <w:b/>
+          <w:i w:val="0"/>
+          <w:color w:val="000000"/>
+          <w:sz w:val="26"/>
+          <w:rFonts w:ascii="Times New Roman" w:hAnsi="Times New Roman" w:cs="Times New Roman" w:eastAsia="Times New Roman"/>
+        </w:rPr>
+        <w:t xml:space="preserve">- </w:t>
+      </w:r>
+      <w:r>
+        <w:rPr>
+          <w:rFonts w:ascii="Times New Roman" w:hAnsi="Times New Roman"/>
+          <w:b w:val="0"/>
+          <w:i w:val="0"/>
+          <w:color w:val="000000"/>
+          <w:sz w:val="26"/>
+          <w:rFonts w:ascii="Times New Roman" w:hAnsi="Times New Roman" w:cs="Times New Roman" w:eastAsia="Times New Roman"/>
+        </w:rPr>
+        <w:t>Nhiệt kỹ thuật: Đóng góp 6.69% trọng số.</w:t>
+      </w:r>
+    </w:p>
+    <w:p>
+      <w:pPr>
+        <w:spacing w:before="0" w:after="60" w:line="300" w:lineRule="auto"/>
+        <w:ind w:left="680" w:hanging="283"/>
+        <w:jc w:val="both"/>
+      </w:pPr>
+      <w:r>
+        <w:rPr>
+          <w:rFonts w:ascii="Times New Roman" w:hAnsi="Times New Roman"/>
+          <w:b/>
+          <w:i w:val="0"/>
+          <w:color w:val="000000"/>
+          <w:sz w:val="26"/>
+          <w:rFonts w:ascii="Times New Roman" w:hAnsi="Times New Roman" w:cs="Times New Roman" w:eastAsia="Times New Roman"/>
+        </w:rPr>
+        <w:t xml:space="preserve">- </w:t>
+      </w:r>
+      <w:r>
+        <w:rPr>
+          <w:rFonts w:ascii="Times New Roman" w:hAnsi="Times New Roman"/>
+          <w:b w:val="0"/>
+          <w:i w:val="0"/>
+          <w:color w:val="000000"/>
+          <w:sz w:val="26"/>
+          <w:rFonts w:ascii="Times New Roman" w:hAnsi="Times New Roman" w:cs="Times New Roman" w:eastAsia="Times New Roman"/>
+        </w:rPr>
+        <w:t>Tiếng Anh 1: Đóng góp 2.02% trọng số.</w:t>
       </w:r>
     </w:p>
     <w:p>
@@ -5001,6 +6870,7 @@
     </w:p>
     <w:p>
       <w:pPr>
+        <w:pStyle w:val="Heading2"/>
         <w:keepNext/>
         <w:spacing w:before="200" w:after="80"/>
         <w:ind w:firstLine="0"/>
@@ -5034,26 +6904,98 @@
           <w:rFonts w:ascii="Times New Roman" w:hAnsi="Times New Roman" w:cs="Times New Roman" w:eastAsia="Times New Roman"/>
         </w:rPr>
         <w:t>Tổng số ca sai trên tập kiểm thử là 95 / 332 sinh viên (28.61%). Phân tích định lượng phân bố điểm GPA của các ca sai cho thấy:</w:t>
-        <w:br/>
-        <w:t>1. Nhóm False Positive (34 ca --- Thực tế TB-Yếu nhưng đoán Khá-Giỏi):</w:t>
-        <w:br/>
-        <w:t xml:space="preserve">   - Điểm GPA trung vị thực tế đạt 2.388 (trung bình: 2.306).</w:t>
-        <w:br/>
-        <w:t xml:space="preserve">   - Trong đó có tới 24 / 34 sinh viên (70.59%) có GPA &gt;= 2.30, tức chỉ kém ngưỡng phân định 2.50 từ 0.05 đến 0.20 điểm.</w:t>
-        <w:br/>
-        <w:t>2. Nhóm False Negative (61 ca --- Thực tế Khá-Giỏi nhưng đoán TB-Yếu):</w:t>
-        <w:br/>
-        <w:t xml:space="preserve">   - Điểm GPA trung vị thực tế đạt 2.595 (trung bình: 2.643).</w:t>
-        <w:br/>
-        <w:t xml:space="preserve">   - Trong đó có tới 46 / 61 sinh viên (75.41%) có GPA &lt; 2.70, cũng nằm sát ngay phía trên ranh giới 2.50.</w:t>
-        <w:br/>
-        <w:t>3. Kết luận định lượng:</w:t>
-        <w:br/>
-        <w:t xml:space="preserve">   - Có tới 70 / 95 ca sai (73.68%) tập trung trong dải điểm hẹp [2.30, 2.70) cận biên ranh giới quyết định. Điều này chứng minh rằng mô hình hoàn toàn không phạm sai lầm thô thiển, mà sai số chủ yếu xuất hiện tại vùng chuyển tiếp nhạy cảm giữa mức Trung bình khá và Khá.</w:t>
       </w:r>
     </w:p>
     <w:p>
       <w:pPr>
+        <w:spacing w:before="0" w:after="60" w:line="300" w:lineRule="auto"/>
+        <w:ind w:left="680" w:hanging="283"/>
+        <w:jc w:val="both"/>
+      </w:pPr>
+      <w:r>
+        <w:rPr>
+          <w:rFonts w:ascii="Times New Roman" w:hAnsi="Times New Roman"/>
+          <w:b/>
+          <w:i w:val="0"/>
+          <w:color w:val="000000"/>
+          <w:sz w:val="26"/>
+          <w:rFonts w:ascii="Times New Roman" w:hAnsi="Times New Roman" w:cs="Times New Roman" w:eastAsia="Times New Roman"/>
+        </w:rPr>
+        <w:t xml:space="preserve">1. </w:t>
+      </w:r>
+      <w:r>
+        <w:rPr>
+          <w:rFonts w:ascii="Times New Roman" w:hAnsi="Times New Roman"/>
+          <w:b w:val="0"/>
+          <w:i w:val="0"/>
+          <w:color w:val="000000"/>
+          <w:sz w:val="26"/>
+          <w:rFonts w:ascii="Times New Roman" w:hAnsi="Times New Roman" w:cs="Times New Roman" w:eastAsia="Times New Roman"/>
+        </w:rPr>
+        <w:t>Nhóm False Positive (34 ca --- Thực tế TB-Yếu nhưng đoán Khá-Giỏi): Điểm GPA trung vị thực tế đạt 2.388 (trung bình: 2.306). Trong đó có tới 24 / 34 sinh viên (70.59%) có GPA &gt;= 2.30, tức chỉ kém ngưỡng phân định 2.50 từ 0.05 đến 0.20 điểm.</w:t>
+      </w:r>
+    </w:p>
+    <w:p>
+      <w:pPr>
+        <w:spacing w:before="0" w:after="60" w:line="300" w:lineRule="auto"/>
+        <w:ind w:left="680" w:hanging="283"/>
+        <w:jc w:val="both"/>
+      </w:pPr>
+      <w:r>
+        <w:rPr>
+          <w:rFonts w:ascii="Times New Roman" w:hAnsi="Times New Roman"/>
+          <w:b/>
+          <w:i w:val="0"/>
+          <w:color w:val="000000"/>
+          <w:sz w:val="26"/>
+          <w:rFonts w:ascii="Times New Roman" w:hAnsi="Times New Roman" w:cs="Times New Roman" w:eastAsia="Times New Roman"/>
+        </w:rPr>
+        <w:t xml:space="preserve">2. </w:t>
+      </w:r>
+      <w:r>
+        <w:rPr>
+          <w:rFonts w:ascii="Times New Roman" w:hAnsi="Times New Roman"/>
+          <w:b w:val="0"/>
+          <w:i w:val="0"/>
+          <w:color w:val="000000"/>
+          <w:sz w:val="26"/>
+          <w:rFonts w:ascii="Times New Roman" w:hAnsi="Times New Roman" w:cs="Times New Roman" w:eastAsia="Times New Roman"/>
+        </w:rPr>
+        <w:t>Nhóm False Negative (61 ca --- Thực tế Khá-Giỏi nhưng đoán TB-Yếu): Điểm GPA trung vị thực tế đạt 2.595 (trung bình: 2.643). Trong đó có tới 46 / 61 sinh viên (75.41%) có GPA &lt; 2.70, cũng nằm sát ngay phía trên ranh giới 2.50.</w:t>
+      </w:r>
+    </w:p>
+    <w:p>
+      <w:pPr>
+        <w:spacing w:before="0" w:after="60" w:line="300" w:lineRule="auto"/>
+        <w:ind w:left="680" w:hanging="283"/>
+        <w:jc w:val="both"/>
+      </w:pPr>
+      <w:r>
+        <w:rPr>
+          <w:rFonts w:ascii="Times New Roman" w:hAnsi="Times New Roman"/>
+          <w:b/>
+          <w:i w:val="0"/>
+          <w:color w:val="000000"/>
+          <w:sz w:val="26"/>
+          <w:rFonts w:ascii="Times New Roman" w:hAnsi="Times New Roman" w:cs="Times New Roman" w:eastAsia="Times New Roman"/>
+        </w:rPr>
+        <w:t xml:space="preserve">3. </w:t>
+      </w:r>
+      <w:r>
+        <w:rPr>
+          <w:rFonts w:ascii="Times New Roman" w:hAnsi="Times New Roman"/>
+          <w:b w:val="0"/>
+          <w:i w:val="0"/>
+          <w:color w:val="000000"/>
+          <w:sz w:val="26"/>
+          <w:rFonts w:ascii="Times New Roman" w:hAnsi="Times New Roman" w:cs="Times New Roman" w:eastAsia="Times New Roman"/>
+        </w:rPr>
+        <w:t>Kết luận định lượng: Có tới 70 / 95 ca sai (73.68%) tập trung trong dải điểm hẹp [2.30, 2.70) cận biên ranh giới quyết định. Điều này chứng minh rằng mô hình hoàn toàn không phạm sai lầm thô thiển, mà sai số chủ yếu xuất hiện tại vùng chuyển tiếp nhạy cảm giữa mức Trung bình khá và Khá.</w:t>
+      </w:r>
+    </w:p>
+    <w:p>
+      <w:pPr>
+        <w:pStyle w:val="Heading1"/>
         <w:keepNext/>
         <w:spacing w:before="280" w:after="120"/>
         <w:ind w:firstLine="0"/>
@@ -5065,7 +7007,7 @@
           <w:b/>
           <w:i w:val="0"/>
           <w:color w:val="000000"/>
-          <w:sz w:val="29"/>
+          <w:sz w:val="28"/>
           <w:rFonts w:ascii="Times New Roman" w:hAnsi="Times New Roman" w:cs="Times New Roman" w:eastAsia="Times New Roman"/>
         </w:rPr>
         <w:t>CHƯƠNG 5: KẾT LUẬN VÀ HƯỚNG PHÁT TRIỂN</w:t>
@@ -5073,6 +7015,7 @@
     </w:p>
     <w:p>
       <w:pPr>
+        <w:pStyle w:val="Heading2"/>
         <w:keepNext/>
         <w:spacing w:before="200" w:after="80"/>
         <w:ind w:firstLine="0"/>
@@ -5092,10 +7035,21 @@
     </w:p>
     <w:p>
       <w:pPr>
-        <w:spacing w:before="0" w:after="80" w:line="312" w:lineRule="auto"/>
-        <w:ind w:firstLine="567"/>
+        <w:spacing w:before="0" w:after="60" w:line="300" w:lineRule="auto"/>
+        <w:ind w:left="680" w:hanging="283"/>
         <w:jc w:val="both"/>
       </w:pPr>
+      <w:r>
+        <w:rPr>
+          <w:rFonts w:ascii="Times New Roman" w:hAnsi="Times New Roman"/>
+          <w:b/>
+          <w:i w:val="0"/>
+          <w:color w:val="000000"/>
+          <w:sz w:val="26"/>
+          <w:rFonts w:ascii="Times New Roman" w:hAnsi="Times New Roman" w:cs="Times New Roman" w:eastAsia="Times New Roman"/>
+        </w:rPr>
+        <w:t xml:space="preserve">1. </w:t>
+      </w:r>
       <w:r>
         <w:rPr>
           <w:rFonts w:ascii="Times New Roman" w:hAnsi="Times New Roman"/>
@@ -5105,17 +7059,99 @@
           <w:sz w:val="26"/>
           <w:rFonts w:ascii="Times New Roman" w:hAnsi="Times New Roman" w:cs="Times New Roman" w:eastAsia="Times New Roman"/>
         </w:rPr>
-        <w:t>1. Xây dựng hoàn chỉnh đường ống xử lý dữ liệu và huấn luyện mô hình Cây quyết định trên bộ dữ liệu 1.656 sinh viên.</w:t>
-        <w:br/>
-        <w:t>2. Đạt độ chính xác 71.39% và Macro F1 70.94% trong kịch bản dự đoán sớm chỉ sử dụng 15 môn học Năm thứ nhất, bảo đảm nguyên tắc Zero Data Leakage.</w:t>
-        <w:br/>
-        <w:t>3. Áp dụng 5-Fold Stratified Cross-Validation trên tập Train để khảo sát siêu tham số max_depth một cách khoa học.</w:t>
-        <w:br/>
-        <w:t>4. Trực quan hóa cấu trúc cây quyết định và giải mã nguyên nhân sai số định lượng tại vùng cận biên ranh giới quyết định.</w:t>
+        <w:t>Xây dựng hoàn chỉnh đường ống xử lý dữ liệu và huấn luyện mô hình Cây quyết định trên bộ dữ liệu 1.656 sinh viên.</w:t>
       </w:r>
     </w:p>
     <w:p>
       <w:pPr>
+        <w:spacing w:before="0" w:after="60" w:line="300" w:lineRule="auto"/>
+        <w:ind w:left="680" w:hanging="283"/>
+        <w:jc w:val="both"/>
+      </w:pPr>
+      <w:r>
+        <w:rPr>
+          <w:rFonts w:ascii="Times New Roman" w:hAnsi="Times New Roman"/>
+          <w:b/>
+          <w:i w:val="0"/>
+          <w:color w:val="000000"/>
+          <w:sz w:val="26"/>
+          <w:rFonts w:ascii="Times New Roman" w:hAnsi="Times New Roman" w:cs="Times New Roman" w:eastAsia="Times New Roman"/>
+        </w:rPr>
+        <w:t xml:space="preserve">2. </w:t>
+      </w:r>
+      <w:r>
+        <w:rPr>
+          <w:rFonts w:ascii="Times New Roman" w:hAnsi="Times New Roman"/>
+          <w:b w:val="0"/>
+          <w:i w:val="0"/>
+          <w:color w:val="000000"/>
+          <w:sz w:val="26"/>
+          <w:rFonts w:ascii="Times New Roman" w:hAnsi="Times New Roman" w:cs="Times New Roman" w:eastAsia="Times New Roman"/>
+        </w:rPr>
+        <w:t>Đạt độ chính xác 71.39% và Macro F1 70.94% trong kịch bản dự đoán sớm chỉ sử dụng 15 môn học Năm thứ nhất, bảo đảm nguyên tắc Zero Data Leakage.</w:t>
+      </w:r>
+    </w:p>
+    <w:p>
+      <w:pPr>
+        <w:spacing w:before="0" w:after="60" w:line="300" w:lineRule="auto"/>
+        <w:ind w:left="680" w:hanging="283"/>
+        <w:jc w:val="both"/>
+      </w:pPr>
+      <w:r>
+        <w:rPr>
+          <w:rFonts w:ascii="Times New Roman" w:hAnsi="Times New Roman"/>
+          <w:b/>
+          <w:i w:val="0"/>
+          <w:color w:val="000000"/>
+          <w:sz w:val="26"/>
+          <w:rFonts w:ascii="Times New Roman" w:hAnsi="Times New Roman" w:cs="Times New Roman" w:eastAsia="Times New Roman"/>
+        </w:rPr>
+        <w:t xml:space="preserve">3. </w:t>
+      </w:r>
+      <w:r>
+        <w:rPr>
+          <w:rFonts w:ascii="Times New Roman" w:hAnsi="Times New Roman"/>
+          <w:b w:val="0"/>
+          <w:i w:val="0"/>
+          <w:color w:val="000000"/>
+          <w:sz w:val="26"/>
+          <w:rFonts w:ascii="Times New Roman" w:hAnsi="Times New Roman" w:cs="Times New Roman" w:eastAsia="Times New Roman"/>
+        </w:rPr>
+        <w:t>Áp dụng 5-Fold Stratified Cross-Validation trên tập Train để khảo sát siêu tham số max_depth một cách khoa học.</w:t>
+      </w:r>
+    </w:p>
+    <w:p>
+      <w:pPr>
+        <w:spacing w:before="0" w:after="60" w:line="300" w:lineRule="auto"/>
+        <w:ind w:left="680" w:hanging="283"/>
+        <w:jc w:val="both"/>
+      </w:pPr>
+      <w:r>
+        <w:rPr>
+          <w:rFonts w:ascii="Times New Roman" w:hAnsi="Times New Roman"/>
+          <w:b/>
+          <w:i w:val="0"/>
+          <w:color w:val="000000"/>
+          <w:sz w:val="26"/>
+          <w:rFonts w:ascii="Times New Roman" w:hAnsi="Times New Roman" w:cs="Times New Roman" w:eastAsia="Times New Roman"/>
+        </w:rPr>
+        <w:t xml:space="preserve">4. </w:t>
+      </w:r>
+      <w:r>
+        <w:rPr>
+          <w:rFonts w:ascii="Times New Roman" w:hAnsi="Times New Roman"/>
+          <w:b w:val="0"/>
+          <w:i w:val="0"/>
+          <w:color w:val="000000"/>
+          <w:sz w:val="26"/>
+          <w:rFonts w:ascii="Times New Roman" w:hAnsi="Times New Roman" w:cs="Times New Roman" w:eastAsia="Times New Roman"/>
+        </w:rPr>
+        <w:t>Trực quan hóa cấu trúc cây quyết định và giải mã nguyên nhân sai số định lượng tại vùng cận biên ranh giới quyết định.</w:t>
+      </w:r>
+    </w:p>
+    <w:p>
+      <w:pPr>
+        <w:pStyle w:val="Heading2"/>
         <w:keepNext/>
         <w:spacing w:before="200" w:after="80"/>
         <w:ind w:firstLine="0"/>
@@ -5135,10 +7171,21 @@
     </w:p>
     <w:p>
       <w:pPr>
-        <w:spacing w:before="0" w:after="80" w:line="312" w:lineRule="auto"/>
-        <w:ind w:firstLine="567"/>
+        <w:spacing w:before="0" w:after="60" w:line="300" w:lineRule="auto"/>
+        <w:ind w:left="680" w:hanging="283"/>
         <w:jc w:val="both"/>
       </w:pPr>
+      <w:r>
+        <w:rPr>
+          <w:rFonts w:ascii="Times New Roman" w:hAnsi="Times New Roman"/>
+          <w:b/>
+          <w:i w:val="0"/>
+          <w:color w:val="000000"/>
+          <w:sz w:val="26"/>
+          <w:rFonts w:ascii="Times New Roman" w:hAnsi="Times New Roman" w:cs="Times New Roman" w:eastAsia="Times New Roman"/>
+        </w:rPr>
+        <w:t xml:space="preserve">1. </w:t>
+      </w:r>
       <w:r>
         <w:rPr>
           <w:rFonts w:ascii="Times New Roman" w:hAnsi="Times New Roman"/>
@@ -5148,13 +7195,41 @@
           <w:sz w:val="26"/>
           <w:rFonts w:ascii="Times New Roman" w:hAnsi="Times New Roman" w:cs="Times New Roman" w:eastAsia="Times New Roman"/>
         </w:rPr>
-        <w:t>1. Điểm mạnh: Tính ứng dụng cao, mô hình minh bạch, phương pháp luận chặt chẽ.</w:t>
-        <w:br/>
-        <w:t>2. Giới hạn khách quan: Dữ liệu chỉ bao gồm điểm thi số học, chưa có các thuộc tính hành vi (như tỷ lệ chuyên cần, thời gian tự học, tương tác hệ thống LMS).</w:t>
+        <w:t>Điểm mạnh: Tính ứng dụng cao, mô hình minh bạch, phương pháp luận chặt chẽ.</w:t>
       </w:r>
     </w:p>
     <w:p>
       <w:pPr>
+        <w:spacing w:before="0" w:after="60" w:line="300" w:lineRule="auto"/>
+        <w:ind w:left="680" w:hanging="283"/>
+        <w:jc w:val="both"/>
+      </w:pPr>
+      <w:r>
+        <w:rPr>
+          <w:rFonts w:ascii="Times New Roman" w:hAnsi="Times New Roman"/>
+          <w:b/>
+          <w:i w:val="0"/>
+          <w:color w:val="000000"/>
+          <w:sz w:val="26"/>
+          <w:rFonts w:ascii="Times New Roman" w:hAnsi="Times New Roman" w:cs="Times New Roman" w:eastAsia="Times New Roman"/>
+        </w:rPr>
+        <w:t xml:space="preserve">2. </w:t>
+      </w:r>
+      <w:r>
+        <w:rPr>
+          <w:rFonts w:ascii="Times New Roman" w:hAnsi="Times New Roman"/>
+          <w:b w:val="0"/>
+          <w:i w:val="0"/>
+          <w:color w:val="000000"/>
+          <w:sz w:val="26"/>
+          <w:rFonts w:ascii="Times New Roman" w:hAnsi="Times New Roman" w:cs="Times New Roman" w:eastAsia="Times New Roman"/>
+        </w:rPr>
+        <w:t>Giới hạn khách quan: Dữ liệu chỉ bao gồm điểm thi số học, chưa có các thuộc tính hành vi (như tỷ lệ chuyên cần, thời gian tự học, tương tác hệ thống LMS).</w:t>
+      </w:r>
+    </w:p>
+    <w:p>
+      <w:pPr>
+        <w:pStyle w:val="Heading2"/>
         <w:keepNext/>
         <w:spacing w:before="200" w:after="80"/>
         <w:ind w:firstLine="0"/>
@@ -5174,10 +7249,21 @@
     </w:p>
     <w:p>
       <w:pPr>
-        <w:spacing w:before="0" w:after="80" w:line="312" w:lineRule="auto"/>
-        <w:ind w:firstLine="567"/>
+        <w:spacing w:before="0" w:after="60" w:line="300" w:lineRule="auto"/>
+        <w:ind w:left="680" w:hanging="283"/>
         <w:jc w:val="both"/>
       </w:pPr>
+      <w:r>
+        <w:rPr>
+          <w:rFonts w:ascii="Times New Roman" w:hAnsi="Times New Roman"/>
+          <w:b/>
+          <w:i w:val="0"/>
+          <w:color w:val="000000"/>
+          <w:sz w:val="26"/>
+          <w:rFonts w:ascii="Times New Roman" w:hAnsi="Times New Roman" w:cs="Times New Roman" w:eastAsia="Times New Roman"/>
+        </w:rPr>
+        <w:t xml:space="preserve">1. </w:t>
+      </w:r>
       <w:r>
         <w:rPr>
           <w:rFonts w:ascii="Times New Roman" w:hAnsi="Times New Roman"/>
@@ -5187,13 +7273,41 @@
           <w:sz w:val="26"/>
           <w:rFonts w:ascii="Times New Roman" w:hAnsi="Times New Roman" w:cs="Times New Roman" w:eastAsia="Times New Roman"/>
         </w:rPr>
-        <w:t>1. Mở rộng sang các thuật toán học tổ hợp (Ensemble Methods: Random Forest, Gradient Boosting) để cải thiện độ chính xác.</w:t>
-        <w:br/>
-        <w:t>2. Thu thập thêm các đặc trưng hành vi số: Tích hợp dữ liệu điểm danh và log học tập trên nền tảng e-learning LMS để bổ trợ cho dữ liệu điểm số.</w:t>
+        <w:t>Mở rộng sang các thuật toán học tổ hợp (Ensemble Methods: Random Forest, Gradient Boosting) để cải thiện độ chính xác.</w:t>
       </w:r>
     </w:p>
     <w:p>
       <w:pPr>
+        <w:spacing w:before="0" w:after="60" w:line="300" w:lineRule="auto"/>
+        <w:ind w:left="680" w:hanging="283"/>
+        <w:jc w:val="both"/>
+      </w:pPr>
+      <w:r>
+        <w:rPr>
+          <w:rFonts w:ascii="Times New Roman" w:hAnsi="Times New Roman"/>
+          <w:b/>
+          <w:i w:val="0"/>
+          <w:color w:val="000000"/>
+          <w:sz w:val="26"/>
+          <w:rFonts w:ascii="Times New Roman" w:hAnsi="Times New Roman" w:cs="Times New Roman" w:eastAsia="Times New Roman"/>
+        </w:rPr>
+        <w:t xml:space="preserve">2. </w:t>
+      </w:r>
+      <w:r>
+        <w:rPr>
+          <w:rFonts w:ascii="Times New Roman" w:hAnsi="Times New Roman"/>
+          <w:b w:val="0"/>
+          <w:i w:val="0"/>
+          <w:color w:val="000000"/>
+          <w:sz w:val="26"/>
+          <w:rFonts w:ascii="Times New Roman" w:hAnsi="Times New Roman" w:cs="Times New Roman" w:eastAsia="Times New Roman"/>
+        </w:rPr>
+        <w:t>Thu thập thêm các đặc trưng hành vi số: Tích hợp dữ liệu điểm danh và log học tập trên nền tảng e-learning LMS để bổ trợ cho dữ liệu điểm số.</w:t>
+      </w:r>
+    </w:p>
+    <w:p>
+      <w:pPr>
+        <w:pStyle w:val="Heading1"/>
         <w:keepNext/>
         <w:spacing w:before="280" w:after="120"/>
         <w:ind w:firstLine="0"/>
@@ -5205,7 +7319,7 @@
           <w:b/>
           <w:i w:val="0"/>
           <w:color w:val="000000"/>
-          <w:sz w:val="29"/>
+          <w:sz w:val="28"/>
           <w:rFonts w:ascii="Times New Roman" w:hAnsi="Times New Roman" w:cs="Times New Roman" w:eastAsia="Times New Roman"/>
         </w:rPr>
         <w:t>TÀI LIỆU THAM KHẢO</w:t>
@@ -5215,6 +7329,7 @@
       <w:pPr>
         <w:spacing w:before="20" w:after="80"/>
         <w:ind w:left="454" w:hanging="454"/>
+        <w:jc w:val="both"/>
       </w:pPr>
       <w:r>
         <w:rPr>
@@ -5232,6 +7347,7 @@
       <w:pPr>
         <w:spacing w:before="20" w:after="80"/>
         <w:ind w:left="454" w:hanging="454"/>
+        <w:jc w:val="both"/>
       </w:pPr>
       <w:r>
         <w:rPr>
@@ -5249,6 +7365,7 @@
       <w:pPr>
         <w:spacing w:before="20" w:after="80"/>
         <w:ind w:left="454" w:hanging="454"/>
+        <w:jc w:val="both"/>
       </w:pPr>
       <w:r>
         <w:rPr>
@@ -5266,6 +7383,7 @@
       <w:pPr>
         <w:spacing w:before="20" w:after="80"/>
         <w:ind w:left="454" w:hanging="454"/>
+        <w:jc w:val="both"/>
       </w:pPr>
       <w:r>
         <w:rPr>
@@ -5283,6 +7401,7 @@
       <w:pPr>
         <w:spacing w:before="20" w:after="80"/>
         <w:ind w:left="454" w:hanging="454"/>
+        <w:jc w:val="both"/>
       </w:pPr>
       <w:r>
         <w:rPr>
@@ -5300,6 +7419,7 @@
       <w:pPr>
         <w:spacing w:before="20" w:after="80"/>
         <w:ind w:left="454" w:hanging="454"/>
+        <w:jc w:val="both"/>
       </w:pPr>
       <w:r>
         <w:rPr>
@@ -5317,6 +7437,7 @@
       <w:pPr>
         <w:spacing w:before="20" w:after="80"/>
         <w:ind w:left="454" w:hanging="454"/>
+        <w:jc w:val="both"/>
       </w:pPr>
       <w:r>
         <w:rPr>
@@ -5337,6 +7458,7 @@
     </w:p>
     <w:p>
       <w:pPr>
+        <w:pStyle w:val="Heading1"/>
         <w:keepNext/>
         <w:spacing w:before="280" w:after="120"/>
         <w:ind w:firstLine="0"/>
@@ -5348,7 +7470,7 @@
           <w:b/>
           <w:i w:val="0"/>
           <w:color w:val="000000"/>
-          <w:sz w:val="29"/>
+          <w:sz w:val="28"/>
           <w:rFonts w:ascii="Times New Roman" w:hAnsi="Times New Roman" w:cs="Times New Roman" w:eastAsia="Times New Roman"/>
         </w:rPr>
         <w:t>PHẦN II: GIẢI MÃ CHI TIẾT Ý NGHĨA CỦA TỪNG CON SỐ THỰC NGHIỆM</w:t>
@@ -5356,6 +7478,7 @@
     </w:p>
     <w:p>
       <w:pPr>
+        <w:pStyle w:val="Heading2"/>
         <w:keepNext/>
         <w:spacing w:before="200" w:after="80"/>
         <w:ind w:firstLine="0"/>
@@ -5375,10 +7498,21 @@
     </w:p>
     <w:p>
       <w:pPr>
-        <w:spacing w:before="0" w:after="80" w:line="312" w:lineRule="auto"/>
-        <w:ind w:firstLine="567"/>
+        <w:spacing w:before="0" w:after="60" w:line="300" w:lineRule="auto"/>
+        <w:ind w:left="680" w:hanging="283"/>
         <w:jc w:val="both"/>
       </w:pPr>
+      <w:r>
+        <w:rPr>
+          <w:rFonts w:ascii="Times New Roman" w:hAnsi="Times New Roman"/>
+          <w:b/>
+          <w:i w:val="0"/>
+          <w:color w:val="000000"/>
+          <w:sz w:val="26"/>
+          <w:rFonts w:ascii="Times New Roman" w:hAnsi="Times New Roman" w:cs="Times New Roman" w:eastAsia="Times New Roman"/>
+        </w:rPr>
+        <w:t xml:space="preserve">- </w:t>
+      </w:r>
       <w:r>
         <w:rPr>
           <w:rFonts w:ascii="Times New Roman" w:hAnsi="Times New Roman"/>
@@ -5388,15 +7522,70 @@
           <w:sz w:val="26"/>
           <w:rFonts w:ascii="Times New Roman" w:hAnsi="Times New Roman" w:cs="Times New Roman" w:eastAsia="Times New Roman"/>
         </w:rPr>
-        <w:t>- 1.656 sinh viên: Đại diện cho toàn bộ số lượng sinh viên kỹ thuật thực tế được theo dõi liên tục trong suốt 4 năm học (từ HK1 đến HK8). Kích thước mẫu này vượt xa ngưỡng mẫu tối thiểu thông thường trong học máy (N &gt;= 300), bảo đảm các kết luận rút ra có ý nghĩa thống kê vững chắc.</w:t>
-        <w:br/>
-        <w:t>- 56 thuộc tính: Bao gồm 2 biến nhân khẩu học (BirthPlace, Sex), 50 môn học từ HK1 đến HK8, số lần nhận học bổng, điểm GPA tích lũy và trạng thái kỷ luật.</w:t>
-        <w:br/>
-        <w:t>- 15 môn học Năm 1: Là 15 môn học sinh viên hoàn thành trong năm thứ nhất. Sử dụng đúng 15 môn này phản ánh bài toán cảnh báo sớm thực tế.</w:t>
+        <w:t>1.656 sinh viên: Đại diện cho toàn bộ số lượng sinh viên kỹ thuật thực tế được theo dõi liên tục trong suốt 4 năm học (từ HK1 đến HK8). Kích thước mẫu này vượt xa ngưỡng mẫu tối thiểu thông thường trong học máy (N &gt;= 300), bảo đảm các kết luận rút ra có ý nghĩa thống kê vững chắc.</w:t>
       </w:r>
     </w:p>
     <w:p>
       <w:pPr>
+        <w:spacing w:before="0" w:after="60" w:line="300" w:lineRule="auto"/>
+        <w:ind w:left="680" w:hanging="283"/>
+        <w:jc w:val="both"/>
+      </w:pPr>
+      <w:r>
+        <w:rPr>
+          <w:rFonts w:ascii="Times New Roman" w:hAnsi="Times New Roman"/>
+          <w:b/>
+          <w:i w:val="0"/>
+          <w:color w:val="000000"/>
+          <w:sz w:val="26"/>
+          <w:rFonts w:ascii="Times New Roman" w:hAnsi="Times New Roman" w:cs="Times New Roman" w:eastAsia="Times New Roman"/>
+        </w:rPr>
+        <w:t xml:space="preserve">- </w:t>
+      </w:r>
+      <w:r>
+        <w:rPr>
+          <w:rFonts w:ascii="Times New Roman" w:hAnsi="Times New Roman"/>
+          <w:b w:val="0"/>
+          <w:i w:val="0"/>
+          <w:color w:val="000000"/>
+          <w:sz w:val="26"/>
+          <w:rFonts w:ascii="Times New Roman" w:hAnsi="Times New Roman" w:cs="Times New Roman" w:eastAsia="Times New Roman"/>
+        </w:rPr>
+        <w:t>56 thuộc tính: Bao gồm 2 biến nhân khẩu học (BirthPlace, Sex), 50 môn học từ HK1 đến HK8, số lần nhận học bổng, điểm GPA tích lũy và trạng thái kỷ luật.</w:t>
+      </w:r>
+    </w:p>
+    <w:p>
+      <w:pPr>
+        <w:spacing w:before="0" w:after="60" w:line="300" w:lineRule="auto"/>
+        <w:ind w:left="680" w:hanging="283"/>
+        <w:jc w:val="both"/>
+      </w:pPr>
+      <w:r>
+        <w:rPr>
+          <w:rFonts w:ascii="Times New Roman" w:hAnsi="Times New Roman"/>
+          <w:b/>
+          <w:i w:val="0"/>
+          <w:color w:val="000000"/>
+          <w:sz w:val="26"/>
+          <w:rFonts w:ascii="Times New Roman" w:hAnsi="Times New Roman" w:cs="Times New Roman" w:eastAsia="Times New Roman"/>
+        </w:rPr>
+        <w:t xml:space="preserve">- </w:t>
+      </w:r>
+      <w:r>
+        <w:rPr>
+          <w:rFonts w:ascii="Times New Roman" w:hAnsi="Times New Roman"/>
+          <w:b w:val="0"/>
+          <w:i w:val="0"/>
+          <w:color w:val="000000"/>
+          <w:sz w:val="26"/>
+          <w:rFonts w:ascii="Times New Roman" w:hAnsi="Times New Roman" w:cs="Times New Roman" w:eastAsia="Times New Roman"/>
+        </w:rPr>
+        <w:t>15 môn học Năm 1: Là 15 môn học sinh viên hoàn thành trong năm thứ nhất. Sử dụng đúng 15 môn này phản ánh bài toán cảnh báo sớm thực tế.</w:t>
+      </w:r>
+    </w:p>
+    <w:p>
+      <w:pPr>
+        <w:pStyle w:val="Heading2"/>
         <w:keepNext/>
         <w:spacing w:before="200" w:after="80"/>
         <w:ind w:firstLine="0"/>
@@ -5416,10 +7605,21 @@
     </w:p>
     <w:p>
       <w:pPr>
-        <w:spacing w:before="0" w:after="80" w:line="312" w:lineRule="auto"/>
-        <w:ind w:firstLine="567"/>
+        <w:spacing w:before="0" w:after="60" w:line="300" w:lineRule="auto"/>
+        <w:ind w:left="680" w:hanging="283"/>
         <w:jc w:val="both"/>
       </w:pPr>
+      <w:r>
+        <w:rPr>
+          <w:rFonts w:ascii="Times New Roman" w:hAnsi="Times New Roman"/>
+          <w:b/>
+          <w:i w:val="0"/>
+          <w:color w:val="000000"/>
+          <w:sz w:val="26"/>
+          <w:rFonts w:ascii="Times New Roman" w:hAnsi="Times New Roman" w:cs="Times New Roman" w:eastAsia="Times New Roman"/>
+        </w:rPr>
+        <w:t xml:space="preserve">- </w:t>
+      </w:r>
       <w:r>
         <w:rPr>
           <w:rFonts w:ascii="Times New Roman" w:hAnsi="Times New Roman"/>
@@ -5429,13 +7629,41 @@
           <w:sz w:val="26"/>
           <w:rFonts w:ascii="Times New Roman" w:hAnsi="Times New Roman" w:cs="Times New Roman" w:eastAsia="Times New Roman"/>
         </w:rPr>
-        <w:t>- Ngưỡng GPA = 2.50: Là mốc phân định tốt nghiệp loại Khá trở lên theo Thông tư 08/2021/TT-BGDĐT. Đây là điều kiện tiên quyết để sinh viên cạnh tranh việc làm sau khi ra trường.</w:t>
-        <w:br/>
-        <w:t>- Tỷ lệ 794 (47.95%) vs 862 (52.05%): Tỷ lệ phân bố gần như hoàn hảo 1:1. Trong học máy phân lớp, tỷ lệ cân bằng này giúp các chỉ số Accuracy, Precision, Recall không bị méo mó hay thiên vị cho bất kỳ lớp nào.</w:t>
+        <w:t>Ngưỡng GPA = 2.50: Là mốc phân định tốt nghiệp loại Khá trở lên theo Thông tư 08/2021/TT-BGDĐT. Đây là điều kiện tiên quyết để sinh viên cạnh tranh việc làm sau khi ra trường.</w:t>
       </w:r>
     </w:p>
     <w:p>
       <w:pPr>
+        <w:spacing w:before="0" w:after="60" w:line="300" w:lineRule="auto"/>
+        <w:ind w:left="680" w:hanging="283"/>
+        <w:jc w:val="both"/>
+      </w:pPr>
+      <w:r>
+        <w:rPr>
+          <w:rFonts w:ascii="Times New Roman" w:hAnsi="Times New Roman"/>
+          <w:b/>
+          <w:i w:val="0"/>
+          <w:color w:val="000000"/>
+          <w:sz w:val="26"/>
+          <w:rFonts w:ascii="Times New Roman" w:hAnsi="Times New Roman" w:cs="Times New Roman" w:eastAsia="Times New Roman"/>
+        </w:rPr>
+        <w:t xml:space="preserve">- </w:t>
+      </w:r>
+      <w:r>
+        <w:rPr>
+          <w:rFonts w:ascii="Times New Roman" w:hAnsi="Times New Roman"/>
+          <w:b w:val="0"/>
+          <w:i w:val="0"/>
+          <w:color w:val="000000"/>
+          <w:sz w:val="26"/>
+          <w:rFonts w:ascii="Times New Roman" w:hAnsi="Times New Roman" w:cs="Times New Roman" w:eastAsia="Times New Roman"/>
+        </w:rPr>
+        <w:t>Tỷ lệ 794 (47.95%) vs 862 (52.05%): Tỷ lệ phân bố gần như hoàn hảo 1:1. Trong học máy phân lớp, tỷ lệ cân bằng này giúp các chỉ số Accuracy, Precision, Recall không bị méo mó hay thiên vị cho bất kỳ lớp nào.</w:t>
+      </w:r>
+    </w:p>
+    <w:p>
+      <w:pPr>
+        <w:pStyle w:val="Heading2"/>
         <w:keepNext/>
         <w:spacing w:before="200" w:after="80"/>
         <w:ind w:firstLine="0"/>
@@ -5455,10 +7683,21 @@
     </w:p>
     <w:p>
       <w:pPr>
-        <w:spacing w:before="0" w:after="80" w:line="312" w:lineRule="auto"/>
-        <w:ind w:firstLine="567"/>
+        <w:spacing w:before="0" w:after="60" w:line="300" w:lineRule="auto"/>
+        <w:ind w:left="680" w:hanging="283"/>
         <w:jc w:val="both"/>
       </w:pPr>
+      <w:r>
+        <w:rPr>
+          <w:rFonts w:ascii="Times New Roman" w:hAnsi="Times New Roman"/>
+          <w:b/>
+          <w:i w:val="0"/>
+          <w:color w:val="000000"/>
+          <w:sz w:val="26"/>
+          <w:rFonts w:ascii="Times New Roman" w:hAnsi="Times New Roman" w:cs="Times New Roman" w:eastAsia="Times New Roman"/>
+        </w:rPr>
+        <w:t xml:space="preserve">- </w:t>
+      </w:r>
       <w:r>
         <w:rPr>
           <w:rFonts w:ascii="Times New Roman" w:hAnsi="Times New Roman"/>
@@ -5468,17 +7707,99 @@
           <w:sz w:val="26"/>
           <w:rFonts w:ascii="Times New Roman" w:hAnsi="Times New Roman" w:cs="Times New Roman" w:eastAsia="Times New Roman"/>
         </w:rPr>
-        <w:t>- Accuracy = 71.39%: Cứ 100 sinh viên kiểm thử, mô hình dự đoán chính xác xếp loại tốt nghiệp cho hơn 71 sinh viên chỉ dựa trên kết quả học tập của năm nhất. Đây là tỷ lệ rất cao đối với bài toán cảnh báo sớm trước 3 năm tốt nghiệp.</w:t>
-        <w:br/>
-        <w:t>- Precision (Khá-Giỏi) = 74.24%: Khi mô hình dự đoán một sinh viên sẽ đạt loại Khá/Giỏi, xác suất sinh viên đó thực sự đạt Khá/Giỏi lên tới 74.24%. Chỉ có 25.76% khả năng bị đoán nhầm.</w:t>
-        <w:br/>
-        <w:t>- Recall (Khá-Giỏi) = 61.64%: Trong tổng số tất cả sinh viên thực tế đạt Khá/Giỏi, mô hình nhận diện và tóm bắt thành công 61.64% sinh viên ngay từ năm nhất.</w:t>
-        <w:br/>
-        <w:t>- Macro F1 = 70.94%: Trung bình điều hòa giữa hai lớp đạt xấp xỉ 71%, khẳng định mô hình học đều cả hai nhóm học lực, không bị thiên vị.</w:t>
+        <w:t>Accuracy = 71.39%: Cứ 100 sinh viên kiểm thử, mô hình dự đoán chính xác xếp loại tốt nghiệp cho hơn 71 sinh viên chỉ dựa trên kết quả học tập của năm nhất. Đây là tỷ lệ rất cao đối với bài toán cảnh báo sớm trước 3 năm tốt nghiệp.</w:t>
       </w:r>
     </w:p>
     <w:p>
       <w:pPr>
+        <w:spacing w:before="0" w:after="60" w:line="300" w:lineRule="auto"/>
+        <w:ind w:left="680" w:hanging="283"/>
+        <w:jc w:val="both"/>
+      </w:pPr>
+      <w:r>
+        <w:rPr>
+          <w:rFonts w:ascii="Times New Roman" w:hAnsi="Times New Roman"/>
+          <w:b/>
+          <w:i w:val="0"/>
+          <w:color w:val="000000"/>
+          <w:sz w:val="26"/>
+          <w:rFonts w:ascii="Times New Roman" w:hAnsi="Times New Roman" w:cs="Times New Roman" w:eastAsia="Times New Roman"/>
+        </w:rPr>
+        <w:t xml:space="preserve">- </w:t>
+      </w:r>
+      <w:r>
+        <w:rPr>
+          <w:rFonts w:ascii="Times New Roman" w:hAnsi="Times New Roman"/>
+          <w:b w:val="0"/>
+          <w:i w:val="0"/>
+          <w:color w:val="000000"/>
+          <w:sz w:val="26"/>
+          <w:rFonts w:ascii="Times New Roman" w:hAnsi="Times New Roman" w:cs="Times New Roman" w:eastAsia="Times New Roman"/>
+        </w:rPr>
+        <w:t>Precision (Khá-Giỏi) = 74.24%: Khi mô hình dự đoán một sinh viên sẽ đạt loại Khá/Giỏi, xác suất sinh viên đó thực sự đạt Khá/Giỏi lên tới 74.24%. Chỉ có 25.76% khả năng bị đoán nhầm.</w:t>
+      </w:r>
+    </w:p>
+    <w:p>
+      <w:pPr>
+        <w:spacing w:before="0" w:after="60" w:line="300" w:lineRule="auto"/>
+        <w:ind w:left="680" w:hanging="283"/>
+        <w:jc w:val="both"/>
+      </w:pPr>
+      <w:r>
+        <w:rPr>
+          <w:rFonts w:ascii="Times New Roman" w:hAnsi="Times New Roman"/>
+          <w:b/>
+          <w:i w:val="0"/>
+          <w:color w:val="000000"/>
+          <w:sz w:val="26"/>
+          <w:rFonts w:ascii="Times New Roman" w:hAnsi="Times New Roman" w:cs="Times New Roman" w:eastAsia="Times New Roman"/>
+        </w:rPr>
+        <w:t xml:space="preserve">- </w:t>
+      </w:r>
+      <w:r>
+        <w:rPr>
+          <w:rFonts w:ascii="Times New Roman" w:hAnsi="Times New Roman"/>
+          <w:b w:val="0"/>
+          <w:i w:val="0"/>
+          <w:color w:val="000000"/>
+          <w:sz w:val="26"/>
+          <w:rFonts w:ascii="Times New Roman" w:hAnsi="Times New Roman" w:cs="Times New Roman" w:eastAsia="Times New Roman"/>
+        </w:rPr>
+        <w:t>Recall (Khá-Giỏi) = 61.64%: Trong tổng số tất cả sinh viên thực tế đạt Khá/Giỏi, mô hình nhận diện và tóm bắt thành công 61.64% sinh viên ngay từ năm nhất.</w:t>
+      </w:r>
+    </w:p>
+    <w:p>
+      <w:pPr>
+        <w:spacing w:before="0" w:after="60" w:line="300" w:lineRule="auto"/>
+        <w:ind w:left="680" w:hanging="283"/>
+        <w:jc w:val="both"/>
+      </w:pPr>
+      <w:r>
+        <w:rPr>
+          <w:rFonts w:ascii="Times New Roman" w:hAnsi="Times New Roman"/>
+          <w:b/>
+          <w:i w:val="0"/>
+          <w:color w:val="000000"/>
+          <w:sz w:val="26"/>
+          <w:rFonts w:ascii="Times New Roman" w:hAnsi="Times New Roman" w:cs="Times New Roman" w:eastAsia="Times New Roman"/>
+        </w:rPr>
+        <w:t xml:space="preserve">- </w:t>
+      </w:r>
+      <w:r>
+        <w:rPr>
+          <w:rFonts w:ascii="Times New Roman" w:hAnsi="Times New Roman"/>
+          <w:b w:val="0"/>
+          <w:i w:val="0"/>
+          <w:color w:val="000000"/>
+          <w:sz w:val="26"/>
+          <w:rFonts w:ascii="Times New Roman" w:hAnsi="Times New Roman" w:cs="Times New Roman" w:eastAsia="Times New Roman"/>
+        </w:rPr>
+        <w:t>Macro F1 = 70.94%: Trung bình điều hòa giữa hai lớp đạt xấp xỉ 71%, khẳng định mô hình học đều cả hai nhóm học lực, không bị thiên vị.</w:t>
+      </w:r>
+    </w:p>
+    <w:p>
+      <w:pPr>
+        <w:pStyle w:val="Heading2"/>
         <w:keepNext/>
         <w:spacing w:before="200" w:after="80"/>
         <w:ind w:firstLine="0"/>
@@ -5498,10 +7819,21 @@
     </w:p>
     <w:p>
       <w:pPr>
-        <w:spacing w:before="0" w:after="80" w:line="312" w:lineRule="auto"/>
-        <w:ind w:firstLine="567"/>
+        <w:spacing w:before="0" w:after="60" w:line="300" w:lineRule="auto"/>
+        <w:ind w:left="680" w:hanging="283"/>
         <w:jc w:val="both"/>
       </w:pPr>
+      <w:r>
+        <w:rPr>
+          <w:rFonts w:ascii="Times New Roman" w:hAnsi="Times New Roman"/>
+          <w:b/>
+          <w:i w:val="0"/>
+          <w:color w:val="000000"/>
+          <w:sz w:val="26"/>
+          <w:rFonts w:ascii="Times New Roman" w:hAnsi="Times New Roman" w:cs="Times New Roman" w:eastAsia="Times New Roman"/>
+        </w:rPr>
+        <w:t xml:space="preserve">- </w:t>
+      </w:r>
       <w:r>
         <w:rPr>
           <w:rFonts w:ascii="Times New Roman" w:hAnsi="Times New Roman"/>
@@ -5511,13 +7843,41 @@
           <w:sz w:val="26"/>
           <w:rFonts w:ascii="Times New Roman" w:hAnsi="Times New Roman" w:cs="Times New Roman" w:eastAsia="Times New Roman"/>
         </w:rPr>
-        <w:t>- Nguyên nhân toán học: Logistic Regression sử dụng hàm sigmoid kết hợp tổ hợp tuyến tính trên toàn bộ 15 biến cùng lúc. Do điểm thi là các biến số thực liên tục từ 0.0 đến 4.0, siêu phẳng tuyến tính có thể xoay nghiêng theo mọi góc trong không gian 15 chiều để tối ưu hóa ranh giới. Ngược lại, Cây quyết định cắt không gian bằng các siêu phẳng trực giao song song với trục tọa độ.</w:t>
-        <w:br/>
-        <w:t>- Lý do Decision Tree được chọn: Khả năng giải thích (Interpretability). Logistic Regression là một mô hình hộp đen với các trọng số toán học trừu tượng. Trong khi đó, Decision Tree cung cấp ngay điều kiện rẽ nhánh số học: 'Nếu sinh viên đạt điểm môn Điện - Điện tử ô tô &gt; 2.25 và Vật liệu học &gt; 2.75 thì xác suất đạt Khá/Giỏi là 85%'. Điều này mang tính hành động trực tiếp cho công tác cố vấn học tập.</w:t>
+        <w:t>Nguyên nhân toán học: Logistic Regression sử dụng hàm sigmoid kết hợp tổ hợp tuyến tính trên toàn bộ 15 biến cùng lúc. Do điểm thi là các biến số thực liên tục từ 0.0 đến 4.0, siêu phẳng tuyến tính có thể xoay nghiêng theo mọi góc trong không gian 15 chiều để tối ưu hóa ranh giới. Ngược lại, Cây quyết định cắt không gian bằng các siêu phẳng trực giao song song với trục tọa độ.</w:t>
       </w:r>
     </w:p>
     <w:p>
       <w:pPr>
+        <w:spacing w:before="0" w:after="60" w:line="300" w:lineRule="auto"/>
+        <w:ind w:left="680" w:hanging="283"/>
+        <w:jc w:val="both"/>
+      </w:pPr>
+      <w:r>
+        <w:rPr>
+          <w:rFonts w:ascii="Times New Roman" w:hAnsi="Times New Roman"/>
+          <w:b/>
+          <w:i w:val="0"/>
+          <w:color w:val="000000"/>
+          <w:sz w:val="26"/>
+          <w:rFonts w:ascii="Times New Roman" w:hAnsi="Times New Roman" w:cs="Times New Roman" w:eastAsia="Times New Roman"/>
+        </w:rPr>
+        <w:t xml:space="preserve">- </w:t>
+      </w:r>
+      <w:r>
+        <w:rPr>
+          <w:rFonts w:ascii="Times New Roman" w:hAnsi="Times New Roman"/>
+          <w:b w:val="0"/>
+          <w:i w:val="0"/>
+          <w:color w:val="000000"/>
+          <w:sz w:val="26"/>
+          <w:rFonts w:ascii="Times New Roman" w:hAnsi="Times New Roman" w:cs="Times New Roman" w:eastAsia="Times New Roman"/>
+        </w:rPr>
+        <w:t>Lý do Decision Tree được chọn: Khả năng giải thích (Interpretability). Logistic Regression là một mô hình hộp đen với các trọng số toán học trừu tượng. Trong khi đó, Decision Tree cung cấp ngay điều kiện rẽ nhánh số học: 'Nếu sinh viên đạt điểm môn Điện - Điện tử ô tô &gt; 2.25 và Vật liệu học &gt; 2.75 thì xác suất đạt Khá/Giỏi là 85%'. Điều này mang tính hành động trực tiếp cho công tác cố vấn học tập.</w:t>
+      </w:r>
+    </w:p>
+    <w:p>
+      <w:pPr>
+        <w:pStyle w:val="Heading2"/>
         <w:keepNext/>
         <w:spacing w:before="200" w:after="80"/>
         <w:ind w:firstLine="0"/>
@@ -5537,10 +7897,21 @@
     </w:p>
     <w:p>
       <w:pPr>
-        <w:spacing w:before="0" w:after="80" w:line="312" w:lineRule="auto"/>
-        <w:ind w:firstLine="567"/>
+        <w:spacing w:before="0" w:after="60" w:line="300" w:lineRule="auto"/>
+        <w:ind w:left="680" w:hanging="283"/>
         <w:jc w:val="both"/>
       </w:pPr>
+      <w:r>
+        <w:rPr>
+          <w:rFonts w:ascii="Times New Roman" w:hAnsi="Times New Roman"/>
+          <w:b/>
+          <w:i w:val="0"/>
+          <w:color w:val="000000"/>
+          <w:sz w:val="26"/>
+          <w:rFonts w:ascii="Times New Roman" w:hAnsi="Times New Roman" w:cs="Times New Roman" w:eastAsia="Times New Roman"/>
+        </w:rPr>
+        <w:t xml:space="preserve">- </w:t>
+      </w:r>
       <w:r>
         <w:rPr>
           <w:rFonts w:ascii="Times New Roman" w:hAnsi="Times New Roman"/>
@@ -5550,17 +7921,99 @@
           <w:sz w:val="26"/>
           <w:rFonts w:ascii="Times New Roman" w:hAnsi="Times New Roman" w:cs="Times New Roman" w:eastAsia="Times New Roman"/>
         </w:rPr>
-        <w:t>- Tại max_depth = 1: CV Mean chỉ đạt 63.67%, Train Acc 66.69% ---&gt; Cây quá nông, bị Underfitting (Dưới khớp).</w:t>
-        <w:br/>
-        <w:t>- Tại max_depth = 3: CV Mean đạt 72.43% với độ lệch chuẩn nhỏ nhất (±1.30%), độ sâu chỉ 3 tầng gồm 8 nút lá ---&gt; Đây là cấu hình tối ưu để giải thích.</w:t>
-        <w:br/>
-        <w:t>- Tại max_depth = 4: Test Acc đạt đỉnh 74.40%.</w:t>
-        <w:br/>
-        <w:t>- Tại max_depth = 8: Train Acc tăng vọt lên 82.10%, nhưng Test Acc giảm về 71.39%. Khoảng cách tổng quát hóa (Generalization Gap) dãn rộng tới +10.71% ---&gt; Đây là minh chứng thực nghiệm không thể chối cãi của hiện tượng Overfitting (Quá khớp).</w:t>
+        <w:t>Tại max_depth = 1: CV Mean chỉ đạt 63.67%, Train Acc 66.69% ---&gt; Cây quá nông, bị Underfitting (Dưới khớp).</w:t>
       </w:r>
     </w:p>
     <w:p>
       <w:pPr>
+        <w:spacing w:before="0" w:after="60" w:line="300" w:lineRule="auto"/>
+        <w:ind w:left="680" w:hanging="283"/>
+        <w:jc w:val="both"/>
+      </w:pPr>
+      <w:r>
+        <w:rPr>
+          <w:rFonts w:ascii="Times New Roman" w:hAnsi="Times New Roman"/>
+          <w:b/>
+          <w:i w:val="0"/>
+          <w:color w:val="000000"/>
+          <w:sz w:val="26"/>
+          <w:rFonts w:ascii="Times New Roman" w:hAnsi="Times New Roman" w:cs="Times New Roman" w:eastAsia="Times New Roman"/>
+        </w:rPr>
+        <w:t xml:space="preserve">- </w:t>
+      </w:r>
+      <w:r>
+        <w:rPr>
+          <w:rFonts w:ascii="Times New Roman" w:hAnsi="Times New Roman"/>
+          <w:b w:val="0"/>
+          <w:i w:val="0"/>
+          <w:color w:val="000000"/>
+          <w:sz w:val="26"/>
+          <w:rFonts w:ascii="Times New Roman" w:hAnsi="Times New Roman" w:cs="Times New Roman" w:eastAsia="Times New Roman"/>
+        </w:rPr>
+        <w:t>Tại max_depth = 3: CV Mean đạt 72.43% với độ lệch chuẩn nhỏ nhất (±1.30%), độ sâu chỉ 3 tầng gồm 8 nút lá ---&gt; Đây là cấu hình tối ưu để giải thích.</w:t>
+      </w:r>
+    </w:p>
+    <w:p>
+      <w:pPr>
+        <w:spacing w:before="0" w:after="60" w:line="300" w:lineRule="auto"/>
+        <w:ind w:left="680" w:hanging="283"/>
+        <w:jc w:val="both"/>
+      </w:pPr>
+      <w:r>
+        <w:rPr>
+          <w:rFonts w:ascii="Times New Roman" w:hAnsi="Times New Roman"/>
+          <w:b/>
+          <w:i w:val="0"/>
+          <w:color w:val="000000"/>
+          <w:sz w:val="26"/>
+          <w:rFonts w:ascii="Times New Roman" w:hAnsi="Times New Roman" w:cs="Times New Roman" w:eastAsia="Times New Roman"/>
+        </w:rPr>
+        <w:t xml:space="preserve">- </w:t>
+      </w:r>
+      <w:r>
+        <w:rPr>
+          <w:rFonts w:ascii="Times New Roman" w:hAnsi="Times New Roman"/>
+          <w:b w:val="0"/>
+          <w:i w:val="0"/>
+          <w:color w:val="000000"/>
+          <w:sz w:val="26"/>
+          <w:rFonts w:ascii="Times New Roman" w:hAnsi="Times New Roman" w:cs="Times New Roman" w:eastAsia="Times New Roman"/>
+        </w:rPr>
+        <w:t>Tại max_depth = 4: Test Acc đạt đỉnh 74.40%.</w:t>
+      </w:r>
+    </w:p>
+    <w:p>
+      <w:pPr>
+        <w:spacing w:before="0" w:after="60" w:line="300" w:lineRule="auto"/>
+        <w:ind w:left="680" w:hanging="283"/>
+        <w:jc w:val="both"/>
+      </w:pPr>
+      <w:r>
+        <w:rPr>
+          <w:rFonts w:ascii="Times New Roman" w:hAnsi="Times New Roman"/>
+          <w:b/>
+          <w:i w:val="0"/>
+          <w:color w:val="000000"/>
+          <w:sz w:val="26"/>
+          <w:rFonts w:ascii="Times New Roman" w:hAnsi="Times New Roman" w:cs="Times New Roman" w:eastAsia="Times New Roman"/>
+        </w:rPr>
+        <w:t xml:space="preserve">- </w:t>
+      </w:r>
+      <w:r>
+        <w:rPr>
+          <w:rFonts w:ascii="Times New Roman" w:hAnsi="Times New Roman"/>
+          <w:b w:val="0"/>
+          <w:i w:val="0"/>
+          <w:color w:val="000000"/>
+          <w:sz w:val="26"/>
+          <w:rFonts w:ascii="Times New Roman" w:hAnsi="Times New Roman" w:cs="Times New Roman" w:eastAsia="Times New Roman"/>
+        </w:rPr>
+        <w:t>Tại max_depth = 8: Train Acc tăng vọt lên 82.10%, nhưng Test Acc giảm về 71.39%. Khoảng cách tổng quát hóa (Generalization Gap) dãn rộng tới +10.71% ---&gt; Đây là minh chứng thực nghiệm không thể chối cãi của hiện tượng Overfitting (Quá khớp).</w:t>
+      </w:r>
+    </w:p>
+    <w:p>
+      <w:pPr>
+        <w:pStyle w:val="Heading2"/>
         <w:keepNext/>
         <w:spacing w:before="200" w:after="80"/>
         <w:ind w:firstLine="0"/>
@@ -5580,10 +8033,21 @@
     </w:p>
     <w:p>
       <w:pPr>
-        <w:spacing w:before="0" w:after="80" w:line="312" w:lineRule="auto"/>
-        <w:ind w:firstLine="567"/>
+        <w:spacing w:before="0" w:after="60" w:line="300" w:lineRule="auto"/>
+        <w:ind w:left="680" w:hanging="283"/>
         <w:jc w:val="both"/>
       </w:pPr>
+      <w:r>
+        <w:rPr>
+          <w:rFonts w:ascii="Times New Roman" w:hAnsi="Times New Roman"/>
+          <w:b/>
+          <w:i w:val="0"/>
+          <w:color w:val="000000"/>
+          <w:sz w:val="26"/>
+          <w:rFonts w:ascii="Times New Roman" w:hAnsi="Times New Roman" w:cs="Times New Roman" w:eastAsia="Times New Roman"/>
+        </w:rPr>
+        <w:t xml:space="preserve">- </w:t>
+      </w:r>
       <w:r>
         <w:rPr>
           <w:rFonts w:ascii="Times New Roman" w:hAnsi="Times New Roman"/>
@@ -5593,15 +8057,70 @@
           <w:sz w:val="26"/>
           <w:rFonts w:ascii="Times New Roman" w:hAnsi="Times New Roman" w:cs="Times New Roman" w:eastAsia="Times New Roman"/>
         </w:rPr>
-        <w:t>- Điện - Điện tử ô tô (44.46%): Chiếm gần một nửa tổng trọng số phân loại. Đây là môn chuyên ngành cơ sở đầu tiên ở năm 1, đòi hỏi cả tư duy mạch điện, tính toán định lượng và khả năng thực hành. Sinh viên vượt qua tốt môn này thể hiện sự thích nghi xuất sắc với ngành kỹ thuật.</w:t>
-        <w:br/>
-        <w:t>- Vật liệu học (24.85%): Môn khoa học vật liệu cung cấp kiến thức nền tảng về cơ tính, nhiệt luyện.</w:t>
-        <w:br/>
-        <w:t>- Tiếng Anh 2 (21.97%): Đóng góp hơn 1/5 tầm quan trọng. Con số này chứng minh ngoại ngữ là rào cản phân hóa cực kỳ mạnh đối với sinh viên kỹ thuật.</w:t>
+        <w:t>Điện - Điện tử ô tô (44.46%): Chiếm gần một nửa tổng trọng số phân loại. Đây là môn chuyên ngành cơ sở đầu tiên ở năm 1, đòi hỏi cả tư duy mạch điện, tính toán định lượng và khả năng thực hành. Sinh viên vượt qua tốt môn này thể hiện sự thích nghi xuất sắc với ngành kỹ thuật.</w:t>
       </w:r>
     </w:p>
     <w:p>
       <w:pPr>
+        <w:spacing w:before="0" w:after="60" w:line="300" w:lineRule="auto"/>
+        <w:ind w:left="680" w:hanging="283"/>
+        <w:jc w:val="both"/>
+      </w:pPr>
+      <w:r>
+        <w:rPr>
+          <w:rFonts w:ascii="Times New Roman" w:hAnsi="Times New Roman"/>
+          <w:b/>
+          <w:i w:val="0"/>
+          <w:color w:val="000000"/>
+          <w:sz w:val="26"/>
+          <w:rFonts w:ascii="Times New Roman" w:hAnsi="Times New Roman" w:cs="Times New Roman" w:eastAsia="Times New Roman"/>
+        </w:rPr>
+        <w:t xml:space="preserve">- </w:t>
+      </w:r>
+      <w:r>
+        <w:rPr>
+          <w:rFonts w:ascii="Times New Roman" w:hAnsi="Times New Roman"/>
+          <w:b w:val="0"/>
+          <w:i w:val="0"/>
+          <w:color w:val="000000"/>
+          <w:sz w:val="26"/>
+          <w:rFonts w:ascii="Times New Roman" w:hAnsi="Times New Roman" w:cs="Times New Roman" w:eastAsia="Times New Roman"/>
+        </w:rPr>
+        <w:t>Vật liệu học (24.85%): Môn khoa học vật liệu cung cấp kiến thức nền tảng về cơ tính, nhiệt luyện.</w:t>
+      </w:r>
+    </w:p>
+    <w:p>
+      <w:pPr>
+        <w:spacing w:before="0" w:after="60" w:line="300" w:lineRule="auto"/>
+        <w:ind w:left="680" w:hanging="283"/>
+        <w:jc w:val="both"/>
+      </w:pPr>
+      <w:r>
+        <w:rPr>
+          <w:rFonts w:ascii="Times New Roman" w:hAnsi="Times New Roman"/>
+          <w:b/>
+          <w:i w:val="0"/>
+          <w:color w:val="000000"/>
+          <w:sz w:val="26"/>
+          <w:rFonts w:ascii="Times New Roman" w:hAnsi="Times New Roman" w:cs="Times New Roman" w:eastAsia="Times New Roman"/>
+        </w:rPr>
+        <w:t xml:space="preserve">- </w:t>
+      </w:r>
+      <w:r>
+        <w:rPr>
+          <w:rFonts w:ascii="Times New Roman" w:hAnsi="Times New Roman"/>
+          <w:b w:val="0"/>
+          <w:i w:val="0"/>
+          <w:color w:val="000000"/>
+          <w:sz w:val="26"/>
+          <w:rFonts w:ascii="Times New Roman" w:hAnsi="Times New Roman" w:cs="Times New Roman" w:eastAsia="Times New Roman"/>
+        </w:rPr>
+        <w:t>Tiếng Anh 2 (21.97%): Đóng góp hơn 1/5 tầm quan trọng. Con số này chứng minh ngoại ngữ là rào cản phân hóa cực kỳ mạnh đối với sinh viên kỹ thuật.</w:t>
+      </w:r>
+    </w:p>
+    <w:p>
+      <w:pPr>
+        <w:pStyle w:val="Heading2"/>
         <w:keepNext/>
         <w:spacing w:before="200" w:after="80"/>
         <w:ind w:firstLine="0"/>
@@ -5635,21 +8154,103 @@
           <w:rFonts w:ascii="Times New Roman" w:hAnsi="Times New Roman" w:cs="Times New Roman" w:eastAsia="Times New Roman"/>
         </w:rPr>
         <w:t>Trong 95 ca dự đoán sai trên tập test:</w:t>
-        <w:br/>
-        <w:t>- 34 ca False Positive: GPA trung vị là 2.388, trong đó 24 sinh viên (70.59%) có GPA &gt;= 2.30.</w:t>
-        <w:br/>
-        <w:t>- 61 ca False Negative: GPA trung vị là 2.595, trong đó 46 sinh viên (75.41%) có GPA &lt; 2.70.</w:t>
-        <w:br/>
-        <w:t>- Tổng cộng 70 / 95 ca sai (73.68%) nằm trong khoảng GPA từ 2.30 đến 2.69: Con số này chứng minh mô hình hoạt động rất ổn định; sai số không xuất phát từ việc đoán sai những ca rõ ràng, mà xuất phát từ việc ranh giới điểm 2.50 trong thực tế rất sít sao (chỉ chênh nhau 0.05 --- 0.15 điểm).</w:t>
       </w:r>
     </w:p>
     <w:p>
-      <w:r>
-        <w:br w:type="page"/>
+      <w:pPr>
+        <w:spacing w:before="0" w:after="60" w:line="300" w:lineRule="auto"/>
+        <w:ind w:left="680" w:hanging="283"/>
+        <w:jc w:val="both"/>
+      </w:pPr>
+      <w:r>
+        <w:rPr>
+          <w:rFonts w:ascii="Times New Roman" w:hAnsi="Times New Roman"/>
+          <w:b/>
+          <w:i w:val="0"/>
+          <w:color w:val="000000"/>
+          <w:sz w:val="26"/>
+          <w:rFonts w:ascii="Times New Roman" w:hAnsi="Times New Roman" w:cs="Times New Roman" w:eastAsia="Times New Roman"/>
+        </w:rPr>
+        <w:t xml:space="preserve">- </w:t>
+      </w:r>
+      <w:r>
+        <w:rPr>
+          <w:rFonts w:ascii="Times New Roman" w:hAnsi="Times New Roman"/>
+          <w:b w:val="0"/>
+          <w:i w:val="0"/>
+          <w:color w:val="000000"/>
+          <w:sz w:val="26"/>
+          <w:rFonts w:ascii="Times New Roman" w:hAnsi="Times New Roman" w:cs="Times New Roman" w:eastAsia="Times New Roman"/>
+        </w:rPr>
+        <w:t>34 ca False Positive: GPA trung vị là 2.388, trong đó 24 sinh viên (70.59%) có GPA &gt;= 2.30.</w:t>
       </w:r>
     </w:p>
     <w:p>
       <w:pPr>
+        <w:spacing w:before="0" w:after="60" w:line="300" w:lineRule="auto"/>
+        <w:ind w:left="680" w:hanging="283"/>
+        <w:jc w:val="both"/>
+      </w:pPr>
+      <w:r>
+        <w:rPr>
+          <w:rFonts w:ascii="Times New Roman" w:hAnsi="Times New Roman"/>
+          <w:b/>
+          <w:i w:val="0"/>
+          <w:color w:val="000000"/>
+          <w:sz w:val="26"/>
+          <w:rFonts w:ascii="Times New Roman" w:hAnsi="Times New Roman" w:cs="Times New Roman" w:eastAsia="Times New Roman"/>
+        </w:rPr>
+        <w:t xml:space="preserve">- </w:t>
+      </w:r>
+      <w:r>
+        <w:rPr>
+          <w:rFonts w:ascii="Times New Roman" w:hAnsi="Times New Roman"/>
+          <w:b w:val="0"/>
+          <w:i w:val="0"/>
+          <w:color w:val="000000"/>
+          <w:sz w:val="26"/>
+          <w:rFonts w:ascii="Times New Roman" w:hAnsi="Times New Roman" w:cs="Times New Roman" w:eastAsia="Times New Roman"/>
+        </w:rPr>
+        <w:t>61 ca False Negative: GPA trung vị là 2.595, trong đó 46 sinh viên (75.41%) có GPA &lt; 2.70.</w:t>
+      </w:r>
+    </w:p>
+    <w:p>
+      <w:pPr>
+        <w:spacing w:before="0" w:after="60" w:line="300" w:lineRule="auto"/>
+        <w:ind w:left="680" w:hanging="283"/>
+        <w:jc w:val="both"/>
+      </w:pPr>
+      <w:r>
+        <w:rPr>
+          <w:rFonts w:ascii="Times New Roman" w:hAnsi="Times New Roman"/>
+          <w:b/>
+          <w:i w:val="0"/>
+          <w:color w:val="000000"/>
+          <w:sz w:val="26"/>
+          <w:rFonts w:ascii="Times New Roman" w:hAnsi="Times New Roman" w:cs="Times New Roman" w:eastAsia="Times New Roman"/>
+        </w:rPr>
+        <w:t xml:space="preserve">- </w:t>
+      </w:r>
+      <w:r>
+        <w:rPr>
+          <w:rFonts w:ascii="Times New Roman" w:hAnsi="Times New Roman"/>
+          <w:b w:val="0"/>
+          <w:i w:val="0"/>
+          <w:color w:val="000000"/>
+          <w:sz w:val="26"/>
+          <w:rFonts w:ascii="Times New Roman" w:hAnsi="Times New Roman" w:cs="Times New Roman" w:eastAsia="Times New Roman"/>
+        </w:rPr>
+        <w:t>Tổng cộng 70 / 95 ca sai (73.68%) nằm trong khoảng GPA từ 2.30 đến 2.69: Con số này chứng minh mô hình hoạt động rất ổn định; sai số không xuất phát từ việc đoán sai những ca rõ ràng, mà xuất phát từ việc ranh giới điểm 2.50 trong thực tế rất sít sao (chỉ chênh nhau 0.05 --- 0.15 điểm).</w:t>
+      </w:r>
+    </w:p>
+    <w:p>
+      <w:r>
+        <w:br w:type="page"/>
+      </w:r>
+    </w:p>
+    <w:p>
+      <w:pPr>
+        <w:pStyle w:val="Heading1"/>
         <w:keepNext/>
         <w:spacing w:before="280" w:after="120"/>
         <w:ind w:firstLine="0"/>
@@ -5661,7 +8262,7 @@
           <w:b/>
           <w:i w:val="0"/>
           <w:color w:val="000000"/>
-          <w:sz w:val="29"/>
+          <w:sz w:val="28"/>
           <w:rFonts w:ascii="Times New Roman" w:hAnsi="Times New Roman" w:cs="Times New Roman" w:eastAsia="Times New Roman"/>
         </w:rPr>
         <w:t>PHẦN III: GIẢI THÍCH KIẾN TRÚC MÃ NGUỒN VÀ Ý NGHĨA TỪNG ĐOẠN CODE</w:t>
@@ -5669,6 +8270,7 @@
     </w:p>
     <w:p>
       <w:pPr>
+        <w:pStyle w:val="Heading2"/>
         <w:keepNext/>
         <w:spacing w:before="200" w:after="80"/>
         <w:ind w:firstLine="0"/>
@@ -5688,10 +8290,21 @@
     </w:p>
     <w:p>
       <w:pPr>
-        <w:spacing w:before="0" w:after="80" w:line="312" w:lineRule="auto"/>
-        <w:ind w:firstLine="567"/>
+        <w:spacing w:before="0" w:after="60" w:line="300" w:lineRule="auto"/>
+        <w:ind w:left="680" w:hanging="283"/>
         <w:jc w:val="both"/>
       </w:pPr>
+      <w:r>
+        <w:rPr>
+          <w:rFonts w:ascii="Times New Roman" w:hAnsi="Times New Roman"/>
+          <w:b/>
+          <w:i w:val="0"/>
+          <w:color w:val="000000"/>
+          <w:sz w:val="26"/>
+          <w:rFonts w:ascii="Times New Roman" w:hAnsi="Times New Roman" w:cs="Times New Roman" w:eastAsia="Times New Roman"/>
+        </w:rPr>
+        <w:t xml:space="preserve">- </w:t>
+      </w:r>
       <w:r>
         <w:rPr>
           <w:rFonts w:ascii="Times New Roman" w:hAnsi="Times New Roman"/>
@@ -5701,13 +8314,41 @@
           <w:sz w:val="26"/>
           <w:rFonts w:ascii="Times New Roman" w:hAnsi="Times New Roman" w:cs="Times New Roman" w:eastAsia="Times New Roman"/>
         </w:rPr>
-        <w:t>- load_student_data(): Định vị file dữ liệu chính và từ điển biến. Kiểm tra an toàn bằng os.path.exists(), trả về bảng dữ liệu df 1.656 bản ghi và từ điển df_dict.</w:t>
-        <w:br/>
-        <w:t>- get_dataset_summary(): Tự động tính toán các chỉ số thống kê 5 số của biến GPA (Mean 2.399, Median 2.485, Std 0.510, Min 0.0, Max 3.48), thống kê số lượng tỉnh thành nơi sinh và cơ cấu giới tính.</w:t>
+        <w:t>load_student_data(): Định vị file dữ liệu chính và từ điển biến. Kiểm tra an toàn bằng os.path.exists(), trả về bảng dữ liệu df 1.656 bản ghi và từ điển df_dict.</w:t>
       </w:r>
     </w:p>
     <w:p>
       <w:pPr>
+        <w:spacing w:before="0" w:after="60" w:line="300" w:lineRule="auto"/>
+        <w:ind w:left="680" w:hanging="283"/>
+        <w:jc w:val="both"/>
+      </w:pPr>
+      <w:r>
+        <w:rPr>
+          <w:rFonts w:ascii="Times New Roman" w:hAnsi="Times New Roman"/>
+          <w:b/>
+          <w:i w:val="0"/>
+          <w:color w:val="000000"/>
+          <w:sz w:val="26"/>
+          <w:rFonts w:ascii="Times New Roman" w:hAnsi="Times New Roman" w:cs="Times New Roman" w:eastAsia="Times New Roman"/>
+        </w:rPr>
+        <w:t xml:space="preserve">- </w:t>
+      </w:r>
+      <w:r>
+        <w:rPr>
+          <w:rFonts w:ascii="Times New Roman" w:hAnsi="Times New Roman"/>
+          <w:b w:val="0"/>
+          <w:i w:val="0"/>
+          <w:color w:val="000000"/>
+          <w:sz w:val="26"/>
+          <w:rFonts w:ascii="Times New Roman" w:hAnsi="Times New Roman" w:cs="Times New Roman" w:eastAsia="Times New Roman"/>
+        </w:rPr>
+        <w:t>get_dataset_summary(): Tự động tính toán các chỉ số thống kê 5 số của biến GPA (Mean 2.399, Median 2.485, Std 0.510, Min 0.0, Max 3.48), thống kê số lượng tỉnh thành nơi sinh và cơ cấu giới tính.</w:t>
+      </w:r>
+    </w:p>
+    <w:p>
+      <w:pPr>
+        <w:pStyle w:val="Heading2"/>
         <w:keepNext/>
         <w:spacing w:before="200" w:after="80"/>
         <w:ind w:firstLine="0"/>
@@ -5727,10 +8368,21 @@
     </w:p>
     <w:p>
       <w:pPr>
-        <w:spacing w:before="0" w:after="80" w:line="312" w:lineRule="auto"/>
-        <w:ind w:firstLine="567"/>
+        <w:spacing w:before="0" w:after="60" w:line="300" w:lineRule="auto"/>
+        <w:ind w:left="680" w:hanging="283"/>
         <w:jc w:val="both"/>
       </w:pPr>
+      <w:r>
+        <w:rPr>
+          <w:rFonts w:ascii="Times New Roman" w:hAnsi="Times New Roman"/>
+          <w:b/>
+          <w:i w:val="0"/>
+          <w:color w:val="000000"/>
+          <w:sz w:val="26"/>
+          <w:rFonts w:ascii="Times New Roman" w:hAnsi="Times New Roman" w:cs="Times New Roman" w:eastAsia="Times New Roman"/>
+        </w:rPr>
+        <w:t xml:space="preserve">- </w:t>
+      </w:r>
       <w:r>
         <w:rPr>
           <w:rFonts w:ascii="Times New Roman" w:hAnsi="Times New Roman"/>
@@ -5740,17 +8392,99 @@
           <w:sz w:val="26"/>
           <w:rFonts w:ascii="Times New Roman" w:hAnsi="Times New Roman" w:cs="Times New Roman" w:eastAsia="Times New Roman"/>
         </w:rPr>
-        <w:t>- create_target(): Nhị phân hóa nhãn học lực theo ngưỡng GPA &gt;= 2.50.</w:t>
-        <w:br/>
-        <w:t>- clean_course_grades(): Ép kiểu dữ liệu điểm số thực và điền 0.0 cho các ô khuyết (.fillna(0.0)), phản ánh đúng việc sinh viên chưa học hoặc vắng thi/điểm F.</w:t>
-        <w:br/>
-        <w:t>- prepare_features(scenario='early'): Cốt lõi ngăn ngừa rò rỉ nhãn: Chỉ lọc 15 môn học có Semester suffix in [1.0, 2.0], loại bỏ toàn bộ môn học HK3-HK8 và GPA toàn khóa khỏi đầu vào.</w:t>
-        <w:br/>
-        <w:t>- split_data(): Chia tập 80/20 với stratify=y để bảo toàn tuyệt đối tỷ lệ 48% vs 52% giữa hai lớp ở cả Train và Test.</w:t>
+        <w:t>create_target(): Nhị phân hóa nhãn học lực theo ngưỡng GPA &gt;= 2.50.</w:t>
       </w:r>
     </w:p>
     <w:p>
       <w:pPr>
+        <w:spacing w:before="0" w:after="60" w:line="300" w:lineRule="auto"/>
+        <w:ind w:left="680" w:hanging="283"/>
+        <w:jc w:val="both"/>
+      </w:pPr>
+      <w:r>
+        <w:rPr>
+          <w:rFonts w:ascii="Times New Roman" w:hAnsi="Times New Roman"/>
+          <w:b/>
+          <w:i w:val="0"/>
+          <w:color w:val="000000"/>
+          <w:sz w:val="26"/>
+          <w:rFonts w:ascii="Times New Roman" w:hAnsi="Times New Roman" w:cs="Times New Roman" w:eastAsia="Times New Roman"/>
+        </w:rPr>
+        <w:t xml:space="preserve">- </w:t>
+      </w:r>
+      <w:r>
+        <w:rPr>
+          <w:rFonts w:ascii="Times New Roman" w:hAnsi="Times New Roman"/>
+          <w:b w:val="0"/>
+          <w:i w:val="0"/>
+          <w:color w:val="000000"/>
+          <w:sz w:val="26"/>
+          <w:rFonts w:ascii="Times New Roman" w:hAnsi="Times New Roman" w:cs="Times New Roman" w:eastAsia="Times New Roman"/>
+        </w:rPr>
+        <w:t>clean_course_grades(): Ép kiểu dữ liệu điểm số thực và điền 0.0 cho các ô khuyết (.fillna(0.0)), phản ánh đúng việc sinh viên chưa học hoặc vắng thi/điểm F.</w:t>
+      </w:r>
+    </w:p>
+    <w:p>
+      <w:pPr>
+        <w:spacing w:before="0" w:after="60" w:line="300" w:lineRule="auto"/>
+        <w:ind w:left="680" w:hanging="283"/>
+        <w:jc w:val="both"/>
+      </w:pPr>
+      <w:r>
+        <w:rPr>
+          <w:rFonts w:ascii="Times New Roman" w:hAnsi="Times New Roman"/>
+          <w:b/>
+          <w:i w:val="0"/>
+          <w:color w:val="000000"/>
+          <w:sz w:val="26"/>
+          <w:rFonts w:ascii="Times New Roman" w:hAnsi="Times New Roman" w:cs="Times New Roman" w:eastAsia="Times New Roman"/>
+        </w:rPr>
+        <w:t xml:space="preserve">- </w:t>
+      </w:r>
+      <w:r>
+        <w:rPr>
+          <w:rFonts w:ascii="Times New Roman" w:hAnsi="Times New Roman"/>
+          <w:b w:val="0"/>
+          <w:i w:val="0"/>
+          <w:color w:val="000000"/>
+          <w:sz w:val="26"/>
+          <w:rFonts w:ascii="Times New Roman" w:hAnsi="Times New Roman" w:cs="Times New Roman" w:eastAsia="Times New Roman"/>
+        </w:rPr>
+        <w:t>prepare_features(scenario='early'): Cốt lõi ngăn ngừa rò rỉ nhãn: Chỉ lọc 15 môn học có Semester suffix in [1.0, 2.0], loại bỏ toàn bộ môn học HK3-HK8 và GPA toàn khóa khỏi đầu vào.</w:t>
+      </w:r>
+    </w:p>
+    <w:p>
+      <w:pPr>
+        <w:spacing w:before="0" w:after="60" w:line="300" w:lineRule="auto"/>
+        <w:ind w:left="680" w:hanging="283"/>
+        <w:jc w:val="both"/>
+      </w:pPr>
+      <w:r>
+        <w:rPr>
+          <w:rFonts w:ascii="Times New Roman" w:hAnsi="Times New Roman"/>
+          <w:b/>
+          <w:i w:val="0"/>
+          <w:color w:val="000000"/>
+          <w:sz w:val="26"/>
+          <w:rFonts w:ascii="Times New Roman" w:hAnsi="Times New Roman" w:cs="Times New Roman" w:eastAsia="Times New Roman"/>
+        </w:rPr>
+        <w:t xml:space="preserve">- </w:t>
+      </w:r>
+      <w:r>
+        <w:rPr>
+          <w:rFonts w:ascii="Times New Roman" w:hAnsi="Times New Roman"/>
+          <w:b w:val="0"/>
+          <w:i w:val="0"/>
+          <w:color w:val="000000"/>
+          <w:sz w:val="26"/>
+          <w:rFonts w:ascii="Times New Roman" w:hAnsi="Times New Roman" w:cs="Times New Roman" w:eastAsia="Times New Roman"/>
+        </w:rPr>
+        <w:t>split_data(): Chia tập 80/20 với stratify=y để bảo toàn tuyệt đối tỷ lệ 48% vs 52% giữa hai lớp ở cả Train và Test.</w:t>
+      </w:r>
+    </w:p>
+    <w:p>
+      <w:pPr>
+        <w:pStyle w:val="Heading2"/>
         <w:keepNext/>
         <w:spacing w:before="200" w:after="80"/>
         <w:ind w:firstLine="0"/>
@@ -5770,10 +8504,21 @@
     </w:p>
     <w:p>
       <w:pPr>
-        <w:spacing w:before="0" w:after="80" w:line="312" w:lineRule="auto"/>
-        <w:ind w:firstLine="567"/>
+        <w:spacing w:before="0" w:after="60" w:line="300" w:lineRule="auto"/>
+        <w:ind w:left="680" w:hanging="283"/>
         <w:jc w:val="both"/>
       </w:pPr>
+      <w:r>
+        <w:rPr>
+          <w:rFonts w:ascii="Times New Roman" w:hAnsi="Times New Roman"/>
+          <w:b/>
+          <w:i w:val="0"/>
+          <w:color w:val="000000"/>
+          <w:sz w:val="26"/>
+          <w:rFonts w:ascii="Times New Roman" w:hAnsi="Times New Roman" w:cs="Times New Roman" w:eastAsia="Times New Roman"/>
+        </w:rPr>
+        <w:t xml:space="preserve">- </w:t>
+      </w:r>
       <w:r>
         <w:rPr>
           <w:rFonts w:ascii="Times New Roman" w:hAnsi="Times New Roman"/>
@@ -5783,15 +8528,70 @@
           <w:sz w:val="26"/>
           <w:rFonts w:ascii="Times New Roman" w:hAnsi="Times New Roman" w:cs="Times New Roman" w:eastAsia="Times New Roman"/>
         </w:rPr>
-        <w:t>- tune_tree_depth_cv(): Chạy StratifiedKFold(n_splits=5) hoàn toàn trên tập Train. Tập Test được cô lập hoàn toàn để bảo đảm nguyên tắc Zero Test Leakage.</w:t>
-        <w:br/>
-        <w:t>- train_decision_tree(): Khởi tạo CART với criterion='gini', max_depth=3, min_samples_leaf=10 để khống chế cây không quá khớp.</w:t>
-        <w:br/>
-        <w:t>- train_baseline_model(): Huấn luyện Logistic Regression làm đối chứng khoa học.</w:t>
+        <w:t>tune_tree_depth_cv(): Chạy StratifiedKFold(n_splits=5) hoàn toàn trên tập Train. Tập Test được cô lập hoàn toàn để bảo đảm nguyên tắc Zero Test Leakage.</w:t>
       </w:r>
     </w:p>
     <w:p>
       <w:pPr>
+        <w:spacing w:before="0" w:after="60" w:line="300" w:lineRule="auto"/>
+        <w:ind w:left="680" w:hanging="283"/>
+        <w:jc w:val="both"/>
+      </w:pPr>
+      <w:r>
+        <w:rPr>
+          <w:rFonts w:ascii="Times New Roman" w:hAnsi="Times New Roman"/>
+          <w:b/>
+          <w:i w:val="0"/>
+          <w:color w:val="000000"/>
+          <w:sz w:val="26"/>
+          <w:rFonts w:ascii="Times New Roman" w:hAnsi="Times New Roman" w:cs="Times New Roman" w:eastAsia="Times New Roman"/>
+        </w:rPr>
+        <w:t xml:space="preserve">- </w:t>
+      </w:r>
+      <w:r>
+        <w:rPr>
+          <w:rFonts w:ascii="Times New Roman" w:hAnsi="Times New Roman"/>
+          <w:b w:val="0"/>
+          <w:i w:val="0"/>
+          <w:color w:val="000000"/>
+          <w:sz w:val="26"/>
+          <w:rFonts w:ascii="Times New Roman" w:hAnsi="Times New Roman" w:cs="Times New Roman" w:eastAsia="Times New Roman"/>
+        </w:rPr>
+        <w:t>train_decision_tree(): Khởi tạo CART với criterion='gini', max_depth=3, min_samples_leaf=10 để khống chế cây không quá khớp.</w:t>
+      </w:r>
+    </w:p>
+    <w:p>
+      <w:pPr>
+        <w:spacing w:before="0" w:after="60" w:line="300" w:lineRule="auto"/>
+        <w:ind w:left="680" w:hanging="283"/>
+        <w:jc w:val="both"/>
+      </w:pPr>
+      <w:r>
+        <w:rPr>
+          <w:rFonts w:ascii="Times New Roman" w:hAnsi="Times New Roman"/>
+          <w:b/>
+          <w:i w:val="0"/>
+          <w:color w:val="000000"/>
+          <w:sz w:val="26"/>
+          <w:rFonts w:ascii="Times New Roman" w:hAnsi="Times New Roman" w:cs="Times New Roman" w:eastAsia="Times New Roman"/>
+        </w:rPr>
+        <w:t xml:space="preserve">- </w:t>
+      </w:r>
+      <w:r>
+        <w:rPr>
+          <w:rFonts w:ascii="Times New Roman" w:hAnsi="Times New Roman"/>
+          <w:b w:val="0"/>
+          <w:i w:val="0"/>
+          <w:color w:val="000000"/>
+          <w:sz w:val="26"/>
+          <w:rFonts w:ascii="Times New Roman" w:hAnsi="Times New Roman" w:cs="Times New Roman" w:eastAsia="Times New Roman"/>
+        </w:rPr>
+        <w:t>train_baseline_model(): Huấn luyện Logistic Regression làm đối chứng khoa học.</w:t>
+      </w:r>
+    </w:p>
+    <w:p>
+      <w:pPr>
+        <w:pStyle w:val="Heading2"/>
         <w:keepNext/>
         <w:spacing w:before="200" w:after="80"/>
         <w:ind w:firstLine="0"/>
@@ -5811,10 +8611,21 @@
     </w:p>
     <w:p>
       <w:pPr>
-        <w:spacing w:before="0" w:after="80" w:line="312" w:lineRule="auto"/>
-        <w:ind w:firstLine="567"/>
+        <w:spacing w:before="0" w:after="60" w:line="300" w:lineRule="auto"/>
+        <w:ind w:left="680" w:hanging="283"/>
         <w:jc w:val="both"/>
       </w:pPr>
+      <w:r>
+        <w:rPr>
+          <w:rFonts w:ascii="Times New Roman" w:hAnsi="Times New Roman"/>
+          <w:b/>
+          <w:i w:val="0"/>
+          <w:color w:val="000000"/>
+          <w:sz w:val="26"/>
+          <w:rFonts w:ascii="Times New Roman" w:hAnsi="Times New Roman" w:cs="Times New Roman" w:eastAsia="Times New Roman"/>
+        </w:rPr>
+        <w:t xml:space="preserve">- </w:t>
+      </w:r>
       <w:r>
         <w:rPr>
           <w:rFonts w:ascii="Times New Roman" w:hAnsi="Times New Roman"/>
@@ -5824,15 +8635,70 @@
           <w:sz w:val="26"/>
           <w:rFonts w:ascii="Times New Roman" w:hAnsi="Times New Roman" w:cs="Times New Roman" w:eastAsia="Times New Roman"/>
         </w:rPr>
-        <w:t>- calculate_metrics(): Tính toán Accuracy, Precision, Recall, F1 và Macro F1 từ confusion_matrix.</w:t>
-        <w:br/>
-        <w:t>- plot_decision_tree_graph(): Việt hóa tên biến rút gọn và vẽ cây quyết định bo tròn với màu sắc tương phản rõ ràng.</w:t>
-        <w:br/>
-        <w:t>- analyze_errors_quantitatively(): Trích xuất 95 ca dự đoán sai, tính toán phân vị GPA và xuất ra con số 73.68% lỗi cận biên.</w:t>
+        <w:t>calculate_metrics(): Tính toán Accuracy, Precision, Recall, F1 và Macro F1 từ confusion_matrix.</w:t>
       </w:r>
     </w:p>
     <w:p>
       <w:pPr>
+        <w:spacing w:before="0" w:after="60" w:line="300" w:lineRule="auto"/>
+        <w:ind w:left="680" w:hanging="283"/>
+        <w:jc w:val="both"/>
+      </w:pPr>
+      <w:r>
+        <w:rPr>
+          <w:rFonts w:ascii="Times New Roman" w:hAnsi="Times New Roman"/>
+          <w:b/>
+          <w:i w:val="0"/>
+          <w:color w:val="000000"/>
+          <w:sz w:val="26"/>
+          <w:rFonts w:ascii="Times New Roman" w:hAnsi="Times New Roman" w:cs="Times New Roman" w:eastAsia="Times New Roman"/>
+        </w:rPr>
+        <w:t xml:space="preserve">- </w:t>
+      </w:r>
+      <w:r>
+        <w:rPr>
+          <w:rFonts w:ascii="Times New Roman" w:hAnsi="Times New Roman"/>
+          <w:b w:val="0"/>
+          <w:i w:val="0"/>
+          <w:color w:val="000000"/>
+          <w:sz w:val="26"/>
+          <w:rFonts w:ascii="Times New Roman" w:hAnsi="Times New Roman" w:cs="Times New Roman" w:eastAsia="Times New Roman"/>
+        </w:rPr>
+        <w:t>plot_decision_tree_graph(): Việt hóa tên biến rút gọn và vẽ cây quyết định bo tròn với màu sắc tương phản rõ ràng.</w:t>
+      </w:r>
+    </w:p>
+    <w:p>
+      <w:pPr>
+        <w:spacing w:before="0" w:after="60" w:line="300" w:lineRule="auto"/>
+        <w:ind w:left="680" w:hanging="283"/>
+        <w:jc w:val="both"/>
+      </w:pPr>
+      <w:r>
+        <w:rPr>
+          <w:rFonts w:ascii="Times New Roman" w:hAnsi="Times New Roman"/>
+          <w:b/>
+          <w:i w:val="0"/>
+          <w:color w:val="000000"/>
+          <w:sz w:val="26"/>
+          <w:rFonts w:ascii="Times New Roman" w:hAnsi="Times New Roman" w:cs="Times New Roman" w:eastAsia="Times New Roman"/>
+        </w:rPr>
+        <w:t xml:space="preserve">- </w:t>
+      </w:r>
+      <w:r>
+        <w:rPr>
+          <w:rFonts w:ascii="Times New Roman" w:hAnsi="Times New Roman"/>
+          <w:b w:val="0"/>
+          <w:i w:val="0"/>
+          <w:color w:val="000000"/>
+          <w:sz w:val="26"/>
+          <w:rFonts w:ascii="Times New Roman" w:hAnsi="Times New Roman" w:cs="Times New Roman" w:eastAsia="Times New Roman"/>
+        </w:rPr>
+        <w:t>analyze_errors_quantitatively(): Trích xuất 95 ca dự đoán sai, tính toán phân vị GPA và xuất ra con số 73.68% lỗi cận biên.</w:t>
+      </w:r>
+    </w:p>
+    <w:p>
+      <w:pPr>
+        <w:pStyle w:val="Heading2"/>
         <w:keepNext/>
         <w:spacing w:before="200" w:after="80"/>
         <w:ind w:firstLine="0"/>
@@ -6338,12 +9204,14 @@
       <w:outlineLvl w:val="0"/>
     </w:pPr>
     <w:rPr>
-      <w:rFonts w:asciiTheme="majorHAnsi" w:eastAsiaTheme="majorEastAsia" w:hAnsiTheme="majorHAnsi" w:cstheme="majorBidi"/>
+      <w:rFonts w:asciiTheme="majorHAnsi" w:eastAsiaTheme="majorEastAsia" w:hAnsiTheme="majorHAnsi" w:cstheme="majorBidi" w:ascii="Times New Roman" w:hAnsi="Times New Roman"/>
       <w:b/>
       <w:bCs/>
-      <w:color w:val="365F91" w:themeColor="accent1" w:themeShade="BF"/>
+      <w:i w:val="0"/>
+      <w:color w:val="000000"/>
       <w:sz w:val="28"/>
       <w:szCs w:val="28"/>
+      <w:rFonts w:ascii="Times New Roman" w:hAnsi="Times New Roman" w:cs="Times New Roman"/>
     </w:rPr>
   </w:style>
   <w:style w:type="paragraph" w:styleId="Heading2">
@@ -6362,12 +9230,14 @@
       <w:outlineLvl w:val="1"/>
     </w:pPr>
     <w:rPr>
-      <w:rFonts w:asciiTheme="majorHAnsi" w:eastAsiaTheme="majorEastAsia" w:hAnsiTheme="majorHAnsi" w:cstheme="majorBidi"/>
+      <w:rFonts w:asciiTheme="majorHAnsi" w:eastAsiaTheme="majorEastAsia" w:hAnsiTheme="majorHAnsi" w:cstheme="majorBidi" w:ascii="Times New Roman" w:hAnsi="Times New Roman"/>
       <w:b/>
       <w:bCs/>
-      <w:color w:val="4F81BD" w:themeColor="accent1"/>
+      <w:i w:val="0"/>
+      <w:color w:val="000000"/>
       <w:sz w:val="26"/>
       <w:szCs w:val="26"/>
+      <w:rFonts w:ascii="Times New Roman" w:hAnsi="Times New Roman" w:cs="Times New Roman"/>
     </w:rPr>
   </w:style>
   <w:style w:type="paragraph" w:styleId="Heading3">
@@ -6386,10 +9256,13 @@
       <w:outlineLvl w:val="2"/>
     </w:pPr>
     <w:rPr>
-      <w:rFonts w:asciiTheme="majorHAnsi" w:eastAsiaTheme="majorEastAsia" w:hAnsiTheme="majorHAnsi" w:cstheme="majorBidi"/>
+      <w:rFonts w:asciiTheme="majorHAnsi" w:eastAsiaTheme="majorEastAsia" w:hAnsiTheme="majorHAnsi" w:cstheme="majorBidi" w:ascii="Times New Roman" w:hAnsi="Times New Roman"/>
       <w:b/>
       <w:bCs/>
-      <w:color w:val="4F81BD" w:themeColor="accent1"/>
+      <w:i/>
+      <w:color w:val="000000"/>
+      <w:sz w:val="26"/>
+      <w:rFonts w:ascii="Times New Roman" w:hAnsi="Times New Roman" w:cs="Times New Roman"/>
     </w:rPr>
   </w:style>
   <w:style w:type="paragraph" w:styleId="Heading4">

</xml_diff>